<commit_message>
Exit-Ticket: mehr Formulierungsvorschläge, Bildung fett und farbig markiert
Co-Authored-By: Claude Opus 5.5 <noreply@anthropic.com>
Claude-Session: https://claude.ai/code/session_01KXvLXHMYPnCyEbMRgNaaYs
</commit_message>
<xml_diff>
--- a/Deutsch_7A/Zeitformen_Zeitstrahl/Druckvorlage_Zeitformen_Zeitstrahl.docx
+++ b/Deutsch_7A/Zeitformen_Zeitstrahl/Druckvorlage_Zeitformen_Zeitstrahl.docx
@@ -2318,7 +2318,7 @@
           </w:tcPr>
           <w:p>
             <w:pPr>
-              <w:spacing w:after="60" w:before="0"/>
+              <w:spacing w:after="80" w:before="0"/>
             </w:pPr>
             <w:r>
               <w:rPr>
@@ -2326,8 +2326,8 @@
                 <w:b/>
                 <w:bCs/>
                 <w:color w:val="1E2761"/>
-                <w:sz w:val="26"/>
-                <w:szCs w:val="26"/>
+                <w:sz w:val="28"/>
+                <w:szCs w:val="28"/>
               </w:rPr>
               <w:t xml:space="preserve">Exit-Ticket: Mein Wochenende in fünf Zeitformen</w:t>
             </w:r>
@@ -2338,12 +2338,12 @@
                 <w:sz w:val="18"/>
                 <w:szCs w:val="18"/>
               </w:rPr>
-              <w:t xml:space="preserve">     Name: ______________</w:t>
+              <w:t xml:space="preserve">   Name: ______________</w:t>
             </w:r>
           </w:p>
           <w:p>
             <w:pPr>
-              <w:spacing w:after="70" w:before="0"/>
+              <w:spacing w:after="100" w:before="0"/>
             </w:pPr>
             <w:r>
               <w:rPr>
@@ -2392,12 +2392,1723 @@
                 <w:sz w:val="21"/>
                 <w:szCs w:val="21"/>
               </w:rPr>
-              <w:t xml:space="preserve"> vor.</w:t>
+              <w:t xml:space="preserve"> vor. Du kannst die Vorschläge übernehmen und ergänzen.</w:t>
             </w:r>
           </w:p>
+          <w:tbl>
+            <w:tblPr>
+              <w:tblW w:type="dxa" w:w="10406"/>
+              <w:tblBorders>
+                <w:top w:val="single" w:color="auto" w:sz="4"/>
+                <w:left w:val="single" w:color="auto" w:sz="4"/>
+                <w:bottom w:val="single" w:color="auto" w:sz="4"/>
+                <w:right w:val="single" w:color="auto" w:sz="4"/>
+                <w:insideH w:val="single" w:color="auto" w:sz="4"/>
+                <w:insideV w:val="single" w:color="auto" w:sz="4"/>
+              </w:tblBorders>
+            </w:tblPr>
+            <w:tblGrid>
+              <w:gridCol w:w="2350"/>
+              <w:gridCol w:w="8056"/>
+            </w:tblGrid>
+            <w:tr>
+              <w:trPr>
+                <w:cantSplit/>
+              </w:trPr>
+              <w:tc>
+                <w:tcPr>
+                  <w:tcW w:type="dxa" w:w="2350"/>
+                  <w:tcBorders>
+                    <w:top w:val="single" w:color="B9C6E8" w:sz="6"/>
+                    <w:left w:val="single" w:color="B9C6E8" w:sz="6"/>
+                    <w:bottom w:val="single" w:color="B9C6E8" w:sz="6"/>
+                    <w:right w:val="single" w:color="B9C6E8" w:sz="6"/>
+                  </w:tcBorders>
+                  <w:shd w:fill="F4F7FD" w:color="auto" w:val="clear"/>
+                  <w:tcMar>
+                    <w:top w:type="dxa" w:w="70"/>
+                    <w:left w:type="dxa" w:w="100"/>
+                    <w:bottom w:type="dxa" w:w="70"/>
+                    <w:right w:type="dxa" w:w="100"/>
+                  </w:tcMar>
+                  <w:vAlign w:val="top"/>
+                </w:tcPr>
+                <w:p>
+                  <w:pPr>
+                    <w:spacing w:after="10" w:before="0"/>
+                  </w:pPr>
+                  <w:r>
+                    <w:rPr>
+                      <w:rFonts w:ascii="Cambria" w:cs="Cambria" w:eastAsia="Cambria" w:hAnsi="Cambria"/>
+                      <w:b/>
+                      <w:bCs/>
+                      <w:color w:val="1E2761"/>
+                      <w:sz w:val="20"/>
+                      <w:szCs w:val="20"/>
+                    </w:rPr>
+                    <w:t xml:space="preserve">Plusquamperfekt</w:t>
+                  </w:r>
+                </w:p>
+                <w:p>
+                  <w:pPr>
+                    <w:spacing w:after="10" w:before="0"/>
+                  </w:pPr>
+                  <w:r>
+                    <w:rPr>
+                      <w:rFonts w:ascii="Calibri" w:cs="Calibri" w:eastAsia="Calibri" w:hAnsi="Calibri"/>
+                      <w:color w:val="5B6B8C"/>
+                      <w:sz w:val="16"/>
+                      <w:szCs w:val="16"/>
+                    </w:rPr>
+                    <w:t xml:space="preserve">vorher</w:t>
+                  </w:r>
+                </w:p>
+                <w:p>
+                  <w:pPr>
+                    <w:spacing w:after="0" w:before="0"/>
+                  </w:pPr>
+                  <w:r>
+                    <w:rPr>
+                      <w:rFonts w:ascii="Calibri" w:cs="Calibri" w:eastAsia="Calibri" w:hAnsi="Calibri"/>
+                      <w:b/>
+                      <w:bCs/>
+                      <w:color w:val="D9534F"/>
+                      <w:sz w:val="16"/>
+                      <w:szCs w:val="16"/>
+                    </w:rPr>
+                    <w:t xml:space="preserve">hatte/war</w:t>
+                  </w:r>
+                  <w:r>
+                    <w:rPr>
+                      <w:rFonts w:ascii="Calibri" w:cs="Calibri" w:eastAsia="Calibri" w:hAnsi="Calibri"/>
+                      <w:b/>
+                      <w:bCs/>
+                      <w:color w:val="333333"/>
+                      <w:sz w:val="16"/>
+                      <w:szCs w:val="16"/>
+                    </w:rPr>
+                    <w:t xml:space="preserve"> + </w:t>
+                  </w:r>
+                  <w:r>
+                    <w:rPr>
+                      <w:rFonts w:ascii="Calibri" w:cs="Calibri" w:eastAsia="Calibri" w:hAnsi="Calibri"/>
+                      <w:b/>
+                      <w:bCs/>
+                      <w:color w:val="C98A1E"/>
+                      <w:sz w:val="16"/>
+                      <w:szCs w:val="16"/>
+                    </w:rPr>
+                    <w:t xml:space="preserve">Partizip II</w:t>
+                  </w:r>
+                </w:p>
+              </w:tc>
+              <w:tc>
+                <w:tcPr>
+                  <w:tcW w:type="dxa" w:w="8056"/>
+                  <w:tcBorders>
+                    <w:top w:val="single" w:color="B9C6E8" w:sz="6"/>
+                    <w:left w:val="single" w:color="B9C6E8" w:sz="6"/>
+                    <w:bottom w:val="single" w:color="B9C6E8" w:sz="6"/>
+                    <w:right w:val="single" w:color="B9C6E8" w:sz="6"/>
+                  </w:tcBorders>
+                  <w:tcMar>
+                    <w:top w:type="dxa" w:w="70"/>
+                    <w:left w:type="dxa" w:w="100"/>
+                    <w:bottom w:type="dxa" w:w="70"/>
+                    <w:right w:type="dxa" w:w="100"/>
+                  </w:tcMar>
+                  <w:vAlign w:val="top"/>
+                </w:tcPr>
+                <w:p>
+                  <w:pPr>
+                    <w:spacing w:after="40" w:before="0"/>
+                  </w:pPr>
+                  <w:r>
+                    <w:rPr>
+                      <w:rFonts w:ascii="Calibri" w:cs="Calibri" w:eastAsia="Calibri" w:hAnsi="Calibri"/>
+                      <w:color w:val="000000"/>
+                      <w:sz w:val="19"/>
+                      <w:szCs w:val="19"/>
+                    </w:rPr>
+                    <w:t xml:space="preserve">Vor dem Wettkampf </w:t>
+                  </w:r>
+                  <w:r>
+                    <w:rPr>
+                      <w:rFonts w:ascii="Calibri" w:cs="Calibri" w:eastAsia="Calibri" w:hAnsi="Calibri"/>
+                      <w:b/>
+                      <w:bCs/>
+                      <w:color w:val="D9534F"/>
+                      <w:sz w:val="19"/>
+                      <w:szCs w:val="19"/>
+                    </w:rPr>
+                    <w:t xml:space="preserve">hatte</w:t>
+                  </w:r>
+                  <w:r>
+                    <w:rPr>
+                      <w:rFonts w:ascii="Calibri" w:cs="Calibri" w:eastAsia="Calibri" w:hAnsi="Calibri"/>
+                      <w:color w:val="000000"/>
+                      <w:sz w:val="19"/>
+                      <w:szCs w:val="19"/>
+                    </w:rPr>
+                    <w:t xml:space="preserve"> ich wochenlang hart </w:t>
+                  </w:r>
+                  <w:r>
+                    <w:rPr>
+                      <w:rFonts w:ascii="Calibri" w:cs="Calibri" w:eastAsia="Calibri" w:hAnsi="Calibri"/>
+                      <w:b/>
+                      <w:bCs/>
+                      <w:color w:val="C98A1E"/>
+                      <w:sz w:val="19"/>
+                      <w:szCs w:val="19"/>
+                    </w:rPr>
+                    <w:t xml:space="preserve">trainiert</w:t>
+                  </w:r>
+                  <w:r>
+                    <w:rPr>
+                      <w:rFonts w:ascii="Calibri" w:cs="Calibri" w:eastAsia="Calibri" w:hAnsi="Calibri"/>
+                      <w:color w:val="000000"/>
+                      <w:sz w:val="19"/>
+                      <w:szCs w:val="19"/>
+                    </w:rPr>
+                    <w:t xml:space="preserve">.</w:t>
+                  </w:r>
+                  <w:r>
+                    <w:rPr>
+                      <w:rFonts w:ascii="Calibri" w:cs="Calibri" w:eastAsia="Calibri" w:hAnsi="Calibri"/>
+                      <w:color w:val="9AA3B5"/>
+                      <w:sz w:val="19"/>
+                      <w:szCs w:val="19"/>
+                    </w:rPr>
+                    <w:t xml:space="preserve">   ·   </w:t>
+                  </w:r>
+                  <w:r>
+                    <w:rPr>
+                      <w:rFonts w:ascii="Calibri" w:cs="Calibri" w:eastAsia="Calibri" w:hAnsi="Calibri"/>
+                      <w:color w:val="000000"/>
+                      <w:sz w:val="19"/>
+                      <w:szCs w:val="19"/>
+                    </w:rPr>
+                    <w:t xml:space="preserve">Am Abend davor </w:t>
+                  </w:r>
+                  <w:r>
+                    <w:rPr>
+                      <w:rFonts w:ascii="Calibri" w:cs="Calibri" w:eastAsia="Calibri" w:hAnsi="Calibri"/>
+                      <w:b/>
+                      <w:bCs/>
+                      <w:color w:val="D9534F"/>
+                      <w:sz w:val="19"/>
+                      <w:szCs w:val="19"/>
+                    </w:rPr>
+                    <w:t xml:space="preserve">hatte</w:t>
+                  </w:r>
+                  <w:r>
+                    <w:rPr>
+                      <w:rFonts w:ascii="Calibri" w:cs="Calibri" w:eastAsia="Calibri" w:hAnsi="Calibri"/>
+                      <w:color w:val="000000"/>
+                      <w:sz w:val="19"/>
+                      <w:szCs w:val="19"/>
+                    </w:rPr>
+                    <w:t xml:space="preserve"> ich kaum </w:t>
+                  </w:r>
+                  <w:r>
+                    <w:rPr>
+                      <w:rFonts w:ascii="Calibri" w:cs="Calibri" w:eastAsia="Calibri" w:hAnsi="Calibri"/>
+                      <w:b/>
+                      <w:bCs/>
+                      <w:color w:val="C98A1E"/>
+                      <w:sz w:val="19"/>
+                      <w:szCs w:val="19"/>
+                    </w:rPr>
+                    <w:t xml:space="preserve">geschlafen</w:t>
+                  </w:r>
+                  <w:r>
+                    <w:rPr>
+                      <w:rFonts w:ascii="Calibri" w:cs="Calibri" w:eastAsia="Calibri" w:hAnsi="Calibri"/>
+                      <w:color w:val="000000"/>
+                      <w:sz w:val="19"/>
+                      <w:szCs w:val="19"/>
+                    </w:rPr>
+                    <w:t xml:space="preserve">.</w:t>
+                  </w:r>
+                </w:p>
+                <w:p>
+                  <w:pPr>
+                    <w:spacing w:after="40" w:before="0"/>
+                  </w:pPr>
+                  <w:r>
+                    <w:rPr>
+                      <w:rFonts w:ascii="Calibri" w:cs="Calibri" w:eastAsia="Calibri" w:hAnsi="Calibri"/>
+                      <w:color w:val="000000"/>
+                      <w:sz w:val="19"/>
+                      <w:szCs w:val="19"/>
+                    </w:rPr>
+                    <w:t xml:space="preserve">Am Freitag </w:t>
+                  </w:r>
+                  <w:r>
+                    <w:rPr>
+                      <w:rFonts w:ascii="Calibri" w:cs="Calibri" w:eastAsia="Calibri" w:hAnsi="Calibri"/>
+                      <w:b/>
+                      <w:bCs/>
+                      <w:color w:val="D9534F"/>
+                      <w:sz w:val="19"/>
+                      <w:szCs w:val="19"/>
+                    </w:rPr>
+                    <w:t xml:space="preserve">waren</w:t>
+                  </w:r>
+                  <w:r>
+                    <w:rPr>
+                      <w:rFonts w:ascii="Calibri" w:cs="Calibri" w:eastAsia="Calibri" w:hAnsi="Calibri"/>
+                      <w:color w:val="000000"/>
+                      <w:sz w:val="19"/>
+                      <w:szCs w:val="19"/>
+                    </w:rPr>
+                    <w:t xml:space="preserve"> wir mit dem Team nach … </w:t>
+                  </w:r>
+                  <w:r>
+                    <w:rPr>
+                      <w:rFonts w:ascii="Calibri" w:cs="Calibri" w:eastAsia="Calibri" w:hAnsi="Calibri"/>
+                      <w:b/>
+                      <w:bCs/>
+                      <w:color w:val="C98A1E"/>
+                      <w:sz w:val="19"/>
+                      <w:szCs w:val="19"/>
+                    </w:rPr>
+                    <w:t xml:space="preserve">gefahren</w:t>
+                  </w:r>
+                  <w:r>
+                    <w:rPr>
+                      <w:rFonts w:ascii="Calibri" w:cs="Calibri" w:eastAsia="Calibri" w:hAnsi="Calibri"/>
+                      <w:color w:val="000000"/>
+                      <w:sz w:val="19"/>
+                      <w:szCs w:val="19"/>
+                    </w:rPr>
+                    <w:t xml:space="preserve">.</w:t>
+                  </w:r>
+                  <w:r>
+                    <w:rPr>
+                      <w:rFonts w:ascii="Calibri" w:cs="Calibri" w:eastAsia="Calibri" w:hAnsi="Calibri"/>
+                      <w:color w:val="9AA3B5"/>
+                      <w:sz w:val="19"/>
+                      <w:szCs w:val="19"/>
+                    </w:rPr>
+                    <w:t xml:space="preserve">   ·   </w:t>
+                  </w:r>
+                  <w:r>
+                    <w:rPr>
+                      <w:rFonts w:ascii="Calibri" w:cs="Calibri" w:eastAsia="Calibri" w:hAnsi="Calibri"/>
+                      <w:color w:val="000000"/>
+                      <w:sz w:val="19"/>
+                      <w:szCs w:val="19"/>
+                    </w:rPr>
+                    <w:t xml:space="preserve">Mein Trainer </w:t>
+                  </w:r>
+                  <w:r>
+                    <w:rPr>
+                      <w:rFonts w:ascii="Calibri" w:cs="Calibri" w:eastAsia="Calibri" w:hAnsi="Calibri"/>
+                      <w:b/>
+                      <w:bCs/>
+                      <w:color w:val="D9534F"/>
+                      <w:sz w:val="19"/>
+                      <w:szCs w:val="19"/>
+                    </w:rPr>
+                    <w:t xml:space="preserve">hatte</w:t>
+                  </w:r>
+                  <w:r>
+                    <w:rPr>
+                      <w:rFonts w:ascii="Calibri" w:cs="Calibri" w:eastAsia="Calibri" w:hAnsi="Calibri"/>
+                      <w:color w:val="000000"/>
+                      <w:sz w:val="19"/>
+                      <w:szCs w:val="19"/>
+                    </w:rPr>
+                    <w:t xml:space="preserve"> mir noch einen Tipp </w:t>
+                  </w:r>
+                  <w:r>
+                    <w:rPr>
+                      <w:rFonts w:ascii="Calibri" w:cs="Calibri" w:eastAsia="Calibri" w:hAnsi="Calibri"/>
+                      <w:b/>
+                      <w:bCs/>
+                      <w:color w:val="C98A1E"/>
+                      <w:sz w:val="19"/>
+                      <w:szCs w:val="19"/>
+                    </w:rPr>
+                    <w:t xml:space="preserve">gegeben</w:t>
+                  </w:r>
+                  <w:r>
+                    <w:rPr>
+                      <w:rFonts w:ascii="Calibri" w:cs="Calibri" w:eastAsia="Calibri" w:hAnsi="Calibri"/>
+                      <w:color w:val="000000"/>
+                      <w:sz w:val="19"/>
+                      <w:szCs w:val="19"/>
+                    </w:rPr>
+                    <w:t xml:space="preserve">.</w:t>
+                  </w:r>
+                </w:p>
+                <w:p>
+                  <w:pPr>
+                    <w:spacing w:after="40" w:before="0"/>
+                  </w:pPr>
+                  <w:r>
+                    <w:rPr>
+                      <w:rFonts w:ascii="Calibri" w:cs="Calibri" w:eastAsia="Calibri" w:hAnsi="Calibri"/>
+                      <w:color w:val="000000"/>
+                      <w:sz w:val="19"/>
+                      <w:szCs w:val="19"/>
+                    </w:rPr>
+                    <w:t xml:space="preserve">Ich </w:t>
+                  </w:r>
+                  <w:r>
+                    <w:rPr>
+                      <w:rFonts w:ascii="Calibri" w:cs="Calibri" w:eastAsia="Calibri" w:hAnsi="Calibri"/>
+                      <w:b/>
+                      <w:bCs/>
+                      <w:color w:val="D9534F"/>
+                      <w:sz w:val="19"/>
+                      <w:szCs w:val="19"/>
+                    </w:rPr>
+                    <w:t xml:space="preserve">hatte</w:t>
+                  </w:r>
+                  <w:r>
+                    <w:rPr>
+                      <w:rFonts w:ascii="Calibri" w:cs="Calibri" w:eastAsia="Calibri" w:hAnsi="Calibri"/>
+                      <w:color w:val="000000"/>
+                      <w:sz w:val="19"/>
+                      <w:szCs w:val="19"/>
+                    </w:rPr>
+                    <w:t xml:space="preserve"> mich lange </w:t>
+                  </w:r>
+                  <w:r>
+                    <w:rPr>
+                      <w:rFonts w:ascii="Calibri" w:cs="Calibri" w:eastAsia="Calibri" w:hAnsi="Calibri"/>
+                      <w:b/>
+                      <w:bCs/>
+                      <w:color w:val="C98A1E"/>
+                      <w:sz w:val="19"/>
+                      <w:szCs w:val="19"/>
+                    </w:rPr>
+                    <w:t xml:space="preserve">aufgewärmt</w:t>
+                  </w:r>
+                  <w:r>
+                    <w:rPr>
+                      <w:rFonts w:ascii="Calibri" w:cs="Calibri" w:eastAsia="Calibri" w:hAnsi="Calibri"/>
+                      <w:color w:val="000000"/>
+                      <w:sz w:val="19"/>
+                      <w:szCs w:val="19"/>
+                    </w:rPr>
+                    <w:t xml:space="preserve">.</w:t>
+                  </w:r>
+                  <w:r>
+                    <w:rPr>
+                      <w:rFonts w:ascii="Calibri" w:cs="Calibri" w:eastAsia="Calibri" w:hAnsi="Calibri"/>
+                      <w:color w:val="9AA3B5"/>
+                      <w:sz w:val="19"/>
+                      <w:szCs w:val="19"/>
+                    </w:rPr>
+                    <w:t xml:space="preserve">   ·   </w:t>
+                  </w:r>
+                  <w:r>
+                    <w:rPr>
+                      <w:rFonts w:ascii="Calibri" w:cs="Calibri" w:eastAsia="Calibri" w:hAnsi="Calibri"/>
+                      <w:color w:val="000000"/>
+                      <w:sz w:val="19"/>
+                      <w:szCs w:val="19"/>
+                    </w:rPr>
+                    <w:t xml:space="preserve">Wir </w:t>
+                  </w:r>
+                  <w:r>
+                    <w:rPr>
+                      <w:rFonts w:ascii="Calibri" w:cs="Calibri" w:eastAsia="Calibri" w:hAnsi="Calibri"/>
+                      <w:b/>
+                      <w:bCs/>
+                      <w:color w:val="D9534F"/>
+                      <w:sz w:val="19"/>
+                      <w:szCs w:val="19"/>
+                    </w:rPr>
+                    <w:t xml:space="preserve">waren</w:t>
+                  </w:r>
+                  <w:r>
+                    <w:rPr>
+                      <w:rFonts w:ascii="Calibri" w:cs="Calibri" w:eastAsia="Calibri" w:hAnsi="Calibri"/>
+                      <w:color w:val="000000"/>
+                      <w:sz w:val="19"/>
+                      <w:szCs w:val="19"/>
+                    </w:rPr>
+                    <w:t xml:space="preserve"> früh </w:t>
+                  </w:r>
+                  <w:r>
+                    <w:rPr>
+                      <w:rFonts w:ascii="Calibri" w:cs="Calibri" w:eastAsia="Calibri" w:hAnsi="Calibri"/>
+                      <w:b/>
+                      <w:bCs/>
+                      <w:color w:val="C98A1E"/>
+                      <w:sz w:val="19"/>
+                      <w:szCs w:val="19"/>
+                    </w:rPr>
+                    <w:t xml:space="preserve">aufgestanden</w:t>
+                  </w:r>
+                  <w:r>
+                    <w:rPr>
+                      <w:rFonts w:ascii="Calibri" w:cs="Calibri" w:eastAsia="Calibri" w:hAnsi="Calibri"/>
+                      <w:color w:val="000000"/>
+                      <w:sz w:val="19"/>
+                      <w:szCs w:val="19"/>
+                    </w:rPr>
+                    <w:t xml:space="preserve">.</w:t>
+                  </w:r>
+                </w:p>
+              </w:tc>
+            </w:tr>
+            <w:tr>
+              <w:trPr>
+                <w:cantSplit/>
+              </w:trPr>
+              <w:tc>
+                <w:tcPr>
+                  <w:tcW w:type="dxa" w:w="2350"/>
+                  <w:tcBorders>
+                    <w:top w:val="single" w:color="B9C6E8" w:sz="6"/>
+                    <w:left w:val="single" w:color="B9C6E8" w:sz="6"/>
+                    <w:bottom w:val="single" w:color="B9C6E8" w:sz="6"/>
+                    <w:right w:val="single" w:color="B9C6E8" w:sz="6"/>
+                  </w:tcBorders>
+                  <w:shd w:fill="F4F7FD" w:color="auto" w:val="clear"/>
+                  <w:tcMar>
+                    <w:top w:type="dxa" w:w="70"/>
+                    <w:left w:type="dxa" w:w="100"/>
+                    <w:bottom w:type="dxa" w:w="70"/>
+                    <w:right w:type="dxa" w:w="100"/>
+                  </w:tcMar>
+                  <w:vAlign w:val="top"/>
+                </w:tcPr>
+                <w:p>
+                  <w:pPr>
+                    <w:spacing w:after="10" w:before="0"/>
+                  </w:pPr>
+                  <w:r>
+                    <w:rPr>
+                      <w:rFonts w:ascii="Cambria" w:cs="Cambria" w:eastAsia="Cambria" w:hAnsi="Cambria"/>
+                      <w:b/>
+                      <w:bCs/>
+                      <w:color w:val="1E2761"/>
+                      <w:sz w:val="20"/>
+                      <w:szCs w:val="20"/>
+                    </w:rPr>
+                    <w:t xml:space="preserve">Präteritum</w:t>
+                  </w:r>
+                </w:p>
+                <w:p>
+                  <w:pPr>
+                    <w:spacing w:after="10" w:before="0"/>
+                  </w:pPr>
+                  <w:r>
+                    <w:rPr>
+                      <w:rFonts w:ascii="Calibri" w:cs="Calibri" w:eastAsia="Calibri" w:hAnsi="Calibri"/>
+                      <w:color w:val="5B6B8C"/>
+                      <w:sz w:val="16"/>
+                      <w:szCs w:val="16"/>
+                    </w:rPr>
+                    <w:t xml:space="preserve">Vergangenheit – erzählt</w:t>
+                  </w:r>
+                </w:p>
+                <w:p>
+                  <w:pPr>
+                    <w:spacing w:after="0" w:before="0"/>
+                  </w:pPr>
+                  <w:r>
+                    <w:rPr>
+                      <w:rFonts w:ascii="Calibri" w:cs="Calibri" w:eastAsia="Calibri" w:hAnsi="Calibri"/>
+                      <w:b/>
+                      <w:bCs/>
+                      <w:color w:val="333333"/>
+                      <w:sz w:val="16"/>
+                      <w:szCs w:val="16"/>
+                    </w:rPr>
+                    <w:t xml:space="preserve">finites Verb im Präteritum</w:t>
+                  </w:r>
+                </w:p>
+              </w:tc>
+              <w:tc>
+                <w:tcPr>
+                  <w:tcW w:type="dxa" w:w="8056"/>
+                  <w:tcBorders>
+                    <w:top w:val="single" w:color="B9C6E8" w:sz="6"/>
+                    <w:left w:val="single" w:color="B9C6E8" w:sz="6"/>
+                    <w:bottom w:val="single" w:color="B9C6E8" w:sz="6"/>
+                    <w:right w:val="single" w:color="B9C6E8" w:sz="6"/>
+                  </w:tcBorders>
+                  <w:tcMar>
+                    <w:top w:type="dxa" w:w="70"/>
+                    <w:left w:type="dxa" w:w="100"/>
+                    <w:bottom w:type="dxa" w:w="70"/>
+                    <w:right w:type="dxa" w:w="100"/>
+                  </w:tcMar>
+                  <w:vAlign w:val="top"/>
+                </w:tcPr>
+                <w:p>
+                  <w:pPr>
+                    <w:spacing w:after="40" w:before="0"/>
+                  </w:pPr>
+                  <w:r>
+                    <w:rPr>
+                      <w:rFonts w:ascii="Calibri" w:cs="Calibri" w:eastAsia="Calibri" w:hAnsi="Calibri"/>
+                      <w:color w:val="000000"/>
+                      <w:sz w:val="19"/>
+                      <w:szCs w:val="19"/>
+                    </w:rPr>
+                    <w:t xml:space="preserve">Am Samstag </w:t>
+                  </w:r>
+                  <w:r>
+                    <w:rPr>
+                      <w:rFonts w:ascii="Calibri" w:cs="Calibri" w:eastAsia="Calibri" w:hAnsi="Calibri"/>
+                      <w:b/>
+                      <w:bCs/>
+                      <w:color w:val="000000"/>
+                      <w:sz w:val="19"/>
+                      <w:szCs w:val="19"/>
+                      <w:u w:val="single"/>
+                    </w:rPr>
+                    <w:t xml:space="preserve">kämpfte</w:t>
+                  </w:r>
+                  <w:r>
+                    <w:rPr>
+                      <w:rFonts w:ascii="Calibri" w:cs="Calibri" w:eastAsia="Calibri" w:hAnsi="Calibri"/>
+                      <w:color w:val="000000"/>
+                      <w:sz w:val="19"/>
+                      <w:szCs w:val="19"/>
+                    </w:rPr>
+                    <w:t xml:space="preserve"> / </w:t>
+                  </w:r>
+                  <w:r>
+                    <w:rPr>
+                      <w:rFonts w:ascii="Calibri" w:cs="Calibri" w:eastAsia="Calibri" w:hAnsi="Calibri"/>
+                      <w:b/>
+                      <w:bCs/>
+                      <w:color w:val="000000"/>
+                      <w:sz w:val="19"/>
+                      <w:szCs w:val="19"/>
+                      <w:u w:val="single"/>
+                    </w:rPr>
+                    <w:t xml:space="preserve">spielte</w:t>
+                  </w:r>
+                  <w:r>
+                    <w:rPr>
+                      <w:rFonts w:ascii="Calibri" w:cs="Calibri" w:eastAsia="Calibri" w:hAnsi="Calibri"/>
+                      <w:color w:val="000000"/>
+                      <w:sz w:val="19"/>
+                      <w:szCs w:val="19"/>
+                    </w:rPr>
+                    <w:t xml:space="preserve"> / </w:t>
+                  </w:r>
+                  <w:r>
+                    <w:rPr>
+                      <w:rFonts w:ascii="Calibri" w:cs="Calibri" w:eastAsia="Calibri" w:hAnsi="Calibri"/>
+                      <w:b/>
+                      <w:bCs/>
+                      <w:color w:val="000000"/>
+                      <w:sz w:val="19"/>
+                      <w:szCs w:val="19"/>
+                      <w:u w:val="single"/>
+                    </w:rPr>
+                    <w:t xml:space="preserve">hob</w:t>
+                  </w:r>
+                  <w:r>
+                    <w:rPr>
+                      <w:rFonts w:ascii="Calibri" w:cs="Calibri" w:eastAsia="Calibri" w:hAnsi="Calibri"/>
+                      <w:color w:val="000000"/>
+                      <w:sz w:val="19"/>
+                      <w:szCs w:val="19"/>
+                    </w:rPr>
+                    <w:t xml:space="preserve"> ich …</w:t>
+                  </w:r>
+                  <w:r>
+                    <w:rPr>
+                      <w:rFonts w:ascii="Calibri" w:cs="Calibri" w:eastAsia="Calibri" w:hAnsi="Calibri"/>
+                      <w:color w:val="9AA3B5"/>
+                      <w:sz w:val="19"/>
+                      <w:szCs w:val="19"/>
+                    </w:rPr>
+                    <w:t xml:space="preserve">   ·   </w:t>
+                  </w:r>
+                  <w:r>
+                    <w:rPr>
+                      <w:rFonts w:ascii="Calibri" w:cs="Calibri" w:eastAsia="Calibri" w:hAnsi="Calibri"/>
+                      <w:color w:val="000000"/>
+                      <w:sz w:val="19"/>
+                      <w:szCs w:val="19"/>
+                    </w:rPr>
+                    <w:t xml:space="preserve">Im ersten Kampf / In der ersten Halbzeit / Im ersten Versuch …</w:t>
+                  </w:r>
+                </w:p>
+                <w:p>
+                  <w:pPr>
+                    <w:spacing w:after="40" w:before="0"/>
+                  </w:pPr>
+                  <w:r>
+                    <w:rPr>
+                      <w:rFonts w:ascii="Calibri" w:cs="Calibri" w:eastAsia="Calibri" w:hAnsi="Calibri"/>
+                      <w:color w:val="000000"/>
+                      <w:sz w:val="19"/>
+                      <w:szCs w:val="19"/>
+                    </w:rPr>
+                    <w:t xml:space="preserve">Am Anfang </w:t>
+                  </w:r>
+                  <w:r>
+                    <w:rPr>
+                      <w:rFonts w:ascii="Calibri" w:cs="Calibri" w:eastAsia="Calibri" w:hAnsi="Calibri"/>
+                      <w:b/>
+                      <w:bCs/>
+                      <w:color w:val="000000"/>
+                      <w:sz w:val="19"/>
+                      <w:szCs w:val="19"/>
+                      <w:u w:val="single"/>
+                    </w:rPr>
+                    <w:t xml:space="preserve">war</w:t>
+                  </w:r>
+                  <w:r>
+                    <w:rPr>
+                      <w:rFonts w:ascii="Calibri" w:cs="Calibri" w:eastAsia="Calibri" w:hAnsi="Calibri"/>
+                      <w:color w:val="000000"/>
+                      <w:sz w:val="19"/>
+                      <w:szCs w:val="19"/>
+                    </w:rPr>
+                    <w:t xml:space="preserve"> ich sehr nervös.</w:t>
+                  </w:r>
+                  <w:r>
+                    <w:rPr>
+                      <w:rFonts w:ascii="Calibri" w:cs="Calibri" w:eastAsia="Calibri" w:hAnsi="Calibri"/>
+                      <w:color w:val="9AA3B5"/>
+                      <w:sz w:val="19"/>
+                      <w:szCs w:val="19"/>
+                    </w:rPr>
+                    <w:t xml:space="preserve">   ·   </w:t>
+                  </w:r>
+                  <w:r>
+                    <w:rPr>
+                      <w:rFonts w:ascii="Calibri" w:cs="Calibri" w:eastAsia="Calibri" w:hAnsi="Calibri"/>
+                      <w:color w:val="000000"/>
+                      <w:sz w:val="19"/>
+                      <w:szCs w:val="19"/>
+                    </w:rPr>
+                    <w:t xml:space="preserve">Dann </w:t>
+                  </w:r>
+                  <w:r>
+                    <w:rPr>
+                      <w:rFonts w:ascii="Calibri" w:cs="Calibri" w:eastAsia="Calibri" w:hAnsi="Calibri"/>
+                      <w:b/>
+                      <w:bCs/>
+                      <w:color w:val="000000"/>
+                      <w:sz w:val="19"/>
+                      <w:szCs w:val="19"/>
+                      <w:u w:val="single"/>
+                    </w:rPr>
+                    <w:t xml:space="preserve">warf</w:t>
+                  </w:r>
+                  <w:r>
+                    <w:rPr>
+                      <w:rFonts w:ascii="Calibri" w:cs="Calibri" w:eastAsia="Calibri" w:hAnsi="Calibri"/>
+                      <w:color w:val="000000"/>
+                      <w:sz w:val="19"/>
+                      <w:szCs w:val="19"/>
+                    </w:rPr>
+                    <w:t xml:space="preserve"> / </w:t>
+                  </w:r>
+                  <w:r>
+                    <w:rPr>
+                      <w:rFonts w:ascii="Calibri" w:cs="Calibri" w:eastAsia="Calibri" w:hAnsi="Calibri"/>
+                      <w:b/>
+                      <w:bCs/>
+                      <w:color w:val="000000"/>
+                      <w:sz w:val="19"/>
+                      <w:szCs w:val="19"/>
+                      <w:u w:val="single"/>
+                    </w:rPr>
+                    <w:t xml:space="preserve">traf</w:t>
+                  </w:r>
+                  <w:r>
+                    <w:rPr>
+                      <w:rFonts w:ascii="Calibri" w:cs="Calibri" w:eastAsia="Calibri" w:hAnsi="Calibri"/>
+                      <w:color w:val="000000"/>
+                      <w:sz w:val="19"/>
+                      <w:szCs w:val="19"/>
+                    </w:rPr>
+                    <w:t xml:space="preserve"> / </w:t>
+                  </w:r>
+                  <w:r>
+                    <w:rPr>
+                      <w:rFonts w:ascii="Calibri" w:cs="Calibri" w:eastAsia="Calibri" w:hAnsi="Calibri"/>
+                      <w:b/>
+                      <w:bCs/>
+                      <w:color w:val="000000"/>
+                      <w:sz w:val="19"/>
+                      <w:szCs w:val="19"/>
+                      <w:u w:val="single"/>
+                    </w:rPr>
+                    <w:t xml:space="preserve">stieß</w:t>
+                  </w:r>
+                  <w:r>
+                    <w:rPr>
+                      <w:rFonts w:ascii="Calibri" w:cs="Calibri" w:eastAsia="Calibri" w:hAnsi="Calibri"/>
+                      <w:color w:val="000000"/>
+                      <w:sz w:val="19"/>
+                      <w:szCs w:val="19"/>
+                    </w:rPr>
+                    <w:t xml:space="preserve"> ich …</w:t>
+                  </w:r>
+                  <w:r>
+                    <w:rPr>
+                      <w:rFonts w:ascii="Calibri" w:cs="Calibri" w:eastAsia="Calibri" w:hAnsi="Calibri"/>
+                      <w:color w:val="9AA3B5"/>
+                      <w:sz w:val="19"/>
+                      <w:szCs w:val="19"/>
+                    </w:rPr>
+                    <w:t xml:space="preserve">   ·   </w:t>
+                  </w:r>
+                  <w:r>
+                    <w:rPr>
+                      <w:rFonts w:ascii="Calibri" w:cs="Calibri" w:eastAsia="Calibri" w:hAnsi="Calibri"/>
+                      <w:color w:val="000000"/>
+                      <w:sz w:val="19"/>
+                      <w:szCs w:val="19"/>
+                    </w:rPr>
+                    <w:t xml:space="preserve">Am Ende </w:t>
+                  </w:r>
+                  <w:r>
+                    <w:rPr>
+                      <w:rFonts w:ascii="Calibri" w:cs="Calibri" w:eastAsia="Calibri" w:hAnsi="Calibri"/>
+                      <w:b/>
+                      <w:bCs/>
+                      <w:color w:val="000000"/>
+                      <w:sz w:val="19"/>
+                      <w:szCs w:val="19"/>
+                      <w:u w:val="single"/>
+                    </w:rPr>
+                    <w:t xml:space="preserve">gewann</w:t>
+                  </w:r>
+                  <w:r>
+                    <w:rPr>
+                      <w:rFonts w:ascii="Calibri" w:cs="Calibri" w:eastAsia="Calibri" w:hAnsi="Calibri"/>
+                      <w:color w:val="000000"/>
+                      <w:sz w:val="19"/>
+                      <w:szCs w:val="19"/>
+                    </w:rPr>
+                    <w:t xml:space="preserve"> / </w:t>
+                  </w:r>
+                  <w:r>
+                    <w:rPr>
+                      <w:rFonts w:ascii="Calibri" w:cs="Calibri" w:eastAsia="Calibri" w:hAnsi="Calibri"/>
+                      <w:b/>
+                      <w:bCs/>
+                      <w:color w:val="000000"/>
+                      <w:sz w:val="19"/>
+                      <w:szCs w:val="19"/>
+                      <w:u w:val="single"/>
+                    </w:rPr>
+                    <w:t xml:space="preserve">verlor</w:t>
+                  </w:r>
+                  <w:r>
+                    <w:rPr>
+                      <w:rFonts w:ascii="Calibri" w:cs="Calibri" w:eastAsia="Calibri" w:hAnsi="Calibri"/>
+                      <w:color w:val="000000"/>
+                      <w:sz w:val="19"/>
+                      <w:szCs w:val="19"/>
+                    </w:rPr>
+                    <w:t xml:space="preserve"> ich …</w:t>
+                  </w:r>
+                </w:p>
+              </w:tc>
+            </w:tr>
+            <w:tr>
+              <w:trPr>
+                <w:cantSplit/>
+              </w:trPr>
+              <w:tc>
+                <w:tcPr>
+                  <w:tcW w:type="dxa" w:w="2350"/>
+                  <w:tcBorders>
+                    <w:top w:val="single" w:color="B9C6E8" w:sz="6"/>
+                    <w:left w:val="single" w:color="B9C6E8" w:sz="6"/>
+                    <w:bottom w:val="single" w:color="B9C6E8" w:sz="6"/>
+                    <w:right w:val="single" w:color="B9C6E8" w:sz="6"/>
+                  </w:tcBorders>
+                  <w:shd w:fill="F4F7FD" w:color="auto" w:val="clear"/>
+                  <w:tcMar>
+                    <w:top w:type="dxa" w:w="70"/>
+                    <w:left w:type="dxa" w:w="100"/>
+                    <w:bottom w:type="dxa" w:w="70"/>
+                    <w:right w:type="dxa" w:w="100"/>
+                  </w:tcMar>
+                  <w:vAlign w:val="top"/>
+                </w:tcPr>
+                <w:p>
+                  <w:pPr>
+                    <w:spacing w:after="10" w:before="0"/>
+                  </w:pPr>
+                  <w:r>
+                    <w:rPr>
+                      <w:rFonts w:ascii="Cambria" w:cs="Cambria" w:eastAsia="Cambria" w:hAnsi="Cambria"/>
+                      <w:b/>
+                      <w:bCs/>
+                      <w:color w:val="1E2761"/>
+                      <w:sz w:val="20"/>
+                      <w:szCs w:val="20"/>
+                    </w:rPr>
+                    <w:t xml:space="preserve">Perfekt</w:t>
+                  </w:r>
+                </w:p>
+                <w:p>
+                  <w:pPr>
+                    <w:spacing w:after="10" w:before="0"/>
+                  </w:pPr>
+                  <w:r>
+                    <w:rPr>
+                      <w:rFonts w:ascii="Calibri" w:cs="Calibri" w:eastAsia="Calibri" w:hAnsi="Calibri"/>
+                      <w:color w:val="5B6B8C"/>
+                      <w:sz w:val="16"/>
+                      <w:szCs w:val="16"/>
+                    </w:rPr>
+                    <w:t xml:space="preserve">Vergangenheit – gesprochen (wörtliche Rede)</w:t>
+                  </w:r>
+                </w:p>
+                <w:p>
+                  <w:pPr>
+                    <w:spacing w:after="0" w:before="0"/>
+                  </w:pPr>
+                  <w:r>
+                    <w:rPr>
+                      <w:rFonts w:ascii="Calibri" w:cs="Calibri" w:eastAsia="Calibri" w:hAnsi="Calibri"/>
+                      <w:b/>
+                      <w:bCs/>
+                      <w:color w:val="D9534F"/>
+                      <w:sz w:val="16"/>
+                      <w:szCs w:val="16"/>
+                    </w:rPr>
+                    <w:t xml:space="preserve">habe/bin</w:t>
+                  </w:r>
+                  <w:r>
+                    <w:rPr>
+                      <w:rFonts w:ascii="Calibri" w:cs="Calibri" w:eastAsia="Calibri" w:hAnsi="Calibri"/>
+                      <w:b/>
+                      <w:bCs/>
+                      <w:color w:val="333333"/>
+                      <w:sz w:val="16"/>
+                      <w:szCs w:val="16"/>
+                    </w:rPr>
+                    <w:t xml:space="preserve"> + </w:t>
+                  </w:r>
+                  <w:r>
+                    <w:rPr>
+                      <w:rFonts w:ascii="Calibri" w:cs="Calibri" w:eastAsia="Calibri" w:hAnsi="Calibri"/>
+                      <w:b/>
+                      <w:bCs/>
+                      <w:color w:val="C98A1E"/>
+                      <w:sz w:val="16"/>
+                      <w:szCs w:val="16"/>
+                    </w:rPr>
+                    <w:t xml:space="preserve">Partizip II</w:t>
+                  </w:r>
+                </w:p>
+              </w:tc>
+              <w:tc>
+                <w:tcPr>
+                  <w:tcW w:type="dxa" w:w="8056"/>
+                  <w:tcBorders>
+                    <w:top w:val="single" w:color="B9C6E8" w:sz="6"/>
+                    <w:left w:val="single" w:color="B9C6E8" w:sz="6"/>
+                    <w:bottom w:val="single" w:color="B9C6E8" w:sz="6"/>
+                    <w:right w:val="single" w:color="B9C6E8" w:sz="6"/>
+                  </w:tcBorders>
+                  <w:tcMar>
+                    <w:top w:type="dxa" w:w="70"/>
+                    <w:left w:type="dxa" w:w="100"/>
+                    <w:bottom w:type="dxa" w:w="70"/>
+                    <w:right w:type="dxa" w:w="100"/>
+                  </w:tcMar>
+                  <w:vAlign w:val="top"/>
+                </w:tcPr>
+                <w:p>
+                  <w:pPr>
+                    <w:spacing w:after="40" w:before="0"/>
+                  </w:pPr>
+                  <w:r>
+                    <w:rPr>
+                      <w:rFonts w:ascii="Calibri" w:cs="Calibri" w:eastAsia="Calibri" w:hAnsi="Calibri"/>
+                      <w:color w:val="000000"/>
+                      <w:sz w:val="19"/>
+                      <w:szCs w:val="19"/>
+                    </w:rPr>
+                    <w:t xml:space="preserve">Mein Trainer sagte: „Du </w:t>
+                  </w:r>
+                  <w:r>
+                    <w:rPr>
+                      <w:rFonts w:ascii="Calibri" w:cs="Calibri" w:eastAsia="Calibri" w:hAnsi="Calibri"/>
+                      <w:b/>
+                      <w:bCs/>
+                      <w:color w:val="D9534F"/>
+                      <w:sz w:val="19"/>
+                      <w:szCs w:val="19"/>
+                    </w:rPr>
+                    <w:t xml:space="preserve">hast</w:t>
+                  </w:r>
+                  <w:r>
+                    <w:rPr>
+                      <w:rFonts w:ascii="Calibri" w:cs="Calibri" w:eastAsia="Calibri" w:hAnsi="Calibri"/>
+                      <w:color w:val="000000"/>
+                      <w:sz w:val="19"/>
+                      <w:szCs w:val="19"/>
+                    </w:rPr>
+                    <w:t xml:space="preserve"> stark </w:t>
+                  </w:r>
+                  <w:r>
+                    <w:rPr>
+                      <w:rFonts w:ascii="Calibri" w:cs="Calibri" w:eastAsia="Calibri" w:hAnsi="Calibri"/>
+                      <w:b/>
+                      <w:bCs/>
+                      <w:color w:val="C98A1E"/>
+                      <w:sz w:val="19"/>
+                      <w:szCs w:val="19"/>
+                    </w:rPr>
+                    <w:t xml:space="preserve">gekämpft</w:t>
+                  </w:r>
+                  <w:r>
+                    <w:rPr>
+                      <w:rFonts w:ascii="Calibri" w:cs="Calibri" w:eastAsia="Calibri" w:hAnsi="Calibri"/>
+                      <w:color w:val="000000"/>
+                      <w:sz w:val="19"/>
+                      <w:szCs w:val="19"/>
+                    </w:rPr>
+                    <w:t xml:space="preserve">!“</w:t>
+                  </w:r>
+                  <w:r>
+                    <w:rPr>
+                      <w:rFonts w:ascii="Calibri" w:cs="Calibri" w:eastAsia="Calibri" w:hAnsi="Calibri"/>
+                      <w:color w:val="9AA3B5"/>
+                      <w:sz w:val="19"/>
+                      <w:szCs w:val="19"/>
+                    </w:rPr>
+                    <w:t xml:space="preserve">   ·   </w:t>
+                  </w:r>
+                  <w:r>
+                    <w:rPr>
+                      <w:rFonts w:ascii="Calibri" w:cs="Calibri" w:eastAsia="Calibri" w:hAnsi="Calibri"/>
+                      <w:color w:val="000000"/>
+                      <w:sz w:val="19"/>
+                      <w:szCs w:val="19"/>
+                    </w:rPr>
+                    <w:t xml:space="preserve">Mein Team rief: „Wir </w:t>
+                  </w:r>
+                  <w:r>
+                    <w:rPr>
+                      <w:rFonts w:ascii="Calibri" w:cs="Calibri" w:eastAsia="Calibri" w:hAnsi="Calibri"/>
+                      <w:b/>
+                      <w:bCs/>
+                      <w:color w:val="D9534F"/>
+                      <w:sz w:val="19"/>
+                      <w:szCs w:val="19"/>
+                    </w:rPr>
+                    <w:t xml:space="preserve">haben</w:t>
+                  </w:r>
+                  <w:r>
+                    <w:rPr>
+                      <w:rFonts w:ascii="Calibri" w:cs="Calibri" w:eastAsia="Calibri" w:hAnsi="Calibri"/>
+                      <w:color w:val="000000"/>
+                      <w:sz w:val="19"/>
+                      <w:szCs w:val="19"/>
+                    </w:rPr>
+                    <w:t xml:space="preserve"> </w:t>
+                  </w:r>
+                  <w:r>
+                    <w:rPr>
+                      <w:rFonts w:ascii="Calibri" w:cs="Calibri" w:eastAsia="Calibri" w:hAnsi="Calibri"/>
+                      <w:b/>
+                      <w:bCs/>
+                      <w:color w:val="C98A1E"/>
+                      <w:sz w:val="19"/>
+                      <w:szCs w:val="19"/>
+                    </w:rPr>
+                    <w:t xml:space="preserve">gewonnen</w:t>
+                  </w:r>
+                  <w:r>
+                    <w:rPr>
+                      <w:rFonts w:ascii="Calibri" w:cs="Calibri" w:eastAsia="Calibri" w:hAnsi="Calibri"/>
+                      <w:color w:val="000000"/>
+                      <w:sz w:val="19"/>
+                      <w:szCs w:val="19"/>
+                    </w:rPr>
+                    <w:t xml:space="preserve">!“</w:t>
+                  </w:r>
+                </w:p>
+                <w:p>
+                  <w:pPr>
+                    <w:spacing w:after="40" w:before="0"/>
+                  </w:pPr>
+                  <w:r>
+                    <w:rPr>
+                      <w:rFonts w:ascii="Calibri" w:cs="Calibri" w:eastAsia="Calibri" w:hAnsi="Calibri"/>
+                      <w:color w:val="000000"/>
+                      <w:sz w:val="19"/>
+                      <w:szCs w:val="19"/>
+                    </w:rPr>
+                    <w:t xml:space="preserve">Ich rief meinen Eltern zu: „Ich </w:t>
+                  </w:r>
+                  <w:r>
+                    <w:rPr>
+                      <w:rFonts w:ascii="Calibri" w:cs="Calibri" w:eastAsia="Calibri" w:hAnsi="Calibri"/>
+                      <w:b/>
+                      <w:bCs/>
+                      <w:color w:val="D9534F"/>
+                      <w:sz w:val="19"/>
+                      <w:szCs w:val="19"/>
+                    </w:rPr>
+                    <w:t xml:space="preserve">bin</w:t>
+                  </w:r>
+                  <w:r>
+                    <w:rPr>
+                      <w:rFonts w:ascii="Calibri" w:cs="Calibri" w:eastAsia="Calibri" w:hAnsi="Calibri"/>
+                      <w:color w:val="000000"/>
+                      <w:sz w:val="19"/>
+                      <w:szCs w:val="19"/>
+                    </w:rPr>
+                    <w:t xml:space="preserve"> Zweite(r) </w:t>
+                  </w:r>
+                  <w:r>
+                    <w:rPr>
+                      <w:rFonts w:ascii="Calibri" w:cs="Calibri" w:eastAsia="Calibri" w:hAnsi="Calibri"/>
+                      <w:b/>
+                      <w:bCs/>
+                      <w:color w:val="C98A1E"/>
+                      <w:sz w:val="19"/>
+                      <w:szCs w:val="19"/>
+                    </w:rPr>
+                    <w:t xml:space="preserve">geworden</w:t>
+                  </w:r>
+                  <w:r>
+                    <w:rPr>
+                      <w:rFonts w:ascii="Calibri" w:cs="Calibri" w:eastAsia="Calibri" w:hAnsi="Calibri"/>
+                      <w:color w:val="000000"/>
+                      <w:sz w:val="19"/>
+                      <w:szCs w:val="19"/>
+                    </w:rPr>
+                    <w:t xml:space="preserve">!“</w:t>
+                  </w:r>
+                  <w:r>
+                    <w:rPr>
+                      <w:rFonts w:ascii="Calibri" w:cs="Calibri" w:eastAsia="Calibri" w:hAnsi="Calibri"/>
+                      <w:color w:val="9AA3B5"/>
+                      <w:sz w:val="19"/>
+                      <w:szCs w:val="19"/>
+                    </w:rPr>
+                    <w:t xml:space="preserve">   ·   </w:t>
+                  </w:r>
+                  <w:r>
+                    <w:rPr>
+                      <w:rFonts w:ascii="Calibri" w:cs="Calibri" w:eastAsia="Calibri" w:hAnsi="Calibri"/>
+                      <w:color w:val="000000"/>
+                      <w:sz w:val="19"/>
+                      <w:szCs w:val="19"/>
+                    </w:rPr>
+                    <w:t xml:space="preserve">Der Kampfrichter sagte: „Das </w:t>
+                  </w:r>
+                  <w:r>
+                    <w:rPr>
+                      <w:rFonts w:ascii="Calibri" w:cs="Calibri" w:eastAsia="Calibri" w:hAnsi="Calibri"/>
+                      <w:b/>
+                      <w:bCs/>
+                      <w:color w:val="D9534F"/>
+                      <w:sz w:val="19"/>
+                      <w:szCs w:val="19"/>
+                    </w:rPr>
+                    <w:t xml:space="preserve">hast</w:t>
+                  </w:r>
+                  <w:r>
+                    <w:rPr>
+                      <w:rFonts w:ascii="Calibri" w:cs="Calibri" w:eastAsia="Calibri" w:hAnsi="Calibri"/>
+                      <w:color w:val="000000"/>
+                      <w:sz w:val="19"/>
+                      <w:szCs w:val="19"/>
+                    </w:rPr>
+                    <w:t xml:space="preserve"> du gut </w:t>
+                  </w:r>
+                  <w:r>
+                    <w:rPr>
+                      <w:rFonts w:ascii="Calibri" w:cs="Calibri" w:eastAsia="Calibri" w:hAnsi="Calibri"/>
+                      <w:b/>
+                      <w:bCs/>
+                      <w:color w:val="C98A1E"/>
+                      <w:sz w:val="19"/>
+                      <w:szCs w:val="19"/>
+                    </w:rPr>
+                    <w:t xml:space="preserve">gemacht</w:t>
+                  </w:r>
+                  <w:r>
+                    <w:rPr>
+                      <w:rFonts w:ascii="Calibri" w:cs="Calibri" w:eastAsia="Calibri" w:hAnsi="Calibri"/>
+                      <w:color w:val="000000"/>
+                      <w:sz w:val="19"/>
+                      <w:szCs w:val="19"/>
+                    </w:rPr>
+                    <w:t xml:space="preserve">.“</w:t>
+                  </w:r>
+                </w:p>
+              </w:tc>
+            </w:tr>
+            <w:tr>
+              <w:trPr>
+                <w:cantSplit/>
+              </w:trPr>
+              <w:tc>
+                <w:tcPr>
+                  <w:tcW w:type="dxa" w:w="2350"/>
+                  <w:tcBorders>
+                    <w:top w:val="single" w:color="B9C6E8" w:sz="6"/>
+                    <w:left w:val="single" w:color="B9C6E8" w:sz="6"/>
+                    <w:bottom w:val="single" w:color="B9C6E8" w:sz="6"/>
+                    <w:right w:val="single" w:color="B9C6E8" w:sz="6"/>
+                  </w:tcBorders>
+                  <w:shd w:fill="F4F7FD" w:color="auto" w:val="clear"/>
+                  <w:tcMar>
+                    <w:top w:type="dxa" w:w="70"/>
+                    <w:left w:type="dxa" w:w="100"/>
+                    <w:bottom w:type="dxa" w:w="70"/>
+                    <w:right w:type="dxa" w:w="100"/>
+                  </w:tcMar>
+                  <w:vAlign w:val="top"/>
+                </w:tcPr>
+                <w:p>
+                  <w:pPr>
+                    <w:spacing w:after="10" w:before="0"/>
+                  </w:pPr>
+                  <w:r>
+                    <w:rPr>
+                      <w:rFonts w:ascii="Cambria" w:cs="Cambria" w:eastAsia="Cambria" w:hAnsi="Cambria"/>
+                      <w:b/>
+                      <w:bCs/>
+                      <w:color w:val="1E2761"/>
+                      <w:sz w:val="20"/>
+                      <w:szCs w:val="20"/>
+                    </w:rPr>
+                    <w:t xml:space="preserve">Präsens</w:t>
+                  </w:r>
+                </w:p>
+                <w:p>
+                  <w:pPr>
+                    <w:spacing w:after="10" w:before="0"/>
+                  </w:pPr>
+                  <w:r>
+                    <w:rPr>
+                      <w:rFonts w:ascii="Calibri" w:cs="Calibri" w:eastAsia="Calibri" w:hAnsi="Calibri"/>
+                      <w:color w:val="5B6B8C"/>
+                      <w:sz w:val="16"/>
+                      <w:szCs w:val="16"/>
+                    </w:rPr>
+                    <w:t xml:space="preserve">jetzt</w:t>
+                  </w:r>
+                </w:p>
+                <w:p>
+                  <w:pPr>
+                    <w:spacing w:after="0" w:before="0"/>
+                  </w:pPr>
+                  <w:r>
+                    <w:rPr>
+                      <w:rFonts w:ascii="Calibri" w:cs="Calibri" w:eastAsia="Calibri" w:hAnsi="Calibri"/>
+                      <w:b/>
+                      <w:bCs/>
+                      <w:color w:val="333333"/>
+                      <w:sz w:val="16"/>
+                      <w:szCs w:val="16"/>
+                    </w:rPr>
+                    <w:t xml:space="preserve">finites Verb im Präsens</w:t>
+                  </w:r>
+                </w:p>
+              </w:tc>
+              <w:tc>
+                <w:tcPr>
+                  <w:tcW w:type="dxa" w:w="8056"/>
+                  <w:tcBorders>
+                    <w:top w:val="single" w:color="B9C6E8" w:sz="6"/>
+                    <w:left w:val="single" w:color="B9C6E8" w:sz="6"/>
+                    <w:bottom w:val="single" w:color="B9C6E8" w:sz="6"/>
+                    <w:right w:val="single" w:color="B9C6E8" w:sz="6"/>
+                  </w:tcBorders>
+                  <w:tcMar>
+                    <w:top w:type="dxa" w:w="70"/>
+                    <w:left w:type="dxa" w:w="100"/>
+                    <w:bottom w:type="dxa" w:w="70"/>
+                    <w:right w:type="dxa" w:w="100"/>
+                  </w:tcMar>
+                  <w:vAlign w:val="top"/>
+                </w:tcPr>
+                <w:p>
+                  <w:pPr>
+                    <w:spacing w:after="40" w:before="0"/>
+                  </w:pPr>
+                  <w:r>
+                    <w:rPr>
+                      <w:rFonts w:ascii="Calibri" w:cs="Calibri" w:eastAsia="Calibri" w:hAnsi="Calibri"/>
+                      <w:color w:val="000000"/>
+                      <w:sz w:val="19"/>
+                      <w:szCs w:val="19"/>
+                    </w:rPr>
+                    <w:t xml:space="preserve">Heute </w:t>
+                  </w:r>
+                  <w:r>
+                    <w:rPr>
+                      <w:rFonts w:ascii="Calibri" w:cs="Calibri" w:eastAsia="Calibri" w:hAnsi="Calibri"/>
+                      <w:b/>
+                      <w:bCs/>
+                      <w:color w:val="000000"/>
+                      <w:sz w:val="19"/>
+                      <w:szCs w:val="19"/>
+                      <w:u w:val="single"/>
+                    </w:rPr>
+                    <w:t xml:space="preserve">bin</w:t>
+                  </w:r>
+                  <w:r>
+                    <w:rPr>
+                      <w:rFonts w:ascii="Calibri" w:cs="Calibri" w:eastAsia="Calibri" w:hAnsi="Calibri"/>
+                      <w:color w:val="000000"/>
+                      <w:sz w:val="19"/>
+                      <w:szCs w:val="19"/>
+                    </w:rPr>
+                    <w:t xml:space="preserve"> ich noch müde.</w:t>
+                  </w:r>
+                  <w:r>
+                    <w:rPr>
+                      <w:rFonts w:ascii="Calibri" w:cs="Calibri" w:eastAsia="Calibri" w:hAnsi="Calibri"/>
+                      <w:color w:val="9AA3B5"/>
+                      <w:sz w:val="19"/>
+                      <w:szCs w:val="19"/>
+                    </w:rPr>
+                    <w:t xml:space="preserve">   ·   </w:t>
+                  </w:r>
+                  <w:r>
+                    <w:rPr>
+                      <w:rFonts w:ascii="Calibri" w:cs="Calibri" w:eastAsia="Calibri" w:hAnsi="Calibri"/>
+                      <w:color w:val="000000"/>
+                      <w:sz w:val="19"/>
+                      <w:szCs w:val="19"/>
+                    </w:rPr>
+                    <w:t xml:space="preserve">Heute </w:t>
+                  </w:r>
+                  <w:r>
+                    <w:rPr>
+                      <w:rFonts w:ascii="Calibri" w:cs="Calibri" w:eastAsia="Calibri" w:hAnsi="Calibri"/>
+                      <w:b/>
+                      <w:bCs/>
+                      <w:color w:val="000000"/>
+                      <w:sz w:val="19"/>
+                      <w:szCs w:val="19"/>
+                      <w:u w:val="single"/>
+                    </w:rPr>
+                    <w:t xml:space="preserve">tut</w:t>
+                  </w:r>
+                  <w:r>
+                    <w:rPr>
+                      <w:rFonts w:ascii="Calibri" w:cs="Calibri" w:eastAsia="Calibri" w:hAnsi="Calibri"/>
+                      <w:color w:val="000000"/>
+                      <w:sz w:val="19"/>
+                      <w:szCs w:val="19"/>
+                    </w:rPr>
+                    <w:t xml:space="preserve"> mir … weh.</w:t>
+                  </w:r>
+                  <w:r>
+                    <w:rPr>
+                      <w:rFonts w:ascii="Calibri" w:cs="Calibri" w:eastAsia="Calibri" w:hAnsi="Calibri"/>
+                      <w:color w:val="9AA3B5"/>
+                      <w:sz w:val="19"/>
+                      <w:szCs w:val="19"/>
+                    </w:rPr>
+                    <w:t xml:space="preserve">   ·   </w:t>
+                  </w:r>
+                  <w:r>
+                    <w:rPr>
+                      <w:rFonts w:ascii="Calibri" w:cs="Calibri" w:eastAsia="Calibri" w:hAnsi="Calibri"/>
+                      <w:color w:val="000000"/>
+                      <w:sz w:val="19"/>
+                      <w:szCs w:val="19"/>
+                    </w:rPr>
+                    <w:t xml:space="preserve">Heute </w:t>
+                  </w:r>
+                  <w:r>
+                    <w:rPr>
+                      <w:rFonts w:ascii="Calibri" w:cs="Calibri" w:eastAsia="Calibri" w:hAnsi="Calibri"/>
+                      <w:b/>
+                      <w:bCs/>
+                      <w:color w:val="000000"/>
+                      <w:sz w:val="19"/>
+                      <w:szCs w:val="19"/>
+                      <w:u w:val="single"/>
+                    </w:rPr>
+                    <w:t xml:space="preserve">analysiere</w:t>
+                  </w:r>
+                  <w:r>
+                    <w:rPr>
+                      <w:rFonts w:ascii="Calibri" w:cs="Calibri" w:eastAsia="Calibri" w:hAnsi="Calibri"/>
+                      <w:color w:val="000000"/>
+                      <w:sz w:val="19"/>
+                      <w:szCs w:val="19"/>
+                    </w:rPr>
+                    <w:t xml:space="preserve"> ich mit meinem Trainer das Video.</w:t>
+                  </w:r>
+                </w:p>
+              </w:tc>
+            </w:tr>
+            <w:tr>
+              <w:trPr>
+                <w:cantSplit/>
+              </w:trPr>
+              <w:tc>
+                <w:tcPr>
+                  <w:tcW w:type="dxa" w:w="2350"/>
+                  <w:tcBorders>
+                    <w:top w:val="single" w:color="B9C6E8" w:sz="6"/>
+                    <w:left w:val="single" w:color="B9C6E8" w:sz="6"/>
+                    <w:bottom w:val="single" w:color="B9C6E8" w:sz="6"/>
+                    <w:right w:val="single" w:color="B9C6E8" w:sz="6"/>
+                  </w:tcBorders>
+                  <w:shd w:fill="F4F7FD" w:color="auto" w:val="clear"/>
+                  <w:tcMar>
+                    <w:top w:type="dxa" w:w="70"/>
+                    <w:left w:type="dxa" w:w="100"/>
+                    <w:bottom w:type="dxa" w:w="70"/>
+                    <w:right w:type="dxa" w:w="100"/>
+                  </w:tcMar>
+                  <w:vAlign w:val="top"/>
+                </w:tcPr>
+                <w:p>
+                  <w:pPr>
+                    <w:spacing w:after="10" w:before="0"/>
+                  </w:pPr>
+                  <w:r>
+                    <w:rPr>
+                      <w:rFonts w:ascii="Cambria" w:cs="Cambria" w:eastAsia="Cambria" w:hAnsi="Cambria"/>
+                      <w:b/>
+                      <w:bCs/>
+                      <w:color w:val="1E2761"/>
+                      <w:sz w:val="20"/>
+                      <w:szCs w:val="20"/>
+                    </w:rPr>
+                    <w:t xml:space="preserve">Futur I</w:t>
+                  </w:r>
+                </w:p>
+                <w:p>
+                  <w:pPr>
+                    <w:spacing w:after="10" w:before="0"/>
+                  </w:pPr>
+                  <w:r>
+                    <w:rPr>
+                      <w:rFonts w:ascii="Calibri" w:cs="Calibri" w:eastAsia="Calibri" w:hAnsi="Calibri"/>
+                      <w:color w:val="5B6B8C"/>
+                      <w:sz w:val="16"/>
+                      <w:szCs w:val="16"/>
+                    </w:rPr>
+                    <w:t xml:space="preserve">Zukunft</w:t>
+                  </w:r>
+                </w:p>
+                <w:p>
+                  <w:pPr>
+                    <w:spacing w:after="0" w:before="0"/>
+                  </w:pPr>
+                  <w:r>
+                    <w:rPr>
+                      <w:rFonts w:ascii="Calibri" w:cs="Calibri" w:eastAsia="Calibri" w:hAnsi="Calibri"/>
+                      <w:b/>
+                      <w:bCs/>
+                      <w:color w:val="D9534F"/>
+                      <w:sz w:val="16"/>
+                      <w:szCs w:val="16"/>
+                    </w:rPr>
+                    <w:t xml:space="preserve">werde</w:t>
+                  </w:r>
+                  <w:r>
+                    <w:rPr>
+                      <w:rFonts w:ascii="Calibri" w:cs="Calibri" w:eastAsia="Calibri" w:hAnsi="Calibri"/>
+                      <w:b/>
+                      <w:bCs/>
+                      <w:color w:val="333333"/>
+                      <w:sz w:val="16"/>
+                      <w:szCs w:val="16"/>
+                    </w:rPr>
+                    <w:t xml:space="preserve"> + </w:t>
+                  </w:r>
+                  <w:r>
+                    <w:rPr>
+                      <w:rFonts w:ascii="Calibri" w:cs="Calibri" w:eastAsia="Calibri" w:hAnsi="Calibri"/>
+                      <w:b/>
+                      <w:bCs/>
+                      <w:color w:val="3F7CC4"/>
+                      <w:sz w:val="16"/>
+                      <w:szCs w:val="16"/>
+                    </w:rPr>
+                    <w:t xml:space="preserve">Infinitiv</w:t>
+                  </w:r>
+                </w:p>
+              </w:tc>
+              <w:tc>
+                <w:tcPr>
+                  <w:tcW w:type="dxa" w:w="8056"/>
+                  <w:tcBorders>
+                    <w:top w:val="single" w:color="B9C6E8" w:sz="6"/>
+                    <w:left w:val="single" w:color="B9C6E8" w:sz="6"/>
+                    <w:bottom w:val="single" w:color="B9C6E8" w:sz="6"/>
+                    <w:right w:val="single" w:color="B9C6E8" w:sz="6"/>
+                  </w:tcBorders>
+                  <w:tcMar>
+                    <w:top w:type="dxa" w:w="70"/>
+                    <w:left w:type="dxa" w:w="100"/>
+                    <w:bottom w:type="dxa" w:w="70"/>
+                    <w:right w:type="dxa" w:w="100"/>
+                  </w:tcMar>
+                  <w:vAlign w:val="top"/>
+                </w:tcPr>
+                <w:p>
+                  <w:pPr>
+                    <w:spacing w:after="40" w:before="0"/>
+                  </w:pPr>
+                  <w:r>
+                    <w:rPr>
+                      <w:rFonts w:ascii="Calibri" w:cs="Calibri" w:eastAsia="Calibri" w:hAnsi="Calibri"/>
+                      <w:color w:val="000000"/>
+                      <w:sz w:val="19"/>
+                      <w:szCs w:val="19"/>
+                    </w:rPr>
+                    <w:t xml:space="preserve">Beim nächsten Wettkampf </w:t>
+                  </w:r>
+                  <w:r>
+                    <w:rPr>
+                      <w:rFonts w:ascii="Calibri" w:cs="Calibri" w:eastAsia="Calibri" w:hAnsi="Calibri"/>
+                      <w:b/>
+                      <w:bCs/>
+                      <w:color w:val="D9534F"/>
+                      <w:sz w:val="19"/>
+                      <w:szCs w:val="19"/>
+                    </w:rPr>
+                    <w:t xml:space="preserve">werde</w:t>
+                  </w:r>
+                  <w:r>
+                    <w:rPr>
+                      <w:rFonts w:ascii="Calibri" w:cs="Calibri" w:eastAsia="Calibri" w:hAnsi="Calibri"/>
+                      <w:color w:val="000000"/>
+                      <w:sz w:val="19"/>
+                      <w:szCs w:val="19"/>
+                    </w:rPr>
+                    <w:t xml:space="preserve"> ich früher </w:t>
+                  </w:r>
+                  <w:r>
+                    <w:rPr>
+                      <w:rFonts w:ascii="Calibri" w:cs="Calibri" w:eastAsia="Calibri" w:hAnsi="Calibri"/>
+                      <w:b/>
+                      <w:bCs/>
+                      <w:color w:val="3F7CC4"/>
+                      <w:sz w:val="19"/>
+                      <w:szCs w:val="19"/>
+                    </w:rPr>
+                    <w:t xml:space="preserve">angreifen</w:t>
+                  </w:r>
+                  <w:r>
+                    <w:rPr>
+                      <w:rFonts w:ascii="Calibri" w:cs="Calibri" w:eastAsia="Calibri" w:hAnsi="Calibri"/>
+                      <w:color w:val="000000"/>
+                      <w:sz w:val="19"/>
+                      <w:szCs w:val="19"/>
+                    </w:rPr>
+                    <w:t xml:space="preserve"> / besser </w:t>
+                  </w:r>
+                  <w:r>
+                    <w:rPr>
+                      <w:rFonts w:ascii="Calibri" w:cs="Calibri" w:eastAsia="Calibri" w:hAnsi="Calibri"/>
+                      <w:b/>
+                      <w:bCs/>
+                      <w:color w:val="3F7CC4"/>
+                      <w:sz w:val="19"/>
+                      <w:szCs w:val="19"/>
+                    </w:rPr>
+                    <w:t xml:space="preserve">verteidigen</w:t>
+                  </w:r>
+                  <w:r>
+                    <w:rPr>
+                      <w:rFonts w:ascii="Calibri" w:cs="Calibri" w:eastAsia="Calibri" w:hAnsi="Calibri"/>
+                      <w:color w:val="000000"/>
+                      <w:sz w:val="19"/>
+                      <w:szCs w:val="19"/>
+                    </w:rPr>
+                    <w:t xml:space="preserve">.</w:t>
+                  </w:r>
+                  <w:r>
+                    <w:rPr>
+                      <w:rFonts w:ascii="Calibri" w:cs="Calibri" w:eastAsia="Calibri" w:hAnsi="Calibri"/>
+                      <w:color w:val="9AA3B5"/>
+                      <w:sz w:val="19"/>
+                      <w:szCs w:val="19"/>
+                    </w:rPr>
+                    <w:t xml:space="preserve">   ·   </w:t>
+                  </w:r>
+                  <w:r>
+                    <w:rPr>
+                      <w:rFonts w:ascii="Calibri" w:cs="Calibri" w:eastAsia="Calibri" w:hAnsi="Calibri"/>
+                      <w:color w:val="000000"/>
+                      <w:sz w:val="19"/>
+                      <w:szCs w:val="19"/>
+                    </w:rPr>
+                    <w:t xml:space="preserve">Ich </w:t>
+                  </w:r>
+                  <w:r>
+                    <w:rPr>
+                      <w:rFonts w:ascii="Calibri" w:cs="Calibri" w:eastAsia="Calibri" w:hAnsi="Calibri"/>
+                      <w:b/>
+                      <w:bCs/>
+                      <w:color w:val="D9534F"/>
+                      <w:sz w:val="19"/>
+                      <w:szCs w:val="19"/>
+                    </w:rPr>
+                    <w:t xml:space="preserve">werde</w:t>
+                  </w:r>
+                  <w:r>
+                    <w:rPr>
+                      <w:rFonts w:ascii="Calibri" w:cs="Calibri" w:eastAsia="Calibri" w:hAnsi="Calibri"/>
+                      <w:color w:val="000000"/>
+                      <w:sz w:val="19"/>
+                      <w:szCs w:val="19"/>
+                    </w:rPr>
+                    <w:t xml:space="preserve"> noch mehr </w:t>
+                  </w:r>
+                  <w:r>
+                    <w:rPr>
+                      <w:rFonts w:ascii="Calibri" w:cs="Calibri" w:eastAsia="Calibri" w:hAnsi="Calibri"/>
+                      <w:b/>
+                      <w:bCs/>
+                      <w:color w:val="3F7CC4"/>
+                      <w:sz w:val="19"/>
+                      <w:szCs w:val="19"/>
+                    </w:rPr>
+                    <w:t xml:space="preserve">trainieren</w:t>
+                  </w:r>
+                  <w:r>
+                    <w:rPr>
+                      <w:rFonts w:ascii="Calibri" w:cs="Calibri" w:eastAsia="Calibri" w:hAnsi="Calibri"/>
+                      <w:color w:val="000000"/>
+                      <w:sz w:val="19"/>
+                      <w:szCs w:val="19"/>
+                    </w:rPr>
+                    <w:t xml:space="preserve">.</w:t>
+                  </w:r>
+                </w:p>
+                <w:p>
+                  <w:pPr>
+                    <w:spacing w:after="40" w:before="0"/>
+                  </w:pPr>
+                  <w:r>
+                    <w:rPr>
+                      <w:rFonts w:ascii="Calibri" w:cs="Calibri" w:eastAsia="Calibri" w:hAnsi="Calibri"/>
+                      <w:color w:val="000000"/>
+                      <w:sz w:val="19"/>
+                      <w:szCs w:val="19"/>
+                    </w:rPr>
+                    <w:t xml:space="preserve">Nächstes Mal </w:t>
+                  </w:r>
+                  <w:r>
+                    <w:rPr>
+                      <w:rFonts w:ascii="Calibri" w:cs="Calibri" w:eastAsia="Calibri" w:hAnsi="Calibri"/>
+                      <w:b/>
+                      <w:bCs/>
+                      <w:color w:val="D9534F"/>
+                      <w:sz w:val="19"/>
+                      <w:szCs w:val="19"/>
+                    </w:rPr>
+                    <w:t xml:space="preserve">werde</w:t>
+                  </w:r>
+                  <w:r>
+                    <w:rPr>
+                      <w:rFonts w:ascii="Calibri" w:cs="Calibri" w:eastAsia="Calibri" w:hAnsi="Calibri"/>
+                      <w:color w:val="000000"/>
+                      <w:sz w:val="19"/>
+                      <w:szCs w:val="19"/>
+                    </w:rPr>
+                    <w:t xml:space="preserve"> ich … </w:t>
+                  </w:r>
+                  <w:r>
+                    <w:rPr>
+                      <w:rFonts w:ascii="Calibri" w:cs="Calibri" w:eastAsia="Calibri" w:hAnsi="Calibri"/>
+                      <w:b/>
+                      <w:bCs/>
+                      <w:color w:val="3F7CC4"/>
+                      <w:sz w:val="19"/>
+                      <w:szCs w:val="19"/>
+                    </w:rPr>
+                    <w:t xml:space="preserve">schaffen</w:t>
+                  </w:r>
+                  <w:r>
+                    <w:rPr>
+                      <w:rFonts w:ascii="Calibri" w:cs="Calibri" w:eastAsia="Calibri" w:hAnsi="Calibri"/>
+                      <w:color w:val="000000"/>
+                      <w:sz w:val="19"/>
+                      <w:szCs w:val="19"/>
+                    </w:rPr>
+                    <w:t xml:space="preserve">.</w:t>
+                  </w:r>
+                  <w:r>
+                    <w:rPr>
+                      <w:rFonts w:ascii="Calibri" w:cs="Calibri" w:eastAsia="Calibri" w:hAnsi="Calibri"/>
+                      <w:color w:val="9AA3B5"/>
+                      <w:sz w:val="19"/>
+                      <w:szCs w:val="19"/>
+                    </w:rPr>
+                    <w:t xml:space="preserve">   ·   </w:t>
+                  </w:r>
+                  <w:r>
+                    <w:rPr>
+                      <w:rFonts w:ascii="Calibri" w:cs="Calibri" w:eastAsia="Calibri" w:hAnsi="Calibri"/>
+                      <w:color w:val="000000"/>
+                      <w:sz w:val="19"/>
+                      <w:szCs w:val="19"/>
+                    </w:rPr>
+                    <w:t xml:space="preserve">Wir </w:t>
+                  </w:r>
+                  <w:r>
+                    <w:rPr>
+                      <w:rFonts w:ascii="Calibri" w:cs="Calibri" w:eastAsia="Calibri" w:hAnsi="Calibri"/>
+                      <w:b/>
+                      <w:bCs/>
+                      <w:color w:val="D9534F"/>
+                      <w:sz w:val="19"/>
+                      <w:szCs w:val="19"/>
+                    </w:rPr>
+                    <w:t xml:space="preserve">werden</w:t>
+                  </w:r>
+                  <w:r>
+                    <w:rPr>
+                      <w:rFonts w:ascii="Calibri" w:cs="Calibri" w:eastAsia="Calibri" w:hAnsi="Calibri"/>
+                      <w:color w:val="000000"/>
+                      <w:sz w:val="19"/>
+                      <w:szCs w:val="19"/>
+                    </w:rPr>
+                    <w:t xml:space="preserve"> die Abwehr </w:t>
+                  </w:r>
+                  <w:r>
+                    <w:rPr>
+                      <w:rFonts w:ascii="Calibri" w:cs="Calibri" w:eastAsia="Calibri" w:hAnsi="Calibri"/>
+                      <w:b/>
+                      <w:bCs/>
+                      <w:color w:val="3F7CC4"/>
+                      <w:sz w:val="19"/>
+                      <w:szCs w:val="19"/>
+                    </w:rPr>
+                    <w:t xml:space="preserve">verbessern</w:t>
+                  </w:r>
+                  <w:r>
+                    <w:rPr>
+                      <w:rFonts w:ascii="Calibri" w:cs="Calibri" w:eastAsia="Calibri" w:hAnsi="Calibri"/>
+                      <w:color w:val="000000"/>
+                      <w:sz w:val="19"/>
+                      <w:szCs w:val="19"/>
+                    </w:rPr>
+                    <w:t xml:space="preserve">.</w:t>
+                  </w:r>
+                </w:p>
+              </w:tc>
+            </w:tr>
+          </w:tbl>
           <w:p>
             <w:pPr>
-              <w:spacing w:after="30" w:before="0"/>
+              <w:spacing w:after="100" w:before="80"/>
             </w:pPr>
             <w:r>
               <w:rPr>
@@ -2408,7 +4119,7 @@
                 <w:sz w:val="18"/>
                 <w:szCs w:val="18"/>
               </w:rPr>
-              <w:t xml:space="preserve">vorher  </w:t>
+              <w:t xml:space="preserve">Verben  </w:t>
             </w:r>
             <w:r>
               <w:rPr>
@@ -2417,12 +4128,12 @@
                 <w:sz w:val="18"/>
                 <w:szCs w:val="18"/>
               </w:rPr>
-              <w:t xml:space="preserve">Vor dem Wettkampf hatte ich …  ·  Am Freitag war(en) wir …</w:t>
+              <w:t xml:space="preserve">Judo: kämpfen – kämpfte, werfen – warf, halten – hielt  ·  Handball: werfen – warf, treffen – traf, spielen – spielte  ·  Gewichtheben: heben – hob, reißen – riss, stoßen – stieß</w:t>
             </w:r>
           </w:p>
           <w:p>
             <w:pPr>
-              <w:spacing w:after="30" w:before="0"/>
+              <w:spacing w:after="0" w:before="0"/>
             </w:pPr>
             <w:r>
               <w:rPr>
@@ -2430,69 +4141,10 @@
                 <w:b/>
                 <w:bCs/>
                 <w:color w:val="1E2761"/>
-                <w:sz w:val="18"/>
-                <w:szCs w:val="18"/>
-              </w:rPr>
-              <w:t xml:space="preserve">Vergangenheit  </w:t>
-            </w:r>
-            <w:r>
-              <w:rPr>
-                <w:rFonts w:ascii="Calibri" w:cs="Calibri" w:eastAsia="Calibri" w:hAnsi="Calibri"/>
-                <w:color w:val="000000"/>
-                <w:sz w:val="18"/>
-                <w:szCs w:val="18"/>
-              </w:rPr>
-              <w:t xml:space="preserve">Am Samstag …  ·  Im ersten Kampf / In der zweiten Halbzeit / Im ersten Versuch …  ·  Mein Trainer sagte: „Du hast …!“</w:t>
-            </w:r>
-          </w:p>
-          <w:p>
-            <w:pPr>
-              <w:spacing w:after="30" w:before="0"/>
-            </w:pPr>
-            <w:r>
-              <w:rPr>
-                <w:rFonts w:ascii="Calibri" w:cs="Calibri" w:eastAsia="Calibri" w:hAnsi="Calibri"/>
-                <w:b/>
-                <w:bCs/>
-                <w:color w:val="1E2761"/>
-                <w:sz w:val="18"/>
-                <w:szCs w:val="18"/>
-              </w:rPr>
-              <w:t xml:space="preserve">jetzt · Zukunft  </w:t>
-            </w:r>
-            <w:r>
-              <w:rPr>
-                <w:rFonts w:ascii="Calibri" w:cs="Calibri" w:eastAsia="Calibri" w:hAnsi="Calibri"/>
-                <w:color w:val="000000"/>
-                <w:sz w:val="18"/>
-                <w:szCs w:val="18"/>
-              </w:rPr>
-              <w:t xml:space="preserve">Heute …  ·  Beim nächsten Wettkampf werde ich …</w:t>
-            </w:r>
-          </w:p>
-          <w:p>
-            <w:pPr>
-              <w:spacing w:after="30" w:before="0"/>
-            </w:pPr>
-            <w:r>
-              <w:rPr>
-                <w:rFonts w:ascii="Calibri" w:cs="Calibri" w:eastAsia="Calibri" w:hAnsi="Calibri"/>
-                <w:b/>
-                <w:bCs/>
-                <w:color w:val="1E2761"/>
-                <w:sz w:val="18"/>
-                <w:szCs w:val="18"/>
-              </w:rPr>
-              <w:t xml:space="preserve">Verben  </w:t>
-            </w:r>
-            <w:r>
-              <w:rPr>
-                <w:rFonts w:ascii="Calibri" w:cs="Calibri" w:eastAsia="Calibri" w:hAnsi="Calibri"/>
-                <w:color w:val="000000"/>
-                <w:sz w:val="18"/>
-                <w:szCs w:val="18"/>
-              </w:rPr>
-              <w:t xml:space="preserve">Judo: kämpfen – kämpfte, werfen – warf, halten – hielt  ·  Handball: werfen – warf, treffen – traf, spielen – spielte  ·  Gewichtheben: heben – hob, reißen – riss, stoßen – stieß</w:t>
+                <w:sz w:val="22"/>
+                <w:szCs w:val="22"/>
+              </w:rPr>
+              <w:t xml:space="preserve">Dein Text</w:t>
             </w:r>
           </w:p>
           <w:tbl>
@@ -2513,7 +4165,7 @@
             <w:tr>
               <w:trPr>
                 <w:cantSplit/>
-                <w:trHeight w:val="540" w:hRule="exact"/>
+                <w:trHeight w:val="620" w:hRule="exact"/>
               </w:trPr>
               <w:tc>
                 <w:tcPr>
@@ -2551,7 +4203,7 @@
             <w:tr>
               <w:trPr>
                 <w:cantSplit/>
-                <w:trHeight w:val="540" w:hRule="exact"/>
+                <w:trHeight w:val="620" w:hRule="exact"/>
               </w:trPr>
               <w:tc>
                 <w:tcPr>
@@ -2589,7 +4241,7 @@
             <w:tr>
               <w:trPr>
                 <w:cantSplit/>
-                <w:trHeight w:val="540" w:hRule="exact"/>
+                <w:trHeight w:val="620" w:hRule="exact"/>
               </w:trPr>
               <w:tc>
                 <w:tcPr>
@@ -2627,7 +4279,7 @@
             <w:tr>
               <w:trPr>
                 <w:cantSplit/>
-                <w:trHeight w:val="540" w:hRule="exact"/>
+                <w:trHeight w:val="620" w:hRule="exact"/>
               </w:trPr>
               <w:tc>
                 <w:tcPr>
@@ -2665,7 +4317,7 @@
             <w:tr>
               <w:trPr>
                 <w:cantSplit/>
-                <w:trHeight w:val="540" w:hRule="exact"/>
+                <w:trHeight w:val="620" w:hRule="exact"/>
               </w:trPr>
               <w:tc>
                 <w:tcPr>
@@ -2703,7 +4355,7 @@
             <w:tr>
               <w:trPr>
                 <w:cantSplit/>
-                <w:trHeight w:val="540" w:hRule="exact"/>
+                <w:trHeight w:val="620" w:hRule="exact"/>
               </w:trPr>
               <w:tc>
                 <w:tcPr>
@@ -2741,7 +4393,121 @@
             <w:tr>
               <w:trPr>
                 <w:cantSplit/>
-                <w:trHeight w:val="540" w:hRule="exact"/>
+                <w:trHeight w:val="620" w:hRule="exact"/>
+              </w:trPr>
+              <w:tc>
+                <w:tcPr>
+                  <w:tcW w:type="dxa" w:w="10406"/>
+                  <w:tcBorders>
+                    <w:top w:val="none" w:color="FFFFFF" w:sz="0"/>
+                    <w:left w:val="none" w:color="FFFFFF" w:sz="0"/>
+                    <w:bottom w:val="single" w:color="9AA3B5" w:sz="6"/>
+                    <w:right w:val="none" w:color="FFFFFF" w:sz="0"/>
+                  </w:tcBorders>
+                  <w:tcMar>
+                    <w:top w:type="dxa" w:w="60"/>
+                    <w:left w:type="dxa" w:w="100"/>
+                    <w:bottom w:type="dxa" w:w="60"/>
+                    <w:right w:type="dxa" w:w="100"/>
+                  </w:tcMar>
+                  <w:vAlign w:val="center"/>
+                </w:tcPr>
+                <w:p>
+                  <w:pPr>
+                    <w:spacing w:after="0" w:before="0"/>
+                  </w:pPr>
+                  <w:r>
+                    <w:rPr>
+                      <w:rFonts w:ascii="Calibri" w:cs="Calibri" w:eastAsia="Calibri" w:hAnsi="Calibri"/>
+                      <w:color w:val="000000"/>
+                      <w:sz w:val="22"/>
+                      <w:szCs w:val="22"/>
+                    </w:rPr>
+                    <w:t xml:space="preserve"/>
+                  </w:r>
+                </w:p>
+              </w:tc>
+            </w:tr>
+            <w:tr>
+              <w:trPr>
+                <w:cantSplit/>
+                <w:trHeight w:val="620" w:hRule="exact"/>
+              </w:trPr>
+              <w:tc>
+                <w:tcPr>
+                  <w:tcW w:type="dxa" w:w="10406"/>
+                  <w:tcBorders>
+                    <w:top w:val="none" w:color="FFFFFF" w:sz="0"/>
+                    <w:left w:val="none" w:color="FFFFFF" w:sz="0"/>
+                    <w:bottom w:val="single" w:color="9AA3B5" w:sz="6"/>
+                    <w:right w:val="none" w:color="FFFFFF" w:sz="0"/>
+                  </w:tcBorders>
+                  <w:tcMar>
+                    <w:top w:type="dxa" w:w="60"/>
+                    <w:left w:type="dxa" w:w="100"/>
+                    <w:bottom w:type="dxa" w:w="60"/>
+                    <w:right w:type="dxa" w:w="100"/>
+                  </w:tcMar>
+                  <w:vAlign w:val="center"/>
+                </w:tcPr>
+                <w:p>
+                  <w:pPr>
+                    <w:spacing w:after="0" w:before="0"/>
+                  </w:pPr>
+                  <w:r>
+                    <w:rPr>
+                      <w:rFonts w:ascii="Calibri" w:cs="Calibri" w:eastAsia="Calibri" w:hAnsi="Calibri"/>
+                      <w:color w:val="000000"/>
+                      <w:sz w:val="22"/>
+                      <w:szCs w:val="22"/>
+                    </w:rPr>
+                    <w:t xml:space="preserve"/>
+                  </w:r>
+                </w:p>
+              </w:tc>
+            </w:tr>
+            <w:tr>
+              <w:trPr>
+                <w:cantSplit/>
+                <w:trHeight w:val="620" w:hRule="exact"/>
+              </w:trPr>
+              <w:tc>
+                <w:tcPr>
+                  <w:tcW w:type="dxa" w:w="10406"/>
+                  <w:tcBorders>
+                    <w:top w:val="none" w:color="FFFFFF" w:sz="0"/>
+                    <w:left w:val="none" w:color="FFFFFF" w:sz="0"/>
+                    <w:bottom w:val="single" w:color="9AA3B5" w:sz="6"/>
+                    <w:right w:val="none" w:color="FFFFFF" w:sz="0"/>
+                  </w:tcBorders>
+                  <w:tcMar>
+                    <w:top w:type="dxa" w:w="60"/>
+                    <w:left w:type="dxa" w:w="100"/>
+                    <w:bottom w:type="dxa" w:w="60"/>
+                    <w:right w:type="dxa" w:w="100"/>
+                  </w:tcMar>
+                  <w:vAlign w:val="center"/>
+                </w:tcPr>
+                <w:p>
+                  <w:pPr>
+                    <w:spacing w:after="0" w:before="0"/>
+                  </w:pPr>
+                  <w:r>
+                    <w:rPr>
+                      <w:rFonts w:ascii="Calibri" w:cs="Calibri" w:eastAsia="Calibri" w:hAnsi="Calibri"/>
+                      <w:color w:val="000000"/>
+                      <w:sz w:val="22"/>
+                      <w:szCs w:val="22"/>
+                    </w:rPr>
+                    <w:t xml:space="preserve"/>
+                  </w:r>
+                </w:p>
+              </w:tc>
+            </w:tr>
+            <w:tr>
+              <w:trPr>
+                <w:cantSplit/>
+                <w:trHeight w:val="620" w:hRule="exact"/>
               </w:trPr>
               <w:tc>
                 <w:tcPr>
@@ -2788,547 +4554,7 @@
                 <w:sz w:val="18"/>
                 <w:szCs w:val="18"/>
               </w:rPr>
-              <w:t xml:space="preserve">☐ alle fünf Zeitformen drin   ☐ Hilfsverb rot, Partizip II gelb, Infinitiv blau markiert</w:t>
-            </w:r>
-            <w:r>
-              <w:rPr>
-                <w:rFonts w:ascii="Calibri" w:cs="Calibri" w:eastAsia="Calibri" w:hAnsi="Calibri"/>
-                <w:i/>
-                <w:iCs/>
-                <w:color w:val="5B6B8C"/>
-                <w:sz w:val="18"/>
-                <w:szCs w:val="18"/>
-              </w:rPr>
-              <w:t xml:space="preserve">     Fertig? Stift hinlegen.</w:t>
-            </w:r>
-          </w:p>
-        </w:tc>
-      </w:tr>
-    </w:tbl>
-    <w:p>
-      <w:pPr>
-        <w:spacing w:after="60" w:before="60"/>
-        <w:jc w:val="center"/>
-      </w:pPr>
-      <w:r>
-        <w:rPr>
-          <w:rFonts w:ascii="Calibri" w:cs="Calibri" w:eastAsia="Calibri" w:hAnsi="Calibri"/>
-          <w:color w:val="9AA3B5"/>
-          <w:sz w:val="16"/>
-          <w:szCs w:val="16"/>
-        </w:rPr>
-        <w:t xml:space="preserve">✂ - - - - - - - - - - - - - - - - - - - - - - - - - - - - - - - - - - - - - - - - - - - - - - - - - - - - - - - - - - - - - -</w:t>
-      </w:r>
-    </w:p>
-    <w:tbl>
-      <w:tblPr>
-        <w:tblW w:type="dxa" w:w="10706"/>
-        <w:tblBorders>
-          <w:top w:val="single" w:color="auto" w:sz="4"/>
-          <w:left w:val="single" w:color="auto" w:sz="4"/>
-          <w:bottom w:val="single" w:color="auto" w:sz="4"/>
-          <w:right w:val="single" w:color="auto" w:sz="4"/>
-          <w:insideH w:val="single" w:color="auto" w:sz="4"/>
-          <w:insideV w:val="single" w:color="auto" w:sz="4"/>
-        </w:tblBorders>
-      </w:tblPr>
-      <w:tblGrid>
-        <w:gridCol w:w="10706"/>
-      </w:tblGrid>
-      <w:tr>
-        <w:trPr>
-          <w:cantSplit/>
-        </w:trPr>
-        <w:tc>
-          <w:tcPr>
-            <w:tcW w:type="dxa" w:w="10706"/>
-            <w:tcBorders>
-              <w:top w:val="dashed" w:color="7A869E" w:sz="8"/>
-              <w:left w:val="dashed" w:color="7A869E" w:sz="8"/>
-              <w:bottom w:val="dashed" w:color="7A869E" w:sz="8"/>
-              <w:right w:val="dashed" w:color="7A869E" w:sz="8"/>
-            </w:tcBorders>
-            <w:tcMar>
-              <w:top w:type="dxa" w:w="130"/>
-              <w:left w:type="dxa" w:w="150"/>
-              <w:bottom w:type="dxa" w:w="130"/>
-              <w:right w:type="dxa" w:w="100"/>
-            </w:tcMar>
-            <w:vAlign w:val="top"/>
-          </w:tcPr>
-          <w:p>
-            <w:pPr>
-              <w:spacing w:after="60" w:before="0"/>
-            </w:pPr>
-            <w:r>
-              <w:rPr>
-                <w:rFonts w:ascii="Cambria" w:cs="Cambria" w:eastAsia="Cambria" w:hAnsi="Cambria"/>
-                <w:b/>
-                <w:bCs/>
-                <w:color w:val="1E2761"/>
-                <w:sz w:val="26"/>
-                <w:szCs w:val="26"/>
-              </w:rPr>
-              <w:t xml:space="preserve">Exit-Ticket: Mein Wochenende in fünf Zeitformen</w:t>
-            </w:r>
-            <w:r>
-              <w:rPr>
-                <w:rFonts w:ascii="Calibri" w:cs="Calibri" w:eastAsia="Calibri" w:hAnsi="Calibri"/>
-                <w:color w:val="5B6B8C"/>
-                <w:sz w:val="18"/>
-                <w:szCs w:val="18"/>
-              </w:rPr>
-              <w:t xml:space="preserve">     Name: ______________</w:t>
-            </w:r>
-          </w:p>
-          <w:p>
-            <w:pPr>
-              <w:spacing w:after="70" w:before="0"/>
-            </w:pPr>
-            <w:r>
-              <w:rPr>
-                <w:rFonts w:ascii="Calibri" w:cs="Calibri" w:eastAsia="Calibri" w:hAnsi="Calibri"/>
-                <w:color w:val="000000"/>
-                <w:sz w:val="21"/>
-                <w:szCs w:val="21"/>
-              </w:rPr>
-              <w:t xml:space="preserve">Schreibe </w:t>
-            </w:r>
-            <w:r>
-              <w:rPr>
-                <w:rFonts w:ascii="Calibri" w:cs="Calibri" w:eastAsia="Calibri" w:hAnsi="Calibri"/>
-                <w:b/>
-                <w:bCs/>
-                <w:color w:val="000000"/>
-                <w:sz w:val="21"/>
-                <w:szCs w:val="21"/>
-              </w:rPr>
-              <w:t xml:space="preserve">5–7 Sätze</w:t>
-            </w:r>
-            <w:r>
-              <w:rPr>
-                <w:rFonts w:ascii="Calibri" w:cs="Calibri" w:eastAsia="Calibri" w:hAnsi="Calibri"/>
-                <w:color w:val="000000"/>
-                <w:sz w:val="21"/>
-                <w:szCs w:val="21"/>
-              </w:rPr>
-              <w:t xml:space="preserve"> über deinen Wettkampf am Wochenende – nach dem Muster an der Tafel. Jede Zeitform kommt </w:t>
-            </w:r>
-            <w:r>
-              <w:rPr>
-                <w:rFonts w:ascii="Calibri" w:cs="Calibri" w:eastAsia="Calibri" w:hAnsi="Calibri"/>
-                <w:b/>
-                <w:bCs/>
-                <w:color w:val="000000"/>
-                <w:sz w:val="21"/>
-                <w:szCs w:val="21"/>
-              </w:rPr>
-              <w:t xml:space="preserve">mindestens einmal</w:t>
-            </w:r>
-            <w:r>
-              <w:rPr>
-                <w:rFonts w:ascii="Calibri" w:cs="Calibri" w:eastAsia="Calibri" w:hAnsi="Calibri"/>
-                <w:color w:val="000000"/>
-                <w:sz w:val="21"/>
-                <w:szCs w:val="21"/>
-              </w:rPr>
-              <w:t xml:space="preserve"> vor.</w:t>
-            </w:r>
-          </w:p>
-          <w:p>
-            <w:pPr>
-              <w:spacing w:after="30" w:before="0"/>
-            </w:pPr>
-            <w:r>
-              <w:rPr>
-                <w:rFonts w:ascii="Calibri" w:cs="Calibri" w:eastAsia="Calibri" w:hAnsi="Calibri"/>
-                <w:b/>
-                <w:bCs/>
-                <w:color w:val="1E2761"/>
-                <w:sz w:val="18"/>
-                <w:szCs w:val="18"/>
-              </w:rPr>
-              <w:t xml:space="preserve">vorher  </w:t>
-            </w:r>
-            <w:r>
-              <w:rPr>
-                <w:rFonts w:ascii="Calibri" w:cs="Calibri" w:eastAsia="Calibri" w:hAnsi="Calibri"/>
-                <w:color w:val="000000"/>
-                <w:sz w:val="18"/>
-                <w:szCs w:val="18"/>
-              </w:rPr>
-              <w:t xml:space="preserve">Vor dem Wettkampf hatte ich …  ·  Am Freitag war(en) wir …</w:t>
-            </w:r>
-          </w:p>
-          <w:p>
-            <w:pPr>
-              <w:spacing w:after="30" w:before="0"/>
-            </w:pPr>
-            <w:r>
-              <w:rPr>
-                <w:rFonts w:ascii="Calibri" w:cs="Calibri" w:eastAsia="Calibri" w:hAnsi="Calibri"/>
-                <w:b/>
-                <w:bCs/>
-                <w:color w:val="1E2761"/>
-                <w:sz w:val="18"/>
-                <w:szCs w:val="18"/>
-              </w:rPr>
-              <w:t xml:space="preserve">Vergangenheit  </w:t>
-            </w:r>
-            <w:r>
-              <w:rPr>
-                <w:rFonts w:ascii="Calibri" w:cs="Calibri" w:eastAsia="Calibri" w:hAnsi="Calibri"/>
-                <w:color w:val="000000"/>
-                <w:sz w:val="18"/>
-                <w:szCs w:val="18"/>
-              </w:rPr>
-              <w:t xml:space="preserve">Am Samstag …  ·  Im ersten Kampf / In der zweiten Halbzeit / Im ersten Versuch …  ·  Mein Trainer sagte: „Du hast …!“</w:t>
-            </w:r>
-          </w:p>
-          <w:p>
-            <w:pPr>
-              <w:spacing w:after="30" w:before="0"/>
-            </w:pPr>
-            <w:r>
-              <w:rPr>
-                <w:rFonts w:ascii="Calibri" w:cs="Calibri" w:eastAsia="Calibri" w:hAnsi="Calibri"/>
-                <w:b/>
-                <w:bCs/>
-                <w:color w:val="1E2761"/>
-                <w:sz w:val="18"/>
-                <w:szCs w:val="18"/>
-              </w:rPr>
-              <w:t xml:space="preserve">jetzt · Zukunft  </w:t>
-            </w:r>
-            <w:r>
-              <w:rPr>
-                <w:rFonts w:ascii="Calibri" w:cs="Calibri" w:eastAsia="Calibri" w:hAnsi="Calibri"/>
-                <w:color w:val="000000"/>
-                <w:sz w:val="18"/>
-                <w:szCs w:val="18"/>
-              </w:rPr>
-              <w:t xml:space="preserve">Heute …  ·  Beim nächsten Wettkampf werde ich …</w:t>
-            </w:r>
-          </w:p>
-          <w:p>
-            <w:pPr>
-              <w:spacing w:after="30" w:before="0"/>
-            </w:pPr>
-            <w:r>
-              <w:rPr>
-                <w:rFonts w:ascii="Calibri" w:cs="Calibri" w:eastAsia="Calibri" w:hAnsi="Calibri"/>
-                <w:b/>
-                <w:bCs/>
-                <w:color w:val="1E2761"/>
-                <w:sz w:val="18"/>
-                <w:szCs w:val="18"/>
-              </w:rPr>
-              <w:t xml:space="preserve">Verben  </w:t>
-            </w:r>
-            <w:r>
-              <w:rPr>
-                <w:rFonts w:ascii="Calibri" w:cs="Calibri" w:eastAsia="Calibri" w:hAnsi="Calibri"/>
-                <w:color w:val="000000"/>
-                <w:sz w:val="18"/>
-                <w:szCs w:val="18"/>
-              </w:rPr>
-              <w:t xml:space="preserve">Judo: kämpfen – kämpfte, werfen – warf, halten – hielt  ·  Handball: werfen – warf, treffen – traf, spielen – spielte  ·  Gewichtheben: heben – hob, reißen – riss, stoßen – stieß</w:t>
-            </w:r>
-          </w:p>
-          <w:tbl>
-            <w:tblPr>
-              <w:tblW w:type="dxa" w:w="10406"/>
-              <w:tblBorders>
-                <w:top w:val="single" w:color="auto" w:sz="4"/>
-                <w:left w:val="single" w:color="auto" w:sz="4"/>
-                <w:bottom w:val="single" w:color="auto" w:sz="4"/>
-                <w:right w:val="single" w:color="auto" w:sz="4"/>
-                <w:insideH w:val="single" w:color="auto" w:sz="4"/>
-                <w:insideV w:val="single" w:color="auto" w:sz="4"/>
-              </w:tblBorders>
-            </w:tblPr>
-            <w:tblGrid>
-              <w:gridCol w:w="10406"/>
-            </w:tblGrid>
-            <w:tr>
-              <w:trPr>
-                <w:cantSplit/>
-                <w:trHeight w:val="540" w:hRule="exact"/>
-              </w:trPr>
-              <w:tc>
-                <w:tcPr>
-                  <w:tcW w:type="dxa" w:w="10406"/>
-                  <w:tcBorders>
-                    <w:top w:val="none" w:color="FFFFFF" w:sz="0"/>
-                    <w:left w:val="none" w:color="FFFFFF" w:sz="0"/>
-                    <w:bottom w:val="single" w:color="9AA3B5" w:sz="6"/>
-                    <w:right w:val="none" w:color="FFFFFF" w:sz="0"/>
-                  </w:tcBorders>
-                  <w:tcMar>
-                    <w:top w:type="dxa" w:w="60"/>
-                    <w:left w:type="dxa" w:w="100"/>
-                    <w:bottom w:type="dxa" w:w="60"/>
-                    <w:right w:type="dxa" w:w="100"/>
-                  </w:tcMar>
-                  <w:vAlign w:val="center"/>
-                </w:tcPr>
-                <w:p>
-                  <w:pPr>
-                    <w:spacing w:after="0" w:before="0"/>
-                  </w:pPr>
-                  <w:r>
-                    <w:rPr>
-                      <w:rFonts w:ascii="Calibri" w:cs="Calibri" w:eastAsia="Calibri" w:hAnsi="Calibri"/>
-                      <w:color w:val="000000"/>
-                      <w:sz w:val="22"/>
-                      <w:szCs w:val="22"/>
-                    </w:rPr>
-                    <w:t xml:space="preserve"/>
-                  </w:r>
-                </w:p>
-              </w:tc>
-            </w:tr>
-            <w:tr>
-              <w:trPr>
-                <w:cantSplit/>
-                <w:trHeight w:val="540" w:hRule="exact"/>
-              </w:trPr>
-              <w:tc>
-                <w:tcPr>
-                  <w:tcW w:type="dxa" w:w="10406"/>
-                  <w:tcBorders>
-                    <w:top w:val="none" w:color="FFFFFF" w:sz="0"/>
-                    <w:left w:val="none" w:color="FFFFFF" w:sz="0"/>
-                    <w:bottom w:val="single" w:color="9AA3B5" w:sz="6"/>
-                    <w:right w:val="none" w:color="FFFFFF" w:sz="0"/>
-                  </w:tcBorders>
-                  <w:tcMar>
-                    <w:top w:type="dxa" w:w="60"/>
-                    <w:left w:type="dxa" w:w="100"/>
-                    <w:bottom w:type="dxa" w:w="60"/>
-                    <w:right w:type="dxa" w:w="100"/>
-                  </w:tcMar>
-                  <w:vAlign w:val="center"/>
-                </w:tcPr>
-                <w:p>
-                  <w:pPr>
-                    <w:spacing w:after="0" w:before="0"/>
-                  </w:pPr>
-                  <w:r>
-                    <w:rPr>
-                      <w:rFonts w:ascii="Calibri" w:cs="Calibri" w:eastAsia="Calibri" w:hAnsi="Calibri"/>
-                      <w:color w:val="000000"/>
-                      <w:sz w:val="22"/>
-                      <w:szCs w:val="22"/>
-                    </w:rPr>
-                    <w:t xml:space="preserve"/>
-                  </w:r>
-                </w:p>
-              </w:tc>
-            </w:tr>
-            <w:tr>
-              <w:trPr>
-                <w:cantSplit/>
-                <w:trHeight w:val="540" w:hRule="exact"/>
-              </w:trPr>
-              <w:tc>
-                <w:tcPr>
-                  <w:tcW w:type="dxa" w:w="10406"/>
-                  <w:tcBorders>
-                    <w:top w:val="none" w:color="FFFFFF" w:sz="0"/>
-                    <w:left w:val="none" w:color="FFFFFF" w:sz="0"/>
-                    <w:bottom w:val="single" w:color="9AA3B5" w:sz="6"/>
-                    <w:right w:val="none" w:color="FFFFFF" w:sz="0"/>
-                  </w:tcBorders>
-                  <w:tcMar>
-                    <w:top w:type="dxa" w:w="60"/>
-                    <w:left w:type="dxa" w:w="100"/>
-                    <w:bottom w:type="dxa" w:w="60"/>
-                    <w:right w:type="dxa" w:w="100"/>
-                  </w:tcMar>
-                  <w:vAlign w:val="center"/>
-                </w:tcPr>
-                <w:p>
-                  <w:pPr>
-                    <w:spacing w:after="0" w:before="0"/>
-                  </w:pPr>
-                  <w:r>
-                    <w:rPr>
-                      <w:rFonts w:ascii="Calibri" w:cs="Calibri" w:eastAsia="Calibri" w:hAnsi="Calibri"/>
-                      <w:color w:val="000000"/>
-                      <w:sz w:val="22"/>
-                      <w:szCs w:val="22"/>
-                    </w:rPr>
-                    <w:t xml:space="preserve"/>
-                  </w:r>
-                </w:p>
-              </w:tc>
-            </w:tr>
-            <w:tr>
-              <w:trPr>
-                <w:cantSplit/>
-                <w:trHeight w:val="540" w:hRule="exact"/>
-              </w:trPr>
-              <w:tc>
-                <w:tcPr>
-                  <w:tcW w:type="dxa" w:w="10406"/>
-                  <w:tcBorders>
-                    <w:top w:val="none" w:color="FFFFFF" w:sz="0"/>
-                    <w:left w:val="none" w:color="FFFFFF" w:sz="0"/>
-                    <w:bottom w:val="single" w:color="9AA3B5" w:sz="6"/>
-                    <w:right w:val="none" w:color="FFFFFF" w:sz="0"/>
-                  </w:tcBorders>
-                  <w:tcMar>
-                    <w:top w:type="dxa" w:w="60"/>
-                    <w:left w:type="dxa" w:w="100"/>
-                    <w:bottom w:type="dxa" w:w="60"/>
-                    <w:right w:type="dxa" w:w="100"/>
-                  </w:tcMar>
-                  <w:vAlign w:val="center"/>
-                </w:tcPr>
-                <w:p>
-                  <w:pPr>
-                    <w:spacing w:after="0" w:before="0"/>
-                  </w:pPr>
-                  <w:r>
-                    <w:rPr>
-                      <w:rFonts w:ascii="Calibri" w:cs="Calibri" w:eastAsia="Calibri" w:hAnsi="Calibri"/>
-                      <w:color w:val="000000"/>
-                      <w:sz w:val="22"/>
-                      <w:szCs w:val="22"/>
-                    </w:rPr>
-                    <w:t xml:space="preserve"/>
-                  </w:r>
-                </w:p>
-              </w:tc>
-            </w:tr>
-            <w:tr>
-              <w:trPr>
-                <w:cantSplit/>
-                <w:trHeight w:val="540" w:hRule="exact"/>
-              </w:trPr>
-              <w:tc>
-                <w:tcPr>
-                  <w:tcW w:type="dxa" w:w="10406"/>
-                  <w:tcBorders>
-                    <w:top w:val="none" w:color="FFFFFF" w:sz="0"/>
-                    <w:left w:val="none" w:color="FFFFFF" w:sz="0"/>
-                    <w:bottom w:val="single" w:color="9AA3B5" w:sz="6"/>
-                    <w:right w:val="none" w:color="FFFFFF" w:sz="0"/>
-                  </w:tcBorders>
-                  <w:tcMar>
-                    <w:top w:type="dxa" w:w="60"/>
-                    <w:left w:type="dxa" w:w="100"/>
-                    <w:bottom w:type="dxa" w:w="60"/>
-                    <w:right w:type="dxa" w:w="100"/>
-                  </w:tcMar>
-                  <w:vAlign w:val="center"/>
-                </w:tcPr>
-                <w:p>
-                  <w:pPr>
-                    <w:spacing w:after="0" w:before="0"/>
-                  </w:pPr>
-                  <w:r>
-                    <w:rPr>
-                      <w:rFonts w:ascii="Calibri" w:cs="Calibri" w:eastAsia="Calibri" w:hAnsi="Calibri"/>
-                      <w:color w:val="000000"/>
-                      <w:sz w:val="22"/>
-                      <w:szCs w:val="22"/>
-                    </w:rPr>
-                    <w:t xml:space="preserve"/>
-                  </w:r>
-                </w:p>
-              </w:tc>
-            </w:tr>
-            <w:tr>
-              <w:trPr>
-                <w:cantSplit/>
-                <w:trHeight w:val="540" w:hRule="exact"/>
-              </w:trPr>
-              <w:tc>
-                <w:tcPr>
-                  <w:tcW w:type="dxa" w:w="10406"/>
-                  <w:tcBorders>
-                    <w:top w:val="none" w:color="FFFFFF" w:sz="0"/>
-                    <w:left w:val="none" w:color="FFFFFF" w:sz="0"/>
-                    <w:bottom w:val="single" w:color="9AA3B5" w:sz="6"/>
-                    <w:right w:val="none" w:color="FFFFFF" w:sz="0"/>
-                  </w:tcBorders>
-                  <w:tcMar>
-                    <w:top w:type="dxa" w:w="60"/>
-                    <w:left w:type="dxa" w:w="100"/>
-                    <w:bottom w:type="dxa" w:w="60"/>
-                    <w:right w:type="dxa" w:w="100"/>
-                  </w:tcMar>
-                  <w:vAlign w:val="center"/>
-                </w:tcPr>
-                <w:p>
-                  <w:pPr>
-                    <w:spacing w:after="0" w:before="0"/>
-                  </w:pPr>
-                  <w:r>
-                    <w:rPr>
-                      <w:rFonts w:ascii="Calibri" w:cs="Calibri" w:eastAsia="Calibri" w:hAnsi="Calibri"/>
-                      <w:color w:val="000000"/>
-                      <w:sz w:val="22"/>
-                      <w:szCs w:val="22"/>
-                    </w:rPr>
-                    <w:t xml:space="preserve"/>
-                  </w:r>
-                </w:p>
-              </w:tc>
-            </w:tr>
-            <w:tr>
-              <w:trPr>
-                <w:cantSplit/>
-                <w:trHeight w:val="540" w:hRule="exact"/>
-              </w:trPr>
-              <w:tc>
-                <w:tcPr>
-                  <w:tcW w:type="dxa" w:w="10406"/>
-                  <w:tcBorders>
-                    <w:top w:val="none" w:color="FFFFFF" w:sz="0"/>
-                    <w:left w:val="none" w:color="FFFFFF" w:sz="0"/>
-                    <w:bottom w:val="single" w:color="9AA3B5" w:sz="6"/>
-                    <w:right w:val="none" w:color="FFFFFF" w:sz="0"/>
-                  </w:tcBorders>
-                  <w:tcMar>
-                    <w:top w:type="dxa" w:w="60"/>
-                    <w:left w:type="dxa" w:w="100"/>
-                    <w:bottom w:type="dxa" w:w="60"/>
-                    <w:right w:type="dxa" w:w="100"/>
-                  </w:tcMar>
-                  <w:vAlign w:val="center"/>
-                </w:tcPr>
-                <w:p>
-                  <w:pPr>
-                    <w:spacing w:after="0" w:before="0"/>
-                  </w:pPr>
-                  <w:r>
-                    <w:rPr>
-                      <w:rFonts w:ascii="Calibri" w:cs="Calibri" w:eastAsia="Calibri" w:hAnsi="Calibri"/>
-                      <w:color w:val="000000"/>
-                      <w:sz w:val="22"/>
-                      <w:szCs w:val="22"/>
-                    </w:rPr>
-                    <w:t xml:space="preserve"/>
-                  </w:r>
-                </w:p>
-              </w:tc>
-            </w:tr>
-          </w:tbl>
-          <w:p>
-            <w:pPr>
-              <w:spacing w:after="0" w:before="100"/>
-            </w:pPr>
-            <w:r>
-              <w:rPr>
-                <w:rFonts w:ascii="Calibri" w:cs="Calibri" w:eastAsia="Calibri" w:hAnsi="Calibri"/>
-                <w:color w:val="000000"/>
-                <w:sz w:val="18"/>
-                <w:szCs w:val="18"/>
-              </w:rPr>
-              <w:t xml:space="preserve">☐ alle fünf Zeitformen drin   ☐ Hilfsverb rot, Partizip II gelb, Infinitiv blau markiert</w:t>
+              <w:t xml:space="preserve">☐ alle fünf Zeitformen drin   ☐ Hilfsverb rot, Partizip II gelb, Infinitiv blau markiert   ☐ Präteritum-Verben unterstrichen</w:t>
             </w:r>
             <w:r>
               <w:rPr>

</xml_diff>

<commit_message>
Formulierungshilfen als Schnipsel (2 pro A4), Exit-Ticket auf eigenem Papier
Co-Authored-By: Claude Opus 5.5 <noreply@anthropic.com>
Claude-Session: https://claude.ai/code/session_01KXvLXHMYPnCyEbMRgNaaYs
</commit_message>
<xml_diff>
--- a/Deutsch_7A/Zeitformen_Zeitstrahl/Druckvorlage_Zeitformen_Zeitstrahl.docx
+++ b/Deutsch_7A/Zeitformen_Zeitstrahl/Druckvorlage_Zeitformen_Zeitstrahl.docx
@@ -2329,16 +2329,7 @@
                 <w:sz w:val="28"/>
                 <w:szCs w:val="28"/>
               </w:rPr>
-              <w:t xml:space="preserve">Exit-Ticket: Mein Wochenende in fünf Zeitformen</w:t>
-            </w:r>
-            <w:r>
-              <w:rPr>
-                <w:rFonts w:ascii="Calibri" w:cs="Calibri" w:eastAsia="Calibri" w:hAnsi="Calibri"/>
-                <w:color w:val="5B6B8C"/>
-                <w:sz w:val="18"/>
-                <w:szCs w:val="18"/>
-              </w:rPr>
-              <w:t xml:space="preserve">   Name: ______________</w:t>
+              <w:t xml:space="preserve">Exit-Ticket: Formulierungshilfen</w:t>
             </w:r>
           </w:p>
           <w:p>
@@ -2352,7 +2343,7 @@
                 <w:sz w:val="21"/>
                 <w:szCs w:val="21"/>
               </w:rPr>
-              <w:t xml:space="preserve">Schreibe </w:t>
+              <w:t xml:space="preserve">Schreibe auf ein </w:t>
             </w:r>
             <w:r>
               <w:rPr>
@@ -2363,7 +2354,7 @@
                 <w:sz w:val="21"/>
                 <w:szCs w:val="21"/>
               </w:rPr>
-              <w:t xml:space="preserve">5–7 Sätze</w:t>
+              <w:t xml:space="preserve">eigenes Blatt</w:t>
             </w:r>
             <w:r>
               <w:rPr>
@@ -2372,7 +2363,7 @@
                 <w:sz w:val="21"/>
                 <w:szCs w:val="21"/>
               </w:rPr>
-              <w:t xml:space="preserve"> über deinen Wettkampf am Wochenende – nach dem Muster an der Tafel. Jede Zeitform kommt </w:t>
+              <w:t xml:space="preserve"> (Name oben rechts) </w:t>
             </w:r>
             <w:r>
               <w:rPr>
@@ -2383,7 +2374,7 @@
                 <w:sz w:val="21"/>
                 <w:szCs w:val="21"/>
               </w:rPr>
-              <w:t xml:space="preserve">mindestens einmal</w:t>
+              <w:t xml:space="preserve">5–7 Sätze</w:t>
             </w:r>
             <w:r>
               <w:rPr>
@@ -2392,7 +2383,27 @@
                 <w:sz w:val="21"/>
                 <w:szCs w:val="21"/>
               </w:rPr>
-              <w:t xml:space="preserve"> vor. Du kannst die Vorschläge übernehmen und ergänzen.</w:t>
+              <w:t xml:space="preserve"> über deinen Wettkampf am Wochenende – nach dem Muster an der Tafel. Jede Zeitform kommt </w:t>
+            </w:r>
+            <w:r>
+              <w:rPr>
+                <w:rFonts w:ascii="Calibri" w:cs="Calibri" w:eastAsia="Calibri" w:hAnsi="Calibri"/>
+                <w:b/>
+                <w:bCs/>
+                <w:color w:val="000000"/>
+                <w:sz w:val="21"/>
+                <w:szCs w:val="21"/>
+              </w:rPr>
+              <w:t xml:space="preserve">mindestens einmal</w:t>
+            </w:r>
+            <w:r>
+              <w:rPr>
+                <w:rFonts w:ascii="Calibri" w:cs="Calibri" w:eastAsia="Calibri" w:hAnsi="Calibri"/>
+                <w:color w:val="000000"/>
+                <w:sz w:val="21"/>
+                <w:szCs w:val="21"/>
+              </w:rPr>
+              <w:t xml:space="preserve"> vor. Du kannst die Vorschläge übernehmen und ergänzen. Am Ende gibst du das Blatt ab.</w:t>
             </w:r>
           </w:p>
           <w:tbl>
@@ -2521,14 +2532,14 @@
                 </w:tcPr>
                 <w:p>
                   <w:pPr>
-                    <w:spacing w:after="40" w:before="0"/>
-                  </w:pPr>
-                  <w:r>
-                    <w:rPr>
-                      <w:rFonts w:ascii="Calibri" w:cs="Calibri" w:eastAsia="Calibri" w:hAnsi="Calibri"/>
-                      <w:color w:val="000000"/>
-                      <w:sz w:val="19"/>
-                      <w:szCs w:val="19"/>
+                    <w:spacing w:after="20" w:before="0"/>
+                  </w:pPr>
+                  <w:r>
+                    <w:rPr>
+                      <w:rFonts w:ascii="Calibri" w:cs="Calibri" w:eastAsia="Calibri" w:hAnsi="Calibri"/>
+                      <w:color w:val="000000"/>
+                      <w:sz w:val="18"/>
+                      <w:szCs w:val="18"/>
                     </w:rPr>
                     <w:t xml:space="preserve">Vor dem Wettkampf </w:t>
                   </w:r>
@@ -2538,8 +2549,8 @@
                       <w:b/>
                       <w:bCs/>
                       <w:color w:val="D9534F"/>
-                      <w:sz w:val="19"/>
-                      <w:szCs w:val="19"/>
+                      <w:sz w:val="18"/>
+                      <w:szCs w:val="18"/>
                     </w:rPr>
                     <w:t xml:space="preserve">hatte</w:t>
                   </w:r>
@@ -2547,8 +2558,8 @@
                     <w:rPr>
                       <w:rFonts w:ascii="Calibri" w:cs="Calibri" w:eastAsia="Calibri" w:hAnsi="Calibri"/>
                       <w:color w:val="000000"/>
-                      <w:sz w:val="19"/>
-                      <w:szCs w:val="19"/>
+                      <w:sz w:val="18"/>
+                      <w:szCs w:val="18"/>
                     </w:rPr>
                     <w:t xml:space="preserve"> ich wochenlang hart </w:t>
                   </w:r>
@@ -2558,8 +2569,8 @@
                       <w:b/>
                       <w:bCs/>
                       <w:color w:val="C98A1E"/>
-                      <w:sz w:val="19"/>
-                      <w:szCs w:val="19"/>
+                      <w:sz w:val="18"/>
+                      <w:szCs w:val="18"/>
                     </w:rPr>
                     <w:t xml:space="preserve">trainiert</w:t>
                   </w:r>
@@ -2567,8 +2578,8 @@
                     <w:rPr>
                       <w:rFonts w:ascii="Calibri" w:cs="Calibri" w:eastAsia="Calibri" w:hAnsi="Calibri"/>
                       <w:color w:val="000000"/>
-                      <w:sz w:val="19"/>
-                      <w:szCs w:val="19"/>
+                      <w:sz w:val="18"/>
+                      <w:szCs w:val="18"/>
                     </w:rPr>
                     <w:t xml:space="preserve">.</w:t>
                   </w:r>
@@ -2576,8 +2587,8 @@
                     <w:rPr>
                       <w:rFonts w:ascii="Calibri" w:cs="Calibri" w:eastAsia="Calibri" w:hAnsi="Calibri"/>
                       <w:color w:val="9AA3B5"/>
-                      <w:sz w:val="19"/>
-                      <w:szCs w:val="19"/>
+                      <w:sz w:val="18"/>
+                      <w:szCs w:val="18"/>
                     </w:rPr>
                     <w:t xml:space="preserve">   ·   </w:t>
                   </w:r>
@@ -2585,8 +2596,8 @@
                     <w:rPr>
                       <w:rFonts w:ascii="Calibri" w:cs="Calibri" w:eastAsia="Calibri" w:hAnsi="Calibri"/>
                       <w:color w:val="000000"/>
-                      <w:sz w:val="19"/>
-                      <w:szCs w:val="19"/>
+                      <w:sz w:val="18"/>
+                      <w:szCs w:val="18"/>
                     </w:rPr>
                     <w:t xml:space="preserve">Am Abend davor </w:t>
                   </w:r>
@@ -2596,8 +2607,8 @@
                       <w:b/>
                       <w:bCs/>
                       <w:color w:val="D9534F"/>
-                      <w:sz w:val="19"/>
-                      <w:szCs w:val="19"/>
+                      <w:sz w:val="18"/>
+                      <w:szCs w:val="18"/>
                     </w:rPr>
                     <w:t xml:space="preserve">hatte</w:t>
                   </w:r>
@@ -2605,8 +2616,8 @@
                     <w:rPr>
                       <w:rFonts w:ascii="Calibri" w:cs="Calibri" w:eastAsia="Calibri" w:hAnsi="Calibri"/>
                       <w:color w:val="000000"/>
-                      <w:sz w:val="19"/>
-                      <w:szCs w:val="19"/>
+                      <w:sz w:val="18"/>
+                      <w:szCs w:val="18"/>
                     </w:rPr>
                     <w:t xml:space="preserve"> ich kaum </w:t>
                   </w:r>
@@ -2616,8 +2627,8 @@
                       <w:b/>
                       <w:bCs/>
                       <w:color w:val="C98A1E"/>
-                      <w:sz w:val="19"/>
-                      <w:szCs w:val="19"/>
+                      <w:sz w:val="18"/>
+                      <w:szCs w:val="18"/>
                     </w:rPr>
                     <w:t xml:space="preserve">geschlafen</w:t>
                   </w:r>
@@ -2625,22 +2636,22 @@
                     <w:rPr>
                       <w:rFonts w:ascii="Calibri" w:cs="Calibri" w:eastAsia="Calibri" w:hAnsi="Calibri"/>
                       <w:color w:val="000000"/>
-                      <w:sz w:val="19"/>
-                      <w:szCs w:val="19"/>
+                      <w:sz w:val="18"/>
+                      <w:szCs w:val="18"/>
                     </w:rPr>
                     <w:t xml:space="preserve">.</w:t>
                   </w:r>
                 </w:p>
                 <w:p>
                   <w:pPr>
-                    <w:spacing w:after="40" w:before="0"/>
-                  </w:pPr>
-                  <w:r>
-                    <w:rPr>
-                      <w:rFonts w:ascii="Calibri" w:cs="Calibri" w:eastAsia="Calibri" w:hAnsi="Calibri"/>
-                      <w:color w:val="000000"/>
-                      <w:sz w:val="19"/>
-                      <w:szCs w:val="19"/>
+                    <w:spacing w:after="20" w:before="0"/>
+                  </w:pPr>
+                  <w:r>
+                    <w:rPr>
+                      <w:rFonts w:ascii="Calibri" w:cs="Calibri" w:eastAsia="Calibri" w:hAnsi="Calibri"/>
+                      <w:color w:val="000000"/>
+                      <w:sz w:val="18"/>
+                      <w:szCs w:val="18"/>
                     </w:rPr>
                     <w:t xml:space="preserve">Am Freitag </w:t>
                   </w:r>
@@ -2650,8 +2661,8 @@
                       <w:b/>
                       <w:bCs/>
                       <w:color w:val="D9534F"/>
-                      <w:sz w:val="19"/>
-                      <w:szCs w:val="19"/>
+                      <w:sz w:val="18"/>
+                      <w:szCs w:val="18"/>
                     </w:rPr>
                     <w:t xml:space="preserve">waren</w:t>
                   </w:r>
@@ -2659,8 +2670,8 @@
                     <w:rPr>
                       <w:rFonts w:ascii="Calibri" w:cs="Calibri" w:eastAsia="Calibri" w:hAnsi="Calibri"/>
                       <w:color w:val="000000"/>
-                      <w:sz w:val="19"/>
-                      <w:szCs w:val="19"/>
+                      <w:sz w:val="18"/>
+                      <w:szCs w:val="18"/>
                     </w:rPr>
                     <w:t xml:space="preserve"> wir mit dem Team nach … </w:t>
                   </w:r>
@@ -2670,8 +2681,8 @@
                       <w:b/>
                       <w:bCs/>
                       <w:color w:val="C98A1E"/>
-                      <w:sz w:val="19"/>
-                      <w:szCs w:val="19"/>
+                      <w:sz w:val="18"/>
+                      <w:szCs w:val="18"/>
                     </w:rPr>
                     <w:t xml:space="preserve">gefahren</w:t>
                   </w:r>
@@ -2679,8 +2690,8 @@
                     <w:rPr>
                       <w:rFonts w:ascii="Calibri" w:cs="Calibri" w:eastAsia="Calibri" w:hAnsi="Calibri"/>
                       <w:color w:val="000000"/>
-                      <w:sz w:val="19"/>
-                      <w:szCs w:val="19"/>
+                      <w:sz w:val="18"/>
+                      <w:szCs w:val="18"/>
                     </w:rPr>
                     <w:t xml:space="preserve">.</w:t>
                   </w:r>
@@ -2688,8 +2699,8 @@
                     <w:rPr>
                       <w:rFonts w:ascii="Calibri" w:cs="Calibri" w:eastAsia="Calibri" w:hAnsi="Calibri"/>
                       <w:color w:val="9AA3B5"/>
-                      <w:sz w:val="19"/>
-                      <w:szCs w:val="19"/>
+                      <w:sz w:val="18"/>
+                      <w:szCs w:val="18"/>
                     </w:rPr>
                     <w:t xml:space="preserve">   ·   </w:t>
                   </w:r>
@@ -2697,8 +2708,8 @@
                     <w:rPr>
                       <w:rFonts w:ascii="Calibri" w:cs="Calibri" w:eastAsia="Calibri" w:hAnsi="Calibri"/>
                       <w:color w:val="000000"/>
-                      <w:sz w:val="19"/>
-                      <w:szCs w:val="19"/>
+                      <w:sz w:val="18"/>
+                      <w:szCs w:val="18"/>
                     </w:rPr>
                     <w:t xml:space="preserve">Mein Trainer </w:t>
                   </w:r>
@@ -2708,8 +2719,8 @@
                       <w:b/>
                       <w:bCs/>
                       <w:color w:val="D9534F"/>
-                      <w:sz w:val="19"/>
-                      <w:szCs w:val="19"/>
+                      <w:sz w:val="18"/>
+                      <w:szCs w:val="18"/>
                     </w:rPr>
                     <w:t xml:space="preserve">hatte</w:t>
                   </w:r>
@@ -2717,8 +2728,8 @@
                     <w:rPr>
                       <w:rFonts w:ascii="Calibri" w:cs="Calibri" w:eastAsia="Calibri" w:hAnsi="Calibri"/>
                       <w:color w:val="000000"/>
-                      <w:sz w:val="19"/>
-                      <w:szCs w:val="19"/>
+                      <w:sz w:val="18"/>
+                      <w:szCs w:val="18"/>
                     </w:rPr>
                     <w:t xml:space="preserve"> mir noch einen Tipp </w:t>
                   </w:r>
@@ -2728,8 +2739,8 @@
                       <w:b/>
                       <w:bCs/>
                       <w:color w:val="C98A1E"/>
-                      <w:sz w:val="19"/>
-                      <w:szCs w:val="19"/>
+                      <w:sz w:val="18"/>
+                      <w:szCs w:val="18"/>
                     </w:rPr>
                     <w:t xml:space="preserve">gegeben</w:t>
                   </w:r>
@@ -2737,22 +2748,22 @@
                     <w:rPr>
                       <w:rFonts w:ascii="Calibri" w:cs="Calibri" w:eastAsia="Calibri" w:hAnsi="Calibri"/>
                       <w:color w:val="000000"/>
-                      <w:sz w:val="19"/>
-                      <w:szCs w:val="19"/>
+                      <w:sz w:val="18"/>
+                      <w:szCs w:val="18"/>
                     </w:rPr>
                     <w:t xml:space="preserve">.</w:t>
                   </w:r>
                 </w:p>
                 <w:p>
                   <w:pPr>
-                    <w:spacing w:after="40" w:before="0"/>
-                  </w:pPr>
-                  <w:r>
-                    <w:rPr>
-                      <w:rFonts w:ascii="Calibri" w:cs="Calibri" w:eastAsia="Calibri" w:hAnsi="Calibri"/>
-                      <w:color w:val="000000"/>
-                      <w:sz w:val="19"/>
-                      <w:szCs w:val="19"/>
+                    <w:spacing w:after="20" w:before="0"/>
+                  </w:pPr>
+                  <w:r>
+                    <w:rPr>
+                      <w:rFonts w:ascii="Calibri" w:cs="Calibri" w:eastAsia="Calibri" w:hAnsi="Calibri"/>
+                      <w:color w:val="000000"/>
+                      <w:sz w:val="18"/>
+                      <w:szCs w:val="18"/>
                     </w:rPr>
                     <w:t xml:space="preserve">Ich </w:t>
                   </w:r>
@@ -2762,8 +2773,8 @@
                       <w:b/>
                       <w:bCs/>
                       <w:color w:val="D9534F"/>
-                      <w:sz w:val="19"/>
-                      <w:szCs w:val="19"/>
+                      <w:sz w:val="18"/>
+                      <w:szCs w:val="18"/>
                     </w:rPr>
                     <w:t xml:space="preserve">hatte</w:t>
                   </w:r>
@@ -2771,8 +2782,8 @@
                     <w:rPr>
                       <w:rFonts w:ascii="Calibri" w:cs="Calibri" w:eastAsia="Calibri" w:hAnsi="Calibri"/>
                       <w:color w:val="000000"/>
-                      <w:sz w:val="19"/>
-                      <w:szCs w:val="19"/>
+                      <w:sz w:val="18"/>
+                      <w:szCs w:val="18"/>
                     </w:rPr>
                     <w:t xml:space="preserve"> mich lange </w:t>
                   </w:r>
@@ -2782,8 +2793,8 @@
                       <w:b/>
                       <w:bCs/>
                       <w:color w:val="C98A1E"/>
-                      <w:sz w:val="19"/>
-                      <w:szCs w:val="19"/>
+                      <w:sz w:val="18"/>
+                      <w:szCs w:val="18"/>
                     </w:rPr>
                     <w:t xml:space="preserve">aufgewärmt</w:t>
                   </w:r>
@@ -2791,8 +2802,8 @@
                     <w:rPr>
                       <w:rFonts w:ascii="Calibri" w:cs="Calibri" w:eastAsia="Calibri" w:hAnsi="Calibri"/>
                       <w:color w:val="000000"/>
-                      <w:sz w:val="19"/>
-                      <w:szCs w:val="19"/>
+                      <w:sz w:val="18"/>
+                      <w:szCs w:val="18"/>
                     </w:rPr>
                     <w:t xml:space="preserve">.</w:t>
                   </w:r>
@@ -2800,8 +2811,8 @@
                     <w:rPr>
                       <w:rFonts w:ascii="Calibri" w:cs="Calibri" w:eastAsia="Calibri" w:hAnsi="Calibri"/>
                       <w:color w:val="9AA3B5"/>
-                      <w:sz w:val="19"/>
-                      <w:szCs w:val="19"/>
+                      <w:sz w:val="18"/>
+                      <w:szCs w:val="18"/>
                     </w:rPr>
                     <w:t xml:space="preserve">   ·   </w:t>
                   </w:r>
@@ -2809,8 +2820,8 @@
                     <w:rPr>
                       <w:rFonts w:ascii="Calibri" w:cs="Calibri" w:eastAsia="Calibri" w:hAnsi="Calibri"/>
                       <w:color w:val="000000"/>
-                      <w:sz w:val="19"/>
-                      <w:szCs w:val="19"/>
+                      <w:sz w:val="18"/>
+                      <w:szCs w:val="18"/>
                     </w:rPr>
                     <w:t xml:space="preserve">Wir </w:t>
                   </w:r>
@@ -2820,8 +2831,8 @@
                       <w:b/>
                       <w:bCs/>
                       <w:color w:val="D9534F"/>
-                      <w:sz w:val="19"/>
-                      <w:szCs w:val="19"/>
+                      <w:sz w:val="18"/>
+                      <w:szCs w:val="18"/>
                     </w:rPr>
                     <w:t xml:space="preserve">waren</w:t>
                   </w:r>
@@ -2829,8 +2840,8 @@
                     <w:rPr>
                       <w:rFonts w:ascii="Calibri" w:cs="Calibri" w:eastAsia="Calibri" w:hAnsi="Calibri"/>
                       <w:color w:val="000000"/>
-                      <w:sz w:val="19"/>
-                      <w:szCs w:val="19"/>
+                      <w:sz w:val="18"/>
+                      <w:szCs w:val="18"/>
                     </w:rPr>
                     <w:t xml:space="preserve"> früh </w:t>
                   </w:r>
@@ -2840,8 +2851,8 @@
                       <w:b/>
                       <w:bCs/>
                       <w:color w:val="C98A1E"/>
-                      <w:sz w:val="19"/>
-                      <w:szCs w:val="19"/>
+                      <w:sz w:val="18"/>
+                      <w:szCs w:val="18"/>
                     </w:rPr>
                     <w:t xml:space="preserve">aufgestanden</w:t>
                   </w:r>
@@ -2849,8 +2860,8 @@
                     <w:rPr>
                       <w:rFonts w:ascii="Calibri" w:cs="Calibri" w:eastAsia="Calibri" w:hAnsi="Calibri"/>
                       <w:color w:val="000000"/>
-                      <w:sz w:val="19"/>
-                      <w:szCs w:val="19"/>
+                      <w:sz w:val="18"/>
+                      <w:szCs w:val="18"/>
                     </w:rPr>
                     <w:t xml:space="preserve">.</w:t>
                   </w:r>
@@ -2945,14 +2956,14 @@
                 </w:tcPr>
                 <w:p>
                   <w:pPr>
-                    <w:spacing w:after="40" w:before="0"/>
-                  </w:pPr>
-                  <w:r>
-                    <w:rPr>
-                      <w:rFonts w:ascii="Calibri" w:cs="Calibri" w:eastAsia="Calibri" w:hAnsi="Calibri"/>
-                      <w:color w:val="000000"/>
-                      <w:sz w:val="19"/>
-                      <w:szCs w:val="19"/>
+                    <w:spacing w:after="20" w:before="0"/>
+                  </w:pPr>
+                  <w:r>
+                    <w:rPr>
+                      <w:rFonts w:ascii="Calibri" w:cs="Calibri" w:eastAsia="Calibri" w:hAnsi="Calibri"/>
+                      <w:color w:val="000000"/>
+                      <w:sz w:val="18"/>
+                      <w:szCs w:val="18"/>
                     </w:rPr>
                     <w:t xml:space="preserve">Am Samstag </w:t>
                   </w:r>
@@ -2962,8 +2973,8 @@
                       <w:b/>
                       <w:bCs/>
                       <w:color w:val="000000"/>
-                      <w:sz w:val="19"/>
-                      <w:szCs w:val="19"/>
+                      <w:sz w:val="18"/>
+                      <w:szCs w:val="18"/>
                       <w:u w:val="single"/>
                     </w:rPr>
                     <w:t xml:space="preserve">kämpfte</w:t>
@@ -2972,8 +2983,8 @@
                     <w:rPr>
                       <w:rFonts w:ascii="Calibri" w:cs="Calibri" w:eastAsia="Calibri" w:hAnsi="Calibri"/>
                       <w:color w:val="000000"/>
-                      <w:sz w:val="19"/>
-                      <w:szCs w:val="19"/>
+                      <w:sz w:val="18"/>
+                      <w:szCs w:val="18"/>
                     </w:rPr>
                     <w:t xml:space="preserve"> / </w:t>
                   </w:r>
@@ -2983,8 +2994,8 @@
                       <w:b/>
                       <w:bCs/>
                       <w:color w:val="000000"/>
-                      <w:sz w:val="19"/>
-                      <w:szCs w:val="19"/>
+                      <w:sz w:val="18"/>
+                      <w:szCs w:val="18"/>
                       <w:u w:val="single"/>
                     </w:rPr>
                     <w:t xml:space="preserve">spielte</w:t>
@@ -2993,8 +3004,8 @@
                     <w:rPr>
                       <w:rFonts w:ascii="Calibri" w:cs="Calibri" w:eastAsia="Calibri" w:hAnsi="Calibri"/>
                       <w:color w:val="000000"/>
-                      <w:sz w:val="19"/>
-                      <w:szCs w:val="19"/>
+                      <w:sz w:val="18"/>
+                      <w:szCs w:val="18"/>
                     </w:rPr>
                     <w:t xml:space="preserve"> / </w:t>
                   </w:r>
@@ -3004,8 +3015,8 @@
                       <w:b/>
                       <w:bCs/>
                       <w:color w:val="000000"/>
-                      <w:sz w:val="19"/>
-                      <w:szCs w:val="19"/>
+                      <w:sz w:val="18"/>
+                      <w:szCs w:val="18"/>
                       <w:u w:val="single"/>
                     </w:rPr>
                     <w:t xml:space="preserve">hob</w:t>
@@ -3014,8 +3025,8 @@
                     <w:rPr>
                       <w:rFonts w:ascii="Calibri" w:cs="Calibri" w:eastAsia="Calibri" w:hAnsi="Calibri"/>
                       <w:color w:val="000000"/>
-                      <w:sz w:val="19"/>
-                      <w:szCs w:val="19"/>
+                      <w:sz w:val="18"/>
+                      <w:szCs w:val="18"/>
                     </w:rPr>
                     <w:t xml:space="preserve"> ich …</w:t>
                   </w:r>
@@ -3023,8 +3034,8 @@
                     <w:rPr>
                       <w:rFonts w:ascii="Calibri" w:cs="Calibri" w:eastAsia="Calibri" w:hAnsi="Calibri"/>
                       <w:color w:val="9AA3B5"/>
-                      <w:sz w:val="19"/>
-                      <w:szCs w:val="19"/>
+                      <w:sz w:val="18"/>
+                      <w:szCs w:val="18"/>
                     </w:rPr>
                     <w:t xml:space="preserve">   ·   </w:t>
                   </w:r>
@@ -3032,22 +3043,22 @@
                     <w:rPr>
                       <w:rFonts w:ascii="Calibri" w:cs="Calibri" w:eastAsia="Calibri" w:hAnsi="Calibri"/>
                       <w:color w:val="000000"/>
-                      <w:sz w:val="19"/>
-                      <w:szCs w:val="19"/>
+                      <w:sz w:val="18"/>
+                      <w:szCs w:val="18"/>
                     </w:rPr>
                     <w:t xml:space="preserve">Im ersten Kampf / In der ersten Halbzeit / Im ersten Versuch …</w:t>
                   </w:r>
                 </w:p>
                 <w:p>
                   <w:pPr>
-                    <w:spacing w:after="40" w:before="0"/>
-                  </w:pPr>
-                  <w:r>
-                    <w:rPr>
-                      <w:rFonts w:ascii="Calibri" w:cs="Calibri" w:eastAsia="Calibri" w:hAnsi="Calibri"/>
-                      <w:color w:val="000000"/>
-                      <w:sz w:val="19"/>
-                      <w:szCs w:val="19"/>
+                    <w:spacing w:after="20" w:before="0"/>
+                  </w:pPr>
+                  <w:r>
+                    <w:rPr>
+                      <w:rFonts w:ascii="Calibri" w:cs="Calibri" w:eastAsia="Calibri" w:hAnsi="Calibri"/>
+                      <w:color w:val="000000"/>
+                      <w:sz w:val="18"/>
+                      <w:szCs w:val="18"/>
                     </w:rPr>
                     <w:t xml:space="preserve">Am Anfang </w:t>
                   </w:r>
@@ -3057,8 +3068,8 @@
                       <w:b/>
                       <w:bCs/>
                       <w:color w:val="000000"/>
-                      <w:sz w:val="19"/>
-                      <w:szCs w:val="19"/>
+                      <w:sz w:val="18"/>
+                      <w:szCs w:val="18"/>
                       <w:u w:val="single"/>
                     </w:rPr>
                     <w:t xml:space="preserve">war</w:t>
@@ -3067,8 +3078,8 @@
                     <w:rPr>
                       <w:rFonts w:ascii="Calibri" w:cs="Calibri" w:eastAsia="Calibri" w:hAnsi="Calibri"/>
                       <w:color w:val="000000"/>
-                      <w:sz w:val="19"/>
-                      <w:szCs w:val="19"/>
+                      <w:sz w:val="18"/>
+                      <w:szCs w:val="18"/>
                     </w:rPr>
                     <w:t xml:space="preserve"> ich sehr nervös.</w:t>
                   </w:r>
@@ -3076,8 +3087,8 @@
                     <w:rPr>
                       <w:rFonts w:ascii="Calibri" w:cs="Calibri" w:eastAsia="Calibri" w:hAnsi="Calibri"/>
                       <w:color w:val="9AA3B5"/>
-                      <w:sz w:val="19"/>
-                      <w:szCs w:val="19"/>
+                      <w:sz w:val="18"/>
+                      <w:szCs w:val="18"/>
                     </w:rPr>
                     <w:t xml:space="preserve">   ·   </w:t>
                   </w:r>
@@ -3085,8 +3096,8 @@
                     <w:rPr>
                       <w:rFonts w:ascii="Calibri" w:cs="Calibri" w:eastAsia="Calibri" w:hAnsi="Calibri"/>
                       <w:color w:val="000000"/>
-                      <w:sz w:val="19"/>
-                      <w:szCs w:val="19"/>
+                      <w:sz w:val="18"/>
+                      <w:szCs w:val="18"/>
                     </w:rPr>
                     <w:t xml:space="preserve">Dann </w:t>
                   </w:r>
@@ -3096,8 +3107,8 @@
                       <w:b/>
                       <w:bCs/>
                       <w:color w:val="000000"/>
-                      <w:sz w:val="19"/>
-                      <w:szCs w:val="19"/>
+                      <w:sz w:val="18"/>
+                      <w:szCs w:val="18"/>
                       <w:u w:val="single"/>
                     </w:rPr>
                     <w:t xml:space="preserve">warf</w:t>
@@ -3106,8 +3117,8 @@
                     <w:rPr>
                       <w:rFonts w:ascii="Calibri" w:cs="Calibri" w:eastAsia="Calibri" w:hAnsi="Calibri"/>
                       <w:color w:val="000000"/>
-                      <w:sz w:val="19"/>
-                      <w:szCs w:val="19"/>
+                      <w:sz w:val="18"/>
+                      <w:szCs w:val="18"/>
                     </w:rPr>
                     <w:t xml:space="preserve"> / </w:t>
                   </w:r>
@@ -3117,8 +3128,8 @@
                       <w:b/>
                       <w:bCs/>
                       <w:color w:val="000000"/>
-                      <w:sz w:val="19"/>
-                      <w:szCs w:val="19"/>
+                      <w:sz w:val="18"/>
+                      <w:szCs w:val="18"/>
                       <w:u w:val="single"/>
                     </w:rPr>
                     <w:t xml:space="preserve">traf</w:t>
@@ -3127,8 +3138,8 @@
                     <w:rPr>
                       <w:rFonts w:ascii="Calibri" w:cs="Calibri" w:eastAsia="Calibri" w:hAnsi="Calibri"/>
                       <w:color w:val="000000"/>
-                      <w:sz w:val="19"/>
-                      <w:szCs w:val="19"/>
+                      <w:sz w:val="18"/>
+                      <w:szCs w:val="18"/>
                     </w:rPr>
                     <w:t xml:space="preserve"> / </w:t>
                   </w:r>
@@ -3138,8 +3149,8 @@
                       <w:b/>
                       <w:bCs/>
                       <w:color w:val="000000"/>
-                      <w:sz w:val="19"/>
-                      <w:szCs w:val="19"/>
+                      <w:sz w:val="18"/>
+                      <w:szCs w:val="18"/>
                       <w:u w:val="single"/>
                     </w:rPr>
                     <w:t xml:space="preserve">stieß</w:t>
@@ -3148,8 +3159,8 @@
                     <w:rPr>
                       <w:rFonts w:ascii="Calibri" w:cs="Calibri" w:eastAsia="Calibri" w:hAnsi="Calibri"/>
                       <w:color w:val="000000"/>
-                      <w:sz w:val="19"/>
-                      <w:szCs w:val="19"/>
+                      <w:sz w:val="18"/>
+                      <w:szCs w:val="18"/>
                     </w:rPr>
                     <w:t xml:space="preserve"> ich …</w:t>
                   </w:r>
@@ -3157,8 +3168,8 @@
                     <w:rPr>
                       <w:rFonts w:ascii="Calibri" w:cs="Calibri" w:eastAsia="Calibri" w:hAnsi="Calibri"/>
                       <w:color w:val="9AA3B5"/>
-                      <w:sz w:val="19"/>
-                      <w:szCs w:val="19"/>
+                      <w:sz w:val="18"/>
+                      <w:szCs w:val="18"/>
                     </w:rPr>
                     <w:t xml:space="preserve">   ·   </w:t>
                   </w:r>
@@ -3166,8 +3177,8 @@
                     <w:rPr>
                       <w:rFonts w:ascii="Calibri" w:cs="Calibri" w:eastAsia="Calibri" w:hAnsi="Calibri"/>
                       <w:color w:val="000000"/>
-                      <w:sz w:val="19"/>
-                      <w:szCs w:val="19"/>
+                      <w:sz w:val="18"/>
+                      <w:szCs w:val="18"/>
                     </w:rPr>
                     <w:t xml:space="preserve">Am Ende </w:t>
                   </w:r>
@@ -3177,8 +3188,8 @@
                       <w:b/>
                       <w:bCs/>
                       <w:color w:val="000000"/>
-                      <w:sz w:val="19"/>
-                      <w:szCs w:val="19"/>
+                      <w:sz w:val="18"/>
+                      <w:szCs w:val="18"/>
                       <w:u w:val="single"/>
                     </w:rPr>
                     <w:t xml:space="preserve">gewann</w:t>
@@ -3187,8 +3198,8 @@
                     <w:rPr>
                       <w:rFonts w:ascii="Calibri" w:cs="Calibri" w:eastAsia="Calibri" w:hAnsi="Calibri"/>
                       <w:color w:val="000000"/>
-                      <w:sz w:val="19"/>
-                      <w:szCs w:val="19"/>
+                      <w:sz w:val="18"/>
+                      <w:szCs w:val="18"/>
                     </w:rPr>
                     <w:t xml:space="preserve"> / </w:t>
                   </w:r>
@@ -3198,8 +3209,8 @@
                       <w:b/>
                       <w:bCs/>
                       <w:color w:val="000000"/>
-                      <w:sz w:val="19"/>
-                      <w:szCs w:val="19"/>
+                      <w:sz w:val="18"/>
+                      <w:szCs w:val="18"/>
                       <w:u w:val="single"/>
                     </w:rPr>
                     <w:t xml:space="preserve">verlor</w:t>
@@ -3208,8 +3219,8 @@
                     <w:rPr>
                       <w:rFonts w:ascii="Calibri" w:cs="Calibri" w:eastAsia="Calibri" w:hAnsi="Calibri"/>
                       <w:color w:val="000000"/>
-                      <w:sz w:val="19"/>
-                      <w:szCs w:val="19"/>
+                      <w:sz w:val="18"/>
+                      <w:szCs w:val="18"/>
                     </w:rPr>
                     <w:t xml:space="preserve"> ich …</w:t>
                   </w:r>
@@ -3326,14 +3337,14 @@
                 </w:tcPr>
                 <w:p>
                   <w:pPr>
-                    <w:spacing w:after="40" w:before="0"/>
-                  </w:pPr>
-                  <w:r>
-                    <w:rPr>
-                      <w:rFonts w:ascii="Calibri" w:cs="Calibri" w:eastAsia="Calibri" w:hAnsi="Calibri"/>
-                      <w:color w:val="000000"/>
-                      <w:sz w:val="19"/>
-                      <w:szCs w:val="19"/>
+                    <w:spacing w:after="20" w:before="0"/>
+                  </w:pPr>
+                  <w:r>
+                    <w:rPr>
+                      <w:rFonts w:ascii="Calibri" w:cs="Calibri" w:eastAsia="Calibri" w:hAnsi="Calibri"/>
+                      <w:color w:val="000000"/>
+                      <w:sz w:val="18"/>
+                      <w:szCs w:val="18"/>
                     </w:rPr>
                     <w:t xml:space="preserve">Mein Trainer sagte: „Du </w:t>
                   </w:r>
@@ -3343,8 +3354,8 @@
                       <w:b/>
                       <w:bCs/>
                       <w:color w:val="D9534F"/>
-                      <w:sz w:val="19"/>
-                      <w:szCs w:val="19"/>
+                      <w:sz w:val="18"/>
+                      <w:szCs w:val="18"/>
                     </w:rPr>
                     <w:t xml:space="preserve">hast</w:t>
                   </w:r>
@@ -3352,8 +3363,8 @@
                     <w:rPr>
                       <w:rFonts w:ascii="Calibri" w:cs="Calibri" w:eastAsia="Calibri" w:hAnsi="Calibri"/>
                       <w:color w:val="000000"/>
-                      <w:sz w:val="19"/>
-                      <w:szCs w:val="19"/>
+                      <w:sz w:val="18"/>
+                      <w:szCs w:val="18"/>
                     </w:rPr>
                     <w:t xml:space="preserve"> stark </w:t>
                   </w:r>
@@ -3363,8 +3374,8 @@
                       <w:b/>
                       <w:bCs/>
                       <w:color w:val="C98A1E"/>
-                      <w:sz w:val="19"/>
-                      <w:szCs w:val="19"/>
+                      <w:sz w:val="18"/>
+                      <w:szCs w:val="18"/>
                     </w:rPr>
                     <w:t xml:space="preserve">gekämpft</w:t>
                   </w:r>
@@ -3372,8 +3383,8 @@
                     <w:rPr>
                       <w:rFonts w:ascii="Calibri" w:cs="Calibri" w:eastAsia="Calibri" w:hAnsi="Calibri"/>
                       <w:color w:val="000000"/>
-                      <w:sz w:val="19"/>
-                      <w:szCs w:val="19"/>
+                      <w:sz w:val="18"/>
+                      <w:szCs w:val="18"/>
                     </w:rPr>
                     <w:t xml:space="preserve">!“</w:t>
                   </w:r>
@@ -3381,8 +3392,8 @@
                     <w:rPr>
                       <w:rFonts w:ascii="Calibri" w:cs="Calibri" w:eastAsia="Calibri" w:hAnsi="Calibri"/>
                       <w:color w:val="9AA3B5"/>
-                      <w:sz w:val="19"/>
-                      <w:szCs w:val="19"/>
+                      <w:sz w:val="18"/>
+                      <w:szCs w:val="18"/>
                     </w:rPr>
                     <w:t xml:space="preserve">   ·   </w:t>
                   </w:r>
@@ -3390,8 +3401,8 @@
                     <w:rPr>
                       <w:rFonts w:ascii="Calibri" w:cs="Calibri" w:eastAsia="Calibri" w:hAnsi="Calibri"/>
                       <w:color w:val="000000"/>
-                      <w:sz w:val="19"/>
-                      <w:szCs w:val="19"/>
+                      <w:sz w:val="18"/>
+                      <w:szCs w:val="18"/>
                     </w:rPr>
                     <w:t xml:space="preserve">Mein Team rief: „Wir </w:t>
                   </w:r>
@@ -3401,8 +3412,8 @@
                       <w:b/>
                       <w:bCs/>
                       <w:color w:val="D9534F"/>
-                      <w:sz w:val="19"/>
-                      <w:szCs w:val="19"/>
+                      <w:sz w:val="18"/>
+                      <w:szCs w:val="18"/>
                     </w:rPr>
                     <w:t xml:space="preserve">haben</w:t>
                   </w:r>
@@ -3410,8 +3421,8 @@
                     <w:rPr>
                       <w:rFonts w:ascii="Calibri" w:cs="Calibri" w:eastAsia="Calibri" w:hAnsi="Calibri"/>
                       <w:color w:val="000000"/>
-                      <w:sz w:val="19"/>
-                      <w:szCs w:val="19"/>
+                      <w:sz w:val="18"/>
+                      <w:szCs w:val="18"/>
                     </w:rPr>
                     <w:t xml:space="preserve"> </w:t>
                   </w:r>
@@ -3421,8 +3432,8 @@
                       <w:b/>
                       <w:bCs/>
                       <w:color w:val="C98A1E"/>
-                      <w:sz w:val="19"/>
-                      <w:szCs w:val="19"/>
+                      <w:sz w:val="18"/>
+                      <w:szCs w:val="18"/>
                     </w:rPr>
                     <w:t xml:space="preserve">gewonnen</w:t>
                   </w:r>
@@ -3430,22 +3441,22 @@
                     <w:rPr>
                       <w:rFonts w:ascii="Calibri" w:cs="Calibri" w:eastAsia="Calibri" w:hAnsi="Calibri"/>
                       <w:color w:val="000000"/>
-                      <w:sz w:val="19"/>
-                      <w:szCs w:val="19"/>
+                      <w:sz w:val="18"/>
+                      <w:szCs w:val="18"/>
                     </w:rPr>
                     <w:t xml:space="preserve">!“</w:t>
                   </w:r>
                 </w:p>
                 <w:p>
                   <w:pPr>
-                    <w:spacing w:after="40" w:before="0"/>
-                  </w:pPr>
-                  <w:r>
-                    <w:rPr>
-                      <w:rFonts w:ascii="Calibri" w:cs="Calibri" w:eastAsia="Calibri" w:hAnsi="Calibri"/>
-                      <w:color w:val="000000"/>
-                      <w:sz w:val="19"/>
-                      <w:szCs w:val="19"/>
+                    <w:spacing w:after="20" w:before="0"/>
+                  </w:pPr>
+                  <w:r>
+                    <w:rPr>
+                      <w:rFonts w:ascii="Calibri" w:cs="Calibri" w:eastAsia="Calibri" w:hAnsi="Calibri"/>
+                      <w:color w:val="000000"/>
+                      <w:sz w:val="18"/>
+                      <w:szCs w:val="18"/>
                     </w:rPr>
                     <w:t xml:space="preserve">Ich rief meinen Eltern zu: „Ich </w:t>
                   </w:r>
@@ -3455,8 +3466,8 @@
                       <w:b/>
                       <w:bCs/>
                       <w:color w:val="D9534F"/>
-                      <w:sz w:val="19"/>
-                      <w:szCs w:val="19"/>
+                      <w:sz w:val="18"/>
+                      <w:szCs w:val="18"/>
                     </w:rPr>
                     <w:t xml:space="preserve">bin</w:t>
                   </w:r>
@@ -3464,8 +3475,8 @@
                     <w:rPr>
                       <w:rFonts w:ascii="Calibri" w:cs="Calibri" w:eastAsia="Calibri" w:hAnsi="Calibri"/>
                       <w:color w:val="000000"/>
-                      <w:sz w:val="19"/>
-                      <w:szCs w:val="19"/>
+                      <w:sz w:val="18"/>
+                      <w:szCs w:val="18"/>
                     </w:rPr>
                     <w:t xml:space="preserve"> Zweite(r) </w:t>
                   </w:r>
@@ -3475,8 +3486,8 @@
                       <w:b/>
                       <w:bCs/>
                       <w:color w:val="C98A1E"/>
-                      <w:sz w:val="19"/>
-                      <w:szCs w:val="19"/>
+                      <w:sz w:val="18"/>
+                      <w:szCs w:val="18"/>
                     </w:rPr>
                     <w:t xml:space="preserve">geworden</w:t>
                   </w:r>
@@ -3484,8 +3495,8 @@
                     <w:rPr>
                       <w:rFonts w:ascii="Calibri" w:cs="Calibri" w:eastAsia="Calibri" w:hAnsi="Calibri"/>
                       <w:color w:val="000000"/>
-                      <w:sz w:val="19"/>
-                      <w:szCs w:val="19"/>
+                      <w:sz w:val="18"/>
+                      <w:szCs w:val="18"/>
                     </w:rPr>
                     <w:t xml:space="preserve">!“</w:t>
                   </w:r>
@@ -3493,8 +3504,8 @@
                     <w:rPr>
                       <w:rFonts w:ascii="Calibri" w:cs="Calibri" w:eastAsia="Calibri" w:hAnsi="Calibri"/>
                       <w:color w:val="9AA3B5"/>
-                      <w:sz w:val="19"/>
-                      <w:szCs w:val="19"/>
+                      <w:sz w:val="18"/>
+                      <w:szCs w:val="18"/>
                     </w:rPr>
                     <w:t xml:space="preserve">   ·   </w:t>
                   </w:r>
@@ -3502,8 +3513,8 @@
                     <w:rPr>
                       <w:rFonts w:ascii="Calibri" w:cs="Calibri" w:eastAsia="Calibri" w:hAnsi="Calibri"/>
                       <w:color w:val="000000"/>
-                      <w:sz w:val="19"/>
-                      <w:szCs w:val="19"/>
+                      <w:sz w:val="18"/>
+                      <w:szCs w:val="18"/>
                     </w:rPr>
                     <w:t xml:space="preserve">Der Kampfrichter sagte: „Das </w:t>
                   </w:r>
@@ -3513,8 +3524,8 @@
                       <w:b/>
                       <w:bCs/>
                       <w:color w:val="D9534F"/>
-                      <w:sz w:val="19"/>
-                      <w:szCs w:val="19"/>
+                      <w:sz w:val="18"/>
+                      <w:szCs w:val="18"/>
                     </w:rPr>
                     <w:t xml:space="preserve">hast</w:t>
                   </w:r>
@@ -3522,8 +3533,8 @@
                     <w:rPr>
                       <w:rFonts w:ascii="Calibri" w:cs="Calibri" w:eastAsia="Calibri" w:hAnsi="Calibri"/>
                       <w:color w:val="000000"/>
-                      <w:sz w:val="19"/>
-                      <w:szCs w:val="19"/>
+                      <w:sz w:val="18"/>
+                      <w:szCs w:val="18"/>
                     </w:rPr>
                     <w:t xml:space="preserve"> du gut </w:t>
                   </w:r>
@@ -3533,8 +3544,8 @@
                       <w:b/>
                       <w:bCs/>
                       <w:color w:val="C98A1E"/>
-                      <w:sz w:val="19"/>
-                      <w:szCs w:val="19"/>
+                      <w:sz w:val="18"/>
+                      <w:szCs w:val="18"/>
                     </w:rPr>
                     <w:t xml:space="preserve">gemacht</w:t>
                   </w:r>
@@ -3542,8 +3553,8 @@
                     <w:rPr>
                       <w:rFonts w:ascii="Calibri" w:cs="Calibri" w:eastAsia="Calibri" w:hAnsi="Calibri"/>
                       <w:color w:val="000000"/>
-                      <w:sz w:val="19"/>
-                      <w:szCs w:val="19"/>
+                      <w:sz w:val="18"/>
+                      <w:szCs w:val="18"/>
                     </w:rPr>
                     <w:t xml:space="preserve">.“</w:t>
                   </w:r>
@@ -3638,14 +3649,14 @@
                 </w:tcPr>
                 <w:p>
                   <w:pPr>
-                    <w:spacing w:after="40" w:before="0"/>
-                  </w:pPr>
-                  <w:r>
-                    <w:rPr>
-                      <w:rFonts w:ascii="Calibri" w:cs="Calibri" w:eastAsia="Calibri" w:hAnsi="Calibri"/>
-                      <w:color w:val="000000"/>
-                      <w:sz w:val="19"/>
-                      <w:szCs w:val="19"/>
+                    <w:spacing w:after="20" w:before="0"/>
+                  </w:pPr>
+                  <w:r>
+                    <w:rPr>
+                      <w:rFonts w:ascii="Calibri" w:cs="Calibri" w:eastAsia="Calibri" w:hAnsi="Calibri"/>
+                      <w:color w:val="000000"/>
+                      <w:sz w:val="18"/>
+                      <w:szCs w:val="18"/>
                     </w:rPr>
                     <w:t xml:space="preserve">Heute </w:t>
                   </w:r>
@@ -3655,8 +3666,8 @@
                       <w:b/>
                       <w:bCs/>
                       <w:color w:val="000000"/>
-                      <w:sz w:val="19"/>
-                      <w:szCs w:val="19"/>
+                      <w:sz w:val="18"/>
+                      <w:szCs w:val="18"/>
                       <w:u w:val="single"/>
                     </w:rPr>
                     <w:t xml:space="preserve">bin</w:t>
@@ -3665,8 +3676,8 @@
                     <w:rPr>
                       <w:rFonts w:ascii="Calibri" w:cs="Calibri" w:eastAsia="Calibri" w:hAnsi="Calibri"/>
                       <w:color w:val="000000"/>
-                      <w:sz w:val="19"/>
-                      <w:szCs w:val="19"/>
+                      <w:sz w:val="18"/>
+                      <w:szCs w:val="18"/>
                     </w:rPr>
                     <w:t xml:space="preserve"> ich noch müde.</w:t>
                   </w:r>
@@ -3674,8 +3685,8 @@
                     <w:rPr>
                       <w:rFonts w:ascii="Calibri" w:cs="Calibri" w:eastAsia="Calibri" w:hAnsi="Calibri"/>
                       <w:color w:val="9AA3B5"/>
-                      <w:sz w:val="19"/>
-                      <w:szCs w:val="19"/>
+                      <w:sz w:val="18"/>
+                      <w:szCs w:val="18"/>
                     </w:rPr>
                     <w:t xml:space="preserve">   ·   </w:t>
                   </w:r>
@@ -3683,8 +3694,8 @@
                     <w:rPr>
                       <w:rFonts w:ascii="Calibri" w:cs="Calibri" w:eastAsia="Calibri" w:hAnsi="Calibri"/>
                       <w:color w:val="000000"/>
-                      <w:sz w:val="19"/>
-                      <w:szCs w:val="19"/>
+                      <w:sz w:val="18"/>
+                      <w:szCs w:val="18"/>
                     </w:rPr>
                     <w:t xml:space="preserve">Heute </w:t>
                   </w:r>
@@ -3694,8 +3705,8 @@
                       <w:b/>
                       <w:bCs/>
                       <w:color w:val="000000"/>
-                      <w:sz w:val="19"/>
-                      <w:szCs w:val="19"/>
+                      <w:sz w:val="18"/>
+                      <w:szCs w:val="18"/>
                       <w:u w:val="single"/>
                     </w:rPr>
                     <w:t xml:space="preserve">tut</w:t>
@@ -3704,8 +3715,8 @@
                     <w:rPr>
                       <w:rFonts w:ascii="Calibri" w:cs="Calibri" w:eastAsia="Calibri" w:hAnsi="Calibri"/>
                       <w:color w:val="000000"/>
-                      <w:sz w:val="19"/>
-                      <w:szCs w:val="19"/>
+                      <w:sz w:val="18"/>
+                      <w:szCs w:val="18"/>
                     </w:rPr>
                     <w:t xml:space="preserve"> mir … weh.</w:t>
                   </w:r>
@@ -3713,8 +3724,8 @@
                     <w:rPr>
                       <w:rFonts w:ascii="Calibri" w:cs="Calibri" w:eastAsia="Calibri" w:hAnsi="Calibri"/>
                       <w:color w:val="9AA3B5"/>
-                      <w:sz w:val="19"/>
-                      <w:szCs w:val="19"/>
+                      <w:sz w:val="18"/>
+                      <w:szCs w:val="18"/>
                     </w:rPr>
                     <w:t xml:space="preserve">   ·   </w:t>
                   </w:r>
@@ -3722,8 +3733,8 @@
                     <w:rPr>
                       <w:rFonts w:ascii="Calibri" w:cs="Calibri" w:eastAsia="Calibri" w:hAnsi="Calibri"/>
                       <w:color w:val="000000"/>
-                      <w:sz w:val="19"/>
-                      <w:szCs w:val="19"/>
+                      <w:sz w:val="18"/>
+                      <w:szCs w:val="18"/>
                     </w:rPr>
                     <w:t xml:space="preserve">Heute </w:t>
                   </w:r>
@@ -3733,8 +3744,8 @@
                       <w:b/>
                       <w:bCs/>
                       <w:color w:val="000000"/>
-                      <w:sz w:val="19"/>
-                      <w:szCs w:val="19"/>
+                      <w:sz w:val="18"/>
+                      <w:szCs w:val="18"/>
                       <w:u w:val="single"/>
                     </w:rPr>
                     <w:t xml:space="preserve">analysiere</w:t>
@@ -3743,8 +3754,8 @@
                     <w:rPr>
                       <w:rFonts w:ascii="Calibri" w:cs="Calibri" w:eastAsia="Calibri" w:hAnsi="Calibri"/>
                       <w:color w:val="000000"/>
-                      <w:sz w:val="19"/>
-                      <w:szCs w:val="19"/>
+                      <w:sz w:val="18"/>
+                      <w:szCs w:val="18"/>
                     </w:rPr>
                     <w:t xml:space="preserve"> ich mit meinem Trainer das Video.</w:t>
                   </w:r>
@@ -3861,14 +3872,14 @@
                 </w:tcPr>
                 <w:p>
                   <w:pPr>
-                    <w:spacing w:after="40" w:before="0"/>
-                  </w:pPr>
-                  <w:r>
-                    <w:rPr>
-                      <w:rFonts w:ascii="Calibri" w:cs="Calibri" w:eastAsia="Calibri" w:hAnsi="Calibri"/>
-                      <w:color w:val="000000"/>
-                      <w:sz w:val="19"/>
-                      <w:szCs w:val="19"/>
+                    <w:spacing w:after="20" w:before="0"/>
+                  </w:pPr>
+                  <w:r>
+                    <w:rPr>
+                      <w:rFonts w:ascii="Calibri" w:cs="Calibri" w:eastAsia="Calibri" w:hAnsi="Calibri"/>
+                      <w:color w:val="000000"/>
+                      <w:sz w:val="18"/>
+                      <w:szCs w:val="18"/>
                     </w:rPr>
                     <w:t xml:space="preserve">Beim nächsten Wettkampf </w:t>
                   </w:r>
@@ -3878,8 +3889,8 @@
                       <w:b/>
                       <w:bCs/>
                       <w:color w:val="D9534F"/>
-                      <w:sz w:val="19"/>
-                      <w:szCs w:val="19"/>
+                      <w:sz w:val="18"/>
+                      <w:szCs w:val="18"/>
                     </w:rPr>
                     <w:t xml:space="preserve">werde</w:t>
                   </w:r>
@@ -3887,8 +3898,8 @@
                     <w:rPr>
                       <w:rFonts w:ascii="Calibri" w:cs="Calibri" w:eastAsia="Calibri" w:hAnsi="Calibri"/>
                       <w:color w:val="000000"/>
-                      <w:sz w:val="19"/>
-                      <w:szCs w:val="19"/>
+                      <w:sz w:val="18"/>
+                      <w:szCs w:val="18"/>
                     </w:rPr>
                     <w:t xml:space="preserve"> ich früher </w:t>
                   </w:r>
@@ -3898,8 +3909,8 @@
                       <w:b/>
                       <w:bCs/>
                       <w:color w:val="3F7CC4"/>
-                      <w:sz w:val="19"/>
-                      <w:szCs w:val="19"/>
+                      <w:sz w:val="18"/>
+                      <w:szCs w:val="18"/>
                     </w:rPr>
                     <w:t xml:space="preserve">angreifen</w:t>
                   </w:r>
@@ -3907,8 +3918,8 @@
                     <w:rPr>
                       <w:rFonts w:ascii="Calibri" w:cs="Calibri" w:eastAsia="Calibri" w:hAnsi="Calibri"/>
                       <w:color w:val="000000"/>
-                      <w:sz w:val="19"/>
-                      <w:szCs w:val="19"/>
+                      <w:sz w:val="18"/>
+                      <w:szCs w:val="18"/>
                     </w:rPr>
                     <w:t xml:space="preserve"> / besser </w:t>
                   </w:r>
@@ -3918,8 +3929,8 @@
                       <w:b/>
                       <w:bCs/>
                       <w:color w:val="3F7CC4"/>
-                      <w:sz w:val="19"/>
-                      <w:szCs w:val="19"/>
+                      <w:sz w:val="18"/>
+                      <w:szCs w:val="18"/>
                     </w:rPr>
                     <w:t xml:space="preserve">verteidigen</w:t>
                   </w:r>
@@ -3927,8 +3938,8 @@
                     <w:rPr>
                       <w:rFonts w:ascii="Calibri" w:cs="Calibri" w:eastAsia="Calibri" w:hAnsi="Calibri"/>
                       <w:color w:val="000000"/>
-                      <w:sz w:val="19"/>
-                      <w:szCs w:val="19"/>
+                      <w:sz w:val="18"/>
+                      <w:szCs w:val="18"/>
                     </w:rPr>
                     <w:t xml:space="preserve">.</w:t>
                   </w:r>
@@ -3936,8 +3947,8 @@
                     <w:rPr>
                       <w:rFonts w:ascii="Calibri" w:cs="Calibri" w:eastAsia="Calibri" w:hAnsi="Calibri"/>
                       <w:color w:val="9AA3B5"/>
-                      <w:sz w:val="19"/>
-                      <w:szCs w:val="19"/>
+                      <w:sz w:val="18"/>
+                      <w:szCs w:val="18"/>
                     </w:rPr>
                     <w:t xml:space="preserve">   ·   </w:t>
                   </w:r>
@@ -3945,8 +3956,8 @@
                     <w:rPr>
                       <w:rFonts w:ascii="Calibri" w:cs="Calibri" w:eastAsia="Calibri" w:hAnsi="Calibri"/>
                       <w:color w:val="000000"/>
-                      <w:sz w:val="19"/>
-                      <w:szCs w:val="19"/>
+                      <w:sz w:val="18"/>
+                      <w:szCs w:val="18"/>
                     </w:rPr>
                     <w:t xml:space="preserve">Ich </w:t>
                   </w:r>
@@ -3956,8 +3967,8 @@
                       <w:b/>
                       <w:bCs/>
                       <w:color w:val="D9534F"/>
-                      <w:sz w:val="19"/>
-                      <w:szCs w:val="19"/>
+                      <w:sz w:val="18"/>
+                      <w:szCs w:val="18"/>
                     </w:rPr>
                     <w:t xml:space="preserve">werde</w:t>
                   </w:r>
@@ -3965,8 +3976,8 @@
                     <w:rPr>
                       <w:rFonts w:ascii="Calibri" w:cs="Calibri" w:eastAsia="Calibri" w:hAnsi="Calibri"/>
                       <w:color w:val="000000"/>
-                      <w:sz w:val="19"/>
-                      <w:szCs w:val="19"/>
+                      <w:sz w:val="18"/>
+                      <w:szCs w:val="18"/>
                     </w:rPr>
                     <w:t xml:space="preserve"> noch mehr </w:t>
                   </w:r>
@@ -3976,8 +3987,8 @@
                       <w:b/>
                       <w:bCs/>
                       <w:color w:val="3F7CC4"/>
-                      <w:sz w:val="19"/>
-                      <w:szCs w:val="19"/>
+                      <w:sz w:val="18"/>
+                      <w:szCs w:val="18"/>
                     </w:rPr>
                     <w:t xml:space="preserve">trainieren</w:t>
                   </w:r>
@@ -3985,22 +3996,22 @@
                     <w:rPr>
                       <w:rFonts w:ascii="Calibri" w:cs="Calibri" w:eastAsia="Calibri" w:hAnsi="Calibri"/>
                       <w:color w:val="000000"/>
-                      <w:sz w:val="19"/>
-                      <w:szCs w:val="19"/>
+                      <w:sz w:val="18"/>
+                      <w:szCs w:val="18"/>
                     </w:rPr>
                     <w:t xml:space="preserve">.</w:t>
                   </w:r>
                 </w:p>
                 <w:p>
                   <w:pPr>
-                    <w:spacing w:after="40" w:before="0"/>
-                  </w:pPr>
-                  <w:r>
-                    <w:rPr>
-                      <w:rFonts w:ascii="Calibri" w:cs="Calibri" w:eastAsia="Calibri" w:hAnsi="Calibri"/>
-                      <w:color w:val="000000"/>
-                      <w:sz w:val="19"/>
-                      <w:szCs w:val="19"/>
+                    <w:spacing w:after="20" w:before="0"/>
+                  </w:pPr>
+                  <w:r>
+                    <w:rPr>
+                      <w:rFonts w:ascii="Calibri" w:cs="Calibri" w:eastAsia="Calibri" w:hAnsi="Calibri"/>
+                      <w:color w:val="000000"/>
+                      <w:sz w:val="18"/>
+                      <w:szCs w:val="18"/>
                     </w:rPr>
                     <w:t xml:space="preserve">Nächstes Mal </w:t>
                   </w:r>
@@ -4010,8 +4021,8 @@
                       <w:b/>
                       <w:bCs/>
                       <w:color w:val="D9534F"/>
-                      <w:sz w:val="19"/>
-                      <w:szCs w:val="19"/>
+                      <w:sz w:val="18"/>
+                      <w:szCs w:val="18"/>
                     </w:rPr>
                     <w:t xml:space="preserve">werde</w:t>
                   </w:r>
@@ -4019,8 +4030,8 @@
                     <w:rPr>
                       <w:rFonts w:ascii="Calibri" w:cs="Calibri" w:eastAsia="Calibri" w:hAnsi="Calibri"/>
                       <w:color w:val="000000"/>
-                      <w:sz w:val="19"/>
-                      <w:szCs w:val="19"/>
+                      <w:sz w:val="18"/>
+                      <w:szCs w:val="18"/>
                     </w:rPr>
                     <w:t xml:space="preserve"> ich … </w:t>
                   </w:r>
@@ -4030,8 +4041,8 @@
                       <w:b/>
                       <w:bCs/>
                       <w:color w:val="3F7CC4"/>
-                      <w:sz w:val="19"/>
-                      <w:szCs w:val="19"/>
+                      <w:sz w:val="18"/>
+                      <w:szCs w:val="18"/>
                     </w:rPr>
                     <w:t xml:space="preserve">schaffen</w:t>
                   </w:r>
@@ -4039,8 +4050,8 @@
                     <w:rPr>
                       <w:rFonts w:ascii="Calibri" w:cs="Calibri" w:eastAsia="Calibri" w:hAnsi="Calibri"/>
                       <w:color w:val="000000"/>
-                      <w:sz w:val="19"/>
-                      <w:szCs w:val="19"/>
+                      <w:sz w:val="18"/>
+                      <w:szCs w:val="18"/>
                     </w:rPr>
                     <w:t xml:space="preserve">.</w:t>
                   </w:r>
@@ -4048,8 +4059,8 @@
                     <w:rPr>
                       <w:rFonts w:ascii="Calibri" w:cs="Calibri" w:eastAsia="Calibri" w:hAnsi="Calibri"/>
                       <w:color w:val="9AA3B5"/>
-                      <w:sz w:val="19"/>
-                      <w:szCs w:val="19"/>
+                      <w:sz w:val="18"/>
+                      <w:szCs w:val="18"/>
                     </w:rPr>
                     <w:t xml:space="preserve">   ·   </w:t>
                   </w:r>
@@ -4057,8 +4068,8 @@
                     <w:rPr>
                       <w:rFonts w:ascii="Calibri" w:cs="Calibri" w:eastAsia="Calibri" w:hAnsi="Calibri"/>
                       <w:color w:val="000000"/>
-                      <w:sz w:val="19"/>
-                      <w:szCs w:val="19"/>
+                      <w:sz w:val="18"/>
+                      <w:szCs w:val="18"/>
                     </w:rPr>
                     <w:t xml:space="preserve">Wir </w:t>
                   </w:r>
@@ -4068,8 +4079,8 @@
                       <w:b/>
                       <w:bCs/>
                       <w:color w:val="D9534F"/>
-                      <w:sz w:val="19"/>
-                      <w:szCs w:val="19"/>
+                      <w:sz w:val="18"/>
+                      <w:szCs w:val="18"/>
                     </w:rPr>
                     <w:t xml:space="preserve">werden</w:t>
                   </w:r>
@@ -4077,8 +4088,8 @@
                     <w:rPr>
                       <w:rFonts w:ascii="Calibri" w:cs="Calibri" w:eastAsia="Calibri" w:hAnsi="Calibri"/>
                       <w:color w:val="000000"/>
-                      <w:sz w:val="19"/>
-                      <w:szCs w:val="19"/>
+                      <w:sz w:val="18"/>
+                      <w:szCs w:val="18"/>
                     </w:rPr>
                     <w:t xml:space="preserve"> die Abwehr </w:t>
                   </w:r>
@@ -4088,8 +4099,8 @@
                       <w:b/>
                       <w:bCs/>
                       <w:color w:val="3F7CC4"/>
-                      <w:sz w:val="19"/>
-                      <w:szCs w:val="19"/>
+                      <w:sz w:val="18"/>
+                      <w:szCs w:val="18"/>
                     </w:rPr>
                     <w:t xml:space="preserve">verbessern</w:t>
                   </w:r>
@@ -4097,8 +4108,8 @@
                     <w:rPr>
                       <w:rFonts w:ascii="Calibri" w:cs="Calibri" w:eastAsia="Calibri" w:hAnsi="Calibri"/>
                       <w:color w:val="000000"/>
-                      <w:sz w:val="19"/>
-                      <w:szCs w:val="19"/>
+                      <w:sz w:val="18"/>
+                      <w:szCs w:val="18"/>
                     </w:rPr>
                     <w:t xml:space="preserve">.</w:t>
                   </w:r>
@@ -4108,7 +4119,7 @@
           </w:tbl>
           <w:p>
             <w:pPr>
-              <w:spacing w:after="100" w:before="80"/>
+              <w:spacing w:after="60" w:before="80"/>
             </w:pPr>
             <w:r>
               <w:rPr>
@@ -4133,18 +4144,182 @@
           </w:p>
           <w:p>
             <w:pPr>
-              <w:spacing w:after="0" w:before="0"/>
+              <w:spacing w:after="0" w:before="100"/>
             </w:pPr>
             <w:r>
               <w:rPr>
                 <w:rFonts w:ascii="Calibri" w:cs="Calibri" w:eastAsia="Calibri" w:hAnsi="Calibri"/>
                 <w:b/>
                 <w:bCs/>
+                <w:color w:val="000000"/>
+                <w:sz w:val="18"/>
+                <w:szCs w:val="18"/>
+              </w:rPr>
+              <w:t xml:space="preserve">Prüfe vor dem Abgeben:  </w:t>
+            </w:r>
+            <w:r>
+              <w:rPr>
+                <w:rFonts w:ascii="Calibri" w:cs="Calibri" w:eastAsia="Calibri" w:hAnsi="Calibri"/>
+                <w:color w:val="000000"/>
+                <w:sz w:val="18"/>
+                <w:szCs w:val="18"/>
+              </w:rPr>
+              <w:t xml:space="preserve">☐ alle fünf Zeitformen drin   ☐ Hilfsverb rot, Partizip II gelb, Infinitiv blau markiert   ☐ Präteritum-Verben unterstrichen</w:t>
+            </w:r>
+            <w:r>
+              <w:rPr>
+                <w:rFonts w:ascii="Calibri" w:cs="Calibri" w:eastAsia="Calibri" w:hAnsi="Calibri"/>
+                <w:i/>
+                <w:iCs/>
+                <w:color w:val="5B6B8C"/>
+                <w:sz w:val="18"/>
+                <w:szCs w:val="18"/>
+              </w:rPr>
+              <w:t xml:space="preserve">     Fertig? Stift hinlegen.</w:t>
+            </w:r>
+          </w:p>
+        </w:tc>
+      </w:tr>
+    </w:tbl>
+    <w:p>
+      <w:pPr>
+        <w:spacing w:after="60" w:before="60"/>
+        <w:jc w:val="center"/>
+      </w:pPr>
+      <w:r>
+        <w:rPr>
+          <w:rFonts w:ascii="Calibri" w:cs="Calibri" w:eastAsia="Calibri" w:hAnsi="Calibri"/>
+          <w:color w:val="9AA3B5"/>
+          <w:sz w:val="16"/>
+          <w:szCs w:val="16"/>
+        </w:rPr>
+        <w:t xml:space="preserve">✂ - - - - - - - - - - - - - - - - - - - - - - - - - - - - - - - - - - - - - - - - - - - - - - - - - - - - - - - - - - - - - -</w:t>
+      </w:r>
+    </w:p>
+    <w:tbl>
+      <w:tblPr>
+        <w:tblW w:type="dxa" w:w="10706"/>
+        <w:tblBorders>
+          <w:top w:val="single" w:color="auto" w:sz="4"/>
+          <w:left w:val="single" w:color="auto" w:sz="4"/>
+          <w:bottom w:val="single" w:color="auto" w:sz="4"/>
+          <w:right w:val="single" w:color="auto" w:sz="4"/>
+          <w:insideH w:val="single" w:color="auto" w:sz="4"/>
+          <w:insideV w:val="single" w:color="auto" w:sz="4"/>
+        </w:tblBorders>
+      </w:tblPr>
+      <w:tblGrid>
+        <w:gridCol w:w="10706"/>
+      </w:tblGrid>
+      <w:tr>
+        <w:trPr>
+          <w:cantSplit/>
+        </w:trPr>
+        <w:tc>
+          <w:tcPr>
+            <w:tcW w:type="dxa" w:w="10706"/>
+            <w:tcBorders>
+              <w:top w:val="dashed" w:color="7A869E" w:sz="8"/>
+              <w:left w:val="dashed" w:color="7A869E" w:sz="8"/>
+              <w:bottom w:val="dashed" w:color="7A869E" w:sz="8"/>
+              <w:right w:val="dashed" w:color="7A869E" w:sz="8"/>
+            </w:tcBorders>
+            <w:tcMar>
+              <w:top w:type="dxa" w:w="130"/>
+              <w:left w:type="dxa" w:w="150"/>
+              <w:bottom w:type="dxa" w:w="130"/>
+              <w:right w:type="dxa" w:w="100"/>
+            </w:tcMar>
+            <w:vAlign w:val="top"/>
+          </w:tcPr>
+          <w:p>
+            <w:pPr>
+              <w:spacing w:after="80" w:before="0"/>
+            </w:pPr>
+            <w:r>
+              <w:rPr>
+                <w:rFonts w:ascii="Cambria" w:cs="Cambria" w:eastAsia="Cambria" w:hAnsi="Cambria"/>
+                <w:b/>
+                <w:bCs/>
                 <w:color w:val="1E2761"/>
-                <w:sz w:val="22"/>
-                <w:szCs w:val="22"/>
-              </w:rPr>
-              <w:t xml:space="preserve">Dein Text</w:t>
+                <w:sz w:val="28"/>
+                <w:szCs w:val="28"/>
+              </w:rPr>
+              <w:t xml:space="preserve">Exit-Ticket: Formulierungshilfen</w:t>
+            </w:r>
+          </w:p>
+          <w:p>
+            <w:pPr>
+              <w:spacing w:after="100" w:before="0"/>
+            </w:pPr>
+            <w:r>
+              <w:rPr>
+                <w:rFonts w:ascii="Calibri" w:cs="Calibri" w:eastAsia="Calibri" w:hAnsi="Calibri"/>
+                <w:color w:val="000000"/>
+                <w:sz w:val="21"/>
+                <w:szCs w:val="21"/>
+              </w:rPr>
+              <w:t xml:space="preserve">Schreibe auf ein </w:t>
+            </w:r>
+            <w:r>
+              <w:rPr>
+                <w:rFonts w:ascii="Calibri" w:cs="Calibri" w:eastAsia="Calibri" w:hAnsi="Calibri"/>
+                <w:b/>
+                <w:bCs/>
+                <w:color w:val="000000"/>
+                <w:sz w:val="21"/>
+                <w:szCs w:val="21"/>
+              </w:rPr>
+              <w:t xml:space="preserve">eigenes Blatt</w:t>
+            </w:r>
+            <w:r>
+              <w:rPr>
+                <w:rFonts w:ascii="Calibri" w:cs="Calibri" w:eastAsia="Calibri" w:hAnsi="Calibri"/>
+                <w:color w:val="000000"/>
+                <w:sz w:val="21"/>
+                <w:szCs w:val="21"/>
+              </w:rPr>
+              <w:t xml:space="preserve"> (Name oben rechts) </w:t>
+            </w:r>
+            <w:r>
+              <w:rPr>
+                <w:rFonts w:ascii="Calibri" w:cs="Calibri" w:eastAsia="Calibri" w:hAnsi="Calibri"/>
+                <w:b/>
+                <w:bCs/>
+                <w:color w:val="000000"/>
+                <w:sz w:val="21"/>
+                <w:szCs w:val="21"/>
+              </w:rPr>
+              <w:t xml:space="preserve">5–7 Sätze</w:t>
+            </w:r>
+            <w:r>
+              <w:rPr>
+                <w:rFonts w:ascii="Calibri" w:cs="Calibri" w:eastAsia="Calibri" w:hAnsi="Calibri"/>
+                <w:color w:val="000000"/>
+                <w:sz w:val="21"/>
+                <w:szCs w:val="21"/>
+              </w:rPr>
+              <w:t xml:space="preserve"> über deinen Wettkampf am Wochenende – nach dem Muster an der Tafel. Jede Zeitform kommt </w:t>
+            </w:r>
+            <w:r>
+              <w:rPr>
+                <w:rFonts w:ascii="Calibri" w:cs="Calibri" w:eastAsia="Calibri" w:hAnsi="Calibri"/>
+                <w:b/>
+                <w:bCs/>
+                <w:color w:val="000000"/>
+                <w:sz w:val="21"/>
+                <w:szCs w:val="21"/>
+              </w:rPr>
+              <w:t xml:space="preserve">mindestens einmal</w:t>
+            </w:r>
+            <w:r>
+              <w:rPr>
+                <w:rFonts w:ascii="Calibri" w:cs="Calibri" w:eastAsia="Calibri" w:hAnsi="Calibri"/>
+                <w:color w:val="000000"/>
+                <w:sz w:val="21"/>
+                <w:szCs w:val="21"/>
+              </w:rPr>
+              <w:t xml:space="preserve"> vor. Du kannst die Vorschläge übernehmen und ergänzen. Am Ende gibst du das Blatt ab.</w:t>
             </w:r>
           </w:p>
           <w:tbl>
@@ -4160,42 +4335,451 @@
               </w:tblBorders>
             </w:tblPr>
             <w:tblGrid>
-              <w:gridCol w:w="10406"/>
+              <w:gridCol w:w="2350"/>
+              <w:gridCol w:w="8056"/>
             </w:tblGrid>
             <w:tr>
               <w:trPr>
                 <w:cantSplit/>
-                <w:trHeight w:val="620" w:hRule="exact"/>
               </w:trPr>
               <w:tc>
                 <w:tcPr>
-                  <w:tcW w:type="dxa" w:w="10406"/>
+                  <w:tcW w:type="dxa" w:w="2350"/>
                   <w:tcBorders>
-                    <w:top w:val="none" w:color="FFFFFF" w:sz="0"/>
-                    <w:left w:val="none" w:color="FFFFFF" w:sz="0"/>
-                    <w:bottom w:val="single" w:color="9AA3B5" w:sz="6"/>
-                    <w:right w:val="none" w:color="FFFFFF" w:sz="0"/>
+                    <w:top w:val="single" w:color="B9C6E8" w:sz="6"/>
+                    <w:left w:val="single" w:color="B9C6E8" w:sz="6"/>
+                    <w:bottom w:val="single" w:color="B9C6E8" w:sz="6"/>
+                    <w:right w:val="single" w:color="B9C6E8" w:sz="6"/>
+                  </w:tcBorders>
+                  <w:shd w:fill="F4F7FD" w:color="auto" w:val="clear"/>
+                  <w:tcMar>
+                    <w:top w:type="dxa" w:w="70"/>
+                    <w:left w:type="dxa" w:w="100"/>
+                    <w:bottom w:type="dxa" w:w="70"/>
+                    <w:right w:type="dxa" w:w="100"/>
+                  </w:tcMar>
+                  <w:vAlign w:val="top"/>
+                </w:tcPr>
+                <w:p>
+                  <w:pPr>
+                    <w:spacing w:after="10" w:before="0"/>
+                  </w:pPr>
+                  <w:r>
+                    <w:rPr>
+                      <w:rFonts w:ascii="Cambria" w:cs="Cambria" w:eastAsia="Cambria" w:hAnsi="Cambria"/>
+                      <w:b/>
+                      <w:bCs/>
+                      <w:color w:val="1E2761"/>
+                      <w:sz w:val="20"/>
+                      <w:szCs w:val="20"/>
+                    </w:rPr>
+                    <w:t xml:space="preserve">Plusquamperfekt</w:t>
+                  </w:r>
+                </w:p>
+                <w:p>
+                  <w:pPr>
+                    <w:spacing w:after="10" w:before="0"/>
+                  </w:pPr>
+                  <w:r>
+                    <w:rPr>
+                      <w:rFonts w:ascii="Calibri" w:cs="Calibri" w:eastAsia="Calibri" w:hAnsi="Calibri"/>
+                      <w:color w:val="5B6B8C"/>
+                      <w:sz w:val="16"/>
+                      <w:szCs w:val="16"/>
+                    </w:rPr>
+                    <w:t xml:space="preserve">vorher</w:t>
+                  </w:r>
+                </w:p>
+                <w:p>
+                  <w:pPr>
+                    <w:spacing w:after="0" w:before="0"/>
+                  </w:pPr>
+                  <w:r>
+                    <w:rPr>
+                      <w:rFonts w:ascii="Calibri" w:cs="Calibri" w:eastAsia="Calibri" w:hAnsi="Calibri"/>
+                      <w:b/>
+                      <w:bCs/>
+                      <w:color w:val="D9534F"/>
+                      <w:sz w:val="16"/>
+                      <w:szCs w:val="16"/>
+                    </w:rPr>
+                    <w:t xml:space="preserve">hatte/war</w:t>
+                  </w:r>
+                  <w:r>
+                    <w:rPr>
+                      <w:rFonts w:ascii="Calibri" w:cs="Calibri" w:eastAsia="Calibri" w:hAnsi="Calibri"/>
+                      <w:b/>
+                      <w:bCs/>
+                      <w:color w:val="333333"/>
+                      <w:sz w:val="16"/>
+                      <w:szCs w:val="16"/>
+                    </w:rPr>
+                    <w:t xml:space="preserve"> + </w:t>
+                  </w:r>
+                  <w:r>
+                    <w:rPr>
+                      <w:rFonts w:ascii="Calibri" w:cs="Calibri" w:eastAsia="Calibri" w:hAnsi="Calibri"/>
+                      <w:b/>
+                      <w:bCs/>
+                      <w:color w:val="C98A1E"/>
+                      <w:sz w:val="16"/>
+                      <w:szCs w:val="16"/>
+                    </w:rPr>
+                    <w:t xml:space="preserve">Partizip II</w:t>
+                  </w:r>
+                </w:p>
+              </w:tc>
+              <w:tc>
+                <w:tcPr>
+                  <w:tcW w:type="dxa" w:w="8056"/>
+                  <w:tcBorders>
+                    <w:top w:val="single" w:color="B9C6E8" w:sz="6"/>
+                    <w:left w:val="single" w:color="B9C6E8" w:sz="6"/>
+                    <w:bottom w:val="single" w:color="B9C6E8" w:sz="6"/>
+                    <w:right w:val="single" w:color="B9C6E8" w:sz="6"/>
                   </w:tcBorders>
                   <w:tcMar>
-                    <w:top w:type="dxa" w:w="60"/>
+                    <w:top w:type="dxa" w:w="70"/>
                     <w:left w:type="dxa" w:w="100"/>
-                    <w:bottom w:type="dxa" w:w="60"/>
+                    <w:bottom w:type="dxa" w:w="70"/>
                     <w:right w:type="dxa" w:w="100"/>
                   </w:tcMar>
-                  <w:vAlign w:val="center"/>
+                  <w:vAlign w:val="top"/>
                 </w:tcPr>
                 <w:p>
                   <w:pPr>
-                    <w:spacing w:after="0" w:before="0"/>
-                  </w:pPr>
-                  <w:r>
-                    <w:rPr>
-                      <w:rFonts w:ascii="Calibri" w:cs="Calibri" w:eastAsia="Calibri" w:hAnsi="Calibri"/>
-                      <w:color w:val="000000"/>
-                      <w:sz w:val="22"/>
-                      <w:szCs w:val="22"/>
-                    </w:rPr>
-                    <w:t xml:space="preserve"/>
+                    <w:spacing w:after="20" w:before="0"/>
+                  </w:pPr>
+                  <w:r>
+                    <w:rPr>
+                      <w:rFonts w:ascii="Calibri" w:cs="Calibri" w:eastAsia="Calibri" w:hAnsi="Calibri"/>
+                      <w:color w:val="000000"/>
+                      <w:sz w:val="18"/>
+                      <w:szCs w:val="18"/>
+                    </w:rPr>
+                    <w:t xml:space="preserve">Vor dem Wettkampf </w:t>
+                  </w:r>
+                  <w:r>
+                    <w:rPr>
+                      <w:rFonts w:ascii="Calibri" w:cs="Calibri" w:eastAsia="Calibri" w:hAnsi="Calibri"/>
+                      <w:b/>
+                      <w:bCs/>
+                      <w:color w:val="D9534F"/>
+                      <w:sz w:val="18"/>
+                      <w:szCs w:val="18"/>
+                    </w:rPr>
+                    <w:t xml:space="preserve">hatte</w:t>
+                  </w:r>
+                  <w:r>
+                    <w:rPr>
+                      <w:rFonts w:ascii="Calibri" w:cs="Calibri" w:eastAsia="Calibri" w:hAnsi="Calibri"/>
+                      <w:color w:val="000000"/>
+                      <w:sz w:val="18"/>
+                      <w:szCs w:val="18"/>
+                    </w:rPr>
+                    <w:t xml:space="preserve"> ich wochenlang hart </w:t>
+                  </w:r>
+                  <w:r>
+                    <w:rPr>
+                      <w:rFonts w:ascii="Calibri" w:cs="Calibri" w:eastAsia="Calibri" w:hAnsi="Calibri"/>
+                      <w:b/>
+                      <w:bCs/>
+                      <w:color w:val="C98A1E"/>
+                      <w:sz w:val="18"/>
+                      <w:szCs w:val="18"/>
+                    </w:rPr>
+                    <w:t xml:space="preserve">trainiert</w:t>
+                  </w:r>
+                  <w:r>
+                    <w:rPr>
+                      <w:rFonts w:ascii="Calibri" w:cs="Calibri" w:eastAsia="Calibri" w:hAnsi="Calibri"/>
+                      <w:color w:val="000000"/>
+                      <w:sz w:val="18"/>
+                      <w:szCs w:val="18"/>
+                    </w:rPr>
+                    <w:t xml:space="preserve">.</w:t>
+                  </w:r>
+                  <w:r>
+                    <w:rPr>
+                      <w:rFonts w:ascii="Calibri" w:cs="Calibri" w:eastAsia="Calibri" w:hAnsi="Calibri"/>
+                      <w:color w:val="9AA3B5"/>
+                      <w:sz w:val="18"/>
+                      <w:szCs w:val="18"/>
+                    </w:rPr>
+                    <w:t xml:space="preserve">   ·   </w:t>
+                  </w:r>
+                  <w:r>
+                    <w:rPr>
+                      <w:rFonts w:ascii="Calibri" w:cs="Calibri" w:eastAsia="Calibri" w:hAnsi="Calibri"/>
+                      <w:color w:val="000000"/>
+                      <w:sz w:val="18"/>
+                      <w:szCs w:val="18"/>
+                    </w:rPr>
+                    <w:t xml:space="preserve">Am Abend davor </w:t>
+                  </w:r>
+                  <w:r>
+                    <w:rPr>
+                      <w:rFonts w:ascii="Calibri" w:cs="Calibri" w:eastAsia="Calibri" w:hAnsi="Calibri"/>
+                      <w:b/>
+                      <w:bCs/>
+                      <w:color w:val="D9534F"/>
+                      <w:sz w:val="18"/>
+                      <w:szCs w:val="18"/>
+                    </w:rPr>
+                    <w:t xml:space="preserve">hatte</w:t>
+                  </w:r>
+                  <w:r>
+                    <w:rPr>
+                      <w:rFonts w:ascii="Calibri" w:cs="Calibri" w:eastAsia="Calibri" w:hAnsi="Calibri"/>
+                      <w:color w:val="000000"/>
+                      <w:sz w:val="18"/>
+                      <w:szCs w:val="18"/>
+                    </w:rPr>
+                    <w:t xml:space="preserve"> ich kaum </w:t>
+                  </w:r>
+                  <w:r>
+                    <w:rPr>
+                      <w:rFonts w:ascii="Calibri" w:cs="Calibri" w:eastAsia="Calibri" w:hAnsi="Calibri"/>
+                      <w:b/>
+                      <w:bCs/>
+                      <w:color w:val="C98A1E"/>
+                      <w:sz w:val="18"/>
+                      <w:szCs w:val="18"/>
+                    </w:rPr>
+                    <w:t xml:space="preserve">geschlafen</w:t>
+                  </w:r>
+                  <w:r>
+                    <w:rPr>
+                      <w:rFonts w:ascii="Calibri" w:cs="Calibri" w:eastAsia="Calibri" w:hAnsi="Calibri"/>
+                      <w:color w:val="000000"/>
+                      <w:sz w:val="18"/>
+                      <w:szCs w:val="18"/>
+                    </w:rPr>
+                    <w:t xml:space="preserve">.</w:t>
+                  </w:r>
+                </w:p>
+                <w:p>
+                  <w:pPr>
+                    <w:spacing w:after="20" w:before="0"/>
+                  </w:pPr>
+                  <w:r>
+                    <w:rPr>
+                      <w:rFonts w:ascii="Calibri" w:cs="Calibri" w:eastAsia="Calibri" w:hAnsi="Calibri"/>
+                      <w:color w:val="000000"/>
+                      <w:sz w:val="18"/>
+                      <w:szCs w:val="18"/>
+                    </w:rPr>
+                    <w:t xml:space="preserve">Am Freitag </w:t>
+                  </w:r>
+                  <w:r>
+                    <w:rPr>
+                      <w:rFonts w:ascii="Calibri" w:cs="Calibri" w:eastAsia="Calibri" w:hAnsi="Calibri"/>
+                      <w:b/>
+                      <w:bCs/>
+                      <w:color w:val="D9534F"/>
+                      <w:sz w:val="18"/>
+                      <w:szCs w:val="18"/>
+                    </w:rPr>
+                    <w:t xml:space="preserve">waren</w:t>
+                  </w:r>
+                  <w:r>
+                    <w:rPr>
+                      <w:rFonts w:ascii="Calibri" w:cs="Calibri" w:eastAsia="Calibri" w:hAnsi="Calibri"/>
+                      <w:color w:val="000000"/>
+                      <w:sz w:val="18"/>
+                      <w:szCs w:val="18"/>
+                    </w:rPr>
+                    <w:t xml:space="preserve"> wir mit dem Team nach … </w:t>
+                  </w:r>
+                  <w:r>
+                    <w:rPr>
+                      <w:rFonts w:ascii="Calibri" w:cs="Calibri" w:eastAsia="Calibri" w:hAnsi="Calibri"/>
+                      <w:b/>
+                      <w:bCs/>
+                      <w:color w:val="C98A1E"/>
+                      <w:sz w:val="18"/>
+                      <w:szCs w:val="18"/>
+                    </w:rPr>
+                    <w:t xml:space="preserve">gefahren</w:t>
+                  </w:r>
+                  <w:r>
+                    <w:rPr>
+                      <w:rFonts w:ascii="Calibri" w:cs="Calibri" w:eastAsia="Calibri" w:hAnsi="Calibri"/>
+                      <w:color w:val="000000"/>
+                      <w:sz w:val="18"/>
+                      <w:szCs w:val="18"/>
+                    </w:rPr>
+                    <w:t xml:space="preserve">.</w:t>
+                  </w:r>
+                  <w:r>
+                    <w:rPr>
+                      <w:rFonts w:ascii="Calibri" w:cs="Calibri" w:eastAsia="Calibri" w:hAnsi="Calibri"/>
+                      <w:color w:val="9AA3B5"/>
+                      <w:sz w:val="18"/>
+                      <w:szCs w:val="18"/>
+                    </w:rPr>
+                    <w:t xml:space="preserve">   ·   </w:t>
+                  </w:r>
+                  <w:r>
+                    <w:rPr>
+                      <w:rFonts w:ascii="Calibri" w:cs="Calibri" w:eastAsia="Calibri" w:hAnsi="Calibri"/>
+                      <w:color w:val="000000"/>
+                      <w:sz w:val="18"/>
+                      <w:szCs w:val="18"/>
+                    </w:rPr>
+                    <w:t xml:space="preserve">Mein Trainer </w:t>
+                  </w:r>
+                  <w:r>
+                    <w:rPr>
+                      <w:rFonts w:ascii="Calibri" w:cs="Calibri" w:eastAsia="Calibri" w:hAnsi="Calibri"/>
+                      <w:b/>
+                      <w:bCs/>
+                      <w:color w:val="D9534F"/>
+                      <w:sz w:val="18"/>
+                      <w:szCs w:val="18"/>
+                    </w:rPr>
+                    <w:t xml:space="preserve">hatte</w:t>
+                  </w:r>
+                  <w:r>
+                    <w:rPr>
+                      <w:rFonts w:ascii="Calibri" w:cs="Calibri" w:eastAsia="Calibri" w:hAnsi="Calibri"/>
+                      <w:color w:val="000000"/>
+                      <w:sz w:val="18"/>
+                      <w:szCs w:val="18"/>
+                    </w:rPr>
+                    <w:t xml:space="preserve"> mir noch einen Tipp </w:t>
+                  </w:r>
+                  <w:r>
+                    <w:rPr>
+                      <w:rFonts w:ascii="Calibri" w:cs="Calibri" w:eastAsia="Calibri" w:hAnsi="Calibri"/>
+                      <w:b/>
+                      <w:bCs/>
+                      <w:color w:val="C98A1E"/>
+                      <w:sz w:val="18"/>
+                      <w:szCs w:val="18"/>
+                    </w:rPr>
+                    <w:t xml:space="preserve">gegeben</w:t>
+                  </w:r>
+                  <w:r>
+                    <w:rPr>
+                      <w:rFonts w:ascii="Calibri" w:cs="Calibri" w:eastAsia="Calibri" w:hAnsi="Calibri"/>
+                      <w:color w:val="000000"/>
+                      <w:sz w:val="18"/>
+                      <w:szCs w:val="18"/>
+                    </w:rPr>
+                    <w:t xml:space="preserve">.</w:t>
+                  </w:r>
+                </w:p>
+                <w:p>
+                  <w:pPr>
+                    <w:spacing w:after="20" w:before="0"/>
+                  </w:pPr>
+                  <w:r>
+                    <w:rPr>
+                      <w:rFonts w:ascii="Calibri" w:cs="Calibri" w:eastAsia="Calibri" w:hAnsi="Calibri"/>
+                      <w:color w:val="000000"/>
+                      <w:sz w:val="18"/>
+                      <w:szCs w:val="18"/>
+                    </w:rPr>
+                    <w:t xml:space="preserve">Ich </w:t>
+                  </w:r>
+                  <w:r>
+                    <w:rPr>
+                      <w:rFonts w:ascii="Calibri" w:cs="Calibri" w:eastAsia="Calibri" w:hAnsi="Calibri"/>
+                      <w:b/>
+                      <w:bCs/>
+                      <w:color w:val="D9534F"/>
+                      <w:sz w:val="18"/>
+                      <w:szCs w:val="18"/>
+                    </w:rPr>
+                    <w:t xml:space="preserve">hatte</w:t>
+                  </w:r>
+                  <w:r>
+                    <w:rPr>
+                      <w:rFonts w:ascii="Calibri" w:cs="Calibri" w:eastAsia="Calibri" w:hAnsi="Calibri"/>
+                      <w:color w:val="000000"/>
+                      <w:sz w:val="18"/>
+                      <w:szCs w:val="18"/>
+                    </w:rPr>
+                    <w:t xml:space="preserve"> mich lange </w:t>
+                  </w:r>
+                  <w:r>
+                    <w:rPr>
+                      <w:rFonts w:ascii="Calibri" w:cs="Calibri" w:eastAsia="Calibri" w:hAnsi="Calibri"/>
+                      <w:b/>
+                      <w:bCs/>
+                      <w:color w:val="C98A1E"/>
+                      <w:sz w:val="18"/>
+                      <w:szCs w:val="18"/>
+                    </w:rPr>
+                    <w:t xml:space="preserve">aufgewärmt</w:t>
+                  </w:r>
+                  <w:r>
+                    <w:rPr>
+                      <w:rFonts w:ascii="Calibri" w:cs="Calibri" w:eastAsia="Calibri" w:hAnsi="Calibri"/>
+                      <w:color w:val="000000"/>
+                      <w:sz w:val="18"/>
+                      <w:szCs w:val="18"/>
+                    </w:rPr>
+                    <w:t xml:space="preserve">.</w:t>
+                  </w:r>
+                  <w:r>
+                    <w:rPr>
+                      <w:rFonts w:ascii="Calibri" w:cs="Calibri" w:eastAsia="Calibri" w:hAnsi="Calibri"/>
+                      <w:color w:val="9AA3B5"/>
+                      <w:sz w:val="18"/>
+                      <w:szCs w:val="18"/>
+                    </w:rPr>
+                    <w:t xml:space="preserve">   ·   </w:t>
+                  </w:r>
+                  <w:r>
+                    <w:rPr>
+                      <w:rFonts w:ascii="Calibri" w:cs="Calibri" w:eastAsia="Calibri" w:hAnsi="Calibri"/>
+                      <w:color w:val="000000"/>
+                      <w:sz w:val="18"/>
+                      <w:szCs w:val="18"/>
+                    </w:rPr>
+                    <w:t xml:space="preserve">Wir </w:t>
+                  </w:r>
+                  <w:r>
+                    <w:rPr>
+                      <w:rFonts w:ascii="Calibri" w:cs="Calibri" w:eastAsia="Calibri" w:hAnsi="Calibri"/>
+                      <w:b/>
+                      <w:bCs/>
+                      <w:color w:val="D9534F"/>
+                      <w:sz w:val="18"/>
+                      <w:szCs w:val="18"/>
+                    </w:rPr>
+                    <w:t xml:space="preserve">waren</w:t>
+                  </w:r>
+                  <w:r>
+                    <w:rPr>
+                      <w:rFonts w:ascii="Calibri" w:cs="Calibri" w:eastAsia="Calibri" w:hAnsi="Calibri"/>
+                      <w:color w:val="000000"/>
+                      <w:sz w:val="18"/>
+                      <w:szCs w:val="18"/>
+                    </w:rPr>
+                    <w:t xml:space="preserve"> früh </w:t>
+                  </w:r>
+                  <w:r>
+                    <w:rPr>
+                      <w:rFonts w:ascii="Calibri" w:cs="Calibri" w:eastAsia="Calibri" w:hAnsi="Calibri"/>
+                      <w:b/>
+                      <w:bCs/>
+                      <w:color w:val="C98A1E"/>
+                      <w:sz w:val="18"/>
+                      <w:szCs w:val="18"/>
+                    </w:rPr>
+                    <w:t xml:space="preserve">aufgestanden</w:t>
+                  </w:r>
+                  <w:r>
+                    <w:rPr>
+                      <w:rFonts w:ascii="Calibri" w:cs="Calibri" w:eastAsia="Calibri" w:hAnsi="Calibri"/>
+                      <w:color w:val="000000"/>
+                      <w:sz w:val="18"/>
+                      <w:szCs w:val="18"/>
+                    </w:rPr>
+                    <w:t xml:space="preserve">.</w:t>
                   </w:r>
                 </w:p>
               </w:tc>
@@ -4203,37 +4787,358 @@
             <w:tr>
               <w:trPr>
                 <w:cantSplit/>
-                <w:trHeight w:val="620" w:hRule="exact"/>
               </w:trPr>
               <w:tc>
                 <w:tcPr>
-                  <w:tcW w:type="dxa" w:w="10406"/>
+                  <w:tcW w:type="dxa" w:w="2350"/>
                   <w:tcBorders>
-                    <w:top w:val="none" w:color="FFFFFF" w:sz="0"/>
-                    <w:left w:val="none" w:color="FFFFFF" w:sz="0"/>
-                    <w:bottom w:val="single" w:color="9AA3B5" w:sz="6"/>
-                    <w:right w:val="none" w:color="FFFFFF" w:sz="0"/>
+                    <w:top w:val="single" w:color="B9C6E8" w:sz="6"/>
+                    <w:left w:val="single" w:color="B9C6E8" w:sz="6"/>
+                    <w:bottom w:val="single" w:color="B9C6E8" w:sz="6"/>
+                    <w:right w:val="single" w:color="B9C6E8" w:sz="6"/>
+                  </w:tcBorders>
+                  <w:shd w:fill="F4F7FD" w:color="auto" w:val="clear"/>
+                  <w:tcMar>
+                    <w:top w:type="dxa" w:w="70"/>
+                    <w:left w:type="dxa" w:w="100"/>
+                    <w:bottom w:type="dxa" w:w="70"/>
+                    <w:right w:type="dxa" w:w="100"/>
+                  </w:tcMar>
+                  <w:vAlign w:val="top"/>
+                </w:tcPr>
+                <w:p>
+                  <w:pPr>
+                    <w:spacing w:after="10" w:before="0"/>
+                  </w:pPr>
+                  <w:r>
+                    <w:rPr>
+                      <w:rFonts w:ascii="Cambria" w:cs="Cambria" w:eastAsia="Cambria" w:hAnsi="Cambria"/>
+                      <w:b/>
+                      <w:bCs/>
+                      <w:color w:val="1E2761"/>
+                      <w:sz w:val="20"/>
+                      <w:szCs w:val="20"/>
+                    </w:rPr>
+                    <w:t xml:space="preserve">Präteritum</w:t>
+                  </w:r>
+                </w:p>
+                <w:p>
+                  <w:pPr>
+                    <w:spacing w:after="10" w:before="0"/>
+                  </w:pPr>
+                  <w:r>
+                    <w:rPr>
+                      <w:rFonts w:ascii="Calibri" w:cs="Calibri" w:eastAsia="Calibri" w:hAnsi="Calibri"/>
+                      <w:color w:val="5B6B8C"/>
+                      <w:sz w:val="16"/>
+                      <w:szCs w:val="16"/>
+                    </w:rPr>
+                    <w:t xml:space="preserve">Vergangenheit – erzählt</w:t>
+                  </w:r>
+                </w:p>
+                <w:p>
+                  <w:pPr>
+                    <w:spacing w:after="0" w:before="0"/>
+                  </w:pPr>
+                  <w:r>
+                    <w:rPr>
+                      <w:rFonts w:ascii="Calibri" w:cs="Calibri" w:eastAsia="Calibri" w:hAnsi="Calibri"/>
+                      <w:b/>
+                      <w:bCs/>
+                      <w:color w:val="333333"/>
+                      <w:sz w:val="16"/>
+                      <w:szCs w:val="16"/>
+                    </w:rPr>
+                    <w:t xml:space="preserve">finites Verb im Präteritum</w:t>
+                  </w:r>
+                </w:p>
+              </w:tc>
+              <w:tc>
+                <w:tcPr>
+                  <w:tcW w:type="dxa" w:w="8056"/>
+                  <w:tcBorders>
+                    <w:top w:val="single" w:color="B9C6E8" w:sz="6"/>
+                    <w:left w:val="single" w:color="B9C6E8" w:sz="6"/>
+                    <w:bottom w:val="single" w:color="B9C6E8" w:sz="6"/>
+                    <w:right w:val="single" w:color="B9C6E8" w:sz="6"/>
                   </w:tcBorders>
                   <w:tcMar>
-                    <w:top w:type="dxa" w:w="60"/>
+                    <w:top w:type="dxa" w:w="70"/>
                     <w:left w:type="dxa" w:w="100"/>
-                    <w:bottom w:type="dxa" w:w="60"/>
+                    <w:bottom w:type="dxa" w:w="70"/>
                     <w:right w:type="dxa" w:w="100"/>
                   </w:tcMar>
-                  <w:vAlign w:val="center"/>
+                  <w:vAlign w:val="top"/>
                 </w:tcPr>
                 <w:p>
                   <w:pPr>
-                    <w:spacing w:after="0" w:before="0"/>
-                  </w:pPr>
-                  <w:r>
-                    <w:rPr>
-                      <w:rFonts w:ascii="Calibri" w:cs="Calibri" w:eastAsia="Calibri" w:hAnsi="Calibri"/>
-                      <w:color w:val="000000"/>
-                      <w:sz w:val="22"/>
-                      <w:szCs w:val="22"/>
-                    </w:rPr>
-                    <w:t xml:space="preserve"/>
+                    <w:spacing w:after="20" w:before="0"/>
+                  </w:pPr>
+                  <w:r>
+                    <w:rPr>
+                      <w:rFonts w:ascii="Calibri" w:cs="Calibri" w:eastAsia="Calibri" w:hAnsi="Calibri"/>
+                      <w:color w:val="000000"/>
+                      <w:sz w:val="18"/>
+                      <w:szCs w:val="18"/>
+                    </w:rPr>
+                    <w:t xml:space="preserve">Am Samstag </w:t>
+                  </w:r>
+                  <w:r>
+                    <w:rPr>
+                      <w:rFonts w:ascii="Calibri" w:cs="Calibri" w:eastAsia="Calibri" w:hAnsi="Calibri"/>
+                      <w:b/>
+                      <w:bCs/>
+                      <w:color w:val="000000"/>
+                      <w:sz w:val="18"/>
+                      <w:szCs w:val="18"/>
+                      <w:u w:val="single"/>
+                    </w:rPr>
+                    <w:t xml:space="preserve">kämpfte</w:t>
+                  </w:r>
+                  <w:r>
+                    <w:rPr>
+                      <w:rFonts w:ascii="Calibri" w:cs="Calibri" w:eastAsia="Calibri" w:hAnsi="Calibri"/>
+                      <w:color w:val="000000"/>
+                      <w:sz w:val="18"/>
+                      <w:szCs w:val="18"/>
+                    </w:rPr>
+                    <w:t xml:space="preserve"> / </w:t>
+                  </w:r>
+                  <w:r>
+                    <w:rPr>
+                      <w:rFonts w:ascii="Calibri" w:cs="Calibri" w:eastAsia="Calibri" w:hAnsi="Calibri"/>
+                      <w:b/>
+                      <w:bCs/>
+                      <w:color w:val="000000"/>
+                      <w:sz w:val="18"/>
+                      <w:szCs w:val="18"/>
+                      <w:u w:val="single"/>
+                    </w:rPr>
+                    <w:t xml:space="preserve">spielte</w:t>
+                  </w:r>
+                  <w:r>
+                    <w:rPr>
+                      <w:rFonts w:ascii="Calibri" w:cs="Calibri" w:eastAsia="Calibri" w:hAnsi="Calibri"/>
+                      <w:color w:val="000000"/>
+                      <w:sz w:val="18"/>
+                      <w:szCs w:val="18"/>
+                    </w:rPr>
+                    <w:t xml:space="preserve"> / </w:t>
+                  </w:r>
+                  <w:r>
+                    <w:rPr>
+                      <w:rFonts w:ascii="Calibri" w:cs="Calibri" w:eastAsia="Calibri" w:hAnsi="Calibri"/>
+                      <w:b/>
+                      <w:bCs/>
+                      <w:color w:val="000000"/>
+                      <w:sz w:val="18"/>
+                      <w:szCs w:val="18"/>
+                      <w:u w:val="single"/>
+                    </w:rPr>
+                    <w:t xml:space="preserve">hob</w:t>
+                  </w:r>
+                  <w:r>
+                    <w:rPr>
+                      <w:rFonts w:ascii="Calibri" w:cs="Calibri" w:eastAsia="Calibri" w:hAnsi="Calibri"/>
+                      <w:color w:val="000000"/>
+                      <w:sz w:val="18"/>
+                      <w:szCs w:val="18"/>
+                    </w:rPr>
+                    <w:t xml:space="preserve"> ich …</w:t>
+                  </w:r>
+                  <w:r>
+                    <w:rPr>
+                      <w:rFonts w:ascii="Calibri" w:cs="Calibri" w:eastAsia="Calibri" w:hAnsi="Calibri"/>
+                      <w:color w:val="9AA3B5"/>
+                      <w:sz w:val="18"/>
+                      <w:szCs w:val="18"/>
+                    </w:rPr>
+                    <w:t xml:space="preserve">   ·   </w:t>
+                  </w:r>
+                  <w:r>
+                    <w:rPr>
+                      <w:rFonts w:ascii="Calibri" w:cs="Calibri" w:eastAsia="Calibri" w:hAnsi="Calibri"/>
+                      <w:color w:val="000000"/>
+                      <w:sz w:val="18"/>
+                      <w:szCs w:val="18"/>
+                    </w:rPr>
+                    <w:t xml:space="preserve">Im ersten Kampf / In der ersten Halbzeit / Im ersten Versuch …</w:t>
+                  </w:r>
+                </w:p>
+                <w:p>
+                  <w:pPr>
+                    <w:spacing w:after="20" w:before="0"/>
+                  </w:pPr>
+                  <w:r>
+                    <w:rPr>
+                      <w:rFonts w:ascii="Calibri" w:cs="Calibri" w:eastAsia="Calibri" w:hAnsi="Calibri"/>
+                      <w:color w:val="000000"/>
+                      <w:sz w:val="18"/>
+                      <w:szCs w:val="18"/>
+                    </w:rPr>
+                    <w:t xml:space="preserve">Am Anfang </w:t>
+                  </w:r>
+                  <w:r>
+                    <w:rPr>
+                      <w:rFonts w:ascii="Calibri" w:cs="Calibri" w:eastAsia="Calibri" w:hAnsi="Calibri"/>
+                      <w:b/>
+                      <w:bCs/>
+                      <w:color w:val="000000"/>
+                      <w:sz w:val="18"/>
+                      <w:szCs w:val="18"/>
+                      <w:u w:val="single"/>
+                    </w:rPr>
+                    <w:t xml:space="preserve">war</w:t>
+                  </w:r>
+                  <w:r>
+                    <w:rPr>
+                      <w:rFonts w:ascii="Calibri" w:cs="Calibri" w:eastAsia="Calibri" w:hAnsi="Calibri"/>
+                      <w:color w:val="000000"/>
+                      <w:sz w:val="18"/>
+                      <w:szCs w:val="18"/>
+                    </w:rPr>
+                    <w:t xml:space="preserve"> ich sehr nervös.</w:t>
+                  </w:r>
+                  <w:r>
+                    <w:rPr>
+                      <w:rFonts w:ascii="Calibri" w:cs="Calibri" w:eastAsia="Calibri" w:hAnsi="Calibri"/>
+                      <w:color w:val="9AA3B5"/>
+                      <w:sz w:val="18"/>
+                      <w:szCs w:val="18"/>
+                    </w:rPr>
+                    <w:t xml:space="preserve">   ·   </w:t>
+                  </w:r>
+                  <w:r>
+                    <w:rPr>
+                      <w:rFonts w:ascii="Calibri" w:cs="Calibri" w:eastAsia="Calibri" w:hAnsi="Calibri"/>
+                      <w:color w:val="000000"/>
+                      <w:sz w:val="18"/>
+                      <w:szCs w:val="18"/>
+                    </w:rPr>
+                    <w:t xml:space="preserve">Dann </w:t>
+                  </w:r>
+                  <w:r>
+                    <w:rPr>
+                      <w:rFonts w:ascii="Calibri" w:cs="Calibri" w:eastAsia="Calibri" w:hAnsi="Calibri"/>
+                      <w:b/>
+                      <w:bCs/>
+                      <w:color w:val="000000"/>
+                      <w:sz w:val="18"/>
+                      <w:szCs w:val="18"/>
+                      <w:u w:val="single"/>
+                    </w:rPr>
+                    <w:t xml:space="preserve">warf</w:t>
+                  </w:r>
+                  <w:r>
+                    <w:rPr>
+                      <w:rFonts w:ascii="Calibri" w:cs="Calibri" w:eastAsia="Calibri" w:hAnsi="Calibri"/>
+                      <w:color w:val="000000"/>
+                      <w:sz w:val="18"/>
+                      <w:szCs w:val="18"/>
+                    </w:rPr>
+                    <w:t xml:space="preserve"> / </w:t>
+                  </w:r>
+                  <w:r>
+                    <w:rPr>
+                      <w:rFonts w:ascii="Calibri" w:cs="Calibri" w:eastAsia="Calibri" w:hAnsi="Calibri"/>
+                      <w:b/>
+                      <w:bCs/>
+                      <w:color w:val="000000"/>
+                      <w:sz w:val="18"/>
+                      <w:szCs w:val="18"/>
+                      <w:u w:val="single"/>
+                    </w:rPr>
+                    <w:t xml:space="preserve">traf</w:t>
+                  </w:r>
+                  <w:r>
+                    <w:rPr>
+                      <w:rFonts w:ascii="Calibri" w:cs="Calibri" w:eastAsia="Calibri" w:hAnsi="Calibri"/>
+                      <w:color w:val="000000"/>
+                      <w:sz w:val="18"/>
+                      <w:szCs w:val="18"/>
+                    </w:rPr>
+                    <w:t xml:space="preserve"> / </w:t>
+                  </w:r>
+                  <w:r>
+                    <w:rPr>
+                      <w:rFonts w:ascii="Calibri" w:cs="Calibri" w:eastAsia="Calibri" w:hAnsi="Calibri"/>
+                      <w:b/>
+                      <w:bCs/>
+                      <w:color w:val="000000"/>
+                      <w:sz w:val="18"/>
+                      <w:szCs w:val="18"/>
+                      <w:u w:val="single"/>
+                    </w:rPr>
+                    <w:t xml:space="preserve">stieß</w:t>
+                  </w:r>
+                  <w:r>
+                    <w:rPr>
+                      <w:rFonts w:ascii="Calibri" w:cs="Calibri" w:eastAsia="Calibri" w:hAnsi="Calibri"/>
+                      <w:color w:val="000000"/>
+                      <w:sz w:val="18"/>
+                      <w:szCs w:val="18"/>
+                    </w:rPr>
+                    <w:t xml:space="preserve"> ich …</w:t>
+                  </w:r>
+                  <w:r>
+                    <w:rPr>
+                      <w:rFonts w:ascii="Calibri" w:cs="Calibri" w:eastAsia="Calibri" w:hAnsi="Calibri"/>
+                      <w:color w:val="9AA3B5"/>
+                      <w:sz w:val="18"/>
+                      <w:szCs w:val="18"/>
+                    </w:rPr>
+                    <w:t xml:space="preserve">   ·   </w:t>
+                  </w:r>
+                  <w:r>
+                    <w:rPr>
+                      <w:rFonts w:ascii="Calibri" w:cs="Calibri" w:eastAsia="Calibri" w:hAnsi="Calibri"/>
+                      <w:color w:val="000000"/>
+                      <w:sz w:val="18"/>
+                      <w:szCs w:val="18"/>
+                    </w:rPr>
+                    <w:t xml:space="preserve">Am Ende </w:t>
+                  </w:r>
+                  <w:r>
+                    <w:rPr>
+                      <w:rFonts w:ascii="Calibri" w:cs="Calibri" w:eastAsia="Calibri" w:hAnsi="Calibri"/>
+                      <w:b/>
+                      <w:bCs/>
+                      <w:color w:val="000000"/>
+                      <w:sz w:val="18"/>
+                      <w:szCs w:val="18"/>
+                      <w:u w:val="single"/>
+                    </w:rPr>
+                    <w:t xml:space="preserve">gewann</w:t>
+                  </w:r>
+                  <w:r>
+                    <w:rPr>
+                      <w:rFonts w:ascii="Calibri" w:cs="Calibri" w:eastAsia="Calibri" w:hAnsi="Calibri"/>
+                      <w:color w:val="000000"/>
+                      <w:sz w:val="18"/>
+                      <w:szCs w:val="18"/>
+                    </w:rPr>
+                    <w:t xml:space="preserve"> / </w:t>
+                  </w:r>
+                  <w:r>
+                    <w:rPr>
+                      <w:rFonts w:ascii="Calibri" w:cs="Calibri" w:eastAsia="Calibri" w:hAnsi="Calibri"/>
+                      <w:b/>
+                      <w:bCs/>
+                      <w:color w:val="000000"/>
+                      <w:sz w:val="18"/>
+                      <w:szCs w:val="18"/>
+                      <w:u w:val="single"/>
+                    </w:rPr>
+                    <w:t xml:space="preserve">verlor</w:t>
+                  </w:r>
+                  <w:r>
+                    <w:rPr>
+                      <w:rFonts w:ascii="Calibri" w:cs="Calibri" w:eastAsia="Calibri" w:hAnsi="Calibri"/>
+                      <w:color w:val="000000"/>
+                      <w:sz w:val="18"/>
+                      <w:szCs w:val="18"/>
+                    </w:rPr>
+                    <w:t xml:space="preserve"> ich …</w:t>
                   </w:r>
                 </w:p>
               </w:tc>
@@ -4241,37 +5146,333 @@
             <w:tr>
               <w:trPr>
                 <w:cantSplit/>
-                <w:trHeight w:val="620" w:hRule="exact"/>
               </w:trPr>
               <w:tc>
                 <w:tcPr>
-                  <w:tcW w:type="dxa" w:w="10406"/>
+                  <w:tcW w:type="dxa" w:w="2350"/>
                   <w:tcBorders>
-                    <w:top w:val="none" w:color="FFFFFF" w:sz="0"/>
-                    <w:left w:val="none" w:color="FFFFFF" w:sz="0"/>
-                    <w:bottom w:val="single" w:color="9AA3B5" w:sz="6"/>
-                    <w:right w:val="none" w:color="FFFFFF" w:sz="0"/>
+                    <w:top w:val="single" w:color="B9C6E8" w:sz="6"/>
+                    <w:left w:val="single" w:color="B9C6E8" w:sz="6"/>
+                    <w:bottom w:val="single" w:color="B9C6E8" w:sz="6"/>
+                    <w:right w:val="single" w:color="B9C6E8" w:sz="6"/>
+                  </w:tcBorders>
+                  <w:shd w:fill="F4F7FD" w:color="auto" w:val="clear"/>
+                  <w:tcMar>
+                    <w:top w:type="dxa" w:w="70"/>
+                    <w:left w:type="dxa" w:w="100"/>
+                    <w:bottom w:type="dxa" w:w="70"/>
+                    <w:right w:type="dxa" w:w="100"/>
+                  </w:tcMar>
+                  <w:vAlign w:val="top"/>
+                </w:tcPr>
+                <w:p>
+                  <w:pPr>
+                    <w:spacing w:after="10" w:before="0"/>
+                  </w:pPr>
+                  <w:r>
+                    <w:rPr>
+                      <w:rFonts w:ascii="Cambria" w:cs="Cambria" w:eastAsia="Cambria" w:hAnsi="Cambria"/>
+                      <w:b/>
+                      <w:bCs/>
+                      <w:color w:val="1E2761"/>
+                      <w:sz w:val="20"/>
+                      <w:szCs w:val="20"/>
+                    </w:rPr>
+                    <w:t xml:space="preserve">Perfekt</w:t>
+                  </w:r>
+                </w:p>
+                <w:p>
+                  <w:pPr>
+                    <w:spacing w:after="10" w:before="0"/>
+                  </w:pPr>
+                  <w:r>
+                    <w:rPr>
+                      <w:rFonts w:ascii="Calibri" w:cs="Calibri" w:eastAsia="Calibri" w:hAnsi="Calibri"/>
+                      <w:color w:val="5B6B8C"/>
+                      <w:sz w:val="16"/>
+                      <w:szCs w:val="16"/>
+                    </w:rPr>
+                    <w:t xml:space="preserve">Vergangenheit – gesprochen (wörtliche Rede)</w:t>
+                  </w:r>
+                </w:p>
+                <w:p>
+                  <w:pPr>
+                    <w:spacing w:after="0" w:before="0"/>
+                  </w:pPr>
+                  <w:r>
+                    <w:rPr>
+                      <w:rFonts w:ascii="Calibri" w:cs="Calibri" w:eastAsia="Calibri" w:hAnsi="Calibri"/>
+                      <w:b/>
+                      <w:bCs/>
+                      <w:color w:val="D9534F"/>
+                      <w:sz w:val="16"/>
+                      <w:szCs w:val="16"/>
+                    </w:rPr>
+                    <w:t xml:space="preserve">habe/bin</w:t>
+                  </w:r>
+                  <w:r>
+                    <w:rPr>
+                      <w:rFonts w:ascii="Calibri" w:cs="Calibri" w:eastAsia="Calibri" w:hAnsi="Calibri"/>
+                      <w:b/>
+                      <w:bCs/>
+                      <w:color w:val="333333"/>
+                      <w:sz w:val="16"/>
+                      <w:szCs w:val="16"/>
+                    </w:rPr>
+                    <w:t xml:space="preserve"> + </w:t>
+                  </w:r>
+                  <w:r>
+                    <w:rPr>
+                      <w:rFonts w:ascii="Calibri" w:cs="Calibri" w:eastAsia="Calibri" w:hAnsi="Calibri"/>
+                      <w:b/>
+                      <w:bCs/>
+                      <w:color w:val="C98A1E"/>
+                      <w:sz w:val="16"/>
+                      <w:szCs w:val="16"/>
+                    </w:rPr>
+                    <w:t xml:space="preserve">Partizip II</w:t>
+                  </w:r>
+                </w:p>
+              </w:tc>
+              <w:tc>
+                <w:tcPr>
+                  <w:tcW w:type="dxa" w:w="8056"/>
+                  <w:tcBorders>
+                    <w:top w:val="single" w:color="B9C6E8" w:sz="6"/>
+                    <w:left w:val="single" w:color="B9C6E8" w:sz="6"/>
+                    <w:bottom w:val="single" w:color="B9C6E8" w:sz="6"/>
+                    <w:right w:val="single" w:color="B9C6E8" w:sz="6"/>
                   </w:tcBorders>
                   <w:tcMar>
-                    <w:top w:type="dxa" w:w="60"/>
+                    <w:top w:type="dxa" w:w="70"/>
                     <w:left w:type="dxa" w:w="100"/>
-                    <w:bottom w:type="dxa" w:w="60"/>
+                    <w:bottom w:type="dxa" w:w="70"/>
                     <w:right w:type="dxa" w:w="100"/>
                   </w:tcMar>
-                  <w:vAlign w:val="center"/>
+                  <w:vAlign w:val="top"/>
                 </w:tcPr>
                 <w:p>
                   <w:pPr>
-                    <w:spacing w:after="0" w:before="0"/>
-                  </w:pPr>
-                  <w:r>
-                    <w:rPr>
-                      <w:rFonts w:ascii="Calibri" w:cs="Calibri" w:eastAsia="Calibri" w:hAnsi="Calibri"/>
-                      <w:color w:val="000000"/>
-                      <w:sz w:val="22"/>
-                      <w:szCs w:val="22"/>
-                    </w:rPr>
-                    <w:t xml:space="preserve"/>
+                    <w:spacing w:after="20" w:before="0"/>
+                  </w:pPr>
+                  <w:r>
+                    <w:rPr>
+                      <w:rFonts w:ascii="Calibri" w:cs="Calibri" w:eastAsia="Calibri" w:hAnsi="Calibri"/>
+                      <w:color w:val="000000"/>
+                      <w:sz w:val="18"/>
+                      <w:szCs w:val="18"/>
+                    </w:rPr>
+                    <w:t xml:space="preserve">Mein Trainer sagte: „Du </w:t>
+                  </w:r>
+                  <w:r>
+                    <w:rPr>
+                      <w:rFonts w:ascii="Calibri" w:cs="Calibri" w:eastAsia="Calibri" w:hAnsi="Calibri"/>
+                      <w:b/>
+                      <w:bCs/>
+                      <w:color w:val="D9534F"/>
+                      <w:sz w:val="18"/>
+                      <w:szCs w:val="18"/>
+                    </w:rPr>
+                    <w:t xml:space="preserve">hast</w:t>
+                  </w:r>
+                  <w:r>
+                    <w:rPr>
+                      <w:rFonts w:ascii="Calibri" w:cs="Calibri" w:eastAsia="Calibri" w:hAnsi="Calibri"/>
+                      <w:color w:val="000000"/>
+                      <w:sz w:val="18"/>
+                      <w:szCs w:val="18"/>
+                    </w:rPr>
+                    <w:t xml:space="preserve"> stark </w:t>
+                  </w:r>
+                  <w:r>
+                    <w:rPr>
+                      <w:rFonts w:ascii="Calibri" w:cs="Calibri" w:eastAsia="Calibri" w:hAnsi="Calibri"/>
+                      <w:b/>
+                      <w:bCs/>
+                      <w:color w:val="C98A1E"/>
+                      <w:sz w:val="18"/>
+                      <w:szCs w:val="18"/>
+                    </w:rPr>
+                    <w:t xml:space="preserve">gekämpft</w:t>
+                  </w:r>
+                  <w:r>
+                    <w:rPr>
+                      <w:rFonts w:ascii="Calibri" w:cs="Calibri" w:eastAsia="Calibri" w:hAnsi="Calibri"/>
+                      <w:color w:val="000000"/>
+                      <w:sz w:val="18"/>
+                      <w:szCs w:val="18"/>
+                    </w:rPr>
+                    <w:t xml:space="preserve">!“</w:t>
+                  </w:r>
+                  <w:r>
+                    <w:rPr>
+                      <w:rFonts w:ascii="Calibri" w:cs="Calibri" w:eastAsia="Calibri" w:hAnsi="Calibri"/>
+                      <w:color w:val="9AA3B5"/>
+                      <w:sz w:val="18"/>
+                      <w:szCs w:val="18"/>
+                    </w:rPr>
+                    <w:t xml:space="preserve">   ·   </w:t>
+                  </w:r>
+                  <w:r>
+                    <w:rPr>
+                      <w:rFonts w:ascii="Calibri" w:cs="Calibri" w:eastAsia="Calibri" w:hAnsi="Calibri"/>
+                      <w:color w:val="000000"/>
+                      <w:sz w:val="18"/>
+                      <w:szCs w:val="18"/>
+                    </w:rPr>
+                    <w:t xml:space="preserve">Mein Team rief: „Wir </w:t>
+                  </w:r>
+                  <w:r>
+                    <w:rPr>
+                      <w:rFonts w:ascii="Calibri" w:cs="Calibri" w:eastAsia="Calibri" w:hAnsi="Calibri"/>
+                      <w:b/>
+                      <w:bCs/>
+                      <w:color w:val="D9534F"/>
+                      <w:sz w:val="18"/>
+                      <w:szCs w:val="18"/>
+                    </w:rPr>
+                    <w:t xml:space="preserve">haben</w:t>
+                  </w:r>
+                  <w:r>
+                    <w:rPr>
+                      <w:rFonts w:ascii="Calibri" w:cs="Calibri" w:eastAsia="Calibri" w:hAnsi="Calibri"/>
+                      <w:color w:val="000000"/>
+                      <w:sz w:val="18"/>
+                      <w:szCs w:val="18"/>
+                    </w:rPr>
+                    <w:t xml:space="preserve"> </w:t>
+                  </w:r>
+                  <w:r>
+                    <w:rPr>
+                      <w:rFonts w:ascii="Calibri" w:cs="Calibri" w:eastAsia="Calibri" w:hAnsi="Calibri"/>
+                      <w:b/>
+                      <w:bCs/>
+                      <w:color w:val="C98A1E"/>
+                      <w:sz w:val="18"/>
+                      <w:szCs w:val="18"/>
+                    </w:rPr>
+                    <w:t xml:space="preserve">gewonnen</w:t>
+                  </w:r>
+                  <w:r>
+                    <w:rPr>
+                      <w:rFonts w:ascii="Calibri" w:cs="Calibri" w:eastAsia="Calibri" w:hAnsi="Calibri"/>
+                      <w:color w:val="000000"/>
+                      <w:sz w:val="18"/>
+                      <w:szCs w:val="18"/>
+                    </w:rPr>
+                    <w:t xml:space="preserve">!“</w:t>
+                  </w:r>
+                </w:p>
+                <w:p>
+                  <w:pPr>
+                    <w:spacing w:after="20" w:before="0"/>
+                  </w:pPr>
+                  <w:r>
+                    <w:rPr>
+                      <w:rFonts w:ascii="Calibri" w:cs="Calibri" w:eastAsia="Calibri" w:hAnsi="Calibri"/>
+                      <w:color w:val="000000"/>
+                      <w:sz w:val="18"/>
+                      <w:szCs w:val="18"/>
+                    </w:rPr>
+                    <w:t xml:space="preserve">Ich rief meinen Eltern zu: „Ich </w:t>
+                  </w:r>
+                  <w:r>
+                    <w:rPr>
+                      <w:rFonts w:ascii="Calibri" w:cs="Calibri" w:eastAsia="Calibri" w:hAnsi="Calibri"/>
+                      <w:b/>
+                      <w:bCs/>
+                      <w:color w:val="D9534F"/>
+                      <w:sz w:val="18"/>
+                      <w:szCs w:val="18"/>
+                    </w:rPr>
+                    <w:t xml:space="preserve">bin</w:t>
+                  </w:r>
+                  <w:r>
+                    <w:rPr>
+                      <w:rFonts w:ascii="Calibri" w:cs="Calibri" w:eastAsia="Calibri" w:hAnsi="Calibri"/>
+                      <w:color w:val="000000"/>
+                      <w:sz w:val="18"/>
+                      <w:szCs w:val="18"/>
+                    </w:rPr>
+                    <w:t xml:space="preserve"> Zweite(r) </w:t>
+                  </w:r>
+                  <w:r>
+                    <w:rPr>
+                      <w:rFonts w:ascii="Calibri" w:cs="Calibri" w:eastAsia="Calibri" w:hAnsi="Calibri"/>
+                      <w:b/>
+                      <w:bCs/>
+                      <w:color w:val="C98A1E"/>
+                      <w:sz w:val="18"/>
+                      <w:szCs w:val="18"/>
+                    </w:rPr>
+                    <w:t xml:space="preserve">geworden</w:t>
+                  </w:r>
+                  <w:r>
+                    <w:rPr>
+                      <w:rFonts w:ascii="Calibri" w:cs="Calibri" w:eastAsia="Calibri" w:hAnsi="Calibri"/>
+                      <w:color w:val="000000"/>
+                      <w:sz w:val="18"/>
+                      <w:szCs w:val="18"/>
+                    </w:rPr>
+                    <w:t xml:space="preserve">!“</w:t>
+                  </w:r>
+                  <w:r>
+                    <w:rPr>
+                      <w:rFonts w:ascii="Calibri" w:cs="Calibri" w:eastAsia="Calibri" w:hAnsi="Calibri"/>
+                      <w:color w:val="9AA3B5"/>
+                      <w:sz w:val="18"/>
+                      <w:szCs w:val="18"/>
+                    </w:rPr>
+                    <w:t xml:space="preserve">   ·   </w:t>
+                  </w:r>
+                  <w:r>
+                    <w:rPr>
+                      <w:rFonts w:ascii="Calibri" w:cs="Calibri" w:eastAsia="Calibri" w:hAnsi="Calibri"/>
+                      <w:color w:val="000000"/>
+                      <w:sz w:val="18"/>
+                      <w:szCs w:val="18"/>
+                    </w:rPr>
+                    <w:t xml:space="preserve">Der Kampfrichter sagte: „Das </w:t>
+                  </w:r>
+                  <w:r>
+                    <w:rPr>
+                      <w:rFonts w:ascii="Calibri" w:cs="Calibri" w:eastAsia="Calibri" w:hAnsi="Calibri"/>
+                      <w:b/>
+                      <w:bCs/>
+                      <w:color w:val="D9534F"/>
+                      <w:sz w:val="18"/>
+                      <w:szCs w:val="18"/>
+                    </w:rPr>
+                    <w:t xml:space="preserve">hast</w:t>
+                  </w:r>
+                  <w:r>
+                    <w:rPr>
+                      <w:rFonts w:ascii="Calibri" w:cs="Calibri" w:eastAsia="Calibri" w:hAnsi="Calibri"/>
+                      <w:color w:val="000000"/>
+                      <w:sz w:val="18"/>
+                      <w:szCs w:val="18"/>
+                    </w:rPr>
+                    <w:t xml:space="preserve"> du gut </w:t>
+                  </w:r>
+                  <w:r>
+                    <w:rPr>
+                      <w:rFonts w:ascii="Calibri" w:cs="Calibri" w:eastAsia="Calibri" w:hAnsi="Calibri"/>
+                      <w:b/>
+                      <w:bCs/>
+                      <w:color w:val="C98A1E"/>
+                      <w:sz w:val="18"/>
+                      <w:szCs w:val="18"/>
+                    </w:rPr>
+                    <w:t xml:space="preserve">gemacht</w:t>
+                  </w:r>
+                  <w:r>
+                    <w:rPr>
+                      <w:rFonts w:ascii="Calibri" w:cs="Calibri" w:eastAsia="Calibri" w:hAnsi="Calibri"/>
+                      <w:color w:val="000000"/>
+                      <w:sz w:val="18"/>
+                      <w:szCs w:val="18"/>
+                    </w:rPr>
+                    <w:t xml:space="preserve">.“</w:t>
                   </w:r>
                 </w:p>
               </w:tc>
@@ -4279,37 +5480,200 @@
             <w:tr>
               <w:trPr>
                 <w:cantSplit/>
-                <w:trHeight w:val="620" w:hRule="exact"/>
               </w:trPr>
               <w:tc>
                 <w:tcPr>
-                  <w:tcW w:type="dxa" w:w="10406"/>
+                  <w:tcW w:type="dxa" w:w="2350"/>
                   <w:tcBorders>
-                    <w:top w:val="none" w:color="FFFFFF" w:sz="0"/>
-                    <w:left w:val="none" w:color="FFFFFF" w:sz="0"/>
-                    <w:bottom w:val="single" w:color="9AA3B5" w:sz="6"/>
-                    <w:right w:val="none" w:color="FFFFFF" w:sz="0"/>
+                    <w:top w:val="single" w:color="B9C6E8" w:sz="6"/>
+                    <w:left w:val="single" w:color="B9C6E8" w:sz="6"/>
+                    <w:bottom w:val="single" w:color="B9C6E8" w:sz="6"/>
+                    <w:right w:val="single" w:color="B9C6E8" w:sz="6"/>
+                  </w:tcBorders>
+                  <w:shd w:fill="F4F7FD" w:color="auto" w:val="clear"/>
+                  <w:tcMar>
+                    <w:top w:type="dxa" w:w="70"/>
+                    <w:left w:type="dxa" w:w="100"/>
+                    <w:bottom w:type="dxa" w:w="70"/>
+                    <w:right w:type="dxa" w:w="100"/>
+                  </w:tcMar>
+                  <w:vAlign w:val="top"/>
+                </w:tcPr>
+                <w:p>
+                  <w:pPr>
+                    <w:spacing w:after="10" w:before="0"/>
+                  </w:pPr>
+                  <w:r>
+                    <w:rPr>
+                      <w:rFonts w:ascii="Cambria" w:cs="Cambria" w:eastAsia="Cambria" w:hAnsi="Cambria"/>
+                      <w:b/>
+                      <w:bCs/>
+                      <w:color w:val="1E2761"/>
+                      <w:sz w:val="20"/>
+                      <w:szCs w:val="20"/>
+                    </w:rPr>
+                    <w:t xml:space="preserve">Präsens</w:t>
+                  </w:r>
+                </w:p>
+                <w:p>
+                  <w:pPr>
+                    <w:spacing w:after="10" w:before="0"/>
+                  </w:pPr>
+                  <w:r>
+                    <w:rPr>
+                      <w:rFonts w:ascii="Calibri" w:cs="Calibri" w:eastAsia="Calibri" w:hAnsi="Calibri"/>
+                      <w:color w:val="5B6B8C"/>
+                      <w:sz w:val="16"/>
+                      <w:szCs w:val="16"/>
+                    </w:rPr>
+                    <w:t xml:space="preserve">jetzt</w:t>
+                  </w:r>
+                </w:p>
+                <w:p>
+                  <w:pPr>
+                    <w:spacing w:after="0" w:before="0"/>
+                  </w:pPr>
+                  <w:r>
+                    <w:rPr>
+                      <w:rFonts w:ascii="Calibri" w:cs="Calibri" w:eastAsia="Calibri" w:hAnsi="Calibri"/>
+                      <w:b/>
+                      <w:bCs/>
+                      <w:color w:val="333333"/>
+                      <w:sz w:val="16"/>
+                      <w:szCs w:val="16"/>
+                    </w:rPr>
+                    <w:t xml:space="preserve">finites Verb im Präsens</w:t>
+                  </w:r>
+                </w:p>
+              </w:tc>
+              <w:tc>
+                <w:tcPr>
+                  <w:tcW w:type="dxa" w:w="8056"/>
+                  <w:tcBorders>
+                    <w:top w:val="single" w:color="B9C6E8" w:sz="6"/>
+                    <w:left w:val="single" w:color="B9C6E8" w:sz="6"/>
+                    <w:bottom w:val="single" w:color="B9C6E8" w:sz="6"/>
+                    <w:right w:val="single" w:color="B9C6E8" w:sz="6"/>
                   </w:tcBorders>
                   <w:tcMar>
-                    <w:top w:type="dxa" w:w="60"/>
+                    <w:top w:type="dxa" w:w="70"/>
                     <w:left w:type="dxa" w:w="100"/>
-                    <w:bottom w:type="dxa" w:w="60"/>
+                    <w:bottom w:type="dxa" w:w="70"/>
                     <w:right w:type="dxa" w:w="100"/>
                   </w:tcMar>
-                  <w:vAlign w:val="center"/>
+                  <w:vAlign w:val="top"/>
                 </w:tcPr>
                 <w:p>
                   <w:pPr>
-                    <w:spacing w:after="0" w:before="0"/>
-                  </w:pPr>
-                  <w:r>
-                    <w:rPr>
-                      <w:rFonts w:ascii="Calibri" w:cs="Calibri" w:eastAsia="Calibri" w:hAnsi="Calibri"/>
-                      <w:color w:val="000000"/>
-                      <w:sz w:val="22"/>
-                      <w:szCs w:val="22"/>
-                    </w:rPr>
-                    <w:t xml:space="preserve"/>
+                    <w:spacing w:after="20" w:before="0"/>
+                  </w:pPr>
+                  <w:r>
+                    <w:rPr>
+                      <w:rFonts w:ascii="Calibri" w:cs="Calibri" w:eastAsia="Calibri" w:hAnsi="Calibri"/>
+                      <w:color w:val="000000"/>
+                      <w:sz w:val="18"/>
+                      <w:szCs w:val="18"/>
+                    </w:rPr>
+                    <w:t xml:space="preserve">Heute </w:t>
+                  </w:r>
+                  <w:r>
+                    <w:rPr>
+                      <w:rFonts w:ascii="Calibri" w:cs="Calibri" w:eastAsia="Calibri" w:hAnsi="Calibri"/>
+                      <w:b/>
+                      <w:bCs/>
+                      <w:color w:val="000000"/>
+                      <w:sz w:val="18"/>
+                      <w:szCs w:val="18"/>
+                      <w:u w:val="single"/>
+                    </w:rPr>
+                    <w:t xml:space="preserve">bin</w:t>
+                  </w:r>
+                  <w:r>
+                    <w:rPr>
+                      <w:rFonts w:ascii="Calibri" w:cs="Calibri" w:eastAsia="Calibri" w:hAnsi="Calibri"/>
+                      <w:color w:val="000000"/>
+                      <w:sz w:val="18"/>
+                      <w:szCs w:val="18"/>
+                    </w:rPr>
+                    <w:t xml:space="preserve"> ich noch müde.</w:t>
+                  </w:r>
+                  <w:r>
+                    <w:rPr>
+                      <w:rFonts w:ascii="Calibri" w:cs="Calibri" w:eastAsia="Calibri" w:hAnsi="Calibri"/>
+                      <w:color w:val="9AA3B5"/>
+                      <w:sz w:val="18"/>
+                      <w:szCs w:val="18"/>
+                    </w:rPr>
+                    <w:t xml:space="preserve">   ·   </w:t>
+                  </w:r>
+                  <w:r>
+                    <w:rPr>
+                      <w:rFonts w:ascii="Calibri" w:cs="Calibri" w:eastAsia="Calibri" w:hAnsi="Calibri"/>
+                      <w:color w:val="000000"/>
+                      <w:sz w:val="18"/>
+                      <w:szCs w:val="18"/>
+                    </w:rPr>
+                    <w:t xml:space="preserve">Heute </w:t>
+                  </w:r>
+                  <w:r>
+                    <w:rPr>
+                      <w:rFonts w:ascii="Calibri" w:cs="Calibri" w:eastAsia="Calibri" w:hAnsi="Calibri"/>
+                      <w:b/>
+                      <w:bCs/>
+                      <w:color w:val="000000"/>
+                      <w:sz w:val="18"/>
+                      <w:szCs w:val="18"/>
+                      <w:u w:val="single"/>
+                    </w:rPr>
+                    <w:t xml:space="preserve">tut</w:t>
+                  </w:r>
+                  <w:r>
+                    <w:rPr>
+                      <w:rFonts w:ascii="Calibri" w:cs="Calibri" w:eastAsia="Calibri" w:hAnsi="Calibri"/>
+                      <w:color w:val="000000"/>
+                      <w:sz w:val="18"/>
+                      <w:szCs w:val="18"/>
+                    </w:rPr>
+                    <w:t xml:space="preserve"> mir … weh.</w:t>
+                  </w:r>
+                  <w:r>
+                    <w:rPr>
+                      <w:rFonts w:ascii="Calibri" w:cs="Calibri" w:eastAsia="Calibri" w:hAnsi="Calibri"/>
+                      <w:color w:val="9AA3B5"/>
+                      <w:sz w:val="18"/>
+                      <w:szCs w:val="18"/>
+                    </w:rPr>
+                    <w:t xml:space="preserve">   ·   </w:t>
+                  </w:r>
+                  <w:r>
+                    <w:rPr>
+                      <w:rFonts w:ascii="Calibri" w:cs="Calibri" w:eastAsia="Calibri" w:hAnsi="Calibri"/>
+                      <w:color w:val="000000"/>
+                      <w:sz w:val="18"/>
+                      <w:szCs w:val="18"/>
+                    </w:rPr>
+                    <w:t xml:space="preserve">Heute </w:t>
+                  </w:r>
+                  <w:r>
+                    <w:rPr>
+                      <w:rFonts w:ascii="Calibri" w:cs="Calibri" w:eastAsia="Calibri" w:hAnsi="Calibri"/>
+                      <w:b/>
+                      <w:bCs/>
+                      <w:color w:val="000000"/>
+                      <w:sz w:val="18"/>
+                      <w:szCs w:val="18"/>
+                      <w:u w:val="single"/>
+                    </w:rPr>
+                    <w:t xml:space="preserve">analysiere</w:t>
+                  </w:r>
+                  <w:r>
+                    <w:rPr>
+                      <w:rFonts w:ascii="Calibri" w:cs="Calibri" w:eastAsia="Calibri" w:hAnsi="Calibri"/>
+                      <w:color w:val="000000"/>
+                      <w:sz w:val="18"/>
+                      <w:szCs w:val="18"/>
+                    </w:rPr>
+                    <w:t xml:space="preserve"> ich mit meinem Trainer das Video.</w:t>
                   </w:r>
                 </w:p>
               </w:tc>
@@ -4317,227 +5681,353 @@
             <w:tr>
               <w:trPr>
                 <w:cantSplit/>
-                <w:trHeight w:val="620" w:hRule="exact"/>
               </w:trPr>
               <w:tc>
                 <w:tcPr>
-                  <w:tcW w:type="dxa" w:w="10406"/>
+                  <w:tcW w:type="dxa" w:w="2350"/>
                   <w:tcBorders>
-                    <w:top w:val="none" w:color="FFFFFF" w:sz="0"/>
-                    <w:left w:val="none" w:color="FFFFFF" w:sz="0"/>
-                    <w:bottom w:val="single" w:color="9AA3B5" w:sz="6"/>
-                    <w:right w:val="none" w:color="FFFFFF" w:sz="0"/>
+                    <w:top w:val="single" w:color="B9C6E8" w:sz="6"/>
+                    <w:left w:val="single" w:color="B9C6E8" w:sz="6"/>
+                    <w:bottom w:val="single" w:color="B9C6E8" w:sz="6"/>
+                    <w:right w:val="single" w:color="B9C6E8" w:sz="6"/>
+                  </w:tcBorders>
+                  <w:shd w:fill="F4F7FD" w:color="auto" w:val="clear"/>
+                  <w:tcMar>
+                    <w:top w:type="dxa" w:w="70"/>
+                    <w:left w:type="dxa" w:w="100"/>
+                    <w:bottom w:type="dxa" w:w="70"/>
+                    <w:right w:type="dxa" w:w="100"/>
+                  </w:tcMar>
+                  <w:vAlign w:val="top"/>
+                </w:tcPr>
+                <w:p>
+                  <w:pPr>
+                    <w:spacing w:after="10" w:before="0"/>
+                  </w:pPr>
+                  <w:r>
+                    <w:rPr>
+                      <w:rFonts w:ascii="Cambria" w:cs="Cambria" w:eastAsia="Cambria" w:hAnsi="Cambria"/>
+                      <w:b/>
+                      <w:bCs/>
+                      <w:color w:val="1E2761"/>
+                      <w:sz w:val="20"/>
+                      <w:szCs w:val="20"/>
+                    </w:rPr>
+                    <w:t xml:space="preserve">Futur I</w:t>
+                  </w:r>
+                </w:p>
+                <w:p>
+                  <w:pPr>
+                    <w:spacing w:after="10" w:before="0"/>
+                  </w:pPr>
+                  <w:r>
+                    <w:rPr>
+                      <w:rFonts w:ascii="Calibri" w:cs="Calibri" w:eastAsia="Calibri" w:hAnsi="Calibri"/>
+                      <w:color w:val="5B6B8C"/>
+                      <w:sz w:val="16"/>
+                      <w:szCs w:val="16"/>
+                    </w:rPr>
+                    <w:t xml:space="preserve">Zukunft</w:t>
+                  </w:r>
+                </w:p>
+                <w:p>
+                  <w:pPr>
+                    <w:spacing w:after="0" w:before="0"/>
+                  </w:pPr>
+                  <w:r>
+                    <w:rPr>
+                      <w:rFonts w:ascii="Calibri" w:cs="Calibri" w:eastAsia="Calibri" w:hAnsi="Calibri"/>
+                      <w:b/>
+                      <w:bCs/>
+                      <w:color w:val="D9534F"/>
+                      <w:sz w:val="16"/>
+                      <w:szCs w:val="16"/>
+                    </w:rPr>
+                    <w:t xml:space="preserve">werde</w:t>
+                  </w:r>
+                  <w:r>
+                    <w:rPr>
+                      <w:rFonts w:ascii="Calibri" w:cs="Calibri" w:eastAsia="Calibri" w:hAnsi="Calibri"/>
+                      <w:b/>
+                      <w:bCs/>
+                      <w:color w:val="333333"/>
+                      <w:sz w:val="16"/>
+                      <w:szCs w:val="16"/>
+                    </w:rPr>
+                    <w:t xml:space="preserve"> + </w:t>
+                  </w:r>
+                  <w:r>
+                    <w:rPr>
+                      <w:rFonts w:ascii="Calibri" w:cs="Calibri" w:eastAsia="Calibri" w:hAnsi="Calibri"/>
+                      <w:b/>
+                      <w:bCs/>
+                      <w:color w:val="3F7CC4"/>
+                      <w:sz w:val="16"/>
+                      <w:szCs w:val="16"/>
+                    </w:rPr>
+                    <w:t xml:space="preserve">Infinitiv</w:t>
+                  </w:r>
+                </w:p>
+              </w:tc>
+              <w:tc>
+                <w:tcPr>
+                  <w:tcW w:type="dxa" w:w="8056"/>
+                  <w:tcBorders>
+                    <w:top w:val="single" w:color="B9C6E8" w:sz="6"/>
+                    <w:left w:val="single" w:color="B9C6E8" w:sz="6"/>
+                    <w:bottom w:val="single" w:color="B9C6E8" w:sz="6"/>
+                    <w:right w:val="single" w:color="B9C6E8" w:sz="6"/>
                   </w:tcBorders>
                   <w:tcMar>
-                    <w:top w:type="dxa" w:w="60"/>
+                    <w:top w:type="dxa" w:w="70"/>
                     <w:left w:type="dxa" w:w="100"/>
-                    <w:bottom w:type="dxa" w:w="60"/>
+                    <w:bottom w:type="dxa" w:w="70"/>
                     <w:right w:type="dxa" w:w="100"/>
                   </w:tcMar>
-                  <w:vAlign w:val="center"/>
+                  <w:vAlign w:val="top"/>
                 </w:tcPr>
                 <w:p>
                   <w:pPr>
-                    <w:spacing w:after="0" w:before="0"/>
-                  </w:pPr>
-                  <w:r>
-                    <w:rPr>
-                      <w:rFonts w:ascii="Calibri" w:cs="Calibri" w:eastAsia="Calibri" w:hAnsi="Calibri"/>
-                      <w:color w:val="000000"/>
-                      <w:sz w:val="22"/>
-                      <w:szCs w:val="22"/>
-                    </w:rPr>
-                    <w:t xml:space="preserve"/>
-                  </w:r>
-                </w:p>
-              </w:tc>
-            </w:tr>
-            <w:tr>
-              <w:trPr>
-                <w:cantSplit/>
-                <w:trHeight w:val="620" w:hRule="exact"/>
-              </w:trPr>
-              <w:tc>
-                <w:tcPr>
-                  <w:tcW w:type="dxa" w:w="10406"/>
-                  <w:tcBorders>
-                    <w:top w:val="none" w:color="FFFFFF" w:sz="0"/>
-                    <w:left w:val="none" w:color="FFFFFF" w:sz="0"/>
-                    <w:bottom w:val="single" w:color="9AA3B5" w:sz="6"/>
-                    <w:right w:val="none" w:color="FFFFFF" w:sz="0"/>
-                  </w:tcBorders>
-                  <w:tcMar>
-                    <w:top w:type="dxa" w:w="60"/>
-                    <w:left w:type="dxa" w:w="100"/>
-                    <w:bottom w:type="dxa" w:w="60"/>
-                    <w:right w:type="dxa" w:w="100"/>
-                  </w:tcMar>
-                  <w:vAlign w:val="center"/>
-                </w:tcPr>
-                <w:p>
-                  <w:pPr>
-                    <w:spacing w:after="0" w:before="0"/>
-                  </w:pPr>
-                  <w:r>
-                    <w:rPr>
-                      <w:rFonts w:ascii="Calibri" w:cs="Calibri" w:eastAsia="Calibri" w:hAnsi="Calibri"/>
-                      <w:color w:val="000000"/>
-                      <w:sz w:val="22"/>
-                      <w:szCs w:val="22"/>
-                    </w:rPr>
-                    <w:t xml:space="preserve"/>
-                  </w:r>
-                </w:p>
-              </w:tc>
-            </w:tr>
-            <w:tr>
-              <w:trPr>
-                <w:cantSplit/>
-                <w:trHeight w:val="620" w:hRule="exact"/>
-              </w:trPr>
-              <w:tc>
-                <w:tcPr>
-                  <w:tcW w:type="dxa" w:w="10406"/>
-                  <w:tcBorders>
-                    <w:top w:val="none" w:color="FFFFFF" w:sz="0"/>
-                    <w:left w:val="none" w:color="FFFFFF" w:sz="0"/>
-                    <w:bottom w:val="single" w:color="9AA3B5" w:sz="6"/>
-                    <w:right w:val="none" w:color="FFFFFF" w:sz="0"/>
-                  </w:tcBorders>
-                  <w:tcMar>
-                    <w:top w:type="dxa" w:w="60"/>
-                    <w:left w:type="dxa" w:w="100"/>
-                    <w:bottom w:type="dxa" w:w="60"/>
-                    <w:right w:type="dxa" w:w="100"/>
-                  </w:tcMar>
-                  <w:vAlign w:val="center"/>
-                </w:tcPr>
-                <w:p>
-                  <w:pPr>
-                    <w:spacing w:after="0" w:before="0"/>
-                  </w:pPr>
-                  <w:r>
-                    <w:rPr>
-                      <w:rFonts w:ascii="Calibri" w:cs="Calibri" w:eastAsia="Calibri" w:hAnsi="Calibri"/>
-                      <w:color w:val="000000"/>
-                      <w:sz w:val="22"/>
-                      <w:szCs w:val="22"/>
-                    </w:rPr>
-                    <w:t xml:space="preserve"/>
-                  </w:r>
-                </w:p>
-              </w:tc>
-            </w:tr>
-            <w:tr>
-              <w:trPr>
-                <w:cantSplit/>
-                <w:trHeight w:val="620" w:hRule="exact"/>
-              </w:trPr>
-              <w:tc>
-                <w:tcPr>
-                  <w:tcW w:type="dxa" w:w="10406"/>
-                  <w:tcBorders>
-                    <w:top w:val="none" w:color="FFFFFF" w:sz="0"/>
-                    <w:left w:val="none" w:color="FFFFFF" w:sz="0"/>
-                    <w:bottom w:val="single" w:color="9AA3B5" w:sz="6"/>
-                    <w:right w:val="none" w:color="FFFFFF" w:sz="0"/>
-                  </w:tcBorders>
-                  <w:tcMar>
-                    <w:top w:type="dxa" w:w="60"/>
-                    <w:left w:type="dxa" w:w="100"/>
-                    <w:bottom w:type="dxa" w:w="60"/>
-                    <w:right w:type="dxa" w:w="100"/>
-                  </w:tcMar>
-                  <w:vAlign w:val="center"/>
-                </w:tcPr>
-                <w:p>
-                  <w:pPr>
-                    <w:spacing w:after="0" w:before="0"/>
-                  </w:pPr>
-                  <w:r>
-                    <w:rPr>
-                      <w:rFonts w:ascii="Calibri" w:cs="Calibri" w:eastAsia="Calibri" w:hAnsi="Calibri"/>
-                      <w:color w:val="000000"/>
-                      <w:sz w:val="22"/>
-                      <w:szCs w:val="22"/>
-                    </w:rPr>
-                    <w:t xml:space="preserve"/>
-                  </w:r>
-                </w:p>
-              </w:tc>
-            </w:tr>
-            <w:tr>
-              <w:trPr>
-                <w:cantSplit/>
-                <w:trHeight w:val="620" w:hRule="exact"/>
-              </w:trPr>
-              <w:tc>
-                <w:tcPr>
-                  <w:tcW w:type="dxa" w:w="10406"/>
-                  <w:tcBorders>
-                    <w:top w:val="none" w:color="FFFFFF" w:sz="0"/>
-                    <w:left w:val="none" w:color="FFFFFF" w:sz="0"/>
-                    <w:bottom w:val="single" w:color="9AA3B5" w:sz="6"/>
-                    <w:right w:val="none" w:color="FFFFFF" w:sz="0"/>
-                  </w:tcBorders>
-                  <w:tcMar>
-                    <w:top w:type="dxa" w:w="60"/>
-                    <w:left w:type="dxa" w:w="100"/>
-                    <w:bottom w:type="dxa" w:w="60"/>
-                    <w:right w:type="dxa" w:w="100"/>
-                  </w:tcMar>
-                  <w:vAlign w:val="center"/>
-                </w:tcPr>
-                <w:p>
-                  <w:pPr>
-                    <w:spacing w:after="0" w:before="0"/>
-                  </w:pPr>
-                  <w:r>
-                    <w:rPr>
-                      <w:rFonts w:ascii="Calibri" w:cs="Calibri" w:eastAsia="Calibri" w:hAnsi="Calibri"/>
-                      <w:color w:val="000000"/>
-                      <w:sz w:val="22"/>
-                      <w:szCs w:val="22"/>
-                    </w:rPr>
-                    <w:t xml:space="preserve"/>
-                  </w:r>
-                </w:p>
-              </w:tc>
-            </w:tr>
-            <w:tr>
-              <w:trPr>
-                <w:cantSplit/>
-                <w:trHeight w:val="620" w:hRule="exact"/>
-              </w:trPr>
-              <w:tc>
-                <w:tcPr>
-                  <w:tcW w:type="dxa" w:w="10406"/>
-                  <w:tcBorders>
-                    <w:top w:val="none" w:color="FFFFFF" w:sz="0"/>
-                    <w:left w:val="none" w:color="FFFFFF" w:sz="0"/>
-                    <w:bottom w:val="single" w:color="9AA3B5" w:sz="6"/>
-                    <w:right w:val="none" w:color="FFFFFF" w:sz="0"/>
-                  </w:tcBorders>
-                  <w:tcMar>
-                    <w:top w:type="dxa" w:w="60"/>
-                    <w:left w:type="dxa" w:w="100"/>
-                    <w:bottom w:type="dxa" w:w="60"/>
-                    <w:right w:type="dxa" w:w="100"/>
-                  </w:tcMar>
-                  <w:vAlign w:val="center"/>
-                </w:tcPr>
-                <w:p>
-                  <w:pPr>
-                    <w:spacing w:after="0" w:before="0"/>
-                  </w:pPr>
-                  <w:r>
-                    <w:rPr>
-                      <w:rFonts w:ascii="Calibri" w:cs="Calibri" w:eastAsia="Calibri" w:hAnsi="Calibri"/>
-                      <w:color w:val="000000"/>
-                      <w:sz w:val="22"/>
-                      <w:szCs w:val="22"/>
-                    </w:rPr>
-                    <w:t xml:space="preserve"/>
+                    <w:spacing w:after="20" w:before="0"/>
+                  </w:pPr>
+                  <w:r>
+                    <w:rPr>
+                      <w:rFonts w:ascii="Calibri" w:cs="Calibri" w:eastAsia="Calibri" w:hAnsi="Calibri"/>
+                      <w:color w:val="000000"/>
+                      <w:sz w:val="18"/>
+                      <w:szCs w:val="18"/>
+                    </w:rPr>
+                    <w:t xml:space="preserve">Beim nächsten Wettkampf </w:t>
+                  </w:r>
+                  <w:r>
+                    <w:rPr>
+                      <w:rFonts w:ascii="Calibri" w:cs="Calibri" w:eastAsia="Calibri" w:hAnsi="Calibri"/>
+                      <w:b/>
+                      <w:bCs/>
+                      <w:color w:val="D9534F"/>
+                      <w:sz w:val="18"/>
+                      <w:szCs w:val="18"/>
+                    </w:rPr>
+                    <w:t xml:space="preserve">werde</w:t>
+                  </w:r>
+                  <w:r>
+                    <w:rPr>
+                      <w:rFonts w:ascii="Calibri" w:cs="Calibri" w:eastAsia="Calibri" w:hAnsi="Calibri"/>
+                      <w:color w:val="000000"/>
+                      <w:sz w:val="18"/>
+                      <w:szCs w:val="18"/>
+                    </w:rPr>
+                    <w:t xml:space="preserve"> ich früher </w:t>
+                  </w:r>
+                  <w:r>
+                    <w:rPr>
+                      <w:rFonts w:ascii="Calibri" w:cs="Calibri" w:eastAsia="Calibri" w:hAnsi="Calibri"/>
+                      <w:b/>
+                      <w:bCs/>
+                      <w:color w:val="3F7CC4"/>
+                      <w:sz w:val="18"/>
+                      <w:szCs w:val="18"/>
+                    </w:rPr>
+                    <w:t xml:space="preserve">angreifen</w:t>
+                  </w:r>
+                  <w:r>
+                    <w:rPr>
+                      <w:rFonts w:ascii="Calibri" w:cs="Calibri" w:eastAsia="Calibri" w:hAnsi="Calibri"/>
+                      <w:color w:val="000000"/>
+                      <w:sz w:val="18"/>
+                      <w:szCs w:val="18"/>
+                    </w:rPr>
+                    <w:t xml:space="preserve"> / besser </w:t>
+                  </w:r>
+                  <w:r>
+                    <w:rPr>
+                      <w:rFonts w:ascii="Calibri" w:cs="Calibri" w:eastAsia="Calibri" w:hAnsi="Calibri"/>
+                      <w:b/>
+                      <w:bCs/>
+                      <w:color w:val="3F7CC4"/>
+                      <w:sz w:val="18"/>
+                      <w:szCs w:val="18"/>
+                    </w:rPr>
+                    <w:t xml:space="preserve">verteidigen</w:t>
+                  </w:r>
+                  <w:r>
+                    <w:rPr>
+                      <w:rFonts w:ascii="Calibri" w:cs="Calibri" w:eastAsia="Calibri" w:hAnsi="Calibri"/>
+                      <w:color w:val="000000"/>
+                      <w:sz w:val="18"/>
+                      <w:szCs w:val="18"/>
+                    </w:rPr>
+                    <w:t xml:space="preserve">.</w:t>
+                  </w:r>
+                  <w:r>
+                    <w:rPr>
+                      <w:rFonts w:ascii="Calibri" w:cs="Calibri" w:eastAsia="Calibri" w:hAnsi="Calibri"/>
+                      <w:color w:val="9AA3B5"/>
+                      <w:sz w:val="18"/>
+                      <w:szCs w:val="18"/>
+                    </w:rPr>
+                    <w:t xml:space="preserve">   ·   </w:t>
+                  </w:r>
+                  <w:r>
+                    <w:rPr>
+                      <w:rFonts w:ascii="Calibri" w:cs="Calibri" w:eastAsia="Calibri" w:hAnsi="Calibri"/>
+                      <w:color w:val="000000"/>
+                      <w:sz w:val="18"/>
+                      <w:szCs w:val="18"/>
+                    </w:rPr>
+                    <w:t xml:space="preserve">Ich </w:t>
+                  </w:r>
+                  <w:r>
+                    <w:rPr>
+                      <w:rFonts w:ascii="Calibri" w:cs="Calibri" w:eastAsia="Calibri" w:hAnsi="Calibri"/>
+                      <w:b/>
+                      <w:bCs/>
+                      <w:color w:val="D9534F"/>
+                      <w:sz w:val="18"/>
+                      <w:szCs w:val="18"/>
+                    </w:rPr>
+                    <w:t xml:space="preserve">werde</w:t>
+                  </w:r>
+                  <w:r>
+                    <w:rPr>
+                      <w:rFonts w:ascii="Calibri" w:cs="Calibri" w:eastAsia="Calibri" w:hAnsi="Calibri"/>
+                      <w:color w:val="000000"/>
+                      <w:sz w:val="18"/>
+                      <w:szCs w:val="18"/>
+                    </w:rPr>
+                    <w:t xml:space="preserve"> noch mehr </w:t>
+                  </w:r>
+                  <w:r>
+                    <w:rPr>
+                      <w:rFonts w:ascii="Calibri" w:cs="Calibri" w:eastAsia="Calibri" w:hAnsi="Calibri"/>
+                      <w:b/>
+                      <w:bCs/>
+                      <w:color w:val="3F7CC4"/>
+                      <w:sz w:val="18"/>
+                      <w:szCs w:val="18"/>
+                    </w:rPr>
+                    <w:t xml:space="preserve">trainieren</w:t>
+                  </w:r>
+                  <w:r>
+                    <w:rPr>
+                      <w:rFonts w:ascii="Calibri" w:cs="Calibri" w:eastAsia="Calibri" w:hAnsi="Calibri"/>
+                      <w:color w:val="000000"/>
+                      <w:sz w:val="18"/>
+                      <w:szCs w:val="18"/>
+                    </w:rPr>
+                    <w:t xml:space="preserve">.</w:t>
+                  </w:r>
+                </w:p>
+                <w:p>
+                  <w:pPr>
+                    <w:spacing w:after="20" w:before="0"/>
+                  </w:pPr>
+                  <w:r>
+                    <w:rPr>
+                      <w:rFonts w:ascii="Calibri" w:cs="Calibri" w:eastAsia="Calibri" w:hAnsi="Calibri"/>
+                      <w:color w:val="000000"/>
+                      <w:sz w:val="18"/>
+                      <w:szCs w:val="18"/>
+                    </w:rPr>
+                    <w:t xml:space="preserve">Nächstes Mal </w:t>
+                  </w:r>
+                  <w:r>
+                    <w:rPr>
+                      <w:rFonts w:ascii="Calibri" w:cs="Calibri" w:eastAsia="Calibri" w:hAnsi="Calibri"/>
+                      <w:b/>
+                      <w:bCs/>
+                      <w:color w:val="D9534F"/>
+                      <w:sz w:val="18"/>
+                      <w:szCs w:val="18"/>
+                    </w:rPr>
+                    <w:t xml:space="preserve">werde</w:t>
+                  </w:r>
+                  <w:r>
+                    <w:rPr>
+                      <w:rFonts w:ascii="Calibri" w:cs="Calibri" w:eastAsia="Calibri" w:hAnsi="Calibri"/>
+                      <w:color w:val="000000"/>
+                      <w:sz w:val="18"/>
+                      <w:szCs w:val="18"/>
+                    </w:rPr>
+                    <w:t xml:space="preserve"> ich … </w:t>
+                  </w:r>
+                  <w:r>
+                    <w:rPr>
+                      <w:rFonts w:ascii="Calibri" w:cs="Calibri" w:eastAsia="Calibri" w:hAnsi="Calibri"/>
+                      <w:b/>
+                      <w:bCs/>
+                      <w:color w:val="3F7CC4"/>
+                      <w:sz w:val="18"/>
+                      <w:szCs w:val="18"/>
+                    </w:rPr>
+                    <w:t xml:space="preserve">schaffen</w:t>
+                  </w:r>
+                  <w:r>
+                    <w:rPr>
+                      <w:rFonts w:ascii="Calibri" w:cs="Calibri" w:eastAsia="Calibri" w:hAnsi="Calibri"/>
+                      <w:color w:val="000000"/>
+                      <w:sz w:val="18"/>
+                      <w:szCs w:val="18"/>
+                    </w:rPr>
+                    <w:t xml:space="preserve">.</w:t>
+                  </w:r>
+                  <w:r>
+                    <w:rPr>
+                      <w:rFonts w:ascii="Calibri" w:cs="Calibri" w:eastAsia="Calibri" w:hAnsi="Calibri"/>
+                      <w:color w:val="9AA3B5"/>
+                      <w:sz w:val="18"/>
+                      <w:szCs w:val="18"/>
+                    </w:rPr>
+                    <w:t xml:space="preserve">   ·   </w:t>
+                  </w:r>
+                  <w:r>
+                    <w:rPr>
+                      <w:rFonts w:ascii="Calibri" w:cs="Calibri" w:eastAsia="Calibri" w:hAnsi="Calibri"/>
+                      <w:color w:val="000000"/>
+                      <w:sz w:val="18"/>
+                      <w:szCs w:val="18"/>
+                    </w:rPr>
+                    <w:t xml:space="preserve">Wir </w:t>
+                  </w:r>
+                  <w:r>
+                    <w:rPr>
+                      <w:rFonts w:ascii="Calibri" w:cs="Calibri" w:eastAsia="Calibri" w:hAnsi="Calibri"/>
+                      <w:b/>
+                      <w:bCs/>
+                      <w:color w:val="D9534F"/>
+                      <w:sz w:val="18"/>
+                      <w:szCs w:val="18"/>
+                    </w:rPr>
+                    <w:t xml:space="preserve">werden</w:t>
+                  </w:r>
+                  <w:r>
+                    <w:rPr>
+                      <w:rFonts w:ascii="Calibri" w:cs="Calibri" w:eastAsia="Calibri" w:hAnsi="Calibri"/>
+                      <w:color w:val="000000"/>
+                      <w:sz w:val="18"/>
+                      <w:szCs w:val="18"/>
+                    </w:rPr>
+                    <w:t xml:space="preserve"> die Abwehr </w:t>
+                  </w:r>
+                  <w:r>
+                    <w:rPr>
+                      <w:rFonts w:ascii="Calibri" w:cs="Calibri" w:eastAsia="Calibri" w:hAnsi="Calibri"/>
+                      <w:b/>
+                      <w:bCs/>
+                      <w:color w:val="3F7CC4"/>
+                      <w:sz w:val="18"/>
+                      <w:szCs w:val="18"/>
+                    </w:rPr>
+                    <w:t xml:space="preserve">verbessern</w:t>
+                  </w:r>
+                  <w:r>
+                    <w:rPr>
+                      <w:rFonts w:ascii="Calibri" w:cs="Calibri" w:eastAsia="Calibri" w:hAnsi="Calibri"/>
+                      <w:color w:val="000000"/>
+                      <w:sz w:val="18"/>
+                      <w:szCs w:val="18"/>
+                    </w:rPr>
+                    <w:t xml:space="preserve">.</w:t>
                   </w:r>
                 </w:p>
               </w:tc>
@@ -4545,8 +6035,44 @@
           </w:tbl>
           <w:p>
             <w:pPr>
+              <w:spacing w:after="60" w:before="80"/>
+            </w:pPr>
+            <w:r>
+              <w:rPr>
+                <w:rFonts w:ascii="Calibri" w:cs="Calibri" w:eastAsia="Calibri" w:hAnsi="Calibri"/>
+                <w:b/>
+                <w:bCs/>
+                <w:color w:val="1E2761"/>
+                <w:sz w:val="18"/>
+                <w:szCs w:val="18"/>
+              </w:rPr>
+              <w:t xml:space="preserve">Verben  </w:t>
+            </w:r>
+            <w:r>
+              <w:rPr>
+                <w:rFonts w:ascii="Calibri" w:cs="Calibri" w:eastAsia="Calibri" w:hAnsi="Calibri"/>
+                <w:color w:val="000000"/>
+                <w:sz w:val="18"/>
+                <w:szCs w:val="18"/>
+              </w:rPr>
+              <w:t xml:space="preserve">Judo: kämpfen – kämpfte, werfen – warf, halten – hielt  ·  Handball: werfen – warf, treffen – traf, spielen – spielte  ·  Gewichtheben: heben – hob, reißen – riss, stoßen – stieß</w:t>
+            </w:r>
+          </w:p>
+          <w:p>
+            <w:pPr>
               <w:spacing w:after="0" w:before="100"/>
             </w:pPr>
+            <w:r>
+              <w:rPr>
+                <w:rFonts w:ascii="Calibri" w:cs="Calibri" w:eastAsia="Calibri" w:hAnsi="Calibri"/>
+                <w:b/>
+                <w:bCs/>
+                <w:color w:val="000000"/>
+                <w:sz w:val="18"/>
+                <w:szCs w:val="18"/>
+              </w:rPr>
+              <w:t xml:space="preserve">Prüfe vor dem Abgeben:  </w:t>
+            </w:r>
             <w:r>
               <w:rPr>
                 <w:rFonts w:ascii="Calibri" w:cs="Calibri" w:eastAsia="Calibri" w:hAnsi="Calibri"/>

</xml_diff>

<commit_message>
Exit-Ticket gekürzt: ein Vorschlag je Zeitform, Schreiblinien, 2 pro A4
Co-Authored-By: Claude Opus 5.5 <noreply@anthropic.com>
Claude-Session: https://claude.ai/code/session_01KXvLXHMYPnCyEbMRgNaaYs
</commit_message>
<xml_diff>
--- a/Deutsch_7A/Zeitformen_Zeitstrahl/Druckvorlage_Zeitformen_Zeitstrahl.docx
+++ b/Deutsch_7A/Zeitformen_Zeitstrahl/Druckvorlage_Zeitformen_Zeitstrahl.docx
@@ -2318,7 +2318,7 @@
           </w:tcPr>
           <w:p>
             <w:pPr>
-              <w:spacing w:after="80" w:before="0"/>
+              <w:spacing w:after="70" w:before="0"/>
             </w:pPr>
             <w:r>
               <w:rPr>
@@ -2329,12 +2329,21 @@
                 <w:sz w:val="28"/>
                 <w:szCs w:val="28"/>
               </w:rPr>
-              <w:t xml:space="preserve">Exit-Ticket: Formulierungshilfen</w:t>
+              <w:t xml:space="preserve">Exit-Ticket: Mein Wochenende</w:t>
+            </w:r>
+            <w:r>
+              <w:rPr>
+                <w:rFonts w:ascii="Calibri" w:cs="Calibri" w:eastAsia="Calibri" w:hAnsi="Calibri"/>
+                <w:color w:val="5B6B8C"/>
+                <w:sz w:val="18"/>
+                <w:szCs w:val="18"/>
+              </w:rPr>
+              <w:t xml:space="preserve">          Name: ____________________</w:t>
             </w:r>
           </w:p>
           <w:p>
             <w:pPr>
-              <w:spacing w:after="100" w:before="0"/>
+              <w:spacing w:after="80" w:before="0"/>
             </w:pPr>
             <w:r>
               <w:rPr>
@@ -2343,7 +2352,7 @@
                 <w:sz w:val="21"/>
                 <w:szCs w:val="21"/>
               </w:rPr>
-              <w:t xml:space="preserve">Schreibe auf ein </w:t>
+              <w:t xml:space="preserve">Schreibe </w:t>
             </w:r>
             <w:r>
               <w:rPr>
@@ -2354,7 +2363,7 @@
                 <w:sz w:val="21"/>
                 <w:szCs w:val="21"/>
               </w:rPr>
-              <w:t xml:space="preserve">eigenes Blatt</w:t>
+              <w:t xml:space="preserve">5–7 Sätze</w:t>
             </w:r>
             <w:r>
               <w:rPr>
@@ -2363,7 +2372,7 @@
                 <w:sz w:val="21"/>
                 <w:szCs w:val="21"/>
               </w:rPr>
-              <w:t xml:space="preserve"> (Name oben rechts) </w:t>
+              <w:t xml:space="preserve"> über deinen Wettkampf am Wochenende – nach dem Muster an der Tafel. Jede Zeitform kommt </w:t>
             </w:r>
             <w:r>
               <w:rPr>
@@ -2374,7 +2383,7 @@
                 <w:sz w:val="21"/>
                 <w:szCs w:val="21"/>
               </w:rPr>
-              <w:t xml:space="preserve">5–7 Sätze</w:t>
+              <w:t xml:space="preserve">mindestens einmal</w:t>
             </w:r>
             <w:r>
               <w:rPr>
@@ -2383,27 +2392,7 @@
                 <w:sz w:val="21"/>
                 <w:szCs w:val="21"/>
               </w:rPr>
-              <w:t xml:space="preserve"> über deinen Wettkampf am Wochenende – nach dem Muster an der Tafel. Jede Zeitform kommt </w:t>
-            </w:r>
-            <w:r>
-              <w:rPr>
-                <w:rFonts w:ascii="Calibri" w:cs="Calibri" w:eastAsia="Calibri" w:hAnsi="Calibri"/>
-                <w:b/>
-                <w:bCs/>
-                <w:color w:val="000000"/>
-                <w:sz w:val="21"/>
-                <w:szCs w:val="21"/>
-              </w:rPr>
-              <w:t xml:space="preserve">mindestens einmal</w:t>
-            </w:r>
-            <w:r>
-              <w:rPr>
-                <w:rFonts w:ascii="Calibri" w:cs="Calibri" w:eastAsia="Calibri" w:hAnsi="Calibri"/>
-                <w:color w:val="000000"/>
-                <w:sz w:val="21"/>
-                <w:szCs w:val="21"/>
-              </w:rPr>
-              <w:t xml:space="preserve"> vor. Du kannst die Vorschläge übernehmen und ergänzen. Am Ende gibst du das Blatt ab.</w:t>
+              <w:t xml:space="preserve"> vor.</w:t>
             </w:r>
           </w:p>
           <w:tbl>
@@ -2419,8 +2408,8 @@
               </w:tblBorders>
             </w:tblPr>
             <w:tblGrid>
-              <w:gridCol w:w="2350"/>
-              <w:gridCol w:w="8056"/>
+              <w:gridCol w:w="3800"/>
+              <w:gridCol w:w="6606"/>
             </w:tblGrid>
             <w:tr>
               <w:trPr>
@@ -2428,7 +2417,7 @@
               </w:trPr>
               <w:tc>
                 <w:tcPr>
-                  <w:tcW w:type="dxa" w:w="2350"/>
+                  <w:tcW w:type="dxa" w:w="3800"/>
                   <w:tcBorders>
                     <w:top w:val="single" w:color="B9C6E8" w:sz="6"/>
                     <w:left w:val="single" w:color="B9C6E8" w:sz="6"/>
@@ -2437,16 +2426,16 @@
                   </w:tcBorders>
                   <w:shd w:fill="F4F7FD" w:color="auto" w:val="clear"/>
                   <w:tcMar>
-                    <w:top w:type="dxa" w:w="70"/>
-                    <w:left w:type="dxa" w:w="100"/>
-                    <w:bottom w:type="dxa" w:w="70"/>
-                    <w:right w:type="dxa" w:w="100"/>
-                  </w:tcMar>
-                  <w:vAlign w:val="top"/>
-                </w:tcPr>
-                <w:p>
-                  <w:pPr>
-                    <w:spacing w:after="10" w:before="0"/>
+                    <w:top w:type="dxa" w:w="50"/>
+                    <w:left w:type="dxa" w:w="100"/>
+                    <w:bottom w:type="dxa" w:w="50"/>
+                    <w:right w:type="dxa" w:w="100"/>
+                  </w:tcMar>
+                  <w:vAlign w:val="center"/>
+                </w:tcPr>
+                <w:p>
+                  <w:pPr>
+                    <w:spacing w:after="0" w:before="0"/>
                   </w:pPr>
                   <w:r>
                     <w:rPr>
@@ -2454,50 +2443,31 @@
                       <w:b/>
                       <w:bCs/>
                       <w:color w:val="1E2761"/>
-                      <w:sz w:val="20"/>
-                      <w:szCs w:val="20"/>
-                    </w:rPr>
-                    <w:t xml:space="preserve">Plusquamperfekt</w:t>
-                  </w:r>
-                </w:p>
-                <w:p>
-                  <w:pPr>
-                    <w:spacing w:after="10" w:before="0"/>
-                  </w:pPr>
-                  <w:r>
-                    <w:rPr>
-                      <w:rFonts w:ascii="Calibri" w:cs="Calibri" w:eastAsia="Calibri" w:hAnsi="Calibri"/>
+                      <w:sz w:val="19"/>
+                      <w:szCs w:val="19"/>
+                    </w:rPr>
+                    <w:t xml:space="preserve">Plusquamperfekt  </w:t>
+                  </w:r>
+                  <w:r>
+                    <w:rPr>
+                      <w:rFonts w:ascii="Calibri" w:cs="Calibri" w:eastAsia="Calibri" w:hAnsi="Calibri"/>
+                      <w:b/>
+                      <w:bCs/>
+                      <w:color w:val="D9534F"/>
+                      <w:sz w:val="16"/>
+                      <w:szCs w:val="16"/>
+                    </w:rPr>
+                    <w:t xml:space="preserve">hatte/war</w:t>
+                  </w:r>
+                  <w:r>
+                    <w:rPr>
+                      <w:rFonts w:ascii="Calibri" w:cs="Calibri" w:eastAsia="Calibri" w:hAnsi="Calibri"/>
+                      <w:b/>
+                      <w:bCs/>
                       <w:color w:val="5B6B8C"/>
                       <w:sz w:val="16"/>
                       <w:szCs w:val="16"/>
                     </w:rPr>
-                    <w:t xml:space="preserve">vorher</w:t>
-                  </w:r>
-                </w:p>
-                <w:p>
-                  <w:pPr>
-                    <w:spacing w:after="0" w:before="0"/>
-                  </w:pPr>
-                  <w:r>
-                    <w:rPr>
-                      <w:rFonts w:ascii="Calibri" w:cs="Calibri" w:eastAsia="Calibri" w:hAnsi="Calibri"/>
-                      <w:b/>
-                      <w:bCs/>
-                      <w:color w:val="D9534F"/>
-                      <w:sz w:val="16"/>
-                      <w:szCs w:val="16"/>
-                    </w:rPr>
-                    <w:t xml:space="preserve">hatte/war</w:t>
-                  </w:r>
-                  <w:r>
-                    <w:rPr>
-                      <w:rFonts w:ascii="Calibri" w:cs="Calibri" w:eastAsia="Calibri" w:hAnsi="Calibri"/>
-                      <w:b/>
-                      <w:bCs/>
-                      <w:color w:val="333333"/>
-                      <w:sz w:val="16"/>
-                      <w:szCs w:val="16"/>
-                    </w:rPr>
                     <w:t xml:space="preserve"> + </w:t>
                   </w:r>
                   <w:r>
@@ -2515,7 +2485,7 @@
               </w:tc>
               <w:tc>
                 <w:tcPr>
-                  <w:tcW w:type="dxa" w:w="8056"/>
+                  <w:tcW w:type="dxa" w:w="6606"/>
                   <w:tcBorders>
                     <w:top w:val="single" w:color="B9C6E8" w:sz="6"/>
                     <w:left w:val="single" w:color="B9C6E8" w:sz="6"/>
@@ -2523,23 +2493,23 @@
                     <w:right w:val="single" w:color="B9C6E8" w:sz="6"/>
                   </w:tcBorders>
                   <w:tcMar>
-                    <w:top w:type="dxa" w:w="70"/>
-                    <w:left w:type="dxa" w:w="100"/>
-                    <w:bottom w:type="dxa" w:w="70"/>
-                    <w:right w:type="dxa" w:w="100"/>
-                  </w:tcMar>
-                  <w:vAlign w:val="top"/>
-                </w:tcPr>
-                <w:p>
-                  <w:pPr>
-                    <w:spacing w:after="20" w:before="0"/>
-                  </w:pPr>
-                  <w:r>
-                    <w:rPr>
-                      <w:rFonts w:ascii="Calibri" w:cs="Calibri" w:eastAsia="Calibri" w:hAnsi="Calibri"/>
-                      <w:color w:val="000000"/>
-                      <w:sz w:val="18"/>
-                      <w:szCs w:val="18"/>
+                    <w:top w:type="dxa" w:w="50"/>
+                    <w:left w:type="dxa" w:w="100"/>
+                    <w:bottom w:type="dxa" w:w="50"/>
+                    <w:right w:type="dxa" w:w="100"/>
+                  </w:tcMar>
+                  <w:vAlign w:val="center"/>
+                </w:tcPr>
+                <w:p>
+                  <w:pPr>
+                    <w:spacing w:after="0" w:before="0"/>
+                  </w:pPr>
+                  <w:r>
+                    <w:rPr>
+                      <w:rFonts w:ascii="Calibri" w:cs="Calibri" w:eastAsia="Calibri" w:hAnsi="Calibri"/>
+                      <w:color w:val="000000"/>
+                      <w:sz w:val="19"/>
+                      <w:szCs w:val="19"/>
                     </w:rPr>
                     <w:t xml:space="preserve">Vor dem Wettkampf </w:t>
                   </w:r>
@@ -2549,8 +2519,8 @@
                       <w:b/>
                       <w:bCs/>
                       <w:color w:val="D9534F"/>
-                      <w:sz w:val="18"/>
-                      <w:szCs w:val="18"/>
+                      <w:sz w:val="19"/>
+                      <w:szCs w:val="19"/>
                     </w:rPr>
                     <w:t xml:space="preserve">hatte</w:t>
                   </w:r>
@@ -2558,10 +2528,10 @@
                     <w:rPr>
                       <w:rFonts w:ascii="Calibri" w:cs="Calibri" w:eastAsia="Calibri" w:hAnsi="Calibri"/>
                       <w:color w:val="000000"/>
-                      <w:sz w:val="18"/>
-                      <w:szCs w:val="18"/>
-                    </w:rPr>
-                    <w:t xml:space="preserve"> ich wochenlang hart </w:t>
+                      <w:sz w:val="19"/>
+                      <w:szCs w:val="19"/>
+                    </w:rPr>
+                    <w:t xml:space="preserve"> ich wochenlang </w:t>
                   </w:r>
                   <w:r>
                     <w:rPr>
@@ -2569,8 +2539,8 @@
                       <w:b/>
                       <w:bCs/>
                       <w:color w:val="C98A1E"/>
-                      <w:sz w:val="18"/>
-                      <w:szCs w:val="18"/>
+                      <w:sz w:val="19"/>
+                      <w:szCs w:val="19"/>
                     </w:rPr>
                     <w:t xml:space="preserve">trainiert</w:t>
                   </w:r>
@@ -2578,290 +2548,8 @@
                     <w:rPr>
                       <w:rFonts w:ascii="Calibri" w:cs="Calibri" w:eastAsia="Calibri" w:hAnsi="Calibri"/>
                       <w:color w:val="000000"/>
-                      <w:sz w:val="18"/>
-                      <w:szCs w:val="18"/>
-                    </w:rPr>
-                    <w:t xml:space="preserve">.</w:t>
-                  </w:r>
-                  <w:r>
-                    <w:rPr>
-                      <w:rFonts w:ascii="Calibri" w:cs="Calibri" w:eastAsia="Calibri" w:hAnsi="Calibri"/>
-                      <w:color w:val="9AA3B5"/>
-                      <w:sz w:val="18"/>
-                      <w:szCs w:val="18"/>
-                    </w:rPr>
-                    <w:t xml:space="preserve">   ·   </w:t>
-                  </w:r>
-                  <w:r>
-                    <w:rPr>
-                      <w:rFonts w:ascii="Calibri" w:cs="Calibri" w:eastAsia="Calibri" w:hAnsi="Calibri"/>
-                      <w:color w:val="000000"/>
-                      <w:sz w:val="18"/>
-                      <w:szCs w:val="18"/>
-                    </w:rPr>
-                    <w:t xml:space="preserve">Am Abend davor </w:t>
-                  </w:r>
-                  <w:r>
-                    <w:rPr>
-                      <w:rFonts w:ascii="Calibri" w:cs="Calibri" w:eastAsia="Calibri" w:hAnsi="Calibri"/>
-                      <w:b/>
-                      <w:bCs/>
-                      <w:color w:val="D9534F"/>
-                      <w:sz w:val="18"/>
-                      <w:szCs w:val="18"/>
-                    </w:rPr>
-                    <w:t xml:space="preserve">hatte</w:t>
-                  </w:r>
-                  <w:r>
-                    <w:rPr>
-                      <w:rFonts w:ascii="Calibri" w:cs="Calibri" w:eastAsia="Calibri" w:hAnsi="Calibri"/>
-                      <w:color w:val="000000"/>
-                      <w:sz w:val="18"/>
-                      <w:szCs w:val="18"/>
-                    </w:rPr>
-                    <w:t xml:space="preserve"> ich kaum </w:t>
-                  </w:r>
-                  <w:r>
-                    <w:rPr>
-                      <w:rFonts w:ascii="Calibri" w:cs="Calibri" w:eastAsia="Calibri" w:hAnsi="Calibri"/>
-                      <w:b/>
-                      <w:bCs/>
-                      <w:color w:val="C98A1E"/>
-                      <w:sz w:val="18"/>
-                      <w:szCs w:val="18"/>
-                    </w:rPr>
-                    <w:t xml:space="preserve">geschlafen</w:t>
-                  </w:r>
-                  <w:r>
-                    <w:rPr>
-                      <w:rFonts w:ascii="Calibri" w:cs="Calibri" w:eastAsia="Calibri" w:hAnsi="Calibri"/>
-                      <w:color w:val="000000"/>
-                      <w:sz w:val="18"/>
-                      <w:szCs w:val="18"/>
-                    </w:rPr>
-                    <w:t xml:space="preserve">.</w:t>
-                  </w:r>
-                </w:p>
-                <w:p>
-                  <w:pPr>
-                    <w:spacing w:after="20" w:before="0"/>
-                  </w:pPr>
-                  <w:r>
-                    <w:rPr>
-                      <w:rFonts w:ascii="Calibri" w:cs="Calibri" w:eastAsia="Calibri" w:hAnsi="Calibri"/>
-                      <w:color w:val="000000"/>
-                      <w:sz w:val="18"/>
-                      <w:szCs w:val="18"/>
-                    </w:rPr>
-                    <w:t xml:space="preserve">Am Freitag </w:t>
-                  </w:r>
-                  <w:r>
-                    <w:rPr>
-                      <w:rFonts w:ascii="Calibri" w:cs="Calibri" w:eastAsia="Calibri" w:hAnsi="Calibri"/>
-                      <w:b/>
-                      <w:bCs/>
-                      <w:color w:val="D9534F"/>
-                      <w:sz w:val="18"/>
-                      <w:szCs w:val="18"/>
-                    </w:rPr>
-                    <w:t xml:space="preserve">waren</w:t>
-                  </w:r>
-                  <w:r>
-                    <w:rPr>
-                      <w:rFonts w:ascii="Calibri" w:cs="Calibri" w:eastAsia="Calibri" w:hAnsi="Calibri"/>
-                      <w:color w:val="000000"/>
-                      <w:sz w:val="18"/>
-                      <w:szCs w:val="18"/>
-                    </w:rPr>
-                    <w:t xml:space="preserve"> wir mit dem Team nach … </w:t>
-                  </w:r>
-                  <w:r>
-                    <w:rPr>
-                      <w:rFonts w:ascii="Calibri" w:cs="Calibri" w:eastAsia="Calibri" w:hAnsi="Calibri"/>
-                      <w:b/>
-                      <w:bCs/>
-                      <w:color w:val="C98A1E"/>
-                      <w:sz w:val="18"/>
-                      <w:szCs w:val="18"/>
-                    </w:rPr>
-                    <w:t xml:space="preserve">gefahren</w:t>
-                  </w:r>
-                  <w:r>
-                    <w:rPr>
-                      <w:rFonts w:ascii="Calibri" w:cs="Calibri" w:eastAsia="Calibri" w:hAnsi="Calibri"/>
-                      <w:color w:val="000000"/>
-                      <w:sz w:val="18"/>
-                      <w:szCs w:val="18"/>
-                    </w:rPr>
-                    <w:t xml:space="preserve">.</w:t>
-                  </w:r>
-                  <w:r>
-                    <w:rPr>
-                      <w:rFonts w:ascii="Calibri" w:cs="Calibri" w:eastAsia="Calibri" w:hAnsi="Calibri"/>
-                      <w:color w:val="9AA3B5"/>
-                      <w:sz w:val="18"/>
-                      <w:szCs w:val="18"/>
-                    </w:rPr>
-                    <w:t xml:space="preserve">   ·   </w:t>
-                  </w:r>
-                  <w:r>
-                    <w:rPr>
-                      <w:rFonts w:ascii="Calibri" w:cs="Calibri" w:eastAsia="Calibri" w:hAnsi="Calibri"/>
-                      <w:color w:val="000000"/>
-                      <w:sz w:val="18"/>
-                      <w:szCs w:val="18"/>
-                    </w:rPr>
-                    <w:t xml:space="preserve">Mein Trainer </w:t>
-                  </w:r>
-                  <w:r>
-                    <w:rPr>
-                      <w:rFonts w:ascii="Calibri" w:cs="Calibri" w:eastAsia="Calibri" w:hAnsi="Calibri"/>
-                      <w:b/>
-                      <w:bCs/>
-                      <w:color w:val="D9534F"/>
-                      <w:sz w:val="18"/>
-                      <w:szCs w:val="18"/>
-                    </w:rPr>
-                    <w:t xml:space="preserve">hatte</w:t>
-                  </w:r>
-                  <w:r>
-                    <w:rPr>
-                      <w:rFonts w:ascii="Calibri" w:cs="Calibri" w:eastAsia="Calibri" w:hAnsi="Calibri"/>
-                      <w:color w:val="000000"/>
-                      <w:sz w:val="18"/>
-                      <w:szCs w:val="18"/>
-                    </w:rPr>
-                    <w:t xml:space="preserve"> mir noch einen Tipp </w:t>
-                  </w:r>
-                  <w:r>
-                    <w:rPr>
-                      <w:rFonts w:ascii="Calibri" w:cs="Calibri" w:eastAsia="Calibri" w:hAnsi="Calibri"/>
-                      <w:b/>
-                      <w:bCs/>
-                      <w:color w:val="C98A1E"/>
-                      <w:sz w:val="18"/>
-                      <w:szCs w:val="18"/>
-                    </w:rPr>
-                    <w:t xml:space="preserve">gegeben</w:t>
-                  </w:r>
-                  <w:r>
-                    <w:rPr>
-                      <w:rFonts w:ascii="Calibri" w:cs="Calibri" w:eastAsia="Calibri" w:hAnsi="Calibri"/>
-                      <w:color w:val="000000"/>
-                      <w:sz w:val="18"/>
-                      <w:szCs w:val="18"/>
-                    </w:rPr>
-                    <w:t xml:space="preserve">.</w:t>
-                  </w:r>
-                </w:p>
-                <w:p>
-                  <w:pPr>
-                    <w:spacing w:after="20" w:before="0"/>
-                  </w:pPr>
-                  <w:r>
-                    <w:rPr>
-                      <w:rFonts w:ascii="Calibri" w:cs="Calibri" w:eastAsia="Calibri" w:hAnsi="Calibri"/>
-                      <w:color w:val="000000"/>
-                      <w:sz w:val="18"/>
-                      <w:szCs w:val="18"/>
-                    </w:rPr>
-                    <w:t xml:space="preserve">Ich </w:t>
-                  </w:r>
-                  <w:r>
-                    <w:rPr>
-                      <w:rFonts w:ascii="Calibri" w:cs="Calibri" w:eastAsia="Calibri" w:hAnsi="Calibri"/>
-                      <w:b/>
-                      <w:bCs/>
-                      <w:color w:val="D9534F"/>
-                      <w:sz w:val="18"/>
-                      <w:szCs w:val="18"/>
-                    </w:rPr>
-                    <w:t xml:space="preserve">hatte</w:t>
-                  </w:r>
-                  <w:r>
-                    <w:rPr>
-                      <w:rFonts w:ascii="Calibri" w:cs="Calibri" w:eastAsia="Calibri" w:hAnsi="Calibri"/>
-                      <w:color w:val="000000"/>
-                      <w:sz w:val="18"/>
-                      <w:szCs w:val="18"/>
-                    </w:rPr>
-                    <w:t xml:space="preserve"> mich lange </w:t>
-                  </w:r>
-                  <w:r>
-                    <w:rPr>
-                      <w:rFonts w:ascii="Calibri" w:cs="Calibri" w:eastAsia="Calibri" w:hAnsi="Calibri"/>
-                      <w:b/>
-                      <w:bCs/>
-                      <w:color w:val="C98A1E"/>
-                      <w:sz w:val="18"/>
-                      <w:szCs w:val="18"/>
-                    </w:rPr>
-                    <w:t xml:space="preserve">aufgewärmt</w:t>
-                  </w:r>
-                  <w:r>
-                    <w:rPr>
-                      <w:rFonts w:ascii="Calibri" w:cs="Calibri" w:eastAsia="Calibri" w:hAnsi="Calibri"/>
-                      <w:color w:val="000000"/>
-                      <w:sz w:val="18"/>
-                      <w:szCs w:val="18"/>
-                    </w:rPr>
-                    <w:t xml:space="preserve">.</w:t>
-                  </w:r>
-                  <w:r>
-                    <w:rPr>
-                      <w:rFonts w:ascii="Calibri" w:cs="Calibri" w:eastAsia="Calibri" w:hAnsi="Calibri"/>
-                      <w:color w:val="9AA3B5"/>
-                      <w:sz w:val="18"/>
-                      <w:szCs w:val="18"/>
-                    </w:rPr>
-                    <w:t xml:space="preserve">   ·   </w:t>
-                  </w:r>
-                  <w:r>
-                    <w:rPr>
-                      <w:rFonts w:ascii="Calibri" w:cs="Calibri" w:eastAsia="Calibri" w:hAnsi="Calibri"/>
-                      <w:color w:val="000000"/>
-                      <w:sz w:val="18"/>
-                      <w:szCs w:val="18"/>
-                    </w:rPr>
-                    <w:t xml:space="preserve">Wir </w:t>
-                  </w:r>
-                  <w:r>
-                    <w:rPr>
-                      <w:rFonts w:ascii="Calibri" w:cs="Calibri" w:eastAsia="Calibri" w:hAnsi="Calibri"/>
-                      <w:b/>
-                      <w:bCs/>
-                      <w:color w:val="D9534F"/>
-                      <w:sz w:val="18"/>
-                      <w:szCs w:val="18"/>
-                    </w:rPr>
-                    <w:t xml:space="preserve">waren</w:t>
-                  </w:r>
-                  <w:r>
-                    <w:rPr>
-                      <w:rFonts w:ascii="Calibri" w:cs="Calibri" w:eastAsia="Calibri" w:hAnsi="Calibri"/>
-                      <w:color w:val="000000"/>
-                      <w:sz w:val="18"/>
-                      <w:szCs w:val="18"/>
-                    </w:rPr>
-                    <w:t xml:space="preserve"> früh </w:t>
-                  </w:r>
-                  <w:r>
-                    <w:rPr>
-                      <w:rFonts w:ascii="Calibri" w:cs="Calibri" w:eastAsia="Calibri" w:hAnsi="Calibri"/>
-                      <w:b/>
-                      <w:bCs/>
-                      <w:color w:val="C98A1E"/>
-                      <w:sz w:val="18"/>
-                      <w:szCs w:val="18"/>
-                    </w:rPr>
-                    <w:t xml:space="preserve">aufgestanden</w:t>
-                  </w:r>
-                  <w:r>
-                    <w:rPr>
-                      <w:rFonts w:ascii="Calibri" w:cs="Calibri" w:eastAsia="Calibri" w:hAnsi="Calibri"/>
-                      <w:color w:val="000000"/>
-                      <w:sz w:val="18"/>
-                      <w:szCs w:val="18"/>
+                      <w:sz w:val="19"/>
+                      <w:szCs w:val="19"/>
                     </w:rPr>
                     <w:t xml:space="preserve">.</w:t>
                   </w:r>
@@ -2874,7 +2562,7 @@
               </w:trPr>
               <w:tc>
                 <w:tcPr>
-                  <w:tcW w:type="dxa" w:w="2350"/>
+                  <w:tcW w:type="dxa" w:w="3800"/>
                   <w:tcBorders>
                     <w:top w:val="single" w:color="B9C6E8" w:sz="6"/>
                     <w:left w:val="single" w:color="B9C6E8" w:sz="6"/>
@@ -2883,16 +2571,16 @@
                   </w:tcBorders>
                   <w:shd w:fill="F4F7FD" w:color="auto" w:val="clear"/>
                   <w:tcMar>
-                    <w:top w:type="dxa" w:w="70"/>
-                    <w:left w:type="dxa" w:w="100"/>
-                    <w:bottom w:type="dxa" w:w="70"/>
-                    <w:right w:type="dxa" w:w="100"/>
-                  </w:tcMar>
-                  <w:vAlign w:val="top"/>
-                </w:tcPr>
-                <w:p>
-                  <w:pPr>
-                    <w:spacing w:after="10" w:before="0"/>
+                    <w:top w:type="dxa" w:w="50"/>
+                    <w:left w:type="dxa" w:w="100"/>
+                    <w:bottom w:type="dxa" w:w="50"/>
+                    <w:right w:type="dxa" w:w="100"/>
+                  </w:tcMar>
+                  <w:vAlign w:val="center"/>
+                </w:tcPr>
+                <w:p>
+                  <w:pPr>
+                    <w:spacing w:after="0" w:before="0"/>
                   </w:pPr>
                   <w:r>
                     <w:rPr>
@@ -2900,46 +2588,27 @@
                       <w:b/>
                       <w:bCs/>
                       <w:color w:val="1E2761"/>
-                      <w:sz w:val="20"/>
-                      <w:szCs w:val="20"/>
-                    </w:rPr>
-                    <w:t xml:space="preserve">Präteritum</w:t>
-                  </w:r>
-                </w:p>
-                <w:p>
-                  <w:pPr>
-                    <w:spacing w:after="10" w:before="0"/>
-                  </w:pPr>
-                  <w:r>
-                    <w:rPr>
-                      <w:rFonts w:ascii="Calibri" w:cs="Calibri" w:eastAsia="Calibri" w:hAnsi="Calibri"/>
+                      <w:sz w:val="19"/>
+                      <w:szCs w:val="19"/>
+                    </w:rPr>
+                    <w:t xml:space="preserve">Präteritum  </w:t>
+                  </w:r>
+                  <w:r>
+                    <w:rPr>
+                      <w:rFonts w:ascii="Calibri" w:cs="Calibri" w:eastAsia="Calibri" w:hAnsi="Calibri"/>
+                      <w:b/>
+                      <w:bCs/>
                       <w:color w:val="5B6B8C"/>
                       <w:sz w:val="16"/>
                       <w:szCs w:val="16"/>
                     </w:rPr>
-                    <w:t xml:space="preserve">Vergangenheit – erzählt</w:t>
-                  </w:r>
-                </w:p>
-                <w:p>
-                  <w:pPr>
-                    <w:spacing w:after="0" w:before="0"/>
-                  </w:pPr>
-                  <w:r>
-                    <w:rPr>
-                      <w:rFonts w:ascii="Calibri" w:cs="Calibri" w:eastAsia="Calibri" w:hAnsi="Calibri"/>
-                      <w:b/>
-                      <w:bCs/>
-                      <w:color w:val="333333"/>
-                      <w:sz w:val="16"/>
-                      <w:szCs w:val="16"/>
-                    </w:rPr>
-                    <w:t xml:space="preserve">finites Verb im Präteritum</w:t>
-                  </w:r>
-                </w:p>
-              </w:tc>
-              <w:tc>
-                <w:tcPr>
-                  <w:tcW w:type="dxa" w:w="8056"/>
+                    <w:t xml:space="preserve">erzählt</w:t>
+                  </w:r>
+                </w:p>
+              </w:tc>
+              <w:tc>
+                <w:tcPr>
+                  <w:tcW w:type="dxa" w:w="6606"/>
                   <w:tcBorders>
                     <w:top w:val="single" w:color="B9C6E8" w:sz="6"/>
                     <w:left w:val="single" w:color="B9C6E8" w:sz="6"/>
@@ -2947,23 +2616,23 @@
                     <w:right w:val="single" w:color="B9C6E8" w:sz="6"/>
                   </w:tcBorders>
                   <w:tcMar>
-                    <w:top w:type="dxa" w:w="70"/>
-                    <w:left w:type="dxa" w:w="100"/>
-                    <w:bottom w:type="dxa" w:w="70"/>
-                    <w:right w:type="dxa" w:w="100"/>
-                  </w:tcMar>
-                  <w:vAlign w:val="top"/>
-                </w:tcPr>
-                <w:p>
-                  <w:pPr>
-                    <w:spacing w:after="20" w:before="0"/>
-                  </w:pPr>
-                  <w:r>
-                    <w:rPr>
-                      <w:rFonts w:ascii="Calibri" w:cs="Calibri" w:eastAsia="Calibri" w:hAnsi="Calibri"/>
-                      <w:color w:val="000000"/>
-                      <w:sz w:val="18"/>
-                      <w:szCs w:val="18"/>
+                    <w:top w:type="dxa" w:w="50"/>
+                    <w:left w:type="dxa" w:w="100"/>
+                    <w:bottom w:type="dxa" w:w="50"/>
+                    <w:right w:type="dxa" w:w="100"/>
+                  </w:tcMar>
+                  <w:vAlign w:val="center"/>
+                </w:tcPr>
+                <w:p>
+                  <w:pPr>
+                    <w:spacing w:after="0" w:before="0"/>
+                  </w:pPr>
+                  <w:r>
+                    <w:rPr>
+                      <w:rFonts w:ascii="Calibri" w:cs="Calibri" w:eastAsia="Calibri" w:hAnsi="Calibri"/>
+                      <w:color w:val="000000"/>
+                      <w:sz w:val="19"/>
+                      <w:szCs w:val="19"/>
                     </w:rPr>
                     <w:t xml:space="preserve">Am Samstag </w:t>
                   </w:r>
@@ -2973,8 +2642,8 @@
                       <w:b/>
                       <w:bCs/>
                       <w:color w:val="000000"/>
-                      <w:sz w:val="18"/>
-                      <w:szCs w:val="18"/>
+                      <w:sz w:val="19"/>
+                      <w:szCs w:val="19"/>
                       <w:u w:val="single"/>
                     </w:rPr>
                     <w:t xml:space="preserve">kämpfte</w:t>
@@ -2983,8 +2652,8 @@
                     <w:rPr>
                       <w:rFonts w:ascii="Calibri" w:cs="Calibri" w:eastAsia="Calibri" w:hAnsi="Calibri"/>
                       <w:color w:val="000000"/>
-                      <w:sz w:val="18"/>
-                      <w:szCs w:val="18"/>
+                      <w:sz w:val="19"/>
+                      <w:szCs w:val="19"/>
                     </w:rPr>
                     <w:t xml:space="preserve"> / </w:t>
                   </w:r>
@@ -2994,8 +2663,8 @@
                       <w:b/>
                       <w:bCs/>
                       <w:color w:val="000000"/>
-                      <w:sz w:val="18"/>
-                      <w:szCs w:val="18"/>
+                      <w:sz w:val="19"/>
+                      <w:szCs w:val="19"/>
                       <w:u w:val="single"/>
                     </w:rPr>
                     <w:t xml:space="preserve">spielte</w:t>
@@ -3004,8 +2673,8 @@
                     <w:rPr>
                       <w:rFonts w:ascii="Calibri" w:cs="Calibri" w:eastAsia="Calibri" w:hAnsi="Calibri"/>
                       <w:color w:val="000000"/>
-                      <w:sz w:val="18"/>
-                      <w:szCs w:val="18"/>
+                      <w:sz w:val="19"/>
+                      <w:szCs w:val="19"/>
                     </w:rPr>
                     <w:t xml:space="preserve"> / </w:t>
                   </w:r>
@@ -3015,8 +2684,8 @@
                       <w:b/>
                       <w:bCs/>
                       <w:color w:val="000000"/>
-                      <w:sz w:val="18"/>
-                      <w:szCs w:val="18"/>
+                      <w:sz w:val="19"/>
+                      <w:szCs w:val="19"/>
                       <w:u w:val="single"/>
                     </w:rPr>
                     <w:t xml:space="preserve">hob</w:t>
@@ -3025,202 +2694,8 @@
                     <w:rPr>
                       <w:rFonts w:ascii="Calibri" w:cs="Calibri" w:eastAsia="Calibri" w:hAnsi="Calibri"/>
                       <w:color w:val="000000"/>
-                      <w:sz w:val="18"/>
-                      <w:szCs w:val="18"/>
-                    </w:rPr>
-                    <w:t xml:space="preserve"> ich …</w:t>
-                  </w:r>
-                  <w:r>
-                    <w:rPr>
-                      <w:rFonts w:ascii="Calibri" w:cs="Calibri" w:eastAsia="Calibri" w:hAnsi="Calibri"/>
-                      <w:color w:val="9AA3B5"/>
-                      <w:sz w:val="18"/>
-                      <w:szCs w:val="18"/>
-                    </w:rPr>
-                    <w:t xml:space="preserve">   ·   </w:t>
-                  </w:r>
-                  <w:r>
-                    <w:rPr>
-                      <w:rFonts w:ascii="Calibri" w:cs="Calibri" w:eastAsia="Calibri" w:hAnsi="Calibri"/>
-                      <w:color w:val="000000"/>
-                      <w:sz w:val="18"/>
-                      <w:szCs w:val="18"/>
-                    </w:rPr>
-                    <w:t xml:space="preserve">Im ersten Kampf / In der ersten Halbzeit / Im ersten Versuch …</w:t>
-                  </w:r>
-                </w:p>
-                <w:p>
-                  <w:pPr>
-                    <w:spacing w:after="20" w:before="0"/>
-                  </w:pPr>
-                  <w:r>
-                    <w:rPr>
-                      <w:rFonts w:ascii="Calibri" w:cs="Calibri" w:eastAsia="Calibri" w:hAnsi="Calibri"/>
-                      <w:color w:val="000000"/>
-                      <w:sz w:val="18"/>
-                      <w:szCs w:val="18"/>
-                    </w:rPr>
-                    <w:t xml:space="preserve">Am Anfang </w:t>
-                  </w:r>
-                  <w:r>
-                    <w:rPr>
-                      <w:rFonts w:ascii="Calibri" w:cs="Calibri" w:eastAsia="Calibri" w:hAnsi="Calibri"/>
-                      <w:b/>
-                      <w:bCs/>
-                      <w:color w:val="000000"/>
-                      <w:sz w:val="18"/>
-                      <w:szCs w:val="18"/>
-                      <w:u w:val="single"/>
-                    </w:rPr>
-                    <w:t xml:space="preserve">war</w:t>
-                  </w:r>
-                  <w:r>
-                    <w:rPr>
-                      <w:rFonts w:ascii="Calibri" w:cs="Calibri" w:eastAsia="Calibri" w:hAnsi="Calibri"/>
-                      <w:color w:val="000000"/>
-                      <w:sz w:val="18"/>
-                      <w:szCs w:val="18"/>
-                    </w:rPr>
-                    <w:t xml:space="preserve"> ich sehr nervös.</w:t>
-                  </w:r>
-                  <w:r>
-                    <w:rPr>
-                      <w:rFonts w:ascii="Calibri" w:cs="Calibri" w:eastAsia="Calibri" w:hAnsi="Calibri"/>
-                      <w:color w:val="9AA3B5"/>
-                      <w:sz w:val="18"/>
-                      <w:szCs w:val="18"/>
-                    </w:rPr>
-                    <w:t xml:space="preserve">   ·   </w:t>
-                  </w:r>
-                  <w:r>
-                    <w:rPr>
-                      <w:rFonts w:ascii="Calibri" w:cs="Calibri" w:eastAsia="Calibri" w:hAnsi="Calibri"/>
-                      <w:color w:val="000000"/>
-                      <w:sz w:val="18"/>
-                      <w:szCs w:val="18"/>
-                    </w:rPr>
-                    <w:t xml:space="preserve">Dann </w:t>
-                  </w:r>
-                  <w:r>
-                    <w:rPr>
-                      <w:rFonts w:ascii="Calibri" w:cs="Calibri" w:eastAsia="Calibri" w:hAnsi="Calibri"/>
-                      <w:b/>
-                      <w:bCs/>
-                      <w:color w:val="000000"/>
-                      <w:sz w:val="18"/>
-                      <w:szCs w:val="18"/>
-                      <w:u w:val="single"/>
-                    </w:rPr>
-                    <w:t xml:space="preserve">warf</w:t>
-                  </w:r>
-                  <w:r>
-                    <w:rPr>
-                      <w:rFonts w:ascii="Calibri" w:cs="Calibri" w:eastAsia="Calibri" w:hAnsi="Calibri"/>
-                      <w:color w:val="000000"/>
-                      <w:sz w:val="18"/>
-                      <w:szCs w:val="18"/>
-                    </w:rPr>
-                    <w:t xml:space="preserve"> / </w:t>
-                  </w:r>
-                  <w:r>
-                    <w:rPr>
-                      <w:rFonts w:ascii="Calibri" w:cs="Calibri" w:eastAsia="Calibri" w:hAnsi="Calibri"/>
-                      <w:b/>
-                      <w:bCs/>
-                      <w:color w:val="000000"/>
-                      <w:sz w:val="18"/>
-                      <w:szCs w:val="18"/>
-                      <w:u w:val="single"/>
-                    </w:rPr>
-                    <w:t xml:space="preserve">traf</w:t>
-                  </w:r>
-                  <w:r>
-                    <w:rPr>
-                      <w:rFonts w:ascii="Calibri" w:cs="Calibri" w:eastAsia="Calibri" w:hAnsi="Calibri"/>
-                      <w:color w:val="000000"/>
-                      <w:sz w:val="18"/>
-                      <w:szCs w:val="18"/>
-                    </w:rPr>
-                    <w:t xml:space="preserve"> / </w:t>
-                  </w:r>
-                  <w:r>
-                    <w:rPr>
-                      <w:rFonts w:ascii="Calibri" w:cs="Calibri" w:eastAsia="Calibri" w:hAnsi="Calibri"/>
-                      <w:b/>
-                      <w:bCs/>
-                      <w:color w:val="000000"/>
-                      <w:sz w:val="18"/>
-                      <w:szCs w:val="18"/>
-                      <w:u w:val="single"/>
-                    </w:rPr>
-                    <w:t xml:space="preserve">stieß</w:t>
-                  </w:r>
-                  <w:r>
-                    <w:rPr>
-                      <w:rFonts w:ascii="Calibri" w:cs="Calibri" w:eastAsia="Calibri" w:hAnsi="Calibri"/>
-                      <w:color w:val="000000"/>
-                      <w:sz w:val="18"/>
-                      <w:szCs w:val="18"/>
-                    </w:rPr>
-                    <w:t xml:space="preserve"> ich …</w:t>
-                  </w:r>
-                  <w:r>
-                    <w:rPr>
-                      <w:rFonts w:ascii="Calibri" w:cs="Calibri" w:eastAsia="Calibri" w:hAnsi="Calibri"/>
-                      <w:color w:val="9AA3B5"/>
-                      <w:sz w:val="18"/>
-                      <w:szCs w:val="18"/>
-                    </w:rPr>
-                    <w:t xml:space="preserve">   ·   </w:t>
-                  </w:r>
-                  <w:r>
-                    <w:rPr>
-                      <w:rFonts w:ascii="Calibri" w:cs="Calibri" w:eastAsia="Calibri" w:hAnsi="Calibri"/>
-                      <w:color w:val="000000"/>
-                      <w:sz w:val="18"/>
-                      <w:szCs w:val="18"/>
-                    </w:rPr>
-                    <w:t xml:space="preserve">Am Ende </w:t>
-                  </w:r>
-                  <w:r>
-                    <w:rPr>
-                      <w:rFonts w:ascii="Calibri" w:cs="Calibri" w:eastAsia="Calibri" w:hAnsi="Calibri"/>
-                      <w:b/>
-                      <w:bCs/>
-                      <w:color w:val="000000"/>
-                      <w:sz w:val="18"/>
-                      <w:szCs w:val="18"/>
-                      <w:u w:val="single"/>
-                    </w:rPr>
-                    <w:t xml:space="preserve">gewann</w:t>
-                  </w:r>
-                  <w:r>
-                    <w:rPr>
-                      <w:rFonts w:ascii="Calibri" w:cs="Calibri" w:eastAsia="Calibri" w:hAnsi="Calibri"/>
-                      <w:color w:val="000000"/>
-                      <w:sz w:val="18"/>
-                      <w:szCs w:val="18"/>
-                    </w:rPr>
-                    <w:t xml:space="preserve"> / </w:t>
-                  </w:r>
-                  <w:r>
-                    <w:rPr>
-                      <w:rFonts w:ascii="Calibri" w:cs="Calibri" w:eastAsia="Calibri" w:hAnsi="Calibri"/>
-                      <w:b/>
-                      <w:bCs/>
-                      <w:color w:val="000000"/>
-                      <w:sz w:val="18"/>
-                      <w:szCs w:val="18"/>
-                      <w:u w:val="single"/>
-                    </w:rPr>
-                    <w:t xml:space="preserve">verlor</w:t>
-                  </w:r>
-                  <w:r>
-                    <w:rPr>
-                      <w:rFonts w:ascii="Calibri" w:cs="Calibri" w:eastAsia="Calibri" w:hAnsi="Calibri"/>
-                      <w:color w:val="000000"/>
-                      <w:sz w:val="18"/>
-                      <w:szCs w:val="18"/>
+                      <w:sz w:val="19"/>
+                      <w:szCs w:val="19"/>
                     </w:rPr>
                     <w:t xml:space="preserve"> ich …</w:t>
                   </w:r>
@@ -3233,7 +2708,7 @@
               </w:trPr>
               <w:tc>
                 <w:tcPr>
-                  <w:tcW w:type="dxa" w:w="2350"/>
+                  <w:tcW w:type="dxa" w:w="3800"/>
                   <w:tcBorders>
                     <w:top w:val="single" w:color="B9C6E8" w:sz="6"/>
                     <w:left w:val="single" w:color="B9C6E8" w:sz="6"/>
@@ -3242,16 +2717,16 @@
                   </w:tcBorders>
                   <w:shd w:fill="F4F7FD" w:color="auto" w:val="clear"/>
                   <w:tcMar>
-                    <w:top w:type="dxa" w:w="70"/>
-                    <w:left w:type="dxa" w:w="100"/>
-                    <w:bottom w:type="dxa" w:w="70"/>
-                    <w:right w:type="dxa" w:w="100"/>
-                  </w:tcMar>
-                  <w:vAlign w:val="top"/>
-                </w:tcPr>
-                <w:p>
-                  <w:pPr>
-                    <w:spacing w:after="10" w:before="0"/>
+                    <w:top w:type="dxa" w:w="50"/>
+                    <w:left w:type="dxa" w:w="100"/>
+                    <w:bottom w:type="dxa" w:w="50"/>
+                    <w:right w:type="dxa" w:w="100"/>
+                  </w:tcMar>
+                  <w:vAlign w:val="center"/>
+                </w:tcPr>
+                <w:p>
+                  <w:pPr>
+                    <w:spacing w:after="0" w:before="0"/>
                   </w:pPr>
                   <w:r>
                     <w:rPr>
@@ -3259,50 +2734,31 @@
                       <w:b/>
                       <w:bCs/>
                       <w:color w:val="1E2761"/>
-                      <w:sz w:val="20"/>
-                      <w:szCs w:val="20"/>
-                    </w:rPr>
-                    <w:t xml:space="preserve">Perfekt</w:t>
-                  </w:r>
-                </w:p>
-                <w:p>
-                  <w:pPr>
-                    <w:spacing w:after="10" w:before="0"/>
-                  </w:pPr>
-                  <w:r>
-                    <w:rPr>
-                      <w:rFonts w:ascii="Calibri" w:cs="Calibri" w:eastAsia="Calibri" w:hAnsi="Calibri"/>
+                      <w:sz w:val="19"/>
+                      <w:szCs w:val="19"/>
+                    </w:rPr>
+                    <w:t xml:space="preserve">Perfekt  </w:t>
+                  </w:r>
+                  <w:r>
+                    <w:rPr>
+                      <w:rFonts w:ascii="Calibri" w:cs="Calibri" w:eastAsia="Calibri" w:hAnsi="Calibri"/>
+                      <w:b/>
+                      <w:bCs/>
+                      <w:color w:val="D9534F"/>
+                      <w:sz w:val="16"/>
+                      <w:szCs w:val="16"/>
+                    </w:rPr>
+                    <w:t xml:space="preserve">habe/bin</w:t>
+                  </w:r>
+                  <w:r>
+                    <w:rPr>
+                      <w:rFonts w:ascii="Calibri" w:cs="Calibri" w:eastAsia="Calibri" w:hAnsi="Calibri"/>
+                      <w:b/>
+                      <w:bCs/>
                       <w:color w:val="5B6B8C"/>
                       <w:sz w:val="16"/>
                       <w:szCs w:val="16"/>
                     </w:rPr>
-                    <w:t xml:space="preserve">Vergangenheit – gesprochen (wörtliche Rede)</w:t>
-                  </w:r>
-                </w:p>
-                <w:p>
-                  <w:pPr>
-                    <w:spacing w:after="0" w:before="0"/>
-                  </w:pPr>
-                  <w:r>
-                    <w:rPr>
-                      <w:rFonts w:ascii="Calibri" w:cs="Calibri" w:eastAsia="Calibri" w:hAnsi="Calibri"/>
-                      <w:b/>
-                      <w:bCs/>
-                      <w:color w:val="D9534F"/>
-                      <w:sz w:val="16"/>
-                      <w:szCs w:val="16"/>
-                    </w:rPr>
-                    <w:t xml:space="preserve">habe/bin</w:t>
-                  </w:r>
-                  <w:r>
-                    <w:rPr>
-                      <w:rFonts w:ascii="Calibri" w:cs="Calibri" w:eastAsia="Calibri" w:hAnsi="Calibri"/>
-                      <w:b/>
-                      <w:bCs/>
-                      <w:color w:val="333333"/>
-                      <w:sz w:val="16"/>
-                      <w:szCs w:val="16"/>
-                    </w:rPr>
                     <w:t xml:space="preserve"> + </w:t>
                   </w:r>
                   <w:r>
@@ -3320,7 +2776,7 @@
               </w:tc>
               <w:tc>
                 <w:tcPr>
-                  <w:tcW w:type="dxa" w:w="8056"/>
+                  <w:tcW w:type="dxa" w:w="6606"/>
                   <w:tcBorders>
                     <w:top w:val="single" w:color="B9C6E8" w:sz="6"/>
                     <w:left w:val="single" w:color="B9C6E8" w:sz="6"/>
@@ -3328,23 +2784,23 @@
                     <w:right w:val="single" w:color="B9C6E8" w:sz="6"/>
                   </w:tcBorders>
                   <w:tcMar>
-                    <w:top w:type="dxa" w:w="70"/>
-                    <w:left w:type="dxa" w:w="100"/>
-                    <w:bottom w:type="dxa" w:w="70"/>
-                    <w:right w:type="dxa" w:w="100"/>
-                  </w:tcMar>
-                  <w:vAlign w:val="top"/>
-                </w:tcPr>
-                <w:p>
-                  <w:pPr>
-                    <w:spacing w:after="20" w:before="0"/>
-                  </w:pPr>
-                  <w:r>
-                    <w:rPr>
-                      <w:rFonts w:ascii="Calibri" w:cs="Calibri" w:eastAsia="Calibri" w:hAnsi="Calibri"/>
-                      <w:color w:val="000000"/>
-                      <w:sz w:val="18"/>
-                      <w:szCs w:val="18"/>
+                    <w:top w:type="dxa" w:w="50"/>
+                    <w:left w:type="dxa" w:w="100"/>
+                    <w:bottom w:type="dxa" w:w="50"/>
+                    <w:right w:type="dxa" w:w="100"/>
+                  </w:tcMar>
+                  <w:vAlign w:val="center"/>
+                </w:tcPr>
+                <w:p>
+                  <w:pPr>
+                    <w:spacing w:after="0" w:before="0"/>
+                  </w:pPr>
+                  <w:r>
+                    <w:rPr>
+                      <w:rFonts w:ascii="Calibri" w:cs="Calibri" w:eastAsia="Calibri" w:hAnsi="Calibri"/>
+                      <w:color w:val="000000"/>
+                      <w:sz w:val="19"/>
+                      <w:szCs w:val="19"/>
                     </w:rPr>
                     <w:t xml:space="preserve">Mein Trainer sagte: „Du </w:t>
                   </w:r>
@@ -3354,8 +2810,8 @@
                       <w:b/>
                       <w:bCs/>
                       <w:color w:val="D9534F"/>
-                      <w:sz w:val="18"/>
-                      <w:szCs w:val="18"/>
+                      <w:sz w:val="19"/>
+                      <w:szCs w:val="19"/>
                     </w:rPr>
                     <w:t xml:space="preserve">hast</w:t>
                   </w:r>
@@ -3363,8 +2819,8 @@
                     <w:rPr>
                       <w:rFonts w:ascii="Calibri" w:cs="Calibri" w:eastAsia="Calibri" w:hAnsi="Calibri"/>
                       <w:color w:val="000000"/>
-                      <w:sz w:val="18"/>
-                      <w:szCs w:val="18"/>
+                      <w:sz w:val="19"/>
+                      <w:szCs w:val="19"/>
                     </w:rPr>
                     <w:t xml:space="preserve"> stark </w:t>
                   </w:r>
@@ -3374,8 +2830,8 @@
                       <w:b/>
                       <w:bCs/>
                       <w:color w:val="C98A1E"/>
-                      <w:sz w:val="18"/>
-                      <w:szCs w:val="18"/>
+                      <w:sz w:val="19"/>
+                      <w:szCs w:val="19"/>
                     </w:rPr>
                     <w:t xml:space="preserve">gekämpft</w:t>
                   </w:r>
@@ -3383,180 +2839,10 @@
                     <w:rPr>
                       <w:rFonts w:ascii="Calibri" w:cs="Calibri" w:eastAsia="Calibri" w:hAnsi="Calibri"/>
                       <w:color w:val="000000"/>
-                      <w:sz w:val="18"/>
-                      <w:szCs w:val="18"/>
+                      <w:sz w:val="19"/>
+                      <w:szCs w:val="19"/>
                     </w:rPr>
                     <w:t xml:space="preserve">!“</w:t>
-                  </w:r>
-                  <w:r>
-                    <w:rPr>
-                      <w:rFonts w:ascii="Calibri" w:cs="Calibri" w:eastAsia="Calibri" w:hAnsi="Calibri"/>
-                      <w:color w:val="9AA3B5"/>
-                      <w:sz w:val="18"/>
-                      <w:szCs w:val="18"/>
-                    </w:rPr>
-                    <w:t xml:space="preserve">   ·   </w:t>
-                  </w:r>
-                  <w:r>
-                    <w:rPr>
-                      <w:rFonts w:ascii="Calibri" w:cs="Calibri" w:eastAsia="Calibri" w:hAnsi="Calibri"/>
-                      <w:color w:val="000000"/>
-                      <w:sz w:val="18"/>
-                      <w:szCs w:val="18"/>
-                    </w:rPr>
-                    <w:t xml:space="preserve">Mein Team rief: „Wir </w:t>
-                  </w:r>
-                  <w:r>
-                    <w:rPr>
-                      <w:rFonts w:ascii="Calibri" w:cs="Calibri" w:eastAsia="Calibri" w:hAnsi="Calibri"/>
-                      <w:b/>
-                      <w:bCs/>
-                      <w:color w:val="D9534F"/>
-                      <w:sz w:val="18"/>
-                      <w:szCs w:val="18"/>
-                    </w:rPr>
-                    <w:t xml:space="preserve">haben</w:t>
-                  </w:r>
-                  <w:r>
-                    <w:rPr>
-                      <w:rFonts w:ascii="Calibri" w:cs="Calibri" w:eastAsia="Calibri" w:hAnsi="Calibri"/>
-                      <w:color w:val="000000"/>
-                      <w:sz w:val="18"/>
-                      <w:szCs w:val="18"/>
-                    </w:rPr>
-                    <w:t xml:space="preserve"> </w:t>
-                  </w:r>
-                  <w:r>
-                    <w:rPr>
-                      <w:rFonts w:ascii="Calibri" w:cs="Calibri" w:eastAsia="Calibri" w:hAnsi="Calibri"/>
-                      <w:b/>
-                      <w:bCs/>
-                      <w:color w:val="C98A1E"/>
-                      <w:sz w:val="18"/>
-                      <w:szCs w:val="18"/>
-                    </w:rPr>
-                    <w:t xml:space="preserve">gewonnen</w:t>
-                  </w:r>
-                  <w:r>
-                    <w:rPr>
-                      <w:rFonts w:ascii="Calibri" w:cs="Calibri" w:eastAsia="Calibri" w:hAnsi="Calibri"/>
-                      <w:color w:val="000000"/>
-                      <w:sz w:val="18"/>
-                      <w:szCs w:val="18"/>
-                    </w:rPr>
-                    <w:t xml:space="preserve">!“</w:t>
-                  </w:r>
-                </w:p>
-                <w:p>
-                  <w:pPr>
-                    <w:spacing w:after="20" w:before="0"/>
-                  </w:pPr>
-                  <w:r>
-                    <w:rPr>
-                      <w:rFonts w:ascii="Calibri" w:cs="Calibri" w:eastAsia="Calibri" w:hAnsi="Calibri"/>
-                      <w:color w:val="000000"/>
-                      <w:sz w:val="18"/>
-                      <w:szCs w:val="18"/>
-                    </w:rPr>
-                    <w:t xml:space="preserve">Ich rief meinen Eltern zu: „Ich </w:t>
-                  </w:r>
-                  <w:r>
-                    <w:rPr>
-                      <w:rFonts w:ascii="Calibri" w:cs="Calibri" w:eastAsia="Calibri" w:hAnsi="Calibri"/>
-                      <w:b/>
-                      <w:bCs/>
-                      <w:color w:val="D9534F"/>
-                      <w:sz w:val="18"/>
-                      <w:szCs w:val="18"/>
-                    </w:rPr>
-                    <w:t xml:space="preserve">bin</w:t>
-                  </w:r>
-                  <w:r>
-                    <w:rPr>
-                      <w:rFonts w:ascii="Calibri" w:cs="Calibri" w:eastAsia="Calibri" w:hAnsi="Calibri"/>
-                      <w:color w:val="000000"/>
-                      <w:sz w:val="18"/>
-                      <w:szCs w:val="18"/>
-                    </w:rPr>
-                    <w:t xml:space="preserve"> Zweite(r) </w:t>
-                  </w:r>
-                  <w:r>
-                    <w:rPr>
-                      <w:rFonts w:ascii="Calibri" w:cs="Calibri" w:eastAsia="Calibri" w:hAnsi="Calibri"/>
-                      <w:b/>
-                      <w:bCs/>
-                      <w:color w:val="C98A1E"/>
-                      <w:sz w:val="18"/>
-                      <w:szCs w:val="18"/>
-                    </w:rPr>
-                    <w:t xml:space="preserve">geworden</w:t>
-                  </w:r>
-                  <w:r>
-                    <w:rPr>
-                      <w:rFonts w:ascii="Calibri" w:cs="Calibri" w:eastAsia="Calibri" w:hAnsi="Calibri"/>
-                      <w:color w:val="000000"/>
-                      <w:sz w:val="18"/>
-                      <w:szCs w:val="18"/>
-                    </w:rPr>
-                    <w:t xml:space="preserve">!“</w:t>
-                  </w:r>
-                  <w:r>
-                    <w:rPr>
-                      <w:rFonts w:ascii="Calibri" w:cs="Calibri" w:eastAsia="Calibri" w:hAnsi="Calibri"/>
-                      <w:color w:val="9AA3B5"/>
-                      <w:sz w:val="18"/>
-                      <w:szCs w:val="18"/>
-                    </w:rPr>
-                    <w:t xml:space="preserve">   ·   </w:t>
-                  </w:r>
-                  <w:r>
-                    <w:rPr>
-                      <w:rFonts w:ascii="Calibri" w:cs="Calibri" w:eastAsia="Calibri" w:hAnsi="Calibri"/>
-                      <w:color w:val="000000"/>
-                      <w:sz w:val="18"/>
-                      <w:szCs w:val="18"/>
-                    </w:rPr>
-                    <w:t xml:space="preserve">Der Kampfrichter sagte: „Das </w:t>
-                  </w:r>
-                  <w:r>
-                    <w:rPr>
-                      <w:rFonts w:ascii="Calibri" w:cs="Calibri" w:eastAsia="Calibri" w:hAnsi="Calibri"/>
-                      <w:b/>
-                      <w:bCs/>
-                      <w:color w:val="D9534F"/>
-                      <w:sz w:val="18"/>
-                      <w:szCs w:val="18"/>
-                    </w:rPr>
-                    <w:t xml:space="preserve">hast</w:t>
-                  </w:r>
-                  <w:r>
-                    <w:rPr>
-                      <w:rFonts w:ascii="Calibri" w:cs="Calibri" w:eastAsia="Calibri" w:hAnsi="Calibri"/>
-                      <w:color w:val="000000"/>
-                      <w:sz w:val="18"/>
-                      <w:szCs w:val="18"/>
-                    </w:rPr>
-                    <w:t xml:space="preserve"> du gut </w:t>
-                  </w:r>
-                  <w:r>
-                    <w:rPr>
-                      <w:rFonts w:ascii="Calibri" w:cs="Calibri" w:eastAsia="Calibri" w:hAnsi="Calibri"/>
-                      <w:b/>
-                      <w:bCs/>
-                      <w:color w:val="C98A1E"/>
-                      <w:sz w:val="18"/>
-                      <w:szCs w:val="18"/>
-                    </w:rPr>
-                    <w:t xml:space="preserve">gemacht</w:t>
-                  </w:r>
-                  <w:r>
-                    <w:rPr>
-                      <w:rFonts w:ascii="Calibri" w:cs="Calibri" w:eastAsia="Calibri" w:hAnsi="Calibri"/>
-                      <w:color w:val="000000"/>
-                      <w:sz w:val="18"/>
-                      <w:szCs w:val="18"/>
-                    </w:rPr>
-                    <w:t xml:space="preserve">.“</w:t>
                   </w:r>
                 </w:p>
               </w:tc>
@@ -3567,7 +2853,7 @@
               </w:trPr>
               <w:tc>
                 <w:tcPr>
-                  <w:tcW w:type="dxa" w:w="2350"/>
+                  <w:tcW w:type="dxa" w:w="3800"/>
                   <w:tcBorders>
                     <w:top w:val="single" w:color="B9C6E8" w:sz="6"/>
                     <w:left w:val="single" w:color="B9C6E8" w:sz="6"/>
@@ -3576,16 +2862,16 @@
                   </w:tcBorders>
                   <w:shd w:fill="F4F7FD" w:color="auto" w:val="clear"/>
                   <w:tcMar>
-                    <w:top w:type="dxa" w:w="70"/>
-                    <w:left w:type="dxa" w:w="100"/>
-                    <w:bottom w:type="dxa" w:w="70"/>
-                    <w:right w:type="dxa" w:w="100"/>
-                  </w:tcMar>
-                  <w:vAlign w:val="top"/>
-                </w:tcPr>
-                <w:p>
-                  <w:pPr>
-                    <w:spacing w:after="10" w:before="0"/>
+                    <w:top w:type="dxa" w:w="50"/>
+                    <w:left w:type="dxa" w:w="100"/>
+                    <w:bottom w:type="dxa" w:w="50"/>
+                    <w:right w:type="dxa" w:w="100"/>
+                  </w:tcMar>
+                  <w:vAlign w:val="center"/>
+                </w:tcPr>
+                <w:p>
+                  <w:pPr>
+                    <w:spacing w:after="0" w:before="0"/>
                   </w:pPr>
                   <w:r>
                     <w:rPr>
@@ -3593,19 +2879,16 @@
                       <w:b/>
                       <w:bCs/>
                       <w:color w:val="1E2761"/>
-                      <w:sz w:val="20"/>
-                      <w:szCs w:val="20"/>
-                    </w:rPr>
-                    <w:t xml:space="preserve">Präsens</w:t>
-                  </w:r>
-                </w:p>
-                <w:p>
-                  <w:pPr>
-                    <w:spacing w:after="10" w:before="0"/>
-                  </w:pPr>
-                  <w:r>
-                    <w:rPr>
-                      <w:rFonts w:ascii="Calibri" w:cs="Calibri" w:eastAsia="Calibri" w:hAnsi="Calibri"/>
+                      <w:sz w:val="19"/>
+                      <w:szCs w:val="19"/>
+                    </w:rPr>
+                    <w:t xml:space="preserve">Präsens  </w:t>
+                  </w:r>
+                  <w:r>
+                    <w:rPr>
+                      <w:rFonts w:ascii="Calibri" w:cs="Calibri" w:eastAsia="Calibri" w:hAnsi="Calibri"/>
+                      <w:b/>
+                      <w:bCs/>
                       <w:color w:val="5B6B8C"/>
                       <w:sz w:val="16"/>
                       <w:szCs w:val="16"/>
@@ -3613,26 +2896,10 @@
                     <w:t xml:space="preserve">jetzt</w:t>
                   </w:r>
                 </w:p>
-                <w:p>
-                  <w:pPr>
-                    <w:spacing w:after="0" w:before="0"/>
-                  </w:pPr>
-                  <w:r>
-                    <w:rPr>
-                      <w:rFonts w:ascii="Calibri" w:cs="Calibri" w:eastAsia="Calibri" w:hAnsi="Calibri"/>
-                      <w:b/>
-                      <w:bCs/>
-                      <w:color w:val="333333"/>
-                      <w:sz w:val="16"/>
-                      <w:szCs w:val="16"/>
-                    </w:rPr>
-                    <w:t xml:space="preserve">finites Verb im Präsens</w:t>
-                  </w:r>
-                </w:p>
-              </w:tc>
-              <w:tc>
-                <w:tcPr>
-                  <w:tcW w:type="dxa" w:w="8056"/>
+              </w:tc>
+              <w:tc>
+                <w:tcPr>
+                  <w:tcW w:type="dxa" w:w="6606"/>
                   <w:tcBorders>
                     <w:top w:val="single" w:color="B9C6E8" w:sz="6"/>
                     <w:left w:val="single" w:color="B9C6E8" w:sz="6"/>
@@ -3640,23 +2907,23 @@
                     <w:right w:val="single" w:color="B9C6E8" w:sz="6"/>
                   </w:tcBorders>
                   <w:tcMar>
-                    <w:top w:type="dxa" w:w="70"/>
-                    <w:left w:type="dxa" w:w="100"/>
-                    <w:bottom w:type="dxa" w:w="70"/>
-                    <w:right w:type="dxa" w:w="100"/>
-                  </w:tcMar>
-                  <w:vAlign w:val="top"/>
-                </w:tcPr>
-                <w:p>
-                  <w:pPr>
-                    <w:spacing w:after="20" w:before="0"/>
-                  </w:pPr>
-                  <w:r>
-                    <w:rPr>
-                      <w:rFonts w:ascii="Calibri" w:cs="Calibri" w:eastAsia="Calibri" w:hAnsi="Calibri"/>
-                      <w:color w:val="000000"/>
-                      <w:sz w:val="18"/>
-                      <w:szCs w:val="18"/>
+                    <w:top w:type="dxa" w:w="50"/>
+                    <w:left w:type="dxa" w:w="100"/>
+                    <w:bottom w:type="dxa" w:w="50"/>
+                    <w:right w:type="dxa" w:w="100"/>
+                  </w:tcMar>
+                  <w:vAlign w:val="center"/>
+                </w:tcPr>
+                <w:p>
+                  <w:pPr>
+                    <w:spacing w:after="0" w:before="0"/>
+                  </w:pPr>
+                  <w:r>
+                    <w:rPr>
+                      <w:rFonts w:ascii="Calibri" w:cs="Calibri" w:eastAsia="Calibri" w:hAnsi="Calibri"/>
+                      <w:color w:val="000000"/>
+                      <w:sz w:val="19"/>
+                      <w:szCs w:val="19"/>
                     </w:rPr>
                     <w:t xml:space="preserve">Heute </w:t>
                   </w:r>
@@ -3666,8 +2933,8 @@
                       <w:b/>
                       <w:bCs/>
                       <w:color w:val="000000"/>
-                      <w:sz w:val="18"/>
-                      <w:szCs w:val="18"/>
+                      <w:sz w:val="19"/>
+                      <w:szCs w:val="19"/>
                       <w:u w:val="single"/>
                     </w:rPr>
                     <w:t xml:space="preserve">bin</w:t>
@@ -3676,88 +2943,10 @@
                     <w:rPr>
                       <w:rFonts w:ascii="Calibri" w:cs="Calibri" w:eastAsia="Calibri" w:hAnsi="Calibri"/>
                       <w:color w:val="000000"/>
-                      <w:sz w:val="18"/>
-                      <w:szCs w:val="18"/>
+                      <w:sz w:val="19"/>
+                      <w:szCs w:val="19"/>
                     </w:rPr>
                     <w:t xml:space="preserve"> ich noch müde.</w:t>
-                  </w:r>
-                  <w:r>
-                    <w:rPr>
-                      <w:rFonts w:ascii="Calibri" w:cs="Calibri" w:eastAsia="Calibri" w:hAnsi="Calibri"/>
-                      <w:color w:val="9AA3B5"/>
-                      <w:sz w:val="18"/>
-                      <w:szCs w:val="18"/>
-                    </w:rPr>
-                    <w:t xml:space="preserve">   ·   </w:t>
-                  </w:r>
-                  <w:r>
-                    <w:rPr>
-                      <w:rFonts w:ascii="Calibri" w:cs="Calibri" w:eastAsia="Calibri" w:hAnsi="Calibri"/>
-                      <w:color w:val="000000"/>
-                      <w:sz w:val="18"/>
-                      <w:szCs w:val="18"/>
-                    </w:rPr>
-                    <w:t xml:space="preserve">Heute </w:t>
-                  </w:r>
-                  <w:r>
-                    <w:rPr>
-                      <w:rFonts w:ascii="Calibri" w:cs="Calibri" w:eastAsia="Calibri" w:hAnsi="Calibri"/>
-                      <w:b/>
-                      <w:bCs/>
-                      <w:color w:val="000000"/>
-                      <w:sz w:val="18"/>
-                      <w:szCs w:val="18"/>
-                      <w:u w:val="single"/>
-                    </w:rPr>
-                    <w:t xml:space="preserve">tut</w:t>
-                  </w:r>
-                  <w:r>
-                    <w:rPr>
-                      <w:rFonts w:ascii="Calibri" w:cs="Calibri" w:eastAsia="Calibri" w:hAnsi="Calibri"/>
-                      <w:color w:val="000000"/>
-                      <w:sz w:val="18"/>
-                      <w:szCs w:val="18"/>
-                    </w:rPr>
-                    <w:t xml:space="preserve"> mir … weh.</w:t>
-                  </w:r>
-                  <w:r>
-                    <w:rPr>
-                      <w:rFonts w:ascii="Calibri" w:cs="Calibri" w:eastAsia="Calibri" w:hAnsi="Calibri"/>
-                      <w:color w:val="9AA3B5"/>
-                      <w:sz w:val="18"/>
-                      <w:szCs w:val="18"/>
-                    </w:rPr>
-                    <w:t xml:space="preserve">   ·   </w:t>
-                  </w:r>
-                  <w:r>
-                    <w:rPr>
-                      <w:rFonts w:ascii="Calibri" w:cs="Calibri" w:eastAsia="Calibri" w:hAnsi="Calibri"/>
-                      <w:color w:val="000000"/>
-                      <w:sz w:val="18"/>
-                      <w:szCs w:val="18"/>
-                    </w:rPr>
-                    <w:t xml:space="preserve">Heute </w:t>
-                  </w:r>
-                  <w:r>
-                    <w:rPr>
-                      <w:rFonts w:ascii="Calibri" w:cs="Calibri" w:eastAsia="Calibri" w:hAnsi="Calibri"/>
-                      <w:b/>
-                      <w:bCs/>
-                      <w:color w:val="000000"/>
-                      <w:sz w:val="18"/>
-                      <w:szCs w:val="18"/>
-                      <w:u w:val="single"/>
-                    </w:rPr>
-                    <w:t xml:space="preserve">analysiere</w:t>
-                  </w:r>
-                  <w:r>
-                    <w:rPr>
-                      <w:rFonts w:ascii="Calibri" w:cs="Calibri" w:eastAsia="Calibri" w:hAnsi="Calibri"/>
-                      <w:color w:val="000000"/>
-                      <w:sz w:val="18"/>
-                      <w:szCs w:val="18"/>
-                    </w:rPr>
-                    <w:t xml:space="preserve"> ich mit meinem Trainer das Video.</w:t>
                   </w:r>
                 </w:p>
               </w:tc>
@@ -3768,7 +2957,7 @@
               </w:trPr>
               <w:tc>
                 <w:tcPr>
-                  <w:tcW w:type="dxa" w:w="2350"/>
+                  <w:tcW w:type="dxa" w:w="3800"/>
                   <w:tcBorders>
                     <w:top w:val="single" w:color="B9C6E8" w:sz="6"/>
                     <w:left w:val="single" w:color="B9C6E8" w:sz="6"/>
@@ -3777,16 +2966,16 @@
                   </w:tcBorders>
                   <w:shd w:fill="F4F7FD" w:color="auto" w:val="clear"/>
                   <w:tcMar>
-                    <w:top w:type="dxa" w:w="70"/>
-                    <w:left w:type="dxa" w:w="100"/>
-                    <w:bottom w:type="dxa" w:w="70"/>
-                    <w:right w:type="dxa" w:w="100"/>
-                  </w:tcMar>
-                  <w:vAlign w:val="top"/>
-                </w:tcPr>
-                <w:p>
-                  <w:pPr>
-                    <w:spacing w:after="10" w:before="0"/>
+                    <w:top w:type="dxa" w:w="50"/>
+                    <w:left w:type="dxa" w:w="100"/>
+                    <w:bottom w:type="dxa" w:w="50"/>
+                    <w:right w:type="dxa" w:w="100"/>
+                  </w:tcMar>
+                  <w:vAlign w:val="center"/>
+                </w:tcPr>
+                <w:p>
+                  <w:pPr>
+                    <w:spacing w:after="0" w:before="0"/>
                   </w:pPr>
                   <w:r>
                     <w:rPr>
@@ -3794,50 +2983,31 @@
                       <w:b/>
                       <w:bCs/>
                       <w:color w:val="1E2761"/>
-                      <w:sz w:val="20"/>
-                      <w:szCs w:val="20"/>
-                    </w:rPr>
-                    <w:t xml:space="preserve">Futur I</w:t>
-                  </w:r>
-                </w:p>
-                <w:p>
-                  <w:pPr>
-                    <w:spacing w:after="10" w:before="0"/>
-                  </w:pPr>
-                  <w:r>
-                    <w:rPr>
-                      <w:rFonts w:ascii="Calibri" w:cs="Calibri" w:eastAsia="Calibri" w:hAnsi="Calibri"/>
+                      <w:sz w:val="19"/>
+                      <w:szCs w:val="19"/>
+                    </w:rPr>
+                    <w:t xml:space="preserve">Futur I  </w:t>
+                  </w:r>
+                  <w:r>
+                    <w:rPr>
+                      <w:rFonts w:ascii="Calibri" w:cs="Calibri" w:eastAsia="Calibri" w:hAnsi="Calibri"/>
+                      <w:b/>
+                      <w:bCs/>
+                      <w:color w:val="D9534F"/>
+                      <w:sz w:val="16"/>
+                      <w:szCs w:val="16"/>
+                    </w:rPr>
+                    <w:t xml:space="preserve">werde</w:t>
+                  </w:r>
+                  <w:r>
+                    <w:rPr>
+                      <w:rFonts w:ascii="Calibri" w:cs="Calibri" w:eastAsia="Calibri" w:hAnsi="Calibri"/>
+                      <w:b/>
+                      <w:bCs/>
                       <w:color w:val="5B6B8C"/>
                       <w:sz w:val="16"/>
                       <w:szCs w:val="16"/>
                     </w:rPr>
-                    <w:t xml:space="preserve">Zukunft</w:t>
-                  </w:r>
-                </w:p>
-                <w:p>
-                  <w:pPr>
-                    <w:spacing w:after="0" w:before="0"/>
-                  </w:pPr>
-                  <w:r>
-                    <w:rPr>
-                      <w:rFonts w:ascii="Calibri" w:cs="Calibri" w:eastAsia="Calibri" w:hAnsi="Calibri"/>
-                      <w:b/>
-                      <w:bCs/>
-                      <w:color w:val="D9534F"/>
-                      <w:sz w:val="16"/>
-                      <w:szCs w:val="16"/>
-                    </w:rPr>
-                    <w:t xml:space="preserve">werde</w:t>
-                  </w:r>
-                  <w:r>
-                    <w:rPr>
-                      <w:rFonts w:ascii="Calibri" w:cs="Calibri" w:eastAsia="Calibri" w:hAnsi="Calibri"/>
-                      <w:b/>
-                      <w:bCs/>
-                      <w:color w:val="333333"/>
-                      <w:sz w:val="16"/>
-                      <w:szCs w:val="16"/>
-                    </w:rPr>
                     <w:t xml:space="preserve"> + </w:t>
                   </w:r>
                   <w:r>
@@ -3855,7 +3025,7 @@
               </w:tc>
               <w:tc>
                 <w:tcPr>
-                  <w:tcW w:type="dxa" w:w="8056"/>
+                  <w:tcW w:type="dxa" w:w="6606"/>
                   <w:tcBorders>
                     <w:top w:val="single" w:color="B9C6E8" w:sz="6"/>
                     <w:left w:val="single" w:color="B9C6E8" w:sz="6"/>
@@ -3863,23 +3033,23 @@
                     <w:right w:val="single" w:color="B9C6E8" w:sz="6"/>
                   </w:tcBorders>
                   <w:tcMar>
-                    <w:top w:type="dxa" w:w="70"/>
-                    <w:left w:type="dxa" w:w="100"/>
-                    <w:bottom w:type="dxa" w:w="70"/>
-                    <w:right w:type="dxa" w:w="100"/>
-                  </w:tcMar>
-                  <w:vAlign w:val="top"/>
-                </w:tcPr>
-                <w:p>
-                  <w:pPr>
-                    <w:spacing w:after="20" w:before="0"/>
-                  </w:pPr>
-                  <w:r>
-                    <w:rPr>
-                      <w:rFonts w:ascii="Calibri" w:cs="Calibri" w:eastAsia="Calibri" w:hAnsi="Calibri"/>
-                      <w:color w:val="000000"/>
-                      <w:sz w:val="18"/>
-                      <w:szCs w:val="18"/>
+                    <w:top w:type="dxa" w:w="50"/>
+                    <w:left w:type="dxa" w:w="100"/>
+                    <w:bottom w:type="dxa" w:w="50"/>
+                    <w:right w:type="dxa" w:w="100"/>
+                  </w:tcMar>
+                  <w:vAlign w:val="center"/>
+                </w:tcPr>
+                <w:p>
+                  <w:pPr>
+                    <w:spacing w:after="0" w:before="0"/>
+                  </w:pPr>
+                  <w:r>
+                    <w:rPr>
+                      <w:rFonts w:ascii="Calibri" w:cs="Calibri" w:eastAsia="Calibri" w:hAnsi="Calibri"/>
+                      <w:color w:val="000000"/>
+                      <w:sz w:val="19"/>
+                      <w:szCs w:val="19"/>
                     </w:rPr>
                     <w:t xml:space="preserve">Beim nächsten Wettkampf </w:t>
                   </w:r>
@@ -3889,8 +3059,8 @@
                       <w:b/>
                       <w:bCs/>
                       <w:color w:val="D9534F"/>
-                      <w:sz w:val="18"/>
-                      <w:szCs w:val="18"/>
+                      <w:sz w:val="19"/>
+                      <w:szCs w:val="19"/>
                     </w:rPr>
                     <w:t xml:space="preserve">werde</w:t>
                   </w:r>
@@ -3898,8 +3068,8 @@
                     <w:rPr>
                       <w:rFonts w:ascii="Calibri" w:cs="Calibri" w:eastAsia="Calibri" w:hAnsi="Calibri"/>
                       <w:color w:val="000000"/>
-                      <w:sz w:val="18"/>
-                      <w:szCs w:val="18"/>
+                      <w:sz w:val="19"/>
+                      <w:szCs w:val="19"/>
                     </w:rPr>
                     <w:t xml:space="preserve"> ich früher </w:t>
                   </w:r>
@@ -3909,8 +3079,8 @@
                       <w:b/>
                       <w:bCs/>
                       <w:color w:val="3F7CC4"/>
-                      <w:sz w:val="18"/>
-                      <w:szCs w:val="18"/>
+                      <w:sz w:val="19"/>
+                      <w:szCs w:val="19"/>
                     </w:rPr>
                     <w:t xml:space="preserve">angreifen</w:t>
                   </w:r>
@@ -3918,200 +3088,292 @@
                     <w:rPr>
                       <w:rFonts w:ascii="Calibri" w:cs="Calibri" w:eastAsia="Calibri" w:hAnsi="Calibri"/>
                       <w:color w:val="000000"/>
-                      <w:sz w:val="18"/>
-                      <w:szCs w:val="18"/>
-                    </w:rPr>
-                    <w:t xml:space="preserve"> / besser </w:t>
-                  </w:r>
-                  <w:r>
-                    <w:rPr>
-                      <w:rFonts w:ascii="Calibri" w:cs="Calibri" w:eastAsia="Calibri" w:hAnsi="Calibri"/>
-                      <w:b/>
-                      <w:bCs/>
-                      <w:color w:val="3F7CC4"/>
-                      <w:sz w:val="18"/>
-                      <w:szCs w:val="18"/>
-                    </w:rPr>
-                    <w:t xml:space="preserve">verteidigen</w:t>
-                  </w:r>
-                  <w:r>
-                    <w:rPr>
-                      <w:rFonts w:ascii="Calibri" w:cs="Calibri" w:eastAsia="Calibri" w:hAnsi="Calibri"/>
-                      <w:color w:val="000000"/>
-                      <w:sz w:val="18"/>
-                      <w:szCs w:val="18"/>
+                      <w:sz w:val="19"/>
+                      <w:szCs w:val="19"/>
                     </w:rPr>
                     <w:t xml:space="preserve">.</w:t>
                   </w:r>
-                  <w:r>
-                    <w:rPr>
-                      <w:rFonts w:ascii="Calibri" w:cs="Calibri" w:eastAsia="Calibri" w:hAnsi="Calibri"/>
-                      <w:color w:val="9AA3B5"/>
-                      <w:sz w:val="18"/>
-                      <w:szCs w:val="18"/>
-                    </w:rPr>
-                    <w:t xml:space="preserve">   ·   </w:t>
-                  </w:r>
-                  <w:r>
-                    <w:rPr>
-                      <w:rFonts w:ascii="Calibri" w:cs="Calibri" w:eastAsia="Calibri" w:hAnsi="Calibri"/>
-                      <w:color w:val="000000"/>
-                      <w:sz w:val="18"/>
-                      <w:szCs w:val="18"/>
-                    </w:rPr>
-                    <w:t xml:space="preserve">Ich </w:t>
-                  </w:r>
-                  <w:r>
-                    <w:rPr>
-                      <w:rFonts w:ascii="Calibri" w:cs="Calibri" w:eastAsia="Calibri" w:hAnsi="Calibri"/>
-                      <w:b/>
-                      <w:bCs/>
-                      <w:color w:val="D9534F"/>
-                      <w:sz w:val="18"/>
-                      <w:szCs w:val="18"/>
-                    </w:rPr>
-                    <w:t xml:space="preserve">werde</w:t>
-                  </w:r>
-                  <w:r>
-                    <w:rPr>
-                      <w:rFonts w:ascii="Calibri" w:cs="Calibri" w:eastAsia="Calibri" w:hAnsi="Calibri"/>
-                      <w:color w:val="000000"/>
-                      <w:sz w:val="18"/>
-                      <w:szCs w:val="18"/>
-                    </w:rPr>
-                    <w:t xml:space="preserve"> noch mehr </w:t>
-                  </w:r>
-                  <w:r>
-                    <w:rPr>
-                      <w:rFonts w:ascii="Calibri" w:cs="Calibri" w:eastAsia="Calibri" w:hAnsi="Calibri"/>
-                      <w:b/>
-                      <w:bCs/>
-                      <w:color w:val="3F7CC4"/>
-                      <w:sz w:val="18"/>
-                      <w:szCs w:val="18"/>
-                    </w:rPr>
-                    <w:t xml:space="preserve">trainieren</w:t>
-                  </w:r>
-                  <w:r>
-                    <w:rPr>
-                      <w:rFonts w:ascii="Calibri" w:cs="Calibri" w:eastAsia="Calibri" w:hAnsi="Calibri"/>
-                      <w:color w:val="000000"/>
-                      <w:sz w:val="18"/>
-                      <w:szCs w:val="18"/>
-                    </w:rPr>
-                    <w:t xml:space="preserve">.</w:t>
-                  </w:r>
-                </w:p>
-                <w:p>
-                  <w:pPr>
-                    <w:spacing w:after="20" w:before="0"/>
-                  </w:pPr>
-                  <w:r>
-                    <w:rPr>
-                      <w:rFonts w:ascii="Calibri" w:cs="Calibri" w:eastAsia="Calibri" w:hAnsi="Calibri"/>
-                      <w:color w:val="000000"/>
-                      <w:sz w:val="18"/>
-                      <w:szCs w:val="18"/>
-                    </w:rPr>
-                    <w:t xml:space="preserve">Nächstes Mal </w:t>
-                  </w:r>
-                  <w:r>
-                    <w:rPr>
-                      <w:rFonts w:ascii="Calibri" w:cs="Calibri" w:eastAsia="Calibri" w:hAnsi="Calibri"/>
-                      <w:b/>
-                      <w:bCs/>
-                      <w:color w:val="D9534F"/>
-                      <w:sz w:val="18"/>
-                      <w:szCs w:val="18"/>
-                    </w:rPr>
-                    <w:t xml:space="preserve">werde</w:t>
-                  </w:r>
-                  <w:r>
-                    <w:rPr>
-                      <w:rFonts w:ascii="Calibri" w:cs="Calibri" w:eastAsia="Calibri" w:hAnsi="Calibri"/>
-                      <w:color w:val="000000"/>
-                      <w:sz w:val="18"/>
-                      <w:szCs w:val="18"/>
-                    </w:rPr>
-                    <w:t xml:space="preserve"> ich … </w:t>
-                  </w:r>
-                  <w:r>
-                    <w:rPr>
-                      <w:rFonts w:ascii="Calibri" w:cs="Calibri" w:eastAsia="Calibri" w:hAnsi="Calibri"/>
-                      <w:b/>
-                      <w:bCs/>
-                      <w:color w:val="3F7CC4"/>
-                      <w:sz w:val="18"/>
-                      <w:szCs w:val="18"/>
-                    </w:rPr>
-                    <w:t xml:space="preserve">schaffen</w:t>
-                  </w:r>
-                  <w:r>
-                    <w:rPr>
-                      <w:rFonts w:ascii="Calibri" w:cs="Calibri" w:eastAsia="Calibri" w:hAnsi="Calibri"/>
-                      <w:color w:val="000000"/>
-                      <w:sz w:val="18"/>
-                      <w:szCs w:val="18"/>
-                    </w:rPr>
-                    <w:t xml:space="preserve">.</w:t>
-                  </w:r>
-                  <w:r>
-                    <w:rPr>
-                      <w:rFonts w:ascii="Calibri" w:cs="Calibri" w:eastAsia="Calibri" w:hAnsi="Calibri"/>
-                      <w:color w:val="9AA3B5"/>
-                      <w:sz w:val="18"/>
-                      <w:szCs w:val="18"/>
-                    </w:rPr>
-                    <w:t xml:space="preserve">   ·   </w:t>
-                  </w:r>
-                  <w:r>
-                    <w:rPr>
-                      <w:rFonts w:ascii="Calibri" w:cs="Calibri" w:eastAsia="Calibri" w:hAnsi="Calibri"/>
-                      <w:color w:val="000000"/>
-                      <w:sz w:val="18"/>
-                      <w:szCs w:val="18"/>
-                    </w:rPr>
-                    <w:t xml:space="preserve">Wir </w:t>
-                  </w:r>
-                  <w:r>
-                    <w:rPr>
-                      <w:rFonts w:ascii="Calibri" w:cs="Calibri" w:eastAsia="Calibri" w:hAnsi="Calibri"/>
-                      <w:b/>
-                      <w:bCs/>
-                      <w:color w:val="D9534F"/>
-                      <w:sz w:val="18"/>
-                      <w:szCs w:val="18"/>
-                    </w:rPr>
-                    <w:t xml:space="preserve">werden</w:t>
-                  </w:r>
-                  <w:r>
-                    <w:rPr>
-                      <w:rFonts w:ascii="Calibri" w:cs="Calibri" w:eastAsia="Calibri" w:hAnsi="Calibri"/>
-                      <w:color w:val="000000"/>
-                      <w:sz w:val="18"/>
-                      <w:szCs w:val="18"/>
-                    </w:rPr>
-                    <w:t xml:space="preserve"> die Abwehr </w:t>
-                  </w:r>
-                  <w:r>
-                    <w:rPr>
-                      <w:rFonts w:ascii="Calibri" w:cs="Calibri" w:eastAsia="Calibri" w:hAnsi="Calibri"/>
-                      <w:b/>
-                      <w:bCs/>
-                      <w:color w:val="3F7CC4"/>
-                      <w:sz w:val="18"/>
-                      <w:szCs w:val="18"/>
-                    </w:rPr>
-                    <w:t xml:space="preserve">verbessern</w:t>
-                  </w:r>
-                  <w:r>
-                    <w:rPr>
-                      <w:rFonts w:ascii="Calibri" w:cs="Calibri" w:eastAsia="Calibri" w:hAnsi="Calibri"/>
-                      <w:color w:val="000000"/>
-                      <w:sz w:val="18"/>
-                      <w:szCs w:val="18"/>
-                    </w:rPr>
-                    <w:t xml:space="preserve">.</w:t>
+                </w:p>
+              </w:tc>
+            </w:tr>
+          </w:tbl>
+          <w:tbl>
+            <w:tblPr>
+              <w:tblW w:type="dxa" w:w="10406"/>
+              <w:tblBorders>
+                <w:top w:val="single" w:color="auto" w:sz="4"/>
+                <w:left w:val="single" w:color="auto" w:sz="4"/>
+                <w:bottom w:val="single" w:color="auto" w:sz="4"/>
+                <w:right w:val="single" w:color="auto" w:sz="4"/>
+                <w:insideH w:val="single" w:color="auto" w:sz="4"/>
+                <w:insideV w:val="single" w:color="auto" w:sz="4"/>
+              </w:tblBorders>
+            </w:tblPr>
+            <w:tblGrid>
+              <w:gridCol w:w="10406"/>
+            </w:tblGrid>
+            <w:tr>
+              <w:trPr>
+                <w:cantSplit/>
+                <w:trHeight w:val="540" w:hRule="exact"/>
+              </w:trPr>
+              <w:tc>
+                <w:tcPr>
+                  <w:tcW w:type="dxa" w:w="10406"/>
+                  <w:tcBorders>
+                    <w:top w:val="none" w:color="FFFFFF" w:sz="0"/>
+                    <w:left w:val="none" w:color="FFFFFF" w:sz="0"/>
+                    <w:bottom w:val="single" w:color="9AA3B5" w:sz="6"/>
+                    <w:right w:val="none" w:color="FFFFFF" w:sz="0"/>
+                  </w:tcBorders>
+                  <w:tcMar>
+                    <w:top w:type="dxa" w:w="60"/>
+                    <w:left w:type="dxa" w:w="100"/>
+                    <w:bottom w:type="dxa" w:w="60"/>
+                    <w:right w:type="dxa" w:w="100"/>
+                  </w:tcMar>
+                  <w:vAlign w:val="center"/>
+                </w:tcPr>
+                <w:p>
+                  <w:pPr>
+                    <w:spacing w:after="0" w:before="0"/>
+                  </w:pPr>
+                  <w:r>
+                    <w:rPr>
+                      <w:rFonts w:ascii="Calibri" w:cs="Calibri" w:eastAsia="Calibri" w:hAnsi="Calibri"/>
+                      <w:color w:val="000000"/>
+                      <w:sz w:val="22"/>
+                      <w:szCs w:val="22"/>
+                    </w:rPr>
+                    <w:t xml:space="preserve"/>
+                  </w:r>
+                </w:p>
+              </w:tc>
+            </w:tr>
+            <w:tr>
+              <w:trPr>
+                <w:cantSplit/>
+                <w:trHeight w:val="540" w:hRule="exact"/>
+              </w:trPr>
+              <w:tc>
+                <w:tcPr>
+                  <w:tcW w:type="dxa" w:w="10406"/>
+                  <w:tcBorders>
+                    <w:top w:val="none" w:color="FFFFFF" w:sz="0"/>
+                    <w:left w:val="none" w:color="FFFFFF" w:sz="0"/>
+                    <w:bottom w:val="single" w:color="9AA3B5" w:sz="6"/>
+                    <w:right w:val="none" w:color="FFFFFF" w:sz="0"/>
+                  </w:tcBorders>
+                  <w:tcMar>
+                    <w:top w:type="dxa" w:w="60"/>
+                    <w:left w:type="dxa" w:w="100"/>
+                    <w:bottom w:type="dxa" w:w="60"/>
+                    <w:right w:type="dxa" w:w="100"/>
+                  </w:tcMar>
+                  <w:vAlign w:val="center"/>
+                </w:tcPr>
+                <w:p>
+                  <w:pPr>
+                    <w:spacing w:after="0" w:before="0"/>
+                  </w:pPr>
+                  <w:r>
+                    <w:rPr>
+                      <w:rFonts w:ascii="Calibri" w:cs="Calibri" w:eastAsia="Calibri" w:hAnsi="Calibri"/>
+                      <w:color w:val="000000"/>
+                      <w:sz w:val="22"/>
+                      <w:szCs w:val="22"/>
+                    </w:rPr>
+                    <w:t xml:space="preserve"/>
+                  </w:r>
+                </w:p>
+              </w:tc>
+            </w:tr>
+            <w:tr>
+              <w:trPr>
+                <w:cantSplit/>
+                <w:trHeight w:val="540" w:hRule="exact"/>
+              </w:trPr>
+              <w:tc>
+                <w:tcPr>
+                  <w:tcW w:type="dxa" w:w="10406"/>
+                  <w:tcBorders>
+                    <w:top w:val="none" w:color="FFFFFF" w:sz="0"/>
+                    <w:left w:val="none" w:color="FFFFFF" w:sz="0"/>
+                    <w:bottom w:val="single" w:color="9AA3B5" w:sz="6"/>
+                    <w:right w:val="none" w:color="FFFFFF" w:sz="0"/>
+                  </w:tcBorders>
+                  <w:tcMar>
+                    <w:top w:type="dxa" w:w="60"/>
+                    <w:left w:type="dxa" w:w="100"/>
+                    <w:bottom w:type="dxa" w:w="60"/>
+                    <w:right w:type="dxa" w:w="100"/>
+                  </w:tcMar>
+                  <w:vAlign w:val="center"/>
+                </w:tcPr>
+                <w:p>
+                  <w:pPr>
+                    <w:spacing w:after="0" w:before="0"/>
+                  </w:pPr>
+                  <w:r>
+                    <w:rPr>
+                      <w:rFonts w:ascii="Calibri" w:cs="Calibri" w:eastAsia="Calibri" w:hAnsi="Calibri"/>
+                      <w:color w:val="000000"/>
+                      <w:sz w:val="22"/>
+                      <w:szCs w:val="22"/>
+                    </w:rPr>
+                    <w:t xml:space="preserve"/>
+                  </w:r>
+                </w:p>
+              </w:tc>
+            </w:tr>
+            <w:tr>
+              <w:trPr>
+                <w:cantSplit/>
+                <w:trHeight w:val="540" w:hRule="exact"/>
+              </w:trPr>
+              <w:tc>
+                <w:tcPr>
+                  <w:tcW w:type="dxa" w:w="10406"/>
+                  <w:tcBorders>
+                    <w:top w:val="none" w:color="FFFFFF" w:sz="0"/>
+                    <w:left w:val="none" w:color="FFFFFF" w:sz="0"/>
+                    <w:bottom w:val="single" w:color="9AA3B5" w:sz="6"/>
+                    <w:right w:val="none" w:color="FFFFFF" w:sz="0"/>
+                  </w:tcBorders>
+                  <w:tcMar>
+                    <w:top w:type="dxa" w:w="60"/>
+                    <w:left w:type="dxa" w:w="100"/>
+                    <w:bottom w:type="dxa" w:w="60"/>
+                    <w:right w:type="dxa" w:w="100"/>
+                  </w:tcMar>
+                  <w:vAlign w:val="center"/>
+                </w:tcPr>
+                <w:p>
+                  <w:pPr>
+                    <w:spacing w:after="0" w:before="0"/>
+                  </w:pPr>
+                  <w:r>
+                    <w:rPr>
+                      <w:rFonts w:ascii="Calibri" w:cs="Calibri" w:eastAsia="Calibri" w:hAnsi="Calibri"/>
+                      <w:color w:val="000000"/>
+                      <w:sz w:val="22"/>
+                      <w:szCs w:val="22"/>
+                    </w:rPr>
+                    <w:t xml:space="preserve"/>
+                  </w:r>
+                </w:p>
+              </w:tc>
+            </w:tr>
+            <w:tr>
+              <w:trPr>
+                <w:cantSplit/>
+                <w:trHeight w:val="540" w:hRule="exact"/>
+              </w:trPr>
+              <w:tc>
+                <w:tcPr>
+                  <w:tcW w:type="dxa" w:w="10406"/>
+                  <w:tcBorders>
+                    <w:top w:val="none" w:color="FFFFFF" w:sz="0"/>
+                    <w:left w:val="none" w:color="FFFFFF" w:sz="0"/>
+                    <w:bottom w:val="single" w:color="9AA3B5" w:sz="6"/>
+                    <w:right w:val="none" w:color="FFFFFF" w:sz="0"/>
+                  </w:tcBorders>
+                  <w:tcMar>
+                    <w:top w:type="dxa" w:w="60"/>
+                    <w:left w:type="dxa" w:w="100"/>
+                    <w:bottom w:type="dxa" w:w="60"/>
+                    <w:right w:type="dxa" w:w="100"/>
+                  </w:tcMar>
+                  <w:vAlign w:val="center"/>
+                </w:tcPr>
+                <w:p>
+                  <w:pPr>
+                    <w:spacing w:after="0" w:before="0"/>
+                  </w:pPr>
+                  <w:r>
+                    <w:rPr>
+                      <w:rFonts w:ascii="Calibri" w:cs="Calibri" w:eastAsia="Calibri" w:hAnsi="Calibri"/>
+                      <w:color w:val="000000"/>
+                      <w:sz w:val="22"/>
+                      <w:szCs w:val="22"/>
+                    </w:rPr>
+                    <w:t xml:space="preserve"/>
+                  </w:r>
+                </w:p>
+              </w:tc>
+            </w:tr>
+            <w:tr>
+              <w:trPr>
+                <w:cantSplit/>
+                <w:trHeight w:val="540" w:hRule="exact"/>
+              </w:trPr>
+              <w:tc>
+                <w:tcPr>
+                  <w:tcW w:type="dxa" w:w="10406"/>
+                  <w:tcBorders>
+                    <w:top w:val="none" w:color="FFFFFF" w:sz="0"/>
+                    <w:left w:val="none" w:color="FFFFFF" w:sz="0"/>
+                    <w:bottom w:val="single" w:color="9AA3B5" w:sz="6"/>
+                    <w:right w:val="none" w:color="FFFFFF" w:sz="0"/>
+                  </w:tcBorders>
+                  <w:tcMar>
+                    <w:top w:type="dxa" w:w="60"/>
+                    <w:left w:type="dxa" w:w="100"/>
+                    <w:bottom w:type="dxa" w:w="60"/>
+                    <w:right w:type="dxa" w:w="100"/>
+                  </w:tcMar>
+                  <w:vAlign w:val="center"/>
+                </w:tcPr>
+                <w:p>
+                  <w:pPr>
+                    <w:spacing w:after="0" w:before="0"/>
+                  </w:pPr>
+                  <w:r>
+                    <w:rPr>
+                      <w:rFonts w:ascii="Calibri" w:cs="Calibri" w:eastAsia="Calibri" w:hAnsi="Calibri"/>
+                      <w:color w:val="000000"/>
+                      <w:sz w:val="22"/>
+                      <w:szCs w:val="22"/>
+                    </w:rPr>
+                    <w:t xml:space="preserve"/>
+                  </w:r>
+                </w:p>
+              </w:tc>
+            </w:tr>
+            <w:tr>
+              <w:trPr>
+                <w:cantSplit/>
+                <w:trHeight w:val="540" w:hRule="exact"/>
+              </w:trPr>
+              <w:tc>
+                <w:tcPr>
+                  <w:tcW w:type="dxa" w:w="10406"/>
+                  <w:tcBorders>
+                    <w:top w:val="none" w:color="FFFFFF" w:sz="0"/>
+                    <w:left w:val="none" w:color="FFFFFF" w:sz="0"/>
+                    <w:bottom w:val="single" w:color="9AA3B5" w:sz="6"/>
+                    <w:right w:val="none" w:color="FFFFFF" w:sz="0"/>
+                  </w:tcBorders>
+                  <w:tcMar>
+                    <w:top w:type="dxa" w:w="60"/>
+                    <w:left w:type="dxa" w:w="100"/>
+                    <w:bottom w:type="dxa" w:w="60"/>
+                    <w:right w:type="dxa" w:w="100"/>
+                  </w:tcMar>
+                  <w:vAlign w:val="center"/>
+                </w:tcPr>
+                <w:p>
+                  <w:pPr>
+                    <w:spacing w:after="0" w:before="0"/>
+                  </w:pPr>
+                  <w:r>
+                    <w:rPr>
+                      <w:rFonts w:ascii="Calibri" w:cs="Calibri" w:eastAsia="Calibri" w:hAnsi="Calibri"/>
+                      <w:color w:val="000000"/>
+                      <w:sz w:val="22"/>
+                      <w:szCs w:val="22"/>
+                    </w:rPr>
+                    <w:t xml:space="preserve"/>
                   </w:r>
                 </w:p>
               </w:tc>
@@ -4119,19 +3381,8 @@
           </w:tbl>
           <w:p>
             <w:pPr>
-              <w:spacing w:after="60" w:before="80"/>
+              <w:spacing w:after="0" w:before="100"/>
             </w:pPr>
-            <w:r>
-              <w:rPr>
-                <w:rFonts w:ascii="Calibri" w:cs="Calibri" w:eastAsia="Calibri" w:hAnsi="Calibri"/>
-                <w:b/>
-                <w:bCs/>
-                <w:color w:val="1E2761"/>
-                <w:sz w:val="18"/>
-                <w:szCs w:val="18"/>
-              </w:rPr>
-              <w:t xml:space="preserve">Verben  </w:t>
-            </w:r>
             <w:r>
               <w:rPr>
                 <w:rFonts w:ascii="Calibri" w:cs="Calibri" w:eastAsia="Calibri" w:hAnsi="Calibri"/>
@@ -4139,32 +3390,7 @@
                 <w:sz w:val="18"/>
                 <w:szCs w:val="18"/>
               </w:rPr>
-              <w:t xml:space="preserve">Judo: kämpfen – kämpfte, werfen – warf, halten – hielt  ·  Handball: werfen – warf, treffen – traf, spielen – spielte  ·  Gewichtheben: heben – hob, reißen – riss, stoßen – stieß</w:t>
-            </w:r>
-          </w:p>
-          <w:p>
-            <w:pPr>
-              <w:spacing w:after="0" w:before="100"/>
-            </w:pPr>
-            <w:r>
-              <w:rPr>
-                <w:rFonts w:ascii="Calibri" w:cs="Calibri" w:eastAsia="Calibri" w:hAnsi="Calibri"/>
-                <w:b/>
-                <w:bCs/>
-                <w:color w:val="000000"/>
-                <w:sz w:val="18"/>
-                <w:szCs w:val="18"/>
-              </w:rPr>
-              <w:t xml:space="preserve">Prüfe vor dem Abgeben:  </w:t>
-            </w:r>
-            <w:r>
-              <w:rPr>
-                <w:rFonts w:ascii="Calibri" w:cs="Calibri" w:eastAsia="Calibri" w:hAnsi="Calibri"/>
-                <w:color w:val="000000"/>
-                <w:sz w:val="18"/>
-                <w:szCs w:val="18"/>
-              </w:rPr>
-              <w:t xml:space="preserve">☐ alle fünf Zeitformen drin   ☐ Hilfsverb rot, Partizip II gelb, Infinitiv blau markiert   ☐ Präteritum-Verben unterstrichen</w:t>
+              <w:t xml:space="preserve">☐ alle fünf Zeitformen drin   ☐ Hilfsverb rot, Partizip II gelb, Infinitiv blau markiert</w:t>
             </w:r>
             <w:r>
               <w:rPr>
@@ -4234,7 +3460,7 @@
           </w:tcPr>
           <w:p>
             <w:pPr>
-              <w:spacing w:after="80" w:before="0"/>
+              <w:spacing w:after="70" w:before="0"/>
             </w:pPr>
             <w:r>
               <w:rPr>
@@ -4245,12 +3471,21 @@
                 <w:sz w:val="28"/>
                 <w:szCs w:val="28"/>
               </w:rPr>
-              <w:t xml:space="preserve">Exit-Ticket: Formulierungshilfen</w:t>
+              <w:t xml:space="preserve">Exit-Ticket: Mein Wochenende</w:t>
+            </w:r>
+            <w:r>
+              <w:rPr>
+                <w:rFonts w:ascii="Calibri" w:cs="Calibri" w:eastAsia="Calibri" w:hAnsi="Calibri"/>
+                <w:color w:val="5B6B8C"/>
+                <w:sz w:val="18"/>
+                <w:szCs w:val="18"/>
+              </w:rPr>
+              <w:t xml:space="preserve">          Name: ____________________</w:t>
             </w:r>
           </w:p>
           <w:p>
             <w:pPr>
-              <w:spacing w:after="100" w:before="0"/>
+              <w:spacing w:after="80" w:before="0"/>
             </w:pPr>
             <w:r>
               <w:rPr>
@@ -4259,7 +3494,7 @@
                 <w:sz w:val="21"/>
                 <w:szCs w:val="21"/>
               </w:rPr>
-              <w:t xml:space="preserve">Schreibe auf ein </w:t>
+              <w:t xml:space="preserve">Schreibe </w:t>
             </w:r>
             <w:r>
               <w:rPr>
@@ -4270,7 +3505,7 @@
                 <w:sz w:val="21"/>
                 <w:szCs w:val="21"/>
               </w:rPr>
-              <w:t xml:space="preserve">eigenes Blatt</w:t>
+              <w:t xml:space="preserve">5–7 Sätze</w:t>
             </w:r>
             <w:r>
               <w:rPr>
@@ -4279,7 +3514,7 @@
                 <w:sz w:val="21"/>
                 <w:szCs w:val="21"/>
               </w:rPr>
-              <w:t xml:space="preserve"> (Name oben rechts) </w:t>
+              <w:t xml:space="preserve"> über deinen Wettkampf am Wochenende – nach dem Muster an der Tafel. Jede Zeitform kommt </w:t>
             </w:r>
             <w:r>
               <w:rPr>
@@ -4290,7 +3525,7 @@
                 <w:sz w:val="21"/>
                 <w:szCs w:val="21"/>
               </w:rPr>
-              <w:t xml:space="preserve">5–7 Sätze</w:t>
+              <w:t xml:space="preserve">mindestens einmal</w:t>
             </w:r>
             <w:r>
               <w:rPr>
@@ -4299,27 +3534,7 @@
                 <w:sz w:val="21"/>
                 <w:szCs w:val="21"/>
               </w:rPr>
-              <w:t xml:space="preserve"> über deinen Wettkampf am Wochenende – nach dem Muster an der Tafel. Jede Zeitform kommt </w:t>
-            </w:r>
-            <w:r>
-              <w:rPr>
-                <w:rFonts w:ascii="Calibri" w:cs="Calibri" w:eastAsia="Calibri" w:hAnsi="Calibri"/>
-                <w:b/>
-                <w:bCs/>
-                <w:color w:val="000000"/>
-                <w:sz w:val="21"/>
-                <w:szCs w:val="21"/>
-              </w:rPr>
-              <w:t xml:space="preserve">mindestens einmal</w:t>
-            </w:r>
-            <w:r>
-              <w:rPr>
-                <w:rFonts w:ascii="Calibri" w:cs="Calibri" w:eastAsia="Calibri" w:hAnsi="Calibri"/>
-                <w:color w:val="000000"/>
-                <w:sz w:val="21"/>
-                <w:szCs w:val="21"/>
-              </w:rPr>
-              <w:t xml:space="preserve"> vor. Du kannst die Vorschläge übernehmen und ergänzen. Am Ende gibst du das Blatt ab.</w:t>
+              <w:t xml:space="preserve"> vor.</w:t>
             </w:r>
           </w:p>
           <w:tbl>
@@ -4335,8 +3550,8 @@
               </w:tblBorders>
             </w:tblPr>
             <w:tblGrid>
-              <w:gridCol w:w="2350"/>
-              <w:gridCol w:w="8056"/>
+              <w:gridCol w:w="3800"/>
+              <w:gridCol w:w="6606"/>
             </w:tblGrid>
             <w:tr>
               <w:trPr>
@@ -4344,7 +3559,7 @@
               </w:trPr>
               <w:tc>
                 <w:tcPr>
-                  <w:tcW w:type="dxa" w:w="2350"/>
+                  <w:tcW w:type="dxa" w:w="3800"/>
                   <w:tcBorders>
                     <w:top w:val="single" w:color="B9C6E8" w:sz="6"/>
                     <w:left w:val="single" w:color="B9C6E8" w:sz="6"/>
@@ -4353,16 +3568,16 @@
                   </w:tcBorders>
                   <w:shd w:fill="F4F7FD" w:color="auto" w:val="clear"/>
                   <w:tcMar>
-                    <w:top w:type="dxa" w:w="70"/>
-                    <w:left w:type="dxa" w:w="100"/>
-                    <w:bottom w:type="dxa" w:w="70"/>
-                    <w:right w:type="dxa" w:w="100"/>
-                  </w:tcMar>
-                  <w:vAlign w:val="top"/>
-                </w:tcPr>
-                <w:p>
-                  <w:pPr>
-                    <w:spacing w:after="10" w:before="0"/>
+                    <w:top w:type="dxa" w:w="50"/>
+                    <w:left w:type="dxa" w:w="100"/>
+                    <w:bottom w:type="dxa" w:w="50"/>
+                    <w:right w:type="dxa" w:w="100"/>
+                  </w:tcMar>
+                  <w:vAlign w:val="center"/>
+                </w:tcPr>
+                <w:p>
+                  <w:pPr>
+                    <w:spacing w:after="0" w:before="0"/>
                   </w:pPr>
                   <w:r>
                     <w:rPr>
@@ -4370,50 +3585,31 @@
                       <w:b/>
                       <w:bCs/>
                       <w:color w:val="1E2761"/>
-                      <w:sz w:val="20"/>
-                      <w:szCs w:val="20"/>
-                    </w:rPr>
-                    <w:t xml:space="preserve">Plusquamperfekt</w:t>
-                  </w:r>
-                </w:p>
-                <w:p>
-                  <w:pPr>
-                    <w:spacing w:after="10" w:before="0"/>
-                  </w:pPr>
-                  <w:r>
-                    <w:rPr>
-                      <w:rFonts w:ascii="Calibri" w:cs="Calibri" w:eastAsia="Calibri" w:hAnsi="Calibri"/>
+                      <w:sz w:val="19"/>
+                      <w:szCs w:val="19"/>
+                    </w:rPr>
+                    <w:t xml:space="preserve">Plusquamperfekt  </w:t>
+                  </w:r>
+                  <w:r>
+                    <w:rPr>
+                      <w:rFonts w:ascii="Calibri" w:cs="Calibri" w:eastAsia="Calibri" w:hAnsi="Calibri"/>
+                      <w:b/>
+                      <w:bCs/>
+                      <w:color w:val="D9534F"/>
+                      <w:sz w:val="16"/>
+                      <w:szCs w:val="16"/>
+                    </w:rPr>
+                    <w:t xml:space="preserve">hatte/war</w:t>
+                  </w:r>
+                  <w:r>
+                    <w:rPr>
+                      <w:rFonts w:ascii="Calibri" w:cs="Calibri" w:eastAsia="Calibri" w:hAnsi="Calibri"/>
+                      <w:b/>
+                      <w:bCs/>
                       <w:color w:val="5B6B8C"/>
                       <w:sz w:val="16"/>
                       <w:szCs w:val="16"/>
                     </w:rPr>
-                    <w:t xml:space="preserve">vorher</w:t>
-                  </w:r>
-                </w:p>
-                <w:p>
-                  <w:pPr>
-                    <w:spacing w:after="0" w:before="0"/>
-                  </w:pPr>
-                  <w:r>
-                    <w:rPr>
-                      <w:rFonts w:ascii="Calibri" w:cs="Calibri" w:eastAsia="Calibri" w:hAnsi="Calibri"/>
-                      <w:b/>
-                      <w:bCs/>
-                      <w:color w:val="D9534F"/>
-                      <w:sz w:val="16"/>
-                      <w:szCs w:val="16"/>
-                    </w:rPr>
-                    <w:t xml:space="preserve">hatte/war</w:t>
-                  </w:r>
-                  <w:r>
-                    <w:rPr>
-                      <w:rFonts w:ascii="Calibri" w:cs="Calibri" w:eastAsia="Calibri" w:hAnsi="Calibri"/>
-                      <w:b/>
-                      <w:bCs/>
-                      <w:color w:val="333333"/>
-                      <w:sz w:val="16"/>
-                      <w:szCs w:val="16"/>
-                    </w:rPr>
                     <w:t xml:space="preserve"> + </w:t>
                   </w:r>
                   <w:r>
@@ -4431,7 +3627,7 @@
               </w:tc>
               <w:tc>
                 <w:tcPr>
-                  <w:tcW w:type="dxa" w:w="8056"/>
+                  <w:tcW w:type="dxa" w:w="6606"/>
                   <w:tcBorders>
                     <w:top w:val="single" w:color="B9C6E8" w:sz="6"/>
                     <w:left w:val="single" w:color="B9C6E8" w:sz="6"/>
@@ -4439,23 +3635,23 @@
                     <w:right w:val="single" w:color="B9C6E8" w:sz="6"/>
                   </w:tcBorders>
                   <w:tcMar>
-                    <w:top w:type="dxa" w:w="70"/>
-                    <w:left w:type="dxa" w:w="100"/>
-                    <w:bottom w:type="dxa" w:w="70"/>
-                    <w:right w:type="dxa" w:w="100"/>
-                  </w:tcMar>
-                  <w:vAlign w:val="top"/>
-                </w:tcPr>
-                <w:p>
-                  <w:pPr>
-                    <w:spacing w:after="20" w:before="0"/>
-                  </w:pPr>
-                  <w:r>
-                    <w:rPr>
-                      <w:rFonts w:ascii="Calibri" w:cs="Calibri" w:eastAsia="Calibri" w:hAnsi="Calibri"/>
-                      <w:color w:val="000000"/>
-                      <w:sz w:val="18"/>
-                      <w:szCs w:val="18"/>
+                    <w:top w:type="dxa" w:w="50"/>
+                    <w:left w:type="dxa" w:w="100"/>
+                    <w:bottom w:type="dxa" w:w="50"/>
+                    <w:right w:type="dxa" w:w="100"/>
+                  </w:tcMar>
+                  <w:vAlign w:val="center"/>
+                </w:tcPr>
+                <w:p>
+                  <w:pPr>
+                    <w:spacing w:after="0" w:before="0"/>
+                  </w:pPr>
+                  <w:r>
+                    <w:rPr>
+                      <w:rFonts w:ascii="Calibri" w:cs="Calibri" w:eastAsia="Calibri" w:hAnsi="Calibri"/>
+                      <w:color w:val="000000"/>
+                      <w:sz w:val="19"/>
+                      <w:szCs w:val="19"/>
                     </w:rPr>
                     <w:t xml:space="preserve">Vor dem Wettkampf </w:t>
                   </w:r>
@@ -4465,8 +3661,8 @@
                       <w:b/>
                       <w:bCs/>
                       <w:color w:val="D9534F"/>
-                      <w:sz w:val="18"/>
-                      <w:szCs w:val="18"/>
+                      <w:sz w:val="19"/>
+                      <w:szCs w:val="19"/>
                     </w:rPr>
                     <w:t xml:space="preserve">hatte</w:t>
                   </w:r>
@@ -4474,10 +3670,10 @@
                     <w:rPr>
                       <w:rFonts w:ascii="Calibri" w:cs="Calibri" w:eastAsia="Calibri" w:hAnsi="Calibri"/>
                       <w:color w:val="000000"/>
-                      <w:sz w:val="18"/>
-                      <w:szCs w:val="18"/>
-                    </w:rPr>
-                    <w:t xml:space="preserve"> ich wochenlang hart </w:t>
+                      <w:sz w:val="19"/>
+                      <w:szCs w:val="19"/>
+                    </w:rPr>
+                    <w:t xml:space="preserve"> ich wochenlang </w:t>
                   </w:r>
                   <w:r>
                     <w:rPr>
@@ -4485,8 +3681,8 @@
                       <w:b/>
                       <w:bCs/>
                       <w:color w:val="C98A1E"/>
-                      <w:sz w:val="18"/>
-                      <w:szCs w:val="18"/>
+                      <w:sz w:val="19"/>
+                      <w:szCs w:val="19"/>
                     </w:rPr>
                     <w:t xml:space="preserve">trainiert</w:t>
                   </w:r>
@@ -4494,290 +3690,8 @@
                     <w:rPr>
                       <w:rFonts w:ascii="Calibri" w:cs="Calibri" w:eastAsia="Calibri" w:hAnsi="Calibri"/>
                       <w:color w:val="000000"/>
-                      <w:sz w:val="18"/>
-                      <w:szCs w:val="18"/>
-                    </w:rPr>
-                    <w:t xml:space="preserve">.</w:t>
-                  </w:r>
-                  <w:r>
-                    <w:rPr>
-                      <w:rFonts w:ascii="Calibri" w:cs="Calibri" w:eastAsia="Calibri" w:hAnsi="Calibri"/>
-                      <w:color w:val="9AA3B5"/>
-                      <w:sz w:val="18"/>
-                      <w:szCs w:val="18"/>
-                    </w:rPr>
-                    <w:t xml:space="preserve">   ·   </w:t>
-                  </w:r>
-                  <w:r>
-                    <w:rPr>
-                      <w:rFonts w:ascii="Calibri" w:cs="Calibri" w:eastAsia="Calibri" w:hAnsi="Calibri"/>
-                      <w:color w:val="000000"/>
-                      <w:sz w:val="18"/>
-                      <w:szCs w:val="18"/>
-                    </w:rPr>
-                    <w:t xml:space="preserve">Am Abend davor </w:t>
-                  </w:r>
-                  <w:r>
-                    <w:rPr>
-                      <w:rFonts w:ascii="Calibri" w:cs="Calibri" w:eastAsia="Calibri" w:hAnsi="Calibri"/>
-                      <w:b/>
-                      <w:bCs/>
-                      <w:color w:val="D9534F"/>
-                      <w:sz w:val="18"/>
-                      <w:szCs w:val="18"/>
-                    </w:rPr>
-                    <w:t xml:space="preserve">hatte</w:t>
-                  </w:r>
-                  <w:r>
-                    <w:rPr>
-                      <w:rFonts w:ascii="Calibri" w:cs="Calibri" w:eastAsia="Calibri" w:hAnsi="Calibri"/>
-                      <w:color w:val="000000"/>
-                      <w:sz w:val="18"/>
-                      <w:szCs w:val="18"/>
-                    </w:rPr>
-                    <w:t xml:space="preserve"> ich kaum </w:t>
-                  </w:r>
-                  <w:r>
-                    <w:rPr>
-                      <w:rFonts w:ascii="Calibri" w:cs="Calibri" w:eastAsia="Calibri" w:hAnsi="Calibri"/>
-                      <w:b/>
-                      <w:bCs/>
-                      <w:color w:val="C98A1E"/>
-                      <w:sz w:val="18"/>
-                      <w:szCs w:val="18"/>
-                    </w:rPr>
-                    <w:t xml:space="preserve">geschlafen</w:t>
-                  </w:r>
-                  <w:r>
-                    <w:rPr>
-                      <w:rFonts w:ascii="Calibri" w:cs="Calibri" w:eastAsia="Calibri" w:hAnsi="Calibri"/>
-                      <w:color w:val="000000"/>
-                      <w:sz w:val="18"/>
-                      <w:szCs w:val="18"/>
-                    </w:rPr>
-                    <w:t xml:space="preserve">.</w:t>
-                  </w:r>
-                </w:p>
-                <w:p>
-                  <w:pPr>
-                    <w:spacing w:after="20" w:before="0"/>
-                  </w:pPr>
-                  <w:r>
-                    <w:rPr>
-                      <w:rFonts w:ascii="Calibri" w:cs="Calibri" w:eastAsia="Calibri" w:hAnsi="Calibri"/>
-                      <w:color w:val="000000"/>
-                      <w:sz w:val="18"/>
-                      <w:szCs w:val="18"/>
-                    </w:rPr>
-                    <w:t xml:space="preserve">Am Freitag </w:t>
-                  </w:r>
-                  <w:r>
-                    <w:rPr>
-                      <w:rFonts w:ascii="Calibri" w:cs="Calibri" w:eastAsia="Calibri" w:hAnsi="Calibri"/>
-                      <w:b/>
-                      <w:bCs/>
-                      <w:color w:val="D9534F"/>
-                      <w:sz w:val="18"/>
-                      <w:szCs w:val="18"/>
-                    </w:rPr>
-                    <w:t xml:space="preserve">waren</w:t>
-                  </w:r>
-                  <w:r>
-                    <w:rPr>
-                      <w:rFonts w:ascii="Calibri" w:cs="Calibri" w:eastAsia="Calibri" w:hAnsi="Calibri"/>
-                      <w:color w:val="000000"/>
-                      <w:sz w:val="18"/>
-                      <w:szCs w:val="18"/>
-                    </w:rPr>
-                    <w:t xml:space="preserve"> wir mit dem Team nach … </w:t>
-                  </w:r>
-                  <w:r>
-                    <w:rPr>
-                      <w:rFonts w:ascii="Calibri" w:cs="Calibri" w:eastAsia="Calibri" w:hAnsi="Calibri"/>
-                      <w:b/>
-                      <w:bCs/>
-                      <w:color w:val="C98A1E"/>
-                      <w:sz w:val="18"/>
-                      <w:szCs w:val="18"/>
-                    </w:rPr>
-                    <w:t xml:space="preserve">gefahren</w:t>
-                  </w:r>
-                  <w:r>
-                    <w:rPr>
-                      <w:rFonts w:ascii="Calibri" w:cs="Calibri" w:eastAsia="Calibri" w:hAnsi="Calibri"/>
-                      <w:color w:val="000000"/>
-                      <w:sz w:val="18"/>
-                      <w:szCs w:val="18"/>
-                    </w:rPr>
-                    <w:t xml:space="preserve">.</w:t>
-                  </w:r>
-                  <w:r>
-                    <w:rPr>
-                      <w:rFonts w:ascii="Calibri" w:cs="Calibri" w:eastAsia="Calibri" w:hAnsi="Calibri"/>
-                      <w:color w:val="9AA3B5"/>
-                      <w:sz w:val="18"/>
-                      <w:szCs w:val="18"/>
-                    </w:rPr>
-                    <w:t xml:space="preserve">   ·   </w:t>
-                  </w:r>
-                  <w:r>
-                    <w:rPr>
-                      <w:rFonts w:ascii="Calibri" w:cs="Calibri" w:eastAsia="Calibri" w:hAnsi="Calibri"/>
-                      <w:color w:val="000000"/>
-                      <w:sz w:val="18"/>
-                      <w:szCs w:val="18"/>
-                    </w:rPr>
-                    <w:t xml:space="preserve">Mein Trainer </w:t>
-                  </w:r>
-                  <w:r>
-                    <w:rPr>
-                      <w:rFonts w:ascii="Calibri" w:cs="Calibri" w:eastAsia="Calibri" w:hAnsi="Calibri"/>
-                      <w:b/>
-                      <w:bCs/>
-                      <w:color w:val="D9534F"/>
-                      <w:sz w:val="18"/>
-                      <w:szCs w:val="18"/>
-                    </w:rPr>
-                    <w:t xml:space="preserve">hatte</w:t>
-                  </w:r>
-                  <w:r>
-                    <w:rPr>
-                      <w:rFonts w:ascii="Calibri" w:cs="Calibri" w:eastAsia="Calibri" w:hAnsi="Calibri"/>
-                      <w:color w:val="000000"/>
-                      <w:sz w:val="18"/>
-                      <w:szCs w:val="18"/>
-                    </w:rPr>
-                    <w:t xml:space="preserve"> mir noch einen Tipp </w:t>
-                  </w:r>
-                  <w:r>
-                    <w:rPr>
-                      <w:rFonts w:ascii="Calibri" w:cs="Calibri" w:eastAsia="Calibri" w:hAnsi="Calibri"/>
-                      <w:b/>
-                      <w:bCs/>
-                      <w:color w:val="C98A1E"/>
-                      <w:sz w:val="18"/>
-                      <w:szCs w:val="18"/>
-                    </w:rPr>
-                    <w:t xml:space="preserve">gegeben</w:t>
-                  </w:r>
-                  <w:r>
-                    <w:rPr>
-                      <w:rFonts w:ascii="Calibri" w:cs="Calibri" w:eastAsia="Calibri" w:hAnsi="Calibri"/>
-                      <w:color w:val="000000"/>
-                      <w:sz w:val="18"/>
-                      <w:szCs w:val="18"/>
-                    </w:rPr>
-                    <w:t xml:space="preserve">.</w:t>
-                  </w:r>
-                </w:p>
-                <w:p>
-                  <w:pPr>
-                    <w:spacing w:after="20" w:before="0"/>
-                  </w:pPr>
-                  <w:r>
-                    <w:rPr>
-                      <w:rFonts w:ascii="Calibri" w:cs="Calibri" w:eastAsia="Calibri" w:hAnsi="Calibri"/>
-                      <w:color w:val="000000"/>
-                      <w:sz w:val="18"/>
-                      <w:szCs w:val="18"/>
-                    </w:rPr>
-                    <w:t xml:space="preserve">Ich </w:t>
-                  </w:r>
-                  <w:r>
-                    <w:rPr>
-                      <w:rFonts w:ascii="Calibri" w:cs="Calibri" w:eastAsia="Calibri" w:hAnsi="Calibri"/>
-                      <w:b/>
-                      <w:bCs/>
-                      <w:color w:val="D9534F"/>
-                      <w:sz w:val="18"/>
-                      <w:szCs w:val="18"/>
-                    </w:rPr>
-                    <w:t xml:space="preserve">hatte</w:t>
-                  </w:r>
-                  <w:r>
-                    <w:rPr>
-                      <w:rFonts w:ascii="Calibri" w:cs="Calibri" w:eastAsia="Calibri" w:hAnsi="Calibri"/>
-                      <w:color w:val="000000"/>
-                      <w:sz w:val="18"/>
-                      <w:szCs w:val="18"/>
-                    </w:rPr>
-                    <w:t xml:space="preserve"> mich lange </w:t>
-                  </w:r>
-                  <w:r>
-                    <w:rPr>
-                      <w:rFonts w:ascii="Calibri" w:cs="Calibri" w:eastAsia="Calibri" w:hAnsi="Calibri"/>
-                      <w:b/>
-                      <w:bCs/>
-                      <w:color w:val="C98A1E"/>
-                      <w:sz w:val="18"/>
-                      <w:szCs w:val="18"/>
-                    </w:rPr>
-                    <w:t xml:space="preserve">aufgewärmt</w:t>
-                  </w:r>
-                  <w:r>
-                    <w:rPr>
-                      <w:rFonts w:ascii="Calibri" w:cs="Calibri" w:eastAsia="Calibri" w:hAnsi="Calibri"/>
-                      <w:color w:val="000000"/>
-                      <w:sz w:val="18"/>
-                      <w:szCs w:val="18"/>
-                    </w:rPr>
-                    <w:t xml:space="preserve">.</w:t>
-                  </w:r>
-                  <w:r>
-                    <w:rPr>
-                      <w:rFonts w:ascii="Calibri" w:cs="Calibri" w:eastAsia="Calibri" w:hAnsi="Calibri"/>
-                      <w:color w:val="9AA3B5"/>
-                      <w:sz w:val="18"/>
-                      <w:szCs w:val="18"/>
-                    </w:rPr>
-                    <w:t xml:space="preserve">   ·   </w:t>
-                  </w:r>
-                  <w:r>
-                    <w:rPr>
-                      <w:rFonts w:ascii="Calibri" w:cs="Calibri" w:eastAsia="Calibri" w:hAnsi="Calibri"/>
-                      <w:color w:val="000000"/>
-                      <w:sz w:val="18"/>
-                      <w:szCs w:val="18"/>
-                    </w:rPr>
-                    <w:t xml:space="preserve">Wir </w:t>
-                  </w:r>
-                  <w:r>
-                    <w:rPr>
-                      <w:rFonts w:ascii="Calibri" w:cs="Calibri" w:eastAsia="Calibri" w:hAnsi="Calibri"/>
-                      <w:b/>
-                      <w:bCs/>
-                      <w:color w:val="D9534F"/>
-                      <w:sz w:val="18"/>
-                      <w:szCs w:val="18"/>
-                    </w:rPr>
-                    <w:t xml:space="preserve">waren</w:t>
-                  </w:r>
-                  <w:r>
-                    <w:rPr>
-                      <w:rFonts w:ascii="Calibri" w:cs="Calibri" w:eastAsia="Calibri" w:hAnsi="Calibri"/>
-                      <w:color w:val="000000"/>
-                      <w:sz w:val="18"/>
-                      <w:szCs w:val="18"/>
-                    </w:rPr>
-                    <w:t xml:space="preserve"> früh </w:t>
-                  </w:r>
-                  <w:r>
-                    <w:rPr>
-                      <w:rFonts w:ascii="Calibri" w:cs="Calibri" w:eastAsia="Calibri" w:hAnsi="Calibri"/>
-                      <w:b/>
-                      <w:bCs/>
-                      <w:color w:val="C98A1E"/>
-                      <w:sz w:val="18"/>
-                      <w:szCs w:val="18"/>
-                    </w:rPr>
-                    <w:t xml:space="preserve">aufgestanden</w:t>
-                  </w:r>
-                  <w:r>
-                    <w:rPr>
-                      <w:rFonts w:ascii="Calibri" w:cs="Calibri" w:eastAsia="Calibri" w:hAnsi="Calibri"/>
-                      <w:color w:val="000000"/>
-                      <w:sz w:val="18"/>
-                      <w:szCs w:val="18"/>
+                      <w:sz w:val="19"/>
+                      <w:szCs w:val="19"/>
                     </w:rPr>
                     <w:t xml:space="preserve">.</w:t>
                   </w:r>
@@ -4790,7 +3704,7 @@
               </w:trPr>
               <w:tc>
                 <w:tcPr>
-                  <w:tcW w:type="dxa" w:w="2350"/>
+                  <w:tcW w:type="dxa" w:w="3800"/>
                   <w:tcBorders>
                     <w:top w:val="single" w:color="B9C6E8" w:sz="6"/>
                     <w:left w:val="single" w:color="B9C6E8" w:sz="6"/>
@@ -4799,16 +3713,16 @@
                   </w:tcBorders>
                   <w:shd w:fill="F4F7FD" w:color="auto" w:val="clear"/>
                   <w:tcMar>
-                    <w:top w:type="dxa" w:w="70"/>
-                    <w:left w:type="dxa" w:w="100"/>
-                    <w:bottom w:type="dxa" w:w="70"/>
-                    <w:right w:type="dxa" w:w="100"/>
-                  </w:tcMar>
-                  <w:vAlign w:val="top"/>
-                </w:tcPr>
-                <w:p>
-                  <w:pPr>
-                    <w:spacing w:after="10" w:before="0"/>
+                    <w:top w:type="dxa" w:w="50"/>
+                    <w:left w:type="dxa" w:w="100"/>
+                    <w:bottom w:type="dxa" w:w="50"/>
+                    <w:right w:type="dxa" w:w="100"/>
+                  </w:tcMar>
+                  <w:vAlign w:val="center"/>
+                </w:tcPr>
+                <w:p>
+                  <w:pPr>
+                    <w:spacing w:after="0" w:before="0"/>
                   </w:pPr>
                   <w:r>
                     <w:rPr>
@@ -4816,46 +3730,27 @@
                       <w:b/>
                       <w:bCs/>
                       <w:color w:val="1E2761"/>
-                      <w:sz w:val="20"/>
-                      <w:szCs w:val="20"/>
-                    </w:rPr>
-                    <w:t xml:space="preserve">Präteritum</w:t>
-                  </w:r>
-                </w:p>
-                <w:p>
-                  <w:pPr>
-                    <w:spacing w:after="10" w:before="0"/>
-                  </w:pPr>
-                  <w:r>
-                    <w:rPr>
-                      <w:rFonts w:ascii="Calibri" w:cs="Calibri" w:eastAsia="Calibri" w:hAnsi="Calibri"/>
+                      <w:sz w:val="19"/>
+                      <w:szCs w:val="19"/>
+                    </w:rPr>
+                    <w:t xml:space="preserve">Präteritum  </w:t>
+                  </w:r>
+                  <w:r>
+                    <w:rPr>
+                      <w:rFonts w:ascii="Calibri" w:cs="Calibri" w:eastAsia="Calibri" w:hAnsi="Calibri"/>
+                      <w:b/>
+                      <w:bCs/>
                       <w:color w:val="5B6B8C"/>
                       <w:sz w:val="16"/>
                       <w:szCs w:val="16"/>
                     </w:rPr>
-                    <w:t xml:space="preserve">Vergangenheit – erzählt</w:t>
-                  </w:r>
-                </w:p>
-                <w:p>
-                  <w:pPr>
-                    <w:spacing w:after="0" w:before="0"/>
-                  </w:pPr>
-                  <w:r>
-                    <w:rPr>
-                      <w:rFonts w:ascii="Calibri" w:cs="Calibri" w:eastAsia="Calibri" w:hAnsi="Calibri"/>
-                      <w:b/>
-                      <w:bCs/>
-                      <w:color w:val="333333"/>
-                      <w:sz w:val="16"/>
-                      <w:szCs w:val="16"/>
-                    </w:rPr>
-                    <w:t xml:space="preserve">finites Verb im Präteritum</w:t>
-                  </w:r>
-                </w:p>
-              </w:tc>
-              <w:tc>
-                <w:tcPr>
-                  <w:tcW w:type="dxa" w:w="8056"/>
+                    <w:t xml:space="preserve">erzählt</w:t>
+                  </w:r>
+                </w:p>
+              </w:tc>
+              <w:tc>
+                <w:tcPr>
+                  <w:tcW w:type="dxa" w:w="6606"/>
                   <w:tcBorders>
                     <w:top w:val="single" w:color="B9C6E8" w:sz="6"/>
                     <w:left w:val="single" w:color="B9C6E8" w:sz="6"/>
@@ -4863,23 +3758,23 @@
                     <w:right w:val="single" w:color="B9C6E8" w:sz="6"/>
                   </w:tcBorders>
                   <w:tcMar>
-                    <w:top w:type="dxa" w:w="70"/>
-                    <w:left w:type="dxa" w:w="100"/>
-                    <w:bottom w:type="dxa" w:w="70"/>
-                    <w:right w:type="dxa" w:w="100"/>
-                  </w:tcMar>
-                  <w:vAlign w:val="top"/>
-                </w:tcPr>
-                <w:p>
-                  <w:pPr>
-                    <w:spacing w:after="20" w:before="0"/>
-                  </w:pPr>
-                  <w:r>
-                    <w:rPr>
-                      <w:rFonts w:ascii="Calibri" w:cs="Calibri" w:eastAsia="Calibri" w:hAnsi="Calibri"/>
-                      <w:color w:val="000000"/>
-                      <w:sz w:val="18"/>
-                      <w:szCs w:val="18"/>
+                    <w:top w:type="dxa" w:w="50"/>
+                    <w:left w:type="dxa" w:w="100"/>
+                    <w:bottom w:type="dxa" w:w="50"/>
+                    <w:right w:type="dxa" w:w="100"/>
+                  </w:tcMar>
+                  <w:vAlign w:val="center"/>
+                </w:tcPr>
+                <w:p>
+                  <w:pPr>
+                    <w:spacing w:after="0" w:before="0"/>
+                  </w:pPr>
+                  <w:r>
+                    <w:rPr>
+                      <w:rFonts w:ascii="Calibri" w:cs="Calibri" w:eastAsia="Calibri" w:hAnsi="Calibri"/>
+                      <w:color w:val="000000"/>
+                      <w:sz w:val="19"/>
+                      <w:szCs w:val="19"/>
                     </w:rPr>
                     <w:t xml:space="preserve">Am Samstag </w:t>
                   </w:r>
@@ -4889,8 +3784,8 @@
                       <w:b/>
                       <w:bCs/>
                       <w:color w:val="000000"/>
-                      <w:sz w:val="18"/>
-                      <w:szCs w:val="18"/>
+                      <w:sz w:val="19"/>
+                      <w:szCs w:val="19"/>
                       <w:u w:val="single"/>
                     </w:rPr>
                     <w:t xml:space="preserve">kämpfte</w:t>
@@ -4899,8 +3794,8 @@
                     <w:rPr>
                       <w:rFonts w:ascii="Calibri" w:cs="Calibri" w:eastAsia="Calibri" w:hAnsi="Calibri"/>
                       <w:color w:val="000000"/>
-                      <w:sz w:val="18"/>
-                      <w:szCs w:val="18"/>
+                      <w:sz w:val="19"/>
+                      <w:szCs w:val="19"/>
                     </w:rPr>
                     <w:t xml:space="preserve"> / </w:t>
                   </w:r>
@@ -4910,8 +3805,8 @@
                       <w:b/>
                       <w:bCs/>
                       <w:color w:val="000000"/>
-                      <w:sz w:val="18"/>
-                      <w:szCs w:val="18"/>
+                      <w:sz w:val="19"/>
+                      <w:szCs w:val="19"/>
                       <w:u w:val="single"/>
                     </w:rPr>
                     <w:t xml:space="preserve">spielte</w:t>
@@ -4920,8 +3815,8 @@
                     <w:rPr>
                       <w:rFonts w:ascii="Calibri" w:cs="Calibri" w:eastAsia="Calibri" w:hAnsi="Calibri"/>
                       <w:color w:val="000000"/>
-                      <w:sz w:val="18"/>
-                      <w:szCs w:val="18"/>
+                      <w:sz w:val="19"/>
+                      <w:szCs w:val="19"/>
                     </w:rPr>
                     <w:t xml:space="preserve"> / </w:t>
                   </w:r>
@@ -4931,8 +3826,8 @@
                       <w:b/>
                       <w:bCs/>
                       <w:color w:val="000000"/>
-                      <w:sz w:val="18"/>
-                      <w:szCs w:val="18"/>
+                      <w:sz w:val="19"/>
+                      <w:szCs w:val="19"/>
                       <w:u w:val="single"/>
                     </w:rPr>
                     <w:t xml:space="preserve">hob</w:t>
@@ -4941,202 +3836,8 @@
                     <w:rPr>
                       <w:rFonts w:ascii="Calibri" w:cs="Calibri" w:eastAsia="Calibri" w:hAnsi="Calibri"/>
                       <w:color w:val="000000"/>
-                      <w:sz w:val="18"/>
-                      <w:szCs w:val="18"/>
-                    </w:rPr>
-                    <w:t xml:space="preserve"> ich …</w:t>
-                  </w:r>
-                  <w:r>
-                    <w:rPr>
-                      <w:rFonts w:ascii="Calibri" w:cs="Calibri" w:eastAsia="Calibri" w:hAnsi="Calibri"/>
-                      <w:color w:val="9AA3B5"/>
-                      <w:sz w:val="18"/>
-                      <w:szCs w:val="18"/>
-                    </w:rPr>
-                    <w:t xml:space="preserve">   ·   </w:t>
-                  </w:r>
-                  <w:r>
-                    <w:rPr>
-                      <w:rFonts w:ascii="Calibri" w:cs="Calibri" w:eastAsia="Calibri" w:hAnsi="Calibri"/>
-                      <w:color w:val="000000"/>
-                      <w:sz w:val="18"/>
-                      <w:szCs w:val="18"/>
-                    </w:rPr>
-                    <w:t xml:space="preserve">Im ersten Kampf / In der ersten Halbzeit / Im ersten Versuch …</w:t>
-                  </w:r>
-                </w:p>
-                <w:p>
-                  <w:pPr>
-                    <w:spacing w:after="20" w:before="0"/>
-                  </w:pPr>
-                  <w:r>
-                    <w:rPr>
-                      <w:rFonts w:ascii="Calibri" w:cs="Calibri" w:eastAsia="Calibri" w:hAnsi="Calibri"/>
-                      <w:color w:val="000000"/>
-                      <w:sz w:val="18"/>
-                      <w:szCs w:val="18"/>
-                    </w:rPr>
-                    <w:t xml:space="preserve">Am Anfang </w:t>
-                  </w:r>
-                  <w:r>
-                    <w:rPr>
-                      <w:rFonts w:ascii="Calibri" w:cs="Calibri" w:eastAsia="Calibri" w:hAnsi="Calibri"/>
-                      <w:b/>
-                      <w:bCs/>
-                      <w:color w:val="000000"/>
-                      <w:sz w:val="18"/>
-                      <w:szCs w:val="18"/>
-                      <w:u w:val="single"/>
-                    </w:rPr>
-                    <w:t xml:space="preserve">war</w:t>
-                  </w:r>
-                  <w:r>
-                    <w:rPr>
-                      <w:rFonts w:ascii="Calibri" w:cs="Calibri" w:eastAsia="Calibri" w:hAnsi="Calibri"/>
-                      <w:color w:val="000000"/>
-                      <w:sz w:val="18"/>
-                      <w:szCs w:val="18"/>
-                    </w:rPr>
-                    <w:t xml:space="preserve"> ich sehr nervös.</w:t>
-                  </w:r>
-                  <w:r>
-                    <w:rPr>
-                      <w:rFonts w:ascii="Calibri" w:cs="Calibri" w:eastAsia="Calibri" w:hAnsi="Calibri"/>
-                      <w:color w:val="9AA3B5"/>
-                      <w:sz w:val="18"/>
-                      <w:szCs w:val="18"/>
-                    </w:rPr>
-                    <w:t xml:space="preserve">   ·   </w:t>
-                  </w:r>
-                  <w:r>
-                    <w:rPr>
-                      <w:rFonts w:ascii="Calibri" w:cs="Calibri" w:eastAsia="Calibri" w:hAnsi="Calibri"/>
-                      <w:color w:val="000000"/>
-                      <w:sz w:val="18"/>
-                      <w:szCs w:val="18"/>
-                    </w:rPr>
-                    <w:t xml:space="preserve">Dann </w:t>
-                  </w:r>
-                  <w:r>
-                    <w:rPr>
-                      <w:rFonts w:ascii="Calibri" w:cs="Calibri" w:eastAsia="Calibri" w:hAnsi="Calibri"/>
-                      <w:b/>
-                      <w:bCs/>
-                      <w:color w:val="000000"/>
-                      <w:sz w:val="18"/>
-                      <w:szCs w:val="18"/>
-                      <w:u w:val="single"/>
-                    </w:rPr>
-                    <w:t xml:space="preserve">warf</w:t>
-                  </w:r>
-                  <w:r>
-                    <w:rPr>
-                      <w:rFonts w:ascii="Calibri" w:cs="Calibri" w:eastAsia="Calibri" w:hAnsi="Calibri"/>
-                      <w:color w:val="000000"/>
-                      <w:sz w:val="18"/>
-                      <w:szCs w:val="18"/>
-                    </w:rPr>
-                    <w:t xml:space="preserve"> / </w:t>
-                  </w:r>
-                  <w:r>
-                    <w:rPr>
-                      <w:rFonts w:ascii="Calibri" w:cs="Calibri" w:eastAsia="Calibri" w:hAnsi="Calibri"/>
-                      <w:b/>
-                      <w:bCs/>
-                      <w:color w:val="000000"/>
-                      <w:sz w:val="18"/>
-                      <w:szCs w:val="18"/>
-                      <w:u w:val="single"/>
-                    </w:rPr>
-                    <w:t xml:space="preserve">traf</w:t>
-                  </w:r>
-                  <w:r>
-                    <w:rPr>
-                      <w:rFonts w:ascii="Calibri" w:cs="Calibri" w:eastAsia="Calibri" w:hAnsi="Calibri"/>
-                      <w:color w:val="000000"/>
-                      <w:sz w:val="18"/>
-                      <w:szCs w:val="18"/>
-                    </w:rPr>
-                    <w:t xml:space="preserve"> / </w:t>
-                  </w:r>
-                  <w:r>
-                    <w:rPr>
-                      <w:rFonts w:ascii="Calibri" w:cs="Calibri" w:eastAsia="Calibri" w:hAnsi="Calibri"/>
-                      <w:b/>
-                      <w:bCs/>
-                      <w:color w:val="000000"/>
-                      <w:sz w:val="18"/>
-                      <w:szCs w:val="18"/>
-                      <w:u w:val="single"/>
-                    </w:rPr>
-                    <w:t xml:space="preserve">stieß</w:t>
-                  </w:r>
-                  <w:r>
-                    <w:rPr>
-                      <w:rFonts w:ascii="Calibri" w:cs="Calibri" w:eastAsia="Calibri" w:hAnsi="Calibri"/>
-                      <w:color w:val="000000"/>
-                      <w:sz w:val="18"/>
-                      <w:szCs w:val="18"/>
-                    </w:rPr>
-                    <w:t xml:space="preserve"> ich …</w:t>
-                  </w:r>
-                  <w:r>
-                    <w:rPr>
-                      <w:rFonts w:ascii="Calibri" w:cs="Calibri" w:eastAsia="Calibri" w:hAnsi="Calibri"/>
-                      <w:color w:val="9AA3B5"/>
-                      <w:sz w:val="18"/>
-                      <w:szCs w:val="18"/>
-                    </w:rPr>
-                    <w:t xml:space="preserve">   ·   </w:t>
-                  </w:r>
-                  <w:r>
-                    <w:rPr>
-                      <w:rFonts w:ascii="Calibri" w:cs="Calibri" w:eastAsia="Calibri" w:hAnsi="Calibri"/>
-                      <w:color w:val="000000"/>
-                      <w:sz w:val="18"/>
-                      <w:szCs w:val="18"/>
-                    </w:rPr>
-                    <w:t xml:space="preserve">Am Ende </w:t>
-                  </w:r>
-                  <w:r>
-                    <w:rPr>
-                      <w:rFonts w:ascii="Calibri" w:cs="Calibri" w:eastAsia="Calibri" w:hAnsi="Calibri"/>
-                      <w:b/>
-                      <w:bCs/>
-                      <w:color w:val="000000"/>
-                      <w:sz w:val="18"/>
-                      <w:szCs w:val="18"/>
-                      <w:u w:val="single"/>
-                    </w:rPr>
-                    <w:t xml:space="preserve">gewann</w:t>
-                  </w:r>
-                  <w:r>
-                    <w:rPr>
-                      <w:rFonts w:ascii="Calibri" w:cs="Calibri" w:eastAsia="Calibri" w:hAnsi="Calibri"/>
-                      <w:color w:val="000000"/>
-                      <w:sz w:val="18"/>
-                      <w:szCs w:val="18"/>
-                    </w:rPr>
-                    <w:t xml:space="preserve"> / </w:t>
-                  </w:r>
-                  <w:r>
-                    <w:rPr>
-                      <w:rFonts w:ascii="Calibri" w:cs="Calibri" w:eastAsia="Calibri" w:hAnsi="Calibri"/>
-                      <w:b/>
-                      <w:bCs/>
-                      <w:color w:val="000000"/>
-                      <w:sz w:val="18"/>
-                      <w:szCs w:val="18"/>
-                      <w:u w:val="single"/>
-                    </w:rPr>
-                    <w:t xml:space="preserve">verlor</w:t>
-                  </w:r>
-                  <w:r>
-                    <w:rPr>
-                      <w:rFonts w:ascii="Calibri" w:cs="Calibri" w:eastAsia="Calibri" w:hAnsi="Calibri"/>
-                      <w:color w:val="000000"/>
-                      <w:sz w:val="18"/>
-                      <w:szCs w:val="18"/>
+                      <w:sz w:val="19"/>
+                      <w:szCs w:val="19"/>
                     </w:rPr>
                     <w:t xml:space="preserve"> ich …</w:t>
                   </w:r>
@@ -5149,7 +3850,7 @@
               </w:trPr>
               <w:tc>
                 <w:tcPr>
-                  <w:tcW w:type="dxa" w:w="2350"/>
+                  <w:tcW w:type="dxa" w:w="3800"/>
                   <w:tcBorders>
                     <w:top w:val="single" w:color="B9C6E8" w:sz="6"/>
                     <w:left w:val="single" w:color="B9C6E8" w:sz="6"/>
@@ -5158,16 +3859,16 @@
                   </w:tcBorders>
                   <w:shd w:fill="F4F7FD" w:color="auto" w:val="clear"/>
                   <w:tcMar>
-                    <w:top w:type="dxa" w:w="70"/>
-                    <w:left w:type="dxa" w:w="100"/>
-                    <w:bottom w:type="dxa" w:w="70"/>
-                    <w:right w:type="dxa" w:w="100"/>
-                  </w:tcMar>
-                  <w:vAlign w:val="top"/>
-                </w:tcPr>
-                <w:p>
-                  <w:pPr>
-                    <w:spacing w:after="10" w:before="0"/>
+                    <w:top w:type="dxa" w:w="50"/>
+                    <w:left w:type="dxa" w:w="100"/>
+                    <w:bottom w:type="dxa" w:w="50"/>
+                    <w:right w:type="dxa" w:w="100"/>
+                  </w:tcMar>
+                  <w:vAlign w:val="center"/>
+                </w:tcPr>
+                <w:p>
+                  <w:pPr>
+                    <w:spacing w:after="0" w:before="0"/>
                   </w:pPr>
                   <w:r>
                     <w:rPr>
@@ -5175,50 +3876,31 @@
                       <w:b/>
                       <w:bCs/>
                       <w:color w:val="1E2761"/>
-                      <w:sz w:val="20"/>
-                      <w:szCs w:val="20"/>
-                    </w:rPr>
-                    <w:t xml:space="preserve">Perfekt</w:t>
-                  </w:r>
-                </w:p>
-                <w:p>
-                  <w:pPr>
-                    <w:spacing w:after="10" w:before="0"/>
-                  </w:pPr>
-                  <w:r>
-                    <w:rPr>
-                      <w:rFonts w:ascii="Calibri" w:cs="Calibri" w:eastAsia="Calibri" w:hAnsi="Calibri"/>
+                      <w:sz w:val="19"/>
+                      <w:szCs w:val="19"/>
+                    </w:rPr>
+                    <w:t xml:space="preserve">Perfekt  </w:t>
+                  </w:r>
+                  <w:r>
+                    <w:rPr>
+                      <w:rFonts w:ascii="Calibri" w:cs="Calibri" w:eastAsia="Calibri" w:hAnsi="Calibri"/>
+                      <w:b/>
+                      <w:bCs/>
+                      <w:color w:val="D9534F"/>
+                      <w:sz w:val="16"/>
+                      <w:szCs w:val="16"/>
+                    </w:rPr>
+                    <w:t xml:space="preserve">habe/bin</w:t>
+                  </w:r>
+                  <w:r>
+                    <w:rPr>
+                      <w:rFonts w:ascii="Calibri" w:cs="Calibri" w:eastAsia="Calibri" w:hAnsi="Calibri"/>
+                      <w:b/>
+                      <w:bCs/>
                       <w:color w:val="5B6B8C"/>
                       <w:sz w:val="16"/>
                       <w:szCs w:val="16"/>
                     </w:rPr>
-                    <w:t xml:space="preserve">Vergangenheit – gesprochen (wörtliche Rede)</w:t>
-                  </w:r>
-                </w:p>
-                <w:p>
-                  <w:pPr>
-                    <w:spacing w:after="0" w:before="0"/>
-                  </w:pPr>
-                  <w:r>
-                    <w:rPr>
-                      <w:rFonts w:ascii="Calibri" w:cs="Calibri" w:eastAsia="Calibri" w:hAnsi="Calibri"/>
-                      <w:b/>
-                      <w:bCs/>
-                      <w:color w:val="D9534F"/>
-                      <w:sz w:val="16"/>
-                      <w:szCs w:val="16"/>
-                    </w:rPr>
-                    <w:t xml:space="preserve">habe/bin</w:t>
-                  </w:r>
-                  <w:r>
-                    <w:rPr>
-                      <w:rFonts w:ascii="Calibri" w:cs="Calibri" w:eastAsia="Calibri" w:hAnsi="Calibri"/>
-                      <w:b/>
-                      <w:bCs/>
-                      <w:color w:val="333333"/>
-                      <w:sz w:val="16"/>
-                      <w:szCs w:val="16"/>
-                    </w:rPr>
                     <w:t xml:space="preserve"> + </w:t>
                   </w:r>
                   <w:r>
@@ -5236,7 +3918,7 @@
               </w:tc>
               <w:tc>
                 <w:tcPr>
-                  <w:tcW w:type="dxa" w:w="8056"/>
+                  <w:tcW w:type="dxa" w:w="6606"/>
                   <w:tcBorders>
                     <w:top w:val="single" w:color="B9C6E8" w:sz="6"/>
                     <w:left w:val="single" w:color="B9C6E8" w:sz="6"/>
@@ -5244,23 +3926,23 @@
                     <w:right w:val="single" w:color="B9C6E8" w:sz="6"/>
                   </w:tcBorders>
                   <w:tcMar>
-                    <w:top w:type="dxa" w:w="70"/>
-                    <w:left w:type="dxa" w:w="100"/>
-                    <w:bottom w:type="dxa" w:w="70"/>
-                    <w:right w:type="dxa" w:w="100"/>
-                  </w:tcMar>
-                  <w:vAlign w:val="top"/>
-                </w:tcPr>
-                <w:p>
-                  <w:pPr>
-                    <w:spacing w:after="20" w:before="0"/>
-                  </w:pPr>
-                  <w:r>
-                    <w:rPr>
-                      <w:rFonts w:ascii="Calibri" w:cs="Calibri" w:eastAsia="Calibri" w:hAnsi="Calibri"/>
-                      <w:color w:val="000000"/>
-                      <w:sz w:val="18"/>
-                      <w:szCs w:val="18"/>
+                    <w:top w:type="dxa" w:w="50"/>
+                    <w:left w:type="dxa" w:w="100"/>
+                    <w:bottom w:type="dxa" w:w="50"/>
+                    <w:right w:type="dxa" w:w="100"/>
+                  </w:tcMar>
+                  <w:vAlign w:val="center"/>
+                </w:tcPr>
+                <w:p>
+                  <w:pPr>
+                    <w:spacing w:after="0" w:before="0"/>
+                  </w:pPr>
+                  <w:r>
+                    <w:rPr>
+                      <w:rFonts w:ascii="Calibri" w:cs="Calibri" w:eastAsia="Calibri" w:hAnsi="Calibri"/>
+                      <w:color w:val="000000"/>
+                      <w:sz w:val="19"/>
+                      <w:szCs w:val="19"/>
                     </w:rPr>
                     <w:t xml:space="preserve">Mein Trainer sagte: „Du </w:t>
                   </w:r>
@@ -5270,8 +3952,8 @@
                       <w:b/>
                       <w:bCs/>
                       <w:color w:val="D9534F"/>
-                      <w:sz w:val="18"/>
-                      <w:szCs w:val="18"/>
+                      <w:sz w:val="19"/>
+                      <w:szCs w:val="19"/>
                     </w:rPr>
                     <w:t xml:space="preserve">hast</w:t>
                   </w:r>
@@ -5279,8 +3961,8 @@
                     <w:rPr>
                       <w:rFonts w:ascii="Calibri" w:cs="Calibri" w:eastAsia="Calibri" w:hAnsi="Calibri"/>
                       <w:color w:val="000000"/>
-                      <w:sz w:val="18"/>
-                      <w:szCs w:val="18"/>
+                      <w:sz w:val="19"/>
+                      <w:szCs w:val="19"/>
                     </w:rPr>
                     <w:t xml:space="preserve"> stark </w:t>
                   </w:r>
@@ -5290,8 +3972,8 @@
                       <w:b/>
                       <w:bCs/>
                       <w:color w:val="C98A1E"/>
-                      <w:sz w:val="18"/>
-                      <w:szCs w:val="18"/>
+                      <w:sz w:val="19"/>
+                      <w:szCs w:val="19"/>
                     </w:rPr>
                     <w:t xml:space="preserve">gekämpft</w:t>
                   </w:r>
@@ -5299,180 +3981,10 @@
                     <w:rPr>
                       <w:rFonts w:ascii="Calibri" w:cs="Calibri" w:eastAsia="Calibri" w:hAnsi="Calibri"/>
                       <w:color w:val="000000"/>
-                      <w:sz w:val="18"/>
-                      <w:szCs w:val="18"/>
+                      <w:sz w:val="19"/>
+                      <w:szCs w:val="19"/>
                     </w:rPr>
                     <w:t xml:space="preserve">!“</w:t>
-                  </w:r>
-                  <w:r>
-                    <w:rPr>
-                      <w:rFonts w:ascii="Calibri" w:cs="Calibri" w:eastAsia="Calibri" w:hAnsi="Calibri"/>
-                      <w:color w:val="9AA3B5"/>
-                      <w:sz w:val="18"/>
-                      <w:szCs w:val="18"/>
-                    </w:rPr>
-                    <w:t xml:space="preserve">   ·   </w:t>
-                  </w:r>
-                  <w:r>
-                    <w:rPr>
-                      <w:rFonts w:ascii="Calibri" w:cs="Calibri" w:eastAsia="Calibri" w:hAnsi="Calibri"/>
-                      <w:color w:val="000000"/>
-                      <w:sz w:val="18"/>
-                      <w:szCs w:val="18"/>
-                    </w:rPr>
-                    <w:t xml:space="preserve">Mein Team rief: „Wir </w:t>
-                  </w:r>
-                  <w:r>
-                    <w:rPr>
-                      <w:rFonts w:ascii="Calibri" w:cs="Calibri" w:eastAsia="Calibri" w:hAnsi="Calibri"/>
-                      <w:b/>
-                      <w:bCs/>
-                      <w:color w:val="D9534F"/>
-                      <w:sz w:val="18"/>
-                      <w:szCs w:val="18"/>
-                    </w:rPr>
-                    <w:t xml:space="preserve">haben</w:t>
-                  </w:r>
-                  <w:r>
-                    <w:rPr>
-                      <w:rFonts w:ascii="Calibri" w:cs="Calibri" w:eastAsia="Calibri" w:hAnsi="Calibri"/>
-                      <w:color w:val="000000"/>
-                      <w:sz w:val="18"/>
-                      <w:szCs w:val="18"/>
-                    </w:rPr>
-                    <w:t xml:space="preserve"> </w:t>
-                  </w:r>
-                  <w:r>
-                    <w:rPr>
-                      <w:rFonts w:ascii="Calibri" w:cs="Calibri" w:eastAsia="Calibri" w:hAnsi="Calibri"/>
-                      <w:b/>
-                      <w:bCs/>
-                      <w:color w:val="C98A1E"/>
-                      <w:sz w:val="18"/>
-                      <w:szCs w:val="18"/>
-                    </w:rPr>
-                    <w:t xml:space="preserve">gewonnen</w:t>
-                  </w:r>
-                  <w:r>
-                    <w:rPr>
-                      <w:rFonts w:ascii="Calibri" w:cs="Calibri" w:eastAsia="Calibri" w:hAnsi="Calibri"/>
-                      <w:color w:val="000000"/>
-                      <w:sz w:val="18"/>
-                      <w:szCs w:val="18"/>
-                    </w:rPr>
-                    <w:t xml:space="preserve">!“</w:t>
-                  </w:r>
-                </w:p>
-                <w:p>
-                  <w:pPr>
-                    <w:spacing w:after="20" w:before="0"/>
-                  </w:pPr>
-                  <w:r>
-                    <w:rPr>
-                      <w:rFonts w:ascii="Calibri" w:cs="Calibri" w:eastAsia="Calibri" w:hAnsi="Calibri"/>
-                      <w:color w:val="000000"/>
-                      <w:sz w:val="18"/>
-                      <w:szCs w:val="18"/>
-                    </w:rPr>
-                    <w:t xml:space="preserve">Ich rief meinen Eltern zu: „Ich </w:t>
-                  </w:r>
-                  <w:r>
-                    <w:rPr>
-                      <w:rFonts w:ascii="Calibri" w:cs="Calibri" w:eastAsia="Calibri" w:hAnsi="Calibri"/>
-                      <w:b/>
-                      <w:bCs/>
-                      <w:color w:val="D9534F"/>
-                      <w:sz w:val="18"/>
-                      <w:szCs w:val="18"/>
-                    </w:rPr>
-                    <w:t xml:space="preserve">bin</w:t>
-                  </w:r>
-                  <w:r>
-                    <w:rPr>
-                      <w:rFonts w:ascii="Calibri" w:cs="Calibri" w:eastAsia="Calibri" w:hAnsi="Calibri"/>
-                      <w:color w:val="000000"/>
-                      <w:sz w:val="18"/>
-                      <w:szCs w:val="18"/>
-                    </w:rPr>
-                    <w:t xml:space="preserve"> Zweite(r) </w:t>
-                  </w:r>
-                  <w:r>
-                    <w:rPr>
-                      <w:rFonts w:ascii="Calibri" w:cs="Calibri" w:eastAsia="Calibri" w:hAnsi="Calibri"/>
-                      <w:b/>
-                      <w:bCs/>
-                      <w:color w:val="C98A1E"/>
-                      <w:sz w:val="18"/>
-                      <w:szCs w:val="18"/>
-                    </w:rPr>
-                    <w:t xml:space="preserve">geworden</w:t>
-                  </w:r>
-                  <w:r>
-                    <w:rPr>
-                      <w:rFonts w:ascii="Calibri" w:cs="Calibri" w:eastAsia="Calibri" w:hAnsi="Calibri"/>
-                      <w:color w:val="000000"/>
-                      <w:sz w:val="18"/>
-                      <w:szCs w:val="18"/>
-                    </w:rPr>
-                    <w:t xml:space="preserve">!“</w:t>
-                  </w:r>
-                  <w:r>
-                    <w:rPr>
-                      <w:rFonts w:ascii="Calibri" w:cs="Calibri" w:eastAsia="Calibri" w:hAnsi="Calibri"/>
-                      <w:color w:val="9AA3B5"/>
-                      <w:sz w:val="18"/>
-                      <w:szCs w:val="18"/>
-                    </w:rPr>
-                    <w:t xml:space="preserve">   ·   </w:t>
-                  </w:r>
-                  <w:r>
-                    <w:rPr>
-                      <w:rFonts w:ascii="Calibri" w:cs="Calibri" w:eastAsia="Calibri" w:hAnsi="Calibri"/>
-                      <w:color w:val="000000"/>
-                      <w:sz w:val="18"/>
-                      <w:szCs w:val="18"/>
-                    </w:rPr>
-                    <w:t xml:space="preserve">Der Kampfrichter sagte: „Das </w:t>
-                  </w:r>
-                  <w:r>
-                    <w:rPr>
-                      <w:rFonts w:ascii="Calibri" w:cs="Calibri" w:eastAsia="Calibri" w:hAnsi="Calibri"/>
-                      <w:b/>
-                      <w:bCs/>
-                      <w:color w:val="D9534F"/>
-                      <w:sz w:val="18"/>
-                      <w:szCs w:val="18"/>
-                    </w:rPr>
-                    <w:t xml:space="preserve">hast</w:t>
-                  </w:r>
-                  <w:r>
-                    <w:rPr>
-                      <w:rFonts w:ascii="Calibri" w:cs="Calibri" w:eastAsia="Calibri" w:hAnsi="Calibri"/>
-                      <w:color w:val="000000"/>
-                      <w:sz w:val="18"/>
-                      <w:szCs w:val="18"/>
-                    </w:rPr>
-                    <w:t xml:space="preserve"> du gut </w:t>
-                  </w:r>
-                  <w:r>
-                    <w:rPr>
-                      <w:rFonts w:ascii="Calibri" w:cs="Calibri" w:eastAsia="Calibri" w:hAnsi="Calibri"/>
-                      <w:b/>
-                      <w:bCs/>
-                      <w:color w:val="C98A1E"/>
-                      <w:sz w:val="18"/>
-                      <w:szCs w:val="18"/>
-                    </w:rPr>
-                    <w:t xml:space="preserve">gemacht</w:t>
-                  </w:r>
-                  <w:r>
-                    <w:rPr>
-                      <w:rFonts w:ascii="Calibri" w:cs="Calibri" w:eastAsia="Calibri" w:hAnsi="Calibri"/>
-                      <w:color w:val="000000"/>
-                      <w:sz w:val="18"/>
-                      <w:szCs w:val="18"/>
-                    </w:rPr>
-                    <w:t xml:space="preserve">.“</w:t>
                   </w:r>
                 </w:p>
               </w:tc>
@@ -5483,7 +3995,7 @@
               </w:trPr>
               <w:tc>
                 <w:tcPr>
-                  <w:tcW w:type="dxa" w:w="2350"/>
+                  <w:tcW w:type="dxa" w:w="3800"/>
                   <w:tcBorders>
                     <w:top w:val="single" w:color="B9C6E8" w:sz="6"/>
                     <w:left w:val="single" w:color="B9C6E8" w:sz="6"/>
@@ -5492,16 +4004,16 @@
                   </w:tcBorders>
                   <w:shd w:fill="F4F7FD" w:color="auto" w:val="clear"/>
                   <w:tcMar>
-                    <w:top w:type="dxa" w:w="70"/>
-                    <w:left w:type="dxa" w:w="100"/>
-                    <w:bottom w:type="dxa" w:w="70"/>
-                    <w:right w:type="dxa" w:w="100"/>
-                  </w:tcMar>
-                  <w:vAlign w:val="top"/>
-                </w:tcPr>
-                <w:p>
-                  <w:pPr>
-                    <w:spacing w:after="10" w:before="0"/>
+                    <w:top w:type="dxa" w:w="50"/>
+                    <w:left w:type="dxa" w:w="100"/>
+                    <w:bottom w:type="dxa" w:w="50"/>
+                    <w:right w:type="dxa" w:w="100"/>
+                  </w:tcMar>
+                  <w:vAlign w:val="center"/>
+                </w:tcPr>
+                <w:p>
+                  <w:pPr>
+                    <w:spacing w:after="0" w:before="0"/>
                   </w:pPr>
                   <w:r>
                     <w:rPr>
@@ -5509,19 +4021,16 @@
                       <w:b/>
                       <w:bCs/>
                       <w:color w:val="1E2761"/>
-                      <w:sz w:val="20"/>
-                      <w:szCs w:val="20"/>
-                    </w:rPr>
-                    <w:t xml:space="preserve">Präsens</w:t>
-                  </w:r>
-                </w:p>
-                <w:p>
-                  <w:pPr>
-                    <w:spacing w:after="10" w:before="0"/>
-                  </w:pPr>
-                  <w:r>
-                    <w:rPr>
-                      <w:rFonts w:ascii="Calibri" w:cs="Calibri" w:eastAsia="Calibri" w:hAnsi="Calibri"/>
+                      <w:sz w:val="19"/>
+                      <w:szCs w:val="19"/>
+                    </w:rPr>
+                    <w:t xml:space="preserve">Präsens  </w:t>
+                  </w:r>
+                  <w:r>
+                    <w:rPr>
+                      <w:rFonts w:ascii="Calibri" w:cs="Calibri" w:eastAsia="Calibri" w:hAnsi="Calibri"/>
+                      <w:b/>
+                      <w:bCs/>
                       <w:color w:val="5B6B8C"/>
                       <w:sz w:val="16"/>
                       <w:szCs w:val="16"/>
@@ -5529,26 +4038,10 @@
                     <w:t xml:space="preserve">jetzt</w:t>
                   </w:r>
                 </w:p>
-                <w:p>
-                  <w:pPr>
-                    <w:spacing w:after="0" w:before="0"/>
-                  </w:pPr>
-                  <w:r>
-                    <w:rPr>
-                      <w:rFonts w:ascii="Calibri" w:cs="Calibri" w:eastAsia="Calibri" w:hAnsi="Calibri"/>
-                      <w:b/>
-                      <w:bCs/>
-                      <w:color w:val="333333"/>
-                      <w:sz w:val="16"/>
-                      <w:szCs w:val="16"/>
-                    </w:rPr>
-                    <w:t xml:space="preserve">finites Verb im Präsens</w:t>
-                  </w:r>
-                </w:p>
-              </w:tc>
-              <w:tc>
-                <w:tcPr>
-                  <w:tcW w:type="dxa" w:w="8056"/>
+              </w:tc>
+              <w:tc>
+                <w:tcPr>
+                  <w:tcW w:type="dxa" w:w="6606"/>
                   <w:tcBorders>
                     <w:top w:val="single" w:color="B9C6E8" w:sz="6"/>
                     <w:left w:val="single" w:color="B9C6E8" w:sz="6"/>
@@ -5556,23 +4049,23 @@
                     <w:right w:val="single" w:color="B9C6E8" w:sz="6"/>
                   </w:tcBorders>
                   <w:tcMar>
-                    <w:top w:type="dxa" w:w="70"/>
-                    <w:left w:type="dxa" w:w="100"/>
-                    <w:bottom w:type="dxa" w:w="70"/>
-                    <w:right w:type="dxa" w:w="100"/>
-                  </w:tcMar>
-                  <w:vAlign w:val="top"/>
-                </w:tcPr>
-                <w:p>
-                  <w:pPr>
-                    <w:spacing w:after="20" w:before="0"/>
-                  </w:pPr>
-                  <w:r>
-                    <w:rPr>
-                      <w:rFonts w:ascii="Calibri" w:cs="Calibri" w:eastAsia="Calibri" w:hAnsi="Calibri"/>
-                      <w:color w:val="000000"/>
-                      <w:sz w:val="18"/>
-                      <w:szCs w:val="18"/>
+                    <w:top w:type="dxa" w:w="50"/>
+                    <w:left w:type="dxa" w:w="100"/>
+                    <w:bottom w:type="dxa" w:w="50"/>
+                    <w:right w:type="dxa" w:w="100"/>
+                  </w:tcMar>
+                  <w:vAlign w:val="center"/>
+                </w:tcPr>
+                <w:p>
+                  <w:pPr>
+                    <w:spacing w:after="0" w:before="0"/>
+                  </w:pPr>
+                  <w:r>
+                    <w:rPr>
+                      <w:rFonts w:ascii="Calibri" w:cs="Calibri" w:eastAsia="Calibri" w:hAnsi="Calibri"/>
+                      <w:color w:val="000000"/>
+                      <w:sz w:val="19"/>
+                      <w:szCs w:val="19"/>
                     </w:rPr>
                     <w:t xml:space="preserve">Heute </w:t>
                   </w:r>
@@ -5582,8 +4075,8 @@
                       <w:b/>
                       <w:bCs/>
                       <w:color w:val="000000"/>
-                      <w:sz w:val="18"/>
-                      <w:szCs w:val="18"/>
+                      <w:sz w:val="19"/>
+                      <w:szCs w:val="19"/>
                       <w:u w:val="single"/>
                     </w:rPr>
                     <w:t xml:space="preserve">bin</w:t>
@@ -5592,88 +4085,10 @@
                     <w:rPr>
                       <w:rFonts w:ascii="Calibri" w:cs="Calibri" w:eastAsia="Calibri" w:hAnsi="Calibri"/>
                       <w:color w:val="000000"/>
-                      <w:sz w:val="18"/>
-                      <w:szCs w:val="18"/>
+                      <w:sz w:val="19"/>
+                      <w:szCs w:val="19"/>
                     </w:rPr>
                     <w:t xml:space="preserve"> ich noch müde.</w:t>
-                  </w:r>
-                  <w:r>
-                    <w:rPr>
-                      <w:rFonts w:ascii="Calibri" w:cs="Calibri" w:eastAsia="Calibri" w:hAnsi="Calibri"/>
-                      <w:color w:val="9AA3B5"/>
-                      <w:sz w:val="18"/>
-                      <w:szCs w:val="18"/>
-                    </w:rPr>
-                    <w:t xml:space="preserve">   ·   </w:t>
-                  </w:r>
-                  <w:r>
-                    <w:rPr>
-                      <w:rFonts w:ascii="Calibri" w:cs="Calibri" w:eastAsia="Calibri" w:hAnsi="Calibri"/>
-                      <w:color w:val="000000"/>
-                      <w:sz w:val="18"/>
-                      <w:szCs w:val="18"/>
-                    </w:rPr>
-                    <w:t xml:space="preserve">Heute </w:t>
-                  </w:r>
-                  <w:r>
-                    <w:rPr>
-                      <w:rFonts w:ascii="Calibri" w:cs="Calibri" w:eastAsia="Calibri" w:hAnsi="Calibri"/>
-                      <w:b/>
-                      <w:bCs/>
-                      <w:color w:val="000000"/>
-                      <w:sz w:val="18"/>
-                      <w:szCs w:val="18"/>
-                      <w:u w:val="single"/>
-                    </w:rPr>
-                    <w:t xml:space="preserve">tut</w:t>
-                  </w:r>
-                  <w:r>
-                    <w:rPr>
-                      <w:rFonts w:ascii="Calibri" w:cs="Calibri" w:eastAsia="Calibri" w:hAnsi="Calibri"/>
-                      <w:color w:val="000000"/>
-                      <w:sz w:val="18"/>
-                      <w:szCs w:val="18"/>
-                    </w:rPr>
-                    <w:t xml:space="preserve"> mir … weh.</w:t>
-                  </w:r>
-                  <w:r>
-                    <w:rPr>
-                      <w:rFonts w:ascii="Calibri" w:cs="Calibri" w:eastAsia="Calibri" w:hAnsi="Calibri"/>
-                      <w:color w:val="9AA3B5"/>
-                      <w:sz w:val="18"/>
-                      <w:szCs w:val="18"/>
-                    </w:rPr>
-                    <w:t xml:space="preserve">   ·   </w:t>
-                  </w:r>
-                  <w:r>
-                    <w:rPr>
-                      <w:rFonts w:ascii="Calibri" w:cs="Calibri" w:eastAsia="Calibri" w:hAnsi="Calibri"/>
-                      <w:color w:val="000000"/>
-                      <w:sz w:val="18"/>
-                      <w:szCs w:val="18"/>
-                    </w:rPr>
-                    <w:t xml:space="preserve">Heute </w:t>
-                  </w:r>
-                  <w:r>
-                    <w:rPr>
-                      <w:rFonts w:ascii="Calibri" w:cs="Calibri" w:eastAsia="Calibri" w:hAnsi="Calibri"/>
-                      <w:b/>
-                      <w:bCs/>
-                      <w:color w:val="000000"/>
-                      <w:sz w:val="18"/>
-                      <w:szCs w:val="18"/>
-                      <w:u w:val="single"/>
-                    </w:rPr>
-                    <w:t xml:space="preserve">analysiere</w:t>
-                  </w:r>
-                  <w:r>
-                    <w:rPr>
-                      <w:rFonts w:ascii="Calibri" w:cs="Calibri" w:eastAsia="Calibri" w:hAnsi="Calibri"/>
-                      <w:color w:val="000000"/>
-                      <w:sz w:val="18"/>
-                      <w:szCs w:val="18"/>
-                    </w:rPr>
-                    <w:t xml:space="preserve"> ich mit meinem Trainer das Video.</w:t>
                   </w:r>
                 </w:p>
               </w:tc>
@@ -5684,7 +4099,7 @@
               </w:trPr>
               <w:tc>
                 <w:tcPr>
-                  <w:tcW w:type="dxa" w:w="2350"/>
+                  <w:tcW w:type="dxa" w:w="3800"/>
                   <w:tcBorders>
                     <w:top w:val="single" w:color="B9C6E8" w:sz="6"/>
                     <w:left w:val="single" w:color="B9C6E8" w:sz="6"/>
@@ -5693,16 +4108,16 @@
                   </w:tcBorders>
                   <w:shd w:fill="F4F7FD" w:color="auto" w:val="clear"/>
                   <w:tcMar>
-                    <w:top w:type="dxa" w:w="70"/>
-                    <w:left w:type="dxa" w:w="100"/>
-                    <w:bottom w:type="dxa" w:w="70"/>
-                    <w:right w:type="dxa" w:w="100"/>
-                  </w:tcMar>
-                  <w:vAlign w:val="top"/>
-                </w:tcPr>
-                <w:p>
-                  <w:pPr>
-                    <w:spacing w:after="10" w:before="0"/>
+                    <w:top w:type="dxa" w:w="50"/>
+                    <w:left w:type="dxa" w:w="100"/>
+                    <w:bottom w:type="dxa" w:w="50"/>
+                    <w:right w:type="dxa" w:w="100"/>
+                  </w:tcMar>
+                  <w:vAlign w:val="center"/>
+                </w:tcPr>
+                <w:p>
+                  <w:pPr>
+                    <w:spacing w:after="0" w:before="0"/>
                   </w:pPr>
                   <w:r>
                     <w:rPr>
@@ -5710,50 +4125,31 @@
                       <w:b/>
                       <w:bCs/>
                       <w:color w:val="1E2761"/>
-                      <w:sz w:val="20"/>
-                      <w:szCs w:val="20"/>
-                    </w:rPr>
-                    <w:t xml:space="preserve">Futur I</w:t>
-                  </w:r>
-                </w:p>
-                <w:p>
-                  <w:pPr>
-                    <w:spacing w:after="10" w:before="0"/>
-                  </w:pPr>
-                  <w:r>
-                    <w:rPr>
-                      <w:rFonts w:ascii="Calibri" w:cs="Calibri" w:eastAsia="Calibri" w:hAnsi="Calibri"/>
+                      <w:sz w:val="19"/>
+                      <w:szCs w:val="19"/>
+                    </w:rPr>
+                    <w:t xml:space="preserve">Futur I  </w:t>
+                  </w:r>
+                  <w:r>
+                    <w:rPr>
+                      <w:rFonts w:ascii="Calibri" w:cs="Calibri" w:eastAsia="Calibri" w:hAnsi="Calibri"/>
+                      <w:b/>
+                      <w:bCs/>
+                      <w:color w:val="D9534F"/>
+                      <w:sz w:val="16"/>
+                      <w:szCs w:val="16"/>
+                    </w:rPr>
+                    <w:t xml:space="preserve">werde</w:t>
+                  </w:r>
+                  <w:r>
+                    <w:rPr>
+                      <w:rFonts w:ascii="Calibri" w:cs="Calibri" w:eastAsia="Calibri" w:hAnsi="Calibri"/>
+                      <w:b/>
+                      <w:bCs/>
                       <w:color w:val="5B6B8C"/>
                       <w:sz w:val="16"/>
                       <w:szCs w:val="16"/>
                     </w:rPr>
-                    <w:t xml:space="preserve">Zukunft</w:t>
-                  </w:r>
-                </w:p>
-                <w:p>
-                  <w:pPr>
-                    <w:spacing w:after="0" w:before="0"/>
-                  </w:pPr>
-                  <w:r>
-                    <w:rPr>
-                      <w:rFonts w:ascii="Calibri" w:cs="Calibri" w:eastAsia="Calibri" w:hAnsi="Calibri"/>
-                      <w:b/>
-                      <w:bCs/>
-                      <w:color w:val="D9534F"/>
-                      <w:sz w:val="16"/>
-                      <w:szCs w:val="16"/>
-                    </w:rPr>
-                    <w:t xml:space="preserve">werde</w:t>
-                  </w:r>
-                  <w:r>
-                    <w:rPr>
-                      <w:rFonts w:ascii="Calibri" w:cs="Calibri" w:eastAsia="Calibri" w:hAnsi="Calibri"/>
-                      <w:b/>
-                      <w:bCs/>
-                      <w:color w:val="333333"/>
-                      <w:sz w:val="16"/>
-                      <w:szCs w:val="16"/>
-                    </w:rPr>
                     <w:t xml:space="preserve"> + </w:t>
                   </w:r>
                   <w:r>
@@ -5771,7 +4167,7 @@
               </w:tc>
               <w:tc>
                 <w:tcPr>
-                  <w:tcW w:type="dxa" w:w="8056"/>
+                  <w:tcW w:type="dxa" w:w="6606"/>
                   <w:tcBorders>
                     <w:top w:val="single" w:color="B9C6E8" w:sz="6"/>
                     <w:left w:val="single" w:color="B9C6E8" w:sz="6"/>
@@ -5779,23 +4175,23 @@
                     <w:right w:val="single" w:color="B9C6E8" w:sz="6"/>
                   </w:tcBorders>
                   <w:tcMar>
-                    <w:top w:type="dxa" w:w="70"/>
-                    <w:left w:type="dxa" w:w="100"/>
-                    <w:bottom w:type="dxa" w:w="70"/>
-                    <w:right w:type="dxa" w:w="100"/>
-                  </w:tcMar>
-                  <w:vAlign w:val="top"/>
-                </w:tcPr>
-                <w:p>
-                  <w:pPr>
-                    <w:spacing w:after="20" w:before="0"/>
-                  </w:pPr>
-                  <w:r>
-                    <w:rPr>
-                      <w:rFonts w:ascii="Calibri" w:cs="Calibri" w:eastAsia="Calibri" w:hAnsi="Calibri"/>
-                      <w:color w:val="000000"/>
-                      <w:sz w:val="18"/>
-                      <w:szCs w:val="18"/>
+                    <w:top w:type="dxa" w:w="50"/>
+                    <w:left w:type="dxa" w:w="100"/>
+                    <w:bottom w:type="dxa" w:w="50"/>
+                    <w:right w:type="dxa" w:w="100"/>
+                  </w:tcMar>
+                  <w:vAlign w:val="center"/>
+                </w:tcPr>
+                <w:p>
+                  <w:pPr>
+                    <w:spacing w:after="0" w:before="0"/>
+                  </w:pPr>
+                  <w:r>
+                    <w:rPr>
+                      <w:rFonts w:ascii="Calibri" w:cs="Calibri" w:eastAsia="Calibri" w:hAnsi="Calibri"/>
+                      <w:color w:val="000000"/>
+                      <w:sz w:val="19"/>
+                      <w:szCs w:val="19"/>
                     </w:rPr>
                     <w:t xml:space="preserve">Beim nächsten Wettkampf </w:t>
                   </w:r>
@@ -5805,8 +4201,8 @@
                       <w:b/>
                       <w:bCs/>
                       <w:color w:val="D9534F"/>
-                      <w:sz w:val="18"/>
-                      <w:szCs w:val="18"/>
+                      <w:sz w:val="19"/>
+                      <w:szCs w:val="19"/>
                     </w:rPr>
                     <w:t xml:space="preserve">werde</w:t>
                   </w:r>
@@ -5814,8 +4210,8 @@
                     <w:rPr>
                       <w:rFonts w:ascii="Calibri" w:cs="Calibri" w:eastAsia="Calibri" w:hAnsi="Calibri"/>
                       <w:color w:val="000000"/>
-                      <w:sz w:val="18"/>
-                      <w:szCs w:val="18"/>
+                      <w:sz w:val="19"/>
+                      <w:szCs w:val="19"/>
                     </w:rPr>
                     <w:t xml:space="preserve"> ich früher </w:t>
                   </w:r>
@@ -5825,8 +4221,8 @@
                       <w:b/>
                       <w:bCs/>
                       <w:color w:val="3F7CC4"/>
-                      <w:sz w:val="18"/>
-                      <w:szCs w:val="18"/>
+                      <w:sz w:val="19"/>
+                      <w:szCs w:val="19"/>
                     </w:rPr>
                     <w:t xml:space="preserve">angreifen</w:t>
                   </w:r>
@@ -5834,200 +4230,292 @@
                     <w:rPr>
                       <w:rFonts w:ascii="Calibri" w:cs="Calibri" w:eastAsia="Calibri" w:hAnsi="Calibri"/>
                       <w:color w:val="000000"/>
-                      <w:sz w:val="18"/>
-                      <w:szCs w:val="18"/>
-                    </w:rPr>
-                    <w:t xml:space="preserve"> / besser </w:t>
-                  </w:r>
-                  <w:r>
-                    <w:rPr>
-                      <w:rFonts w:ascii="Calibri" w:cs="Calibri" w:eastAsia="Calibri" w:hAnsi="Calibri"/>
-                      <w:b/>
-                      <w:bCs/>
-                      <w:color w:val="3F7CC4"/>
-                      <w:sz w:val="18"/>
-                      <w:szCs w:val="18"/>
-                    </w:rPr>
-                    <w:t xml:space="preserve">verteidigen</w:t>
-                  </w:r>
-                  <w:r>
-                    <w:rPr>
-                      <w:rFonts w:ascii="Calibri" w:cs="Calibri" w:eastAsia="Calibri" w:hAnsi="Calibri"/>
-                      <w:color w:val="000000"/>
-                      <w:sz w:val="18"/>
-                      <w:szCs w:val="18"/>
+                      <w:sz w:val="19"/>
+                      <w:szCs w:val="19"/>
                     </w:rPr>
                     <w:t xml:space="preserve">.</w:t>
                   </w:r>
-                  <w:r>
-                    <w:rPr>
-                      <w:rFonts w:ascii="Calibri" w:cs="Calibri" w:eastAsia="Calibri" w:hAnsi="Calibri"/>
-                      <w:color w:val="9AA3B5"/>
-                      <w:sz w:val="18"/>
-                      <w:szCs w:val="18"/>
-                    </w:rPr>
-                    <w:t xml:space="preserve">   ·   </w:t>
-                  </w:r>
-                  <w:r>
-                    <w:rPr>
-                      <w:rFonts w:ascii="Calibri" w:cs="Calibri" w:eastAsia="Calibri" w:hAnsi="Calibri"/>
-                      <w:color w:val="000000"/>
-                      <w:sz w:val="18"/>
-                      <w:szCs w:val="18"/>
-                    </w:rPr>
-                    <w:t xml:space="preserve">Ich </w:t>
-                  </w:r>
-                  <w:r>
-                    <w:rPr>
-                      <w:rFonts w:ascii="Calibri" w:cs="Calibri" w:eastAsia="Calibri" w:hAnsi="Calibri"/>
-                      <w:b/>
-                      <w:bCs/>
-                      <w:color w:val="D9534F"/>
-                      <w:sz w:val="18"/>
-                      <w:szCs w:val="18"/>
-                    </w:rPr>
-                    <w:t xml:space="preserve">werde</w:t>
-                  </w:r>
-                  <w:r>
-                    <w:rPr>
-                      <w:rFonts w:ascii="Calibri" w:cs="Calibri" w:eastAsia="Calibri" w:hAnsi="Calibri"/>
-                      <w:color w:val="000000"/>
-                      <w:sz w:val="18"/>
-                      <w:szCs w:val="18"/>
-                    </w:rPr>
-                    <w:t xml:space="preserve"> noch mehr </w:t>
-                  </w:r>
-                  <w:r>
-                    <w:rPr>
-                      <w:rFonts w:ascii="Calibri" w:cs="Calibri" w:eastAsia="Calibri" w:hAnsi="Calibri"/>
-                      <w:b/>
-                      <w:bCs/>
-                      <w:color w:val="3F7CC4"/>
-                      <w:sz w:val="18"/>
-                      <w:szCs w:val="18"/>
-                    </w:rPr>
-                    <w:t xml:space="preserve">trainieren</w:t>
-                  </w:r>
-                  <w:r>
-                    <w:rPr>
-                      <w:rFonts w:ascii="Calibri" w:cs="Calibri" w:eastAsia="Calibri" w:hAnsi="Calibri"/>
-                      <w:color w:val="000000"/>
-                      <w:sz w:val="18"/>
-                      <w:szCs w:val="18"/>
-                    </w:rPr>
-                    <w:t xml:space="preserve">.</w:t>
-                  </w:r>
-                </w:p>
-                <w:p>
-                  <w:pPr>
-                    <w:spacing w:after="20" w:before="0"/>
-                  </w:pPr>
-                  <w:r>
-                    <w:rPr>
-                      <w:rFonts w:ascii="Calibri" w:cs="Calibri" w:eastAsia="Calibri" w:hAnsi="Calibri"/>
-                      <w:color w:val="000000"/>
-                      <w:sz w:val="18"/>
-                      <w:szCs w:val="18"/>
-                    </w:rPr>
-                    <w:t xml:space="preserve">Nächstes Mal </w:t>
-                  </w:r>
-                  <w:r>
-                    <w:rPr>
-                      <w:rFonts w:ascii="Calibri" w:cs="Calibri" w:eastAsia="Calibri" w:hAnsi="Calibri"/>
-                      <w:b/>
-                      <w:bCs/>
-                      <w:color w:val="D9534F"/>
-                      <w:sz w:val="18"/>
-                      <w:szCs w:val="18"/>
-                    </w:rPr>
-                    <w:t xml:space="preserve">werde</w:t>
-                  </w:r>
-                  <w:r>
-                    <w:rPr>
-                      <w:rFonts w:ascii="Calibri" w:cs="Calibri" w:eastAsia="Calibri" w:hAnsi="Calibri"/>
-                      <w:color w:val="000000"/>
-                      <w:sz w:val="18"/>
-                      <w:szCs w:val="18"/>
-                    </w:rPr>
-                    <w:t xml:space="preserve"> ich … </w:t>
-                  </w:r>
-                  <w:r>
-                    <w:rPr>
-                      <w:rFonts w:ascii="Calibri" w:cs="Calibri" w:eastAsia="Calibri" w:hAnsi="Calibri"/>
-                      <w:b/>
-                      <w:bCs/>
-                      <w:color w:val="3F7CC4"/>
-                      <w:sz w:val="18"/>
-                      <w:szCs w:val="18"/>
-                    </w:rPr>
-                    <w:t xml:space="preserve">schaffen</w:t>
-                  </w:r>
-                  <w:r>
-                    <w:rPr>
-                      <w:rFonts w:ascii="Calibri" w:cs="Calibri" w:eastAsia="Calibri" w:hAnsi="Calibri"/>
-                      <w:color w:val="000000"/>
-                      <w:sz w:val="18"/>
-                      <w:szCs w:val="18"/>
-                    </w:rPr>
-                    <w:t xml:space="preserve">.</w:t>
-                  </w:r>
-                  <w:r>
-                    <w:rPr>
-                      <w:rFonts w:ascii="Calibri" w:cs="Calibri" w:eastAsia="Calibri" w:hAnsi="Calibri"/>
-                      <w:color w:val="9AA3B5"/>
-                      <w:sz w:val="18"/>
-                      <w:szCs w:val="18"/>
-                    </w:rPr>
-                    <w:t xml:space="preserve">   ·   </w:t>
-                  </w:r>
-                  <w:r>
-                    <w:rPr>
-                      <w:rFonts w:ascii="Calibri" w:cs="Calibri" w:eastAsia="Calibri" w:hAnsi="Calibri"/>
-                      <w:color w:val="000000"/>
-                      <w:sz w:val="18"/>
-                      <w:szCs w:val="18"/>
-                    </w:rPr>
-                    <w:t xml:space="preserve">Wir </w:t>
-                  </w:r>
-                  <w:r>
-                    <w:rPr>
-                      <w:rFonts w:ascii="Calibri" w:cs="Calibri" w:eastAsia="Calibri" w:hAnsi="Calibri"/>
-                      <w:b/>
-                      <w:bCs/>
-                      <w:color w:val="D9534F"/>
-                      <w:sz w:val="18"/>
-                      <w:szCs w:val="18"/>
-                    </w:rPr>
-                    <w:t xml:space="preserve">werden</w:t>
-                  </w:r>
-                  <w:r>
-                    <w:rPr>
-                      <w:rFonts w:ascii="Calibri" w:cs="Calibri" w:eastAsia="Calibri" w:hAnsi="Calibri"/>
-                      <w:color w:val="000000"/>
-                      <w:sz w:val="18"/>
-                      <w:szCs w:val="18"/>
-                    </w:rPr>
-                    <w:t xml:space="preserve"> die Abwehr </w:t>
-                  </w:r>
-                  <w:r>
-                    <w:rPr>
-                      <w:rFonts w:ascii="Calibri" w:cs="Calibri" w:eastAsia="Calibri" w:hAnsi="Calibri"/>
-                      <w:b/>
-                      <w:bCs/>
-                      <w:color w:val="3F7CC4"/>
-                      <w:sz w:val="18"/>
-                      <w:szCs w:val="18"/>
-                    </w:rPr>
-                    <w:t xml:space="preserve">verbessern</w:t>
-                  </w:r>
-                  <w:r>
-                    <w:rPr>
-                      <w:rFonts w:ascii="Calibri" w:cs="Calibri" w:eastAsia="Calibri" w:hAnsi="Calibri"/>
-                      <w:color w:val="000000"/>
-                      <w:sz w:val="18"/>
-                      <w:szCs w:val="18"/>
-                    </w:rPr>
-                    <w:t xml:space="preserve">.</w:t>
+                </w:p>
+              </w:tc>
+            </w:tr>
+          </w:tbl>
+          <w:tbl>
+            <w:tblPr>
+              <w:tblW w:type="dxa" w:w="10406"/>
+              <w:tblBorders>
+                <w:top w:val="single" w:color="auto" w:sz="4"/>
+                <w:left w:val="single" w:color="auto" w:sz="4"/>
+                <w:bottom w:val="single" w:color="auto" w:sz="4"/>
+                <w:right w:val="single" w:color="auto" w:sz="4"/>
+                <w:insideH w:val="single" w:color="auto" w:sz="4"/>
+                <w:insideV w:val="single" w:color="auto" w:sz="4"/>
+              </w:tblBorders>
+            </w:tblPr>
+            <w:tblGrid>
+              <w:gridCol w:w="10406"/>
+            </w:tblGrid>
+            <w:tr>
+              <w:trPr>
+                <w:cantSplit/>
+                <w:trHeight w:val="540" w:hRule="exact"/>
+              </w:trPr>
+              <w:tc>
+                <w:tcPr>
+                  <w:tcW w:type="dxa" w:w="10406"/>
+                  <w:tcBorders>
+                    <w:top w:val="none" w:color="FFFFFF" w:sz="0"/>
+                    <w:left w:val="none" w:color="FFFFFF" w:sz="0"/>
+                    <w:bottom w:val="single" w:color="9AA3B5" w:sz="6"/>
+                    <w:right w:val="none" w:color="FFFFFF" w:sz="0"/>
+                  </w:tcBorders>
+                  <w:tcMar>
+                    <w:top w:type="dxa" w:w="60"/>
+                    <w:left w:type="dxa" w:w="100"/>
+                    <w:bottom w:type="dxa" w:w="60"/>
+                    <w:right w:type="dxa" w:w="100"/>
+                  </w:tcMar>
+                  <w:vAlign w:val="center"/>
+                </w:tcPr>
+                <w:p>
+                  <w:pPr>
+                    <w:spacing w:after="0" w:before="0"/>
+                  </w:pPr>
+                  <w:r>
+                    <w:rPr>
+                      <w:rFonts w:ascii="Calibri" w:cs="Calibri" w:eastAsia="Calibri" w:hAnsi="Calibri"/>
+                      <w:color w:val="000000"/>
+                      <w:sz w:val="22"/>
+                      <w:szCs w:val="22"/>
+                    </w:rPr>
+                    <w:t xml:space="preserve"/>
+                  </w:r>
+                </w:p>
+              </w:tc>
+            </w:tr>
+            <w:tr>
+              <w:trPr>
+                <w:cantSplit/>
+                <w:trHeight w:val="540" w:hRule="exact"/>
+              </w:trPr>
+              <w:tc>
+                <w:tcPr>
+                  <w:tcW w:type="dxa" w:w="10406"/>
+                  <w:tcBorders>
+                    <w:top w:val="none" w:color="FFFFFF" w:sz="0"/>
+                    <w:left w:val="none" w:color="FFFFFF" w:sz="0"/>
+                    <w:bottom w:val="single" w:color="9AA3B5" w:sz="6"/>
+                    <w:right w:val="none" w:color="FFFFFF" w:sz="0"/>
+                  </w:tcBorders>
+                  <w:tcMar>
+                    <w:top w:type="dxa" w:w="60"/>
+                    <w:left w:type="dxa" w:w="100"/>
+                    <w:bottom w:type="dxa" w:w="60"/>
+                    <w:right w:type="dxa" w:w="100"/>
+                  </w:tcMar>
+                  <w:vAlign w:val="center"/>
+                </w:tcPr>
+                <w:p>
+                  <w:pPr>
+                    <w:spacing w:after="0" w:before="0"/>
+                  </w:pPr>
+                  <w:r>
+                    <w:rPr>
+                      <w:rFonts w:ascii="Calibri" w:cs="Calibri" w:eastAsia="Calibri" w:hAnsi="Calibri"/>
+                      <w:color w:val="000000"/>
+                      <w:sz w:val="22"/>
+                      <w:szCs w:val="22"/>
+                    </w:rPr>
+                    <w:t xml:space="preserve"/>
+                  </w:r>
+                </w:p>
+              </w:tc>
+            </w:tr>
+            <w:tr>
+              <w:trPr>
+                <w:cantSplit/>
+                <w:trHeight w:val="540" w:hRule="exact"/>
+              </w:trPr>
+              <w:tc>
+                <w:tcPr>
+                  <w:tcW w:type="dxa" w:w="10406"/>
+                  <w:tcBorders>
+                    <w:top w:val="none" w:color="FFFFFF" w:sz="0"/>
+                    <w:left w:val="none" w:color="FFFFFF" w:sz="0"/>
+                    <w:bottom w:val="single" w:color="9AA3B5" w:sz="6"/>
+                    <w:right w:val="none" w:color="FFFFFF" w:sz="0"/>
+                  </w:tcBorders>
+                  <w:tcMar>
+                    <w:top w:type="dxa" w:w="60"/>
+                    <w:left w:type="dxa" w:w="100"/>
+                    <w:bottom w:type="dxa" w:w="60"/>
+                    <w:right w:type="dxa" w:w="100"/>
+                  </w:tcMar>
+                  <w:vAlign w:val="center"/>
+                </w:tcPr>
+                <w:p>
+                  <w:pPr>
+                    <w:spacing w:after="0" w:before="0"/>
+                  </w:pPr>
+                  <w:r>
+                    <w:rPr>
+                      <w:rFonts w:ascii="Calibri" w:cs="Calibri" w:eastAsia="Calibri" w:hAnsi="Calibri"/>
+                      <w:color w:val="000000"/>
+                      <w:sz w:val="22"/>
+                      <w:szCs w:val="22"/>
+                    </w:rPr>
+                    <w:t xml:space="preserve"/>
+                  </w:r>
+                </w:p>
+              </w:tc>
+            </w:tr>
+            <w:tr>
+              <w:trPr>
+                <w:cantSplit/>
+                <w:trHeight w:val="540" w:hRule="exact"/>
+              </w:trPr>
+              <w:tc>
+                <w:tcPr>
+                  <w:tcW w:type="dxa" w:w="10406"/>
+                  <w:tcBorders>
+                    <w:top w:val="none" w:color="FFFFFF" w:sz="0"/>
+                    <w:left w:val="none" w:color="FFFFFF" w:sz="0"/>
+                    <w:bottom w:val="single" w:color="9AA3B5" w:sz="6"/>
+                    <w:right w:val="none" w:color="FFFFFF" w:sz="0"/>
+                  </w:tcBorders>
+                  <w:tcMar>
+                    <w:top w:type="dxa" w:w="60"/>
+                    <w:left w:type="dxa" w:w="100"/>
+                    <w:bottom w:type="dxa" w:w="60"/>
+                    <w:right w:type="dxa" w:w="100"/>
+                  </w:tcMar>
+                  <w:vAlign w:val="center"/>
+                </w:tcPr>
+                <w:p>
+                  <w:pPr>
+                    <w:spacing w:after="0" w:before="0"/>
+                  </w:pPr>
+                  <w:r>
+                    <w:rPr>
+                      <w:rFonts w:ascii="Calibri" w:cs="Calibri" w:eastAsia="Calibri" w:hAnsi="Calibri"/>
+                      <w:color w:val="000000"/>
+                      <w:sz w:val="22"/>
+                      <w:szCs w:val="22"/>
+                    </w:rPr>
+                    <w:t xml:space="preserve"/>
+                  </w:r>
+                </w:p>
+              </w:tc>
+            </w:tr>
+            <w:tr>
+              <w:trPr>
+                <w:cantSplit/>
+                <w:trHeight w:val="540" w:hRule="exact"/>
+              </w:trPr>
+              <w:tc>
+                <w:tcPr>
+                  <w:tcW w:type="dxa" w:w="10406"/>
+                  <w:tcBorders>
+                    <w:top w:val="none" w:color="FFFFFF" w:sz="0"/>
+                    <w:left w:val="none" w:color="FFFFFF" w:sz="0"/>
+                    <w:bottom w:val="single" w:color="9AA3B5" w:sz="6"/>
+                    <w:right w:val="none" w:color="FFFFFF" w:sz="0"/>
+                  </w:tcBorders>
+                  <w:tcMar>
+                    <w:top w:type="dxa" w:w="60"/>
+                    <w:left w:type="dxa" w:w="100"/>
+                    <w:bottom w:type="dxa" w:w="60"/>
+                    <w:right w:type="dxa" w:w="100"/>
+                  </w:tcMar>
+                  <w:vAlign w:val="center"/>
+                </w:tcPr>
+                <w:p>
+                  <w:pPr>
+                    <w:spacing w:after="0" w:before="0"/>
+                  </w:pPr>
+                  <w:r>
+                    <w:rPr>
+                      <w:rFonts w:ascii="Calibri" w:cs="Calibri" w:eastAsia="Calibri" w:hAnsi="Calibri"/>
+                      <w:color w:val="000000"/>
+                      <w:sz w:val="22"/>
+                      <w:szCs w:val="22"/>
+                    </w:rPr>
+                    <w:t xml:space="preserve"/>
+                  </w:r>
+                </w:p>
+              </w:tc>
+            </w:tr>
+            <w:tr>
+              <w:trPr>
+                <w:cantSplit/>
+                <w:trHeight w:val="540" w:hRule="exact"/>
+              </w:trPr>
+              <w:tc>
+                <w:tcPr>
+                  <w:tcW w:type="dxa" w:w="10406"/>
+                  <w:tcBorders>
+                    <w:top w:val="none" w:color="FFFFFF" w:sz="0"/>
+                    <w:left w:val="none" w:color="FFFFFF" w:sz="0"/>
+                    <w:bottom w:val="single" w:color="9AA3B5" w:sz="6"/>
+                    <w:right w:val="none" w:color="FFFFFF" w:sz="0"/>
+                  </w:tcBorders>
+                  <w:tcMar>
+                    <w:top w:type="dxa" w:w="60"/>
+                    <w:left w:type="dxa" w:w="100"/>
+                    <w:bottom w:type="dxa" w:w="60"/>
+                    <w:right w:type="dxa" w:w="100"/>
+                  </w:tcMar>
+                  <w:vAlign w:val="center"/>
+                </w:tcPr>
+                <w:p>
+                  <w:pPr>
+                    <w:spacing w:after="0" w:before="0"/>
+                  </w:pPr>
+                  <w:r>
+                    <w:rPr>
+                      <w:rFonts w:ascii="Calibri" w:cs="Calibri" w:eastAsia="Calibri" w:hAnsi="Calibri"/>
+                      <w:color w:val="000000"/>
+                      <w:sz w:val="22"/>
+                      <w:szCs w:val="22"/>
+                    </w:rPr>
+                    <w:t xml:space="preserve"/>
+                  </w:r>
+                </w:p>
+              </w:tc>
+            </w:tr>
+            <w:tr>
+              <w:trPr>
+                <w:cantSplit/>
+                <w:trHeight w:val="540" w:hRule="exact"/>
+              </w:trPr>
+              <w:tc>
+                <w:tcPr>
+                  <w:tcW w:type="dxa" w:w="10406"/>
+                  <w:tcBorders>
+                    <w:top w:val="none" w:color="FFFFFF" w:sz="0"/>
+                    <w:left w:val="none" w:color="FFFFFF" w:sz="0"/>
+                    <w:bottom w:val="single" w:color="9AA3B5" w:sz="6"/>
+                    <w:right w:val="none" w:color="FFFFFF" w:sz="0"/>
+                  </w:tcBorders>
+                  <w:tcMar>
+                    <w:top w:type="dxa" w:w="60"/>
+                    <w:left w:type="dxa" w:w="100"/>
+                    <w:bottom w:type="dxa" w:w="60"/>
+                    <w:right w:type="dxa" w:w="100"/>
+                  </w:tcMar>
+                  <w:vAlign w:val="center"/>
+                </w:tcPr>
+                <w:p>
+                  <w:pPr>
+                    <w:spacing w:after="0" w:before="0"/>
+                  </w:pPr>
+                  <w:r>
+                    <w:rPr>
+                      <w:rFonts w:ascii="Calibri" w:cs="Calibri" w:eastAsia="Calibri" w:hAnsi="Calibri"/>
+                      <w:color w:val="000000"/>
+                      <w:sz w:val="22"/>
+                      <w:szCs w:val="22"/>
+                    </w:rPr>
+                    <w:t xml:space="preserve"/>
                   </w:r>
                 </w:p>
               </w:tc>
@@ -6035,19 +4523,8 @@
           </w:tbl>
           <w:p>
             <w:pPr>
-              <w:spacing w:after="60" w:before="80"/>
+              <w:spacing w:after="0" w:before="100"/>
             </w:pPr>
-            <w:r>
-              <w:rPr>
-                <w:rFonts w:ascii="Calibri" w:cs="Calibri" w:eastAsia="Calibri" w:hAnsi="Calibri"/>
-                <w:b/>
-                <w:bCs/>
-                <w:color w:val="1E2761"/>
-                <w:sz w:val="18"/>
-                <w:szCs w:val="18"/>
-              </w:rPr>
-              <w:t xml:space="preserve">Verben  </w:t>
-            </w:r>
             <w:r>
               <w:rPr>
                 <w:rFonts w:ascii="Calibri" w:cs="Calibri" w:eastAsia="Calibri" w:hAnsi="Calibri"/>
@@ -6055,32 +4532,7 @@
                 <w:sz w:val="18"/>
                 <w:szCs w:val="18"/>
               </w:rPr>
-              <w:t xml:space="preserve">Judo: kämpfen – kämpfte, werfen – warf, halten – hielt  ·  Handball: werfen – warf, treffen – traf, spielen – spielte  ·  Gewichtheben: heben – hob, reißen – riss, stoßen – stieß</w:t>
-            </w:r>
-          </w:p>
-          <w:p>
-            <w:pPr>
-              <w:spacing w:after="0" w:before="100"/>
-            </w:pPr>
-            <w:r>
-              <w:rPr>
-                <w:rFonts w:ascii="Calibri" w:cs="Calibri" w:eastAsia="Calibri" w:hAnsi="Calibri"/>
-                <w:b/>
-                <w:bCs/>
-                <w:color w:val="000000"/>
-                <w:sz w:val="18"/>
-                <w:szCs w:val="18"/>
-              </w:rPr>
-              <w:t xml:space="preserve">Prüfe vor dem Abgeben:  </w:t>
-            </w:r>
-            <w:r>
-              <w:rPr>
-                <w:rFonts w:ascii="Calibri" w:cs="Calibri" w:eastAsia="Calibri" w:hAnsi="Calibri"/>
-                <w:color w:val="000000"/>
-                <w:sz w:val="18"/>
-                <w:szCs w:val="18"/>
-              </w:rPr>
-              <w:t xml:space="preserve">☐ alle fünf Zeitformen drin   ☐ Hilfsverb rot, Partizip II gelb, Infinitiv blau markiert   ☐ Präteritum-Verben unterstrichen</w:t>
+              <w:t xml:space="preserve">☐ alle fünf Zeitformen drin   ☐ Hilfsverb rot, Partizip II gelb, Infinitiv blau markiert</w:t>
             </w:r>
             <w:r>
               <w:rPr>

</xml_diff>

<commit_message>
Exit-Ticket: Satzanfänge statt Sätze, mind. 4 je Zeitform, nach Inhalt geordnet
Co-Authored-By: Claude Opus 5.5 <noreply@anthropic.com>
Claude-Session: https://claude.ai/code/session_01KXvLXHMYPnCyEbMRgNaaYs
</commit_message>
<xml_diff>
--- a/Deutsch_7A/Zeitformen_Zeitstrahl/Druckvorlage_Zeitformen_Zeitstrahl.docx
+++ b/Deutsch_7A/Zeitformen_Zeitstrahl/Druckvorlage_Zeitformen_Zeitstrahl.docx
@@ -31,9 +31,9 @@
               <w:right w:val="dashed" w:color="7A869E" w:sz="8"/>
             </w:tcBorders>
             <w:tcMar>
-              <w:top w:type="dxa" w:w="130"/>
+              <w:top w:type="dxa" w:w="100"/>
               <w:left w:type="dxa" w:w="150"/>
-              <w:bottom w:type="dxa" w:w="130"/>
+              <w:bottom w:type="dxa" w:w="100"/>
               <w:right w:type="dxa" w:w="100"/>
             </w:tcMar>
             <w:vAlign w:val="top"/>
@@ -1133,7 +1133,7 @@
     </w:tbl>
     <w:p>
       <w:pPr>
-        <w:spacing w:after="60" w:before="60"/>
+        <w:spacing w:after="20" w:before="20"/>
         <w:jc w:val="center"/>
       </w:pPr>
       <w:r>
@@ -1175,9 +1175,9 @@
               <w:right w:val="dashed" w:color="7A869E" w:sz="8"/>
             </w:tcBorders>
             <w:tcMar>
-              <w:top w:type="dxa" w:w="130"/>
+              <w:top w:type="dxa" w:w="100"/>
               <w:left w:type="dxa" w:w="150"/>
-              <w:bottom w:type="dxa" w:w="130"/>
+              <w:bottom w:type="dxa" w:w="100"/>
               <w:right w:type="dxa" w:w="100"/>
             </w:tcMar>
             <w:vAlign w:val="top"/>
@@ -2309,16 +2309,16 @@
               <w:right w:val="dashed" w:color="7A869E" w:sz="8"/>
             </w:tcBorders>
             <w:tcMar>
-              <w:top w:type="dxa" w:w="130"/>
+              <w:top w:type="dxa" w:w="100"/>
               <w:left w:type="dxa" w:w="150"/>
-              <w:bottom w:type="dxa" w:w="130"/>
+              <w:bottom w:type="dxa" w:w="100"/>
               <w:right w:type="dxa" w:w="100"/>
             </w:tcMar>
             <w:vAlign w:val="top"/>
           </w:tcPr>
           <w:p>
             <w:pPr>
-              <w:spacing w:after="70" w:before="0"/>
+              <w:spacing w:after="40" w:before="0"/>
             </w:pPr>
             <w:r>
               <w:rPr>
@@ -2326,8 +2326,8 @@
                 <w:b/>
                 <w:bCs/>
                 <w:color w:val="1E2761"/>
-                <w:sz w:val="28"/>
-                <w:szCs w:val="28"/>
+                <w:sz w:val="26"/>
+                <w:szCs w:val="26"/>
               </w:rPr>
               <w:t xml:space="preserve">Exit-Ticket: Mein Wochenende</w:t>
             </w:r>
@@ -2343,7 +2343,7 @@
           </w:p>
           <w:p>
             <w:pPr>
-              <w:spacing w:after="80" w:before="0"/>
+              <w:spacing w:after="60" w:before="0"/>
             </w:pPr>
             <w:r>
               <w:rPr>
@@ -2372,7 +2372,7 @@
                 <w:sz w:val="21"/>
                 <w:szCs w:val="21"/>
               </w:rPr>
-              <w:t xml:space="preserve"> über deinen Wettkampf am Wochenende – nach dem Muster an der Tafel. Jede Zeitform kommt </w:t>
+              <w:t xml:space="preserve"> über deinen Wettkampf – jede Zeitform </w:t>
             </w:r>
             <w:r>
               <w:rPr>
@@ -2389,10 +2389,10 @@
               <w:rPr>
                 <w:rFonts w:ascii="Calibri" w:cs="Calibri" w:eastAsia="Calibri" w:hAnsi="Calibri"/>
                 <w:color w:val="000000"/>
-                <w:sz w:val="21"/>
-                <w:szCs w:val="21"/>
-              </w:rPr>
-              <w:t xml:space="preserve"> vor.</w:t>
+                <w:sz w:val="19"/>
+                <w:szCs w:val="19"/>
+              </w:rPr>
+              <w:t xml:space="preserve">. Farbige Linie = hier kommt Partizip II bzw. Infinitiv hin. Platz reicht nicht? Rückseite!</w:t>
             </w:r>
           </w:p>
           <w:tbl>
@@ -2408,8 +2408,8 @@
               </w:tblBorders>
             </w:tblPr>
             <w:tblGrid>
-              <w:gridCol w:w="3800"/>
-              <w:gridCol w:w="6606"/>
+              <w:gridCol w:w="2500"/>
+              <w:gridCol w:w="7906"/>
             </w:tblGrid>
             <w:tr>
               <w:trPr>
@@ -2417,7 +2417,7 @@
               </w:trPr>
               <w:tc>
                 <w:tcPr>
-                  <w:tcW w:type="dxa" w:w="3800"/>
+                  <w:tcW w:type="dxa" w:w="2500"/>
                   <w:tcBorders>
                     <w:top w:val="single" w:color="B9C6E8" w:sz="6"/>
                     <w:left w:val="single" w:color="B9C6E8" w:sz="6"/>
@@ -2426,12 +2426,12 @@
                   </w:tcBorders>
                   <w:shd w:fill="F4F7FD" w:color="auto" w:val="clear"/>
                   <w:tcMar>
-                    <w:top w:type="dxa" w:w="50"/>
-                    <w:left w:type="dxa" w:w="100"/>
-                    <w:bottom w:type="dxa" w:w="50"/>
-                    <w:right w:type="dxa" w:w="100"/>
-                  </w:tcMar>
-                  <w:vAlign w:val="center"/>
+                    <w:top w:type="dxa" w:w="40"/>
+                    <w:left w:type="dxa" w:w="100"/>
+                    <w:bottom w:type="dxa" w:w="40"/>
+                    <w:right w:type="dxa" w:w="100"/>
+                  </w:tcMar>
+                  <w:vAlign w:val="top"/>
                 </w:tcPr>
                 <w:p>
                   <w:pPr>
@@ -2446,16 +2446,21 @@
                       <w:sz w:val="19"/>
                       <w:szCs w:val="19"/>
                     </w:rPr>
-                    <w:t xml:space="preserve">Plusquamperfekt  </w:t>
-                  </w:r>
+                    <w:t xml:space="preserve">Plusquamperfekt</w:t>
+                  </w:r>
+                </w:p>
+                <w:p>
+                  <w:pPr>
+                    <w:spacing w:after="0" w:before="0"/>
+                  </w:pPr>
                   <w:r>
                     <w:rPr>
                       <w:rFonts w:ascii="Calibri" w:cs="Calibri" w:eastAsia="Calibri" w:hAnsi="Calibri"/>
                       <w:b/>
                       <w:bCs/>
                       <w:color w:val="D9534F"/>
-                      <w:sz w:val="16"/>
-                      <w:szCs w:val="16"/>
+                      <w:sz w:val="15"/>
+                      <w:szCs w:val="15"/>
                     </w:rPr>
                     <w:t xml:space="preserve">hatte/war</w:t>
                   </w:r>
@@ -2465,8 +2470,8 @@
                       <w:b/>
                       <w:bCs/>
                       <w:color w:val="5B6B8C"/>
-                      <w:sz w:val="16"/>
-                      <w:szCs w:val="16"/>
+                      <w:sz w:val="15"/>
+                      <w:szCs w:val="15"/>
                     </w:rPr>
                     <w:t xml:space="preserve"> + </w:t>
                   </w:r>
@@ -2476,16 +2481,32 @@
                       <w:b/>
                       <w:bCs/>
                       <w:color w:val="C98A1E"/>
-                      <w:sz w:val="16"/>
-                      <w:szCs w:val="16"/>
+                      <w:sz w:val="15"/>
+                      <w:szCs w:val="15"/>
                     </w:rPr>
                     <w:t xml:space="preserve">Partizip II</w:t>
                   </w:r>
                 </w:p>
-              </w:tc>
-              <w:tc>
-                <w:tcPr>
-                  <w:tcW w:type="dxa" w:w="6606"/>
+                <w:p>
+                  <w:pPr>
+                    <w:spacing w:after="0" w:before="0"/>
+                  </w:pPr>
+                  <w:r>
+                    <w:rPr>
+                      <w:rFonts w:ascii="Calibri" w:cs="Calibri" w:eastAsia="Calibri" w:hAnsi="Calibri"/>
+                      <w:i/>
+                      <w:iCs/>
+                      <w:color w:val="5B6B8C"/>
+                      <w:sz w:val="15"/>
+                      <w:szCs w:val="15"/>
+                    </w:rPr>
+                    <w:t xml:space="preserve">Vorbereitung</w:t>
+                  </w:r>
+                </w:p>
+              </w:tc>
+              <w:tc>
+                <w:tcPr>
+                  <w:tcW w:type="dxa" w:w="7906"/>
                   <w:tcBorders>
                     <w:top w:val="single" w:color="B9C6E8" w:sz="6"/>
                     <w:left w:val="single" w:color="B9C6E8" w:sz="6"/>
@@ -2508,8 +2529,8 @@
                     <w:rPr>
                       <w:rFonts w:ascii="Calibri" w:cs="Calibri" w:eastAsia="Calibri" w:hAnsi="Calibri"/>
                       <w:color w:val="000000"/>
-                      <w:sz w:val="19"/>
-                      <w:szCs w:val="19"/>
+                      <w:sz w:val="18"/>
+                      <w:szCs w:val="18"/>
                     </w:rPr>
                     <w:t xml:space="preserve">Vor dem Wettkampf </w:t>
                   </w:r>
@@ -2519,8 +2540,8 @@
                       <w:b/>
                       <w:bCs/>
                       <w:color w:val="D9534F"/>
-                      <w:sz w:val="19"/>
-                      <w:szCs w:val="19"/>
+                      <w:sz w:val="18"/>
+                      <w:szCs w:val="18"/>
                     </w:rPr>
                     <w:t xml:space="preserve">hatte</w:t>
                   </w:r>
@@ -2528,30 +2549,168 @@
                     <w:rPr>
                       <w:rFonts w:ascii="Calibri" w:cs="Calibri" w:eastAsia="Calibri" w:hAnsi="Calibri"/>
                       <w:color w:val="000000"/>
-                      <w:sz w:val="19"/>
-                      <w:szCs w:val="19"/>
-                    </w:rPr>
-                    <w:t xml:space="preserve"> ich wochenlang </w:t>
-                  </w:r>
-                  <w:r>
-                    <w:rPr>
-                      <w:rFonts w:ascii="Calibri" w:cs="Calibri" w:eastAsia="Calibri" w:hAnsi="Calibri"/>
-                      <w:b/>
-                      <w:bCs/>
-                      <w:color w:val="C98A1E"/>
-                      <w:sz w:val="19"/>
-                      <w:szCs w:val="19"/>
-                    </w:rPr>
-                    <w:t xml:space="preserve">trainiert</w:t>
-                  </w:r>
-                  <w:r>
-                    <w:rPr>
-                      <w:rFonts w:ascii="Calibri" w:cs="Calibri" w:eastAsia="Calibri" w:hAnsi="Calibri"/>
-                      <w:color w:val="000000"/>
-                      <w:sz w:val="19"/>
-                      <w:szCs w:val="19"/>
-                    </w:rPr>
-                    <w:t xml:space="preserve">.</w:t>
+                      <w:sz w:val="18"/>
+                      <w:szCs w:val="18"/>
+                    </w:rPr>
+                    <w:t xml:space="preserve"> ich … </w:t>
+                  </w:r>
+                  <w:r>
+                    <w:rPr>
+                      <w:rFonts w:ascii="Calibri" w:cs="Calibri" w:eastAsia="Calibri" w:hAnsi="Calibri"/>
+                      <w:b/>
+                      <w:bCs/>
+                      <w:color w:val="E8A33D"/>
+                      <w:sz w:val="18"/>
+                      <w:szCs w:val="18"/>
+                    </w:rPr>
+                    <w:t xml:space="preserve">_______</w:t>
+                  </w:r>
+                  <w:r>
+                    <w:rPr>
+                      <w:rFonts w:ascii="Calibri" w:cs="Calibri" w:eastAsia="Calibri" w:hAnsi="Calibri"/>
+                      <w:color w:val="9AA3B5"/>
+                      <w:sz w:val="18"/>
+                      <w:szCs w:val="18"/>
+                    </w:rPr>
+                    <w:t xml:space="preserve">  ·  </w:t>
+                  </w:r>
+                  <w:r>
+                    <w:rPr>
+                      <w:rFonts w:ascii="Calibri" w:cs="Calibri" w:eastAsia="Calibri" w:hAnsi="Calibri"/>
+                      <w:color w:val="000000"/>
+                      <w:sz w:val="18"/>
+                      <w:szCs w:val="18"/>
+                    </w:rPr>
+                    <w:t xml:space="preserve">Wochenlang </w:t>
+                  </w:r>
+                  <w:r>
+                    <w:rPr>
+                      <w:rFonts w:ascii="Calibri" w:cs="Calibri" w:eastAsia="Calibri" w:hAnsi="Calibri"/>
+                      <w:b/>
+                      <w:bCs/>
+                      <w:color w:val="D9534F"/>
+                      <w:sz w:val="18"/>
+                      <w:szCs w:val="18"/>
+                    </w:rPr>
+                    <w:t xml:space="preserve">hatte</w:t>
+                  </w:r>
+                  <w:r>
+                    <w:rPr>
+                      <w:rFonts w:ascii="Calibri" w:cs="Calibri" w:eastAsia="Calibri" w:hAnsi="Calibri"/>
+                      <w:color w:val="000000"/>
+                      <w:sz w:val="18"/>
+                      <w:szCs w:val="18"/>
+                    </w:rPr>
+                    <w:t xml:space="preserve"> ich … </w:t>
+                  </w:r>
+                  <w:r>
+                    <w:rPr>
+                      <w:rFonts w:ascii="Calibri" w:cs="Calibri" w:eastAsia="Calibri" w:hAnsi="Calibri"/>
+                      <w:b/>
+                      <w:bCs/>
+                      <w:color w:val="E8A33D"/>
+                      <w:sz w:val="18"/>
+                      <w:szCs w:val="18"/>
+                    </w:rPr>
+                    <w:t xml:space="preserve">_______</w:t>
+                  </w:r>
+                  <w:r>
+                    <w:rPr>
+                      <w:rFonts w:ascii="Calibri" w:cs="Calibri" w:eastAsia="Calibri" w:hAnsi="Calibri"/>
+                      <w:color w:val="9AA3B5"/>
+                      <w:sz w:val="18"/>
+                      <w:szCs w:val="18"/>
+                    </w:rPr>
+                    <w:t xml:space="preserve">  ·  </w:t>
+                  </w:r>
+                  <w:r>
+                    <w:rPr>
+                      <w:rFonts w:ascii="Calibri" w:cs="Calibri" w:eastAsia="Calibri" w:hAnsi="Calibri"/>
+                      <w:color w:val="000000"/>
+                      <w:sz w:val="18"/>
+                      <w:szCs w:val="18"/>
+                    </w:rPr>
+                    <w:t xml:space="preserve">Am Abend davor </w:t>
+                  </w:r>
+                  <w:r>
+                    <w:rPr>
+                      <w:rFonts w:ascii="Calibri" w:cs="Calibri" w:eastAsia="Calibri" w:hAnsi="Calibri"/>
+                      <w:b/>
+                      <w:bCs/>
+                      <w:color w:val="D9534F"/>
+                      <w:sz w:val="18"/>
+                      <w:szCs w:val="18"/>
+                    </w:rPr>
+                    <w:t xml:space="preserve">hatte</w:t>
+                  </w:r>
+                  <w:r>
+                    <w:rPr>
+                      <w:rFonts w:ascii="Calibri" w:cs="Calibri" w:eastAsia="Calibri" w:hAnsi="Calibri"/>
+                      <w:color w:val="000000"/>
+                      <w:sz w:val="18"/>
+                      <w:szCs w:val="18"/>
+                    </w:rPr>
+                    <w:t xml:space="preserve"> ich … </w:t>
+                  </w:r>
+                  <w:r>
+                    <w:rPr>
+                      <w:rFonts w:ascii="Calibri" w:cs="Calibri" w:eastAsia="Calibri" w:hAnsi="Calibri"/>
+                      <w:b/>
+                      <w:bCs/>
+                      <w:color w:val="E8A33D"/>
+                      <w:sz w:val="18"/>
+                      <w:szCs w:val="18"/>
+                    </w:rPr>
+                    <w:t xml:space="preserve">_______</w:t>
+                  </w:r>
+                  <w:r>
+                    <w:rPr>
+                      <w:rFonts w:ascii="Calibri" w:cs="Calibri" w:eastAsia="Calibri" w:hAnsi="Calibri"/>
+                      <w:color w:val="9AA3B5"/>
+                      <w:sz w:val="18"/>
+                      <w:szCs w:val="18"/>
+                    </w:rPr>
+                    <w:t xml:space="preserve">  ·  </w:t>
+                  </w:r>
+                  <w:r>
+                    <w:rPr>
+                      <w:rFonts w:ascii="Calibri" w:cs="Calibri" w:eastAsia="Calibri" w:hAnsi="Calibri"/>
+                      <w:color w:val="000000"/>
+                      <w:sz w:val="18"/>
+                      <w:szCs w:val="18"/>
+                    </w:rPr>
+                    <w:t xml:space="preserve">Am Morgen </w:t>
+                  </w:r>
+                  <w:r>
+                    <w:rPr>
+                      <w:rFonts w:ascii="Calibri" w:cs="Calibri" w:eastAsia="Calibri" w:hAnsi="Calibri"/>
+                      <w:b/>
+                      <w:bCs/>
+                      <w:color w:val="D9534F"/>
+                      <w:sz w:val="18"/>
+                      <w:szCs w:val="18"/>
+                    </w:rPr>
+                    <w:t xml:space="preserve">waren</w:t>
+                  </w:r>
+                  <w:r>
+                    <w:rPr>
+                      <w:rFonts w:ascii="Calibri" w:cs="Calibri" w:eastAsia="Calibri" w:hAnsi="Calibri"/>
+                      <w:color w:val="000000"/>
+                      <w:sz w:val="18"/>
+                      <w:szCs w:val="18"/>
+                    </w:rPr>
+                    <w:t xml:space="preserve"> wir … </w:t>
+                  </w:r>
+                  <w:r>
+                    <w:rPr>
+                      <w:rFonts w:ascii="Calibri" w:cs="Calibri" w:eastAsia="Calibri" w:hAnsi="Calibri"/>
+                      <w:b/>
+                      <w:bCs/>
+                      <w:color w:val="E8A33D"/>
+                      <w:sz w:val="18"/>
+                      <w:szCs w:val="18"/>
+                    </w:rPr>
+                    <w:t xml:space="preserve">_______</w:t>
                   </w:r>
                 </w:p>
               </w:tc>
@@ -2562,7 +2721,7 @@
               </w:trPr>
               <w:tc>
                 <w:tcPr>
-                  <w:tcW w:type="dxa" w:w="3800"/>
+                  <w:tcW w:type="dxa" w:w="2500"/>
                   <w:tcBorders>
                     <w:top w:val="single" w:color="B9C6E8" w:sz="6"/>
                     <w:left w:val="single" w:color="B9C6E8" w:sz="6"/>
@@ -2571,12 +2730,12 @@
                   </w:tcBorders>
                   <w:shd w:fill="F4F7FD" w:color="auto" w:val="clear"/>
                   <w:tcMar>
-                    <w:top w:type="dxa" w:w="50"/>
-                    <w:left w:type="dxa" w:w="100"/>
-                    <w:bottom w:type="dxa" w:w="50"/>
-                    <w:right w:type="dxa" w:w="100"/>
-                  </w:tcMar>
-                  <w:vAlign w:val="center"/>
+                    <w:top w:type="dxa" w:w="40"/>
+                    <w:left w:type="dxa" w:w="100"/>
+                    <w:bottom w:type="dxa" w:w="40"/>
+                    <w:right w:type="dxa" w:w="100"/>
+                  </w:tcMar>
+                  <w:vAlign w:val="top"/>
                 </w:tcPr>
                 <w:p>
                   <w:pPr>
@@ -2591,24 +2750,45 @@
                       <w:sz w:val="19"/>
                       <w:szCs w:val="19"/>
                     </w:rPr>
-                    <w:t xml:space="preserve">Präteritum  </w:t>
-                  </w:r>
+                    <w:t xml:space="preserve">Präteritum</w:t>
+                  </w:r>
+                </w:p>
+                <w:p>
+                  <w:pPr>
+                    <w:spacing w:after="0" w:before="0"/>
+                  </w:pPr>
                   <w:r>
                     <w:rPr>
                       <w:rFonts w:ascii="Calibri" w:cs="Calibri" w:eastAsia="Calibri" w:hAnsi="Calibri"/>
                       <w:b/>
                       <w:bCs/>
                       <w:color w:val="5B6B8C"/>
-                      <w:sz w:val="16"/>
-                      <w:szCs w:val="16"/>
-                    </w:rPr>
-                    <w:t xml:space="preserve">erzählt</w:t>
-                  </w:r>
-                </w:p>
-              </w:tc>
-              <w:tc>
-                <w:tcPr>
-                  <w:tcW w:type="dxa" w:w="6606"/>
+                      <w:sz w:val="15"/>
+                      <w:szCs w:val="15"/>
+                    </w:rPr>
+                    <w:t xml:space="preserve">finites Verb im Präteritum</w:t>
+                  </w:r>
+                </w:p>
+                <w:p>
+                  <w:pPr>
+                    <w:spacing w:after="0" w:before="0"/>
+                  </w:pPr>
+                  <w:r>
+                    <w:rPr>
+                      <w:rFonts w:ascii="Calibri" w:cs="Calibri" w:eastAsia="Calibri" w:hAnsi="Calibri"/>
+                      <w:i/>
+                      <w:iCs/>
+                      <w:color w:val="5B6B8C"/>
+                      <w:sz w:val="15"/>
+                      <w:szCs w:val="15"/>
+                    </w:rPr>
+                    <w:t xml:space="preserve">Ablauf und Ergebnis</w:t>
+                  </w:r>
+                </w:p>
+              </w:tc>
+              <w:tc>
+                <w:tcPr>
+                  <w:tcW w:type="dxa" w:w="7906"/>
                   <w:tcBorders>
                     <w:top w:val="single" w:color="B9C6E8" w:sz="6"/>
                     <w:left w:val="single" w:color="B9C6E8" w:sz="6"/>
@@ -2631,73 +2811,64 @@
                     <w:rPr>
                       <w:rFonts w:ascii="Calibri" w:cs="Calibri" w:eastAsia="Calibri" w:hAnsi="Calibri"/>
                       <w:color w:val="000000"/>
-                      <w:sz w:val="19"/>
-                      <w:szCs w:val="19"/>
-                    </w:rPr>
-                    <w:t xml:space="preserve">Am Samstag </w:t>
-                  </w:r>
-                  <w:r>
-                    <w:rPr>
-                      <w:rFonts w:ascii="Calibri" w:cs="Calibri" w:eastAsia="Calibri" w:hAnsi="Calibri"/>
-                      <w:b/>
-                      <w:bCs/>
-                      <w:color w:val="000000"/>
-                      <w:sz w:val="19"/>
-                      <w:szCs w:val="19"/>
-                      <w:u w:val="single"/>
-                    </w:rPr>
-                    <w:t xml:space="preserve">kämpfte</w:t>
-                  </w:r>
-                  <w:r>
-                    <w:rPr>
-                      <w:rFonts w:ascii="Calibri" w:cs="Calibri" w:eastAsia="Calibri" w:hAnsi="Calibri"/>
-                      <w:color w:val="000000"/>
-                      <w:sz w:val="19"/>
-                      <w:szCs w:val="19"/>
-                    </w:rPr>
-                    <w:t xml:space="preserve"> / </w:t>
-                  </w:r>
-                  <w:r>
-                    <w:rPr>
-                      <w:rFonts w:ascii="Calibri" w:cs="Calibri" w:eastAsia="Calibri" w:hAnsi="Calibri"/>
-                      <w:b/>
-                      <w:bCs/>
-                      <w:color w:val="000000"/>
-                      <w:sz w:val="19"/>
-                      <w:szCs w:val="19"/>
-                      <w:u w:val="single"/>
-                    </w:rPr>
-                    <w:t xml:space="preserve">spielte</w:t>
-                  </w:r>
-                  <w:r>
-                    <w:rPr>
-                      <w:rFonts w:ascii="Calibri" w:cs="Calibri" w:eastAsia="Calibri" w:hAnsi="Calibri"/>
-                      <w:color w:val="000000"/>
-                      <w:sz w:val="19"/>
-                      <w:szCs w:val="19"/>
-                    </w:rPr>
-                    <w:t xml:space="preserve"> / </w:t>
-                  </w:r>
-                  <w:r>
-                    <w:rPr>
-                      <w:rFonts w:ascii="Calibri" w:cs="Calibri" w:eastAsia="Calibri" w:hAnsi="Calibri"/>
-                      <w:b/>
-                      <w:bCs/>
-                      <w:color w:val="000000"/>
-                      <w:sz w:val="19"/>
-                      <w:szCs w:val="19"/>
-                      <w:u w:val="single"/>
-                    </w:rPr>
-                    <w:t xml:space="preserve">hob</w:t>
-                  </w:r>
-                  <w:r>
-                    <w:rPr>
-                      <w:rFonts w:ascii="Calibri" w:cs="Calibri" w:eastAsia="Calibri" w:hAnsi="Calibri"/>
-                      <w:color w:val="000000"/>
-                      <w:sz w:val="19"/>
-                      <w:szCs w:val="19"/>
-                    </w:rPr>
-                    <w:t xml:space="preserve"> ich …</w:t>
+                      <w:sz w:val="18"/>
+                      <w:szCs w:val="18"/>
+                    </w:rPr>
+                    <w:t xml:space="preserve">In der Halle …</w:t>
+                  </w:r>
+                  <w:r>
+                    <w:rPr>
+                      <w:rFonts w:ascii="Calibri" w:cs="Calibri" w:eastAsia="Calibri" w:hAnsi="Calibri"/>
+                      <w:color w:val="9AA3B5"/>
+                      <w:sz w:val="18"/>
+                      <w:szCs w:val="18"/>
+                    </w:rPr>
+                    <w:t xml:space="preserve">  ·  </w:t>
+                  </w:r>
+                  <w:r>
+                    <w:rPr>
+                      <w:rFonts w:ascii="Calibri" w:cs="Calibri" w:eastAsia="Calibri" w:hAnsi="Calibri"/>
+                      <w:color w:val="000000"/>
+                      <w:sz w:val="18"/>
+                      <w:szCs w:val="18"/>
+                    </w:rPr>
+                    <w:t xml:space="preserve">Im ersten Kampf / In der ersten Halbzeit / Im ersten Versuch …</w:t>
+                  </w:r>
+                  <w:r>
+                    <w:rPr>
+                      <w:rFonts w:ascii="Calibri" w:cs="Calibri" w:eastAsia="Calibri" w:hAnsi="Calibri"/>
+                      <w:color w:val="9AA3B5"/>
+                      <w:sz w:val="18"/>
+                      <w:szCs w:val="18"/>
+                    </w:rPr>
+                    <w:t xml:space="preserve">  ·  </w:t>
+                  </w:r>
+                  <w:r>
+                    <w:rPr>
+                      <w:rFonts w:ascii="Calibri" w:cs="Calibri" w:eastAsia="Calibri" w:hAnsi="Calibri"/>
+                      <w:color w:val="000000"/>
+                      <w:sz w:val="18"/>
+                      <w:szCs w:val="18"/>
+                    </w:rPr>
+                    <w:t xml:space="preserve">Danach …</w:t>
+                  </w:r>
+                  <w:r>
+                    <w:rPr>
+                      <w:rFonts w:ascii="Calibri" w:cs="Calibri" w:eastAsia="Calibri" w:hAnsi="Calibri"/>
+                      <w:color w:val="9AA3B5"/>
+                      <w:sz w:val="18"/>
+                      <w:szCs w:val="18"/>
+                    </w:rPr>
+                    <w:t xml:space="preserve">  ·  </w:t>
+                  </w:r>
+                  <w:r>
+                    <w:rPr>
+                      <w:rFonts w:ascii="Calibri" w:cs="Calibri" w:eastAsia="Calibri" w:hAnsi="Calibri"/>
+                      <w:color w:val="000000"/>
+                      <w:sz w:val="18"/>
+                      <w:szCs w:val="18"/>
+                    </w:rPr>
+                    <w:t xml:space="preserve">Am Ende …</w:t>
                   </w:r>
                 </w:p>
               </w:tc>
@@ -2708,7 +2879,7 @@
               </w:trPr>
               <w:tc>
                 <w:tcPr>
-                  <w:tcW w:type="dxa" w:w="3800"/>
+                  <w:tcW w:type="dxa" w:w="2500"/>
                   <w:tcBorders>
                     <w:top w:val="single" w:color="B9C6E8" w:sz="6"/>
                     <w:left w:val="single" w:color="B9C6E8" w:sz="6"/>
@@ -2717,12 +2888,12 @@
                   </w:tcBorders>
                   <w:shd w:fill="F4F7FD" w:color="auto" w:val="clear"/>
                   <w:tcMar>
-                    <w:top w:type="dxa" w:w="50"/>
-                    <w:left w:type="dxa" w:w="100"/>
-                    <w:bottom w:type="dxa" w:w="50"/>
-                    <w:right w:type="dxa" w:w="100"/>
-                  </w:tcMar>
-                  <w:vAlign w:val="center"/>
+                    <w:top w:type="dxa" w:w="40"/>
+                    <w:left w:type="dxa" w:w="100"/>
+                    <w:bottom w:type="dxa" w:w="40"/>
+                    <w:right w:type="dxa" w:w="100"/>
+                  </w:tcMar>
+                  <w:vAlign w:val="top"/>
                 </w:tcPr>
                 <w:p>
                   <w:pPr>
@@ -2737,16 +2908,21 @@
                       <w:sz w:val="19"/>
                       <w:szCs w:val="19"/>
                     </w:rPr>
-                    <w:t xml:space="preserve">Perfekt  </w:t>
-                  </w:r>
+                    <w:t xml:space="preserve">Perfekt</w:t>
+                  </w:r>
+                </w:p>
+                <w:p>
+                  <w:pPr>
+                    <w:spacing w:after="0" w:before="0"/>
+                  </w:pPr>
                   <w:r>
                     <w:rPr>
                       <w:rFonts w:ascii="Calibri" w:cs="Calibri" w:eastAsia="Calibri" w:hAnsi="Calibri"/>
                       <w:b/>
                       <w:bCs/>
                       <w:color w:val="D9534F"/>
-                      <w:sz w:val="16"/>
-                      <w:szCs w:val="16"/>
+                      <w:sz w:val="15"/>
+                      <w:szCs w:val="15"/>
                     </w:rPr>
                     <w:t xml:space="preserve">habe/bin</w:t>
                   </w:r>
@@ -2756,8 +2932,8 @@
                       <w:b/>
                       <w:bCs/>
                       <w:color w:val="5B6B8C"/>
-                      <w:sz w:val="16"/>
-                      <w:szCs w:val="16"/>
+                      <w:sz w:val="15"/>
+                      <w:szCs w:val="15"/>
                     </w:rPr>
                     <w:t xml:space="preserve"> + </w:t>
                   </w:r>
@@ -2767,16 +2943,32 @@
                       <w:b/>
                       <w:bCs/>
                       <w:color w:val="C98A1E"/>
-                      <w:sz w:val="16"/>
-                      <w:szCs w:val="16"/>
+                      <w:sz w:val="15"/>
+                      <w:szCs w:val="15"/>
                     </w:rPr>
                     <w:t xml:space="preserve">Partizip II</w:t>
                   </w:r>
                 </w:p>
-              </w:tc>
-              <w:tc>
-                <w:tcPr>
-                  <w:tcW w:type="dxa" w:w="6606"/>
+                <w:p>
+                  <w:pPr>
+                    <w:spacing w:after="0" w:before="0"/>
+                  </w:pPr>
+                  <w:r>
+                    <w:rPr>
+                      <w:rFonts w:ascii="Calibri" w:cs="Calibri" w:eastAsia="Calibri" w:hAnsi="Calibri"/>
+                      <w:i/>
+                      <w:iCs/>
+                      <w:color w:val="5B6B8C"/>
+                      <w:sz w:val="15"/>
+                      <w:szCs w:val="15"/>
+                    </w:rPr>
+                    <w:t xml:space="preserve">Was jemand gesagt hat</w:t>
+                  </w:r>
+                </w:p>
+              </w:tc>
+              <w:tc>
+                <w:tcPr>
+                  <w:tcW w:type="dxa" w:w="7906"/>
                   <w:tcBorders>
                     <w:top w:val="single" w:color="B9C6E8" w:sz="6"/>
                     <w:left w:val="single" w:color="B9C6E8" w:sz="6"/>
@@ -2799,8 +2991,8 @@
                     <w:rPr>
                       <w:rFonts w:ascii="Calibri" w:cs="Calibri" w:eastAsia="Calibri" w:hAnsi="Calibri"/>
                       <w:color w:val="000000"/>
-                      <w:sz w:val="19"/>
-                      <w:szCs w:val="19"/>
+                      <w:sz w:val="18"/>
+                      <w:szCs w:val="18"/>
                     </w:rPr>
                     <w:t xml:space="preserve">Mein Trainer sagte: „Du </w:t>
                   </w:r>
@@ -2810,8 +3002,8 @@
                       <w:b/>
                       <w:bCs/>
                       <w:color w:val="D9534F"/>
-                      <w:sz w:val="19"/>
-                      <w:szCs w:val="19"/>
+                      <w:sz w:val="18"/>
+                      <w:szCs w:val="18"/>
                     </w:rPr>
                     <w:t xml:space="preserve">hast</w:t>
                   </w:r>
@@ -2819,30 +3011,204 @@
                     <w:rPr>
                       <w:rFonts w:ascii="Calibri" w:cs="Calibri" w:eastAsia="Calibri" w:hAnsi="Calibri"/>
                       <w:color w:val="000000"/>
-                      <w:sz w:val="19"/>
-                      <w:szCs w:val="19"/>
-                    </w:rPr>
-                    <w:t xml:space="preserve"> stark </w:t>
-                  </w:r>
-                  <w:r>
-                    <w:rPr>
-                      <w:rFonts w:ascii="Calibri" w:cs="Calibri" w:eastAsia="Calibri" w:hAnsi="Calibri"/>
-                      <w:b/>
-                      <w:bCs/>
-                      <w:color w:val="C98A1E"/>
-                      <w:sz w:val="19"/>
-                      <w:szCs w:val="19"/>
-                    </w:rPr>
-                    <w:t xml:space="preserve">gekämpft</w:t>
-                  </w:r>
-                  <w:r>
-                    <w:rPr>
-                      <w:rFonts w:ascii="Calibri" w:cs="Calibri" w:eastAsia="Calibri" w:hAnsi="Calibri"/>
-                      <w:color w:val="000000"/>
-                      <w:sz w:val="19"/>
-                      <w:szCs w:val="19"/>
-                    </w:rPr>
-                    <w:t xml:space="preserve">!“</w:t>
+                      <w:sz w:val="18"/>
+                      <w:szCs w:val="18"/>
+                    </w:rPr>
+                    <w:t xml:space="preserve"> … </w:t>
+                  </w:r>
+                  <w:r>
+                    <w:rPr>
+                      <w:rFonts w:ascii="Calibri" w:cs="Calibri" w:eastAsia="Calibri" w:hAnsi="Calibri"/>
+                      <w:b/>
+                      <w:bCs/>
+                      <w:color w:val="E8A33D"/>
+                      <w:sz w:val="18"/>
+                      <w:szCs w:val="18"/>
+                    </w:rPr>
+                    <w:t xml:space="preserve">_______</w:t>
+                  </w:r>
+                  <w:r>
+                    <w:rPr>
+                      <w:rFonts w:ascii="Calibri" w:cs="Calibri" w:eastAsia="Calibri" w:hAnsi="Calibri"/>
+                      <w:color w:val="000000"/>
+                      <w:sz w:val="18"/>
+                      <w:szCs w:val="18"/>
+                    </w:rPr>
+                    <w:t xml:space="preserve">“</w:t>
+                  </w:r>
+                  <w:r>
+                    <w:rPr>
+                      <w:rFonts w:ascii="Calibri" w:cs="Calibri" w:eastAsia="Calibri" w:hAnsi="Calibri"/>
+                      <w:color w:val="9AA3B5"/>
+                      <w:sz w:val="18"/>
+                      <w:szCs w:val="18"/>
+                    </w:rPr>
+                    <w:t xml:space="preserve">  ·  </w:t>
+                  </w:r>
+                  <w:r>
+                    <w:rPr>
+                      <w:rFonts w:ascii="Calibri" w:cs="Calibri" w:eastAsia="Calibri" w:hAnsi="Calibri"/>
+                      <w:color w:val="000000"/>
+                      <w:sz w:val="18"/>
+                      <w:szCs w:val="18"/>
+                    </w:rPr>
+                    <w:t xml:space="preserve">Mein Team rief: „Wir </w:t>
+                  </w:r>
+                  <w:r>
+                    <w:rPr>
+                      <w:rFonts w:ascii="Calibri" w:cs="Calibri" w:eastAsia="Calibri" w:hAnsi="Calibri"/>
+                      <w:b/>
+                      <w:bCs/>
+                      <w:color w:val="D9534F"/>
+                      <w:sz w:val="18"/>
+                      <w:szCs w:val="18"/>
+                    </w:rPr>
+                    <w:t xml:space="preserve">haben</w:t>
+                  </w:r>
+                  <w:r>
+                    <w:rPr>
+                      <w:rFonts w:ascii="Calibri" w:cs="Calibri" w:eastAsia="Calibri" w:hAnsi="Calibri"/>
+                      <w:color w:val="000000"/>
+                      <w:sz w:val="18"/>
+                      <w:szCs w:val="18"/>
+                    </w:rPr>
+                    <w:t xml:space="preserve"> … </w:t>
+                  </w:r>
+                  <w:r>
+                    <w:rPr>
+                      <w:rFonts w:ascii="Calibri" w:cs="Calibri" w:eastAsia="Calibri" w:hAnsi="Calibri"/>
+                      <w:b/>
+                      <w:bCs/>
+                      <w:color w:val="E8A33D"/>
+                      <w:sz w:val="18"/>
+                      <w:szCs w:val="18"/>
+                    </w:rPr>
+                    <w:t xml:space="preserve">_______</w:t>
+                  </w:r>
+                  <w:r>
+                    <w:rPr>
+                      <w:rFonts w:ascii="Calibri" w:cs="Calibri" w:eastAsia="Calibri" w:hAnsi="Calibri"/>
+                      <w:color w:val="000000"/>
+                      <w:sz w:val="18"/>
+                      <w:szCs w:val="18"/>
+                    </w:rPr>
+                    <w:t xml:space="preserve">“</w:t>
+                  </w:r>
+                  <w:r>
+                    <w:rPr>
+                      <w:rFonts w:ascii="Calibri" w:cs="Calibri" w:eastAsia="Calibri" w:hAnsi="Calibri"/>
+                      <w:color w:val="9AA3B5"/>
+                      <w:sz w:val="18"/>
+                      <w:szCs w:val="18"/>
+                    </w:rPr>
+                    <w:t xml:space="preserve">  ·  </w:t>
+                  </w:r>
+                  <w:r>
+                    <w:rPr>
+                      <w:rFonts w:ascii="Calibri" w:cs="Calibri" w:eastAsia="Calibri" w:hAnsi="Calibri"/>
+                      <w:color w:val="000000"/>
+                      <w:sz w:val="18"/>
+                      <w:szCs w:val="18"/>
+                    </w:rPr>
+                    <w:t xml:space="preserve">Meine Eltern fragten: „</w:t>
+                  </w:r>
+                  <w:r>
+                    <w:rPr>
+                      <w:rFonts w:ascii="Calibri" w:cs="Calibri" w:eastAsia="Calibri" w:hAnsi="Calibri"/>
+                      <w:b/>
+                      <w:bCs/>
+                      <w:color w:val="D9534F"/>
+                      <w:sz w:val="18"/>
+                      <w:szCs w:val="18"/>
+                    </w:rPr>
+                    <w:t xml:space="preserve">Hast</w:t>
+                  </w:r>
+                  <w:r>
+                    <w:rPr>
+                      <w:rFonts w:ascii="Calibri" w:cs="Calibri" w:eastAsia="Calibri" w:hAnsi="Calibri"/>
+                      <w:color w:val="000000"/>
+                      <w:sz w:val="18"/>
+                      <w:szCs w:val="18"/>
+                    </w:rPr>
+                    <w:t xml:space="preserve"> du … </w:t>
+                  </w:r>
+                  <w:r>
+                    <w:rPr>
+                      <w:rFonts w:ascii="Calibri" w:cs="Calibri" w:eastAsia="Calibri" w:hAnsi="Calibri"/>
+                      <w:b/>
+                      <w:bCs/>
+                      <w:color w:val="E8A33D"/>
+                      <w:sz w:val="18"/>
+                      <w:szCs w:val="18"/>
+                    </w:rPr>
+                    <w:t xml:space="preserve">_______</w:t>
+                  </w:r>
+                  <w:r>
+                    <w:rPr>
+                      <w:rFonts w:ascii="Calibri" w:cs="Calibri" w:eastAsia="Calibri" w:hAnsi="Calibri"/>
+                      <w:color w:val="000000"/>
+                      <w:sz w:val="18"/>
+                      <w:szCs w:val="18"/>
+                    </w:rPr>
+                    <w:t xml:space="preserve">?“</w:t>
+                  </w:r>
+                  <w:r>
+                    <w:rPr>
+                      <w:rFonts w:ascii="Calibri" w:cs="Calibri" w:eastAsia="Calibri" w:hAnsi="Calibri"/>
+                      <w:color w:val="9AA3B5"/>
+                      <w:sz w:val="18"/>
+                      <w:szCs w:val="18"/>
+                    </w:rPr>
+                    <w:t xml:space="preserve">  ·  </w:t>
+                  </w:r>
+                  <w:r>
+                    <w:rPr>
+                      <w:rFonts w:ascii="Calibri" w:cs="Calibri" w:eastAsia="Calibri" w:hAnsi="Calibri"/>
+                      <w:color w:val="000000"/>
+                      <w:sz w:val="18"/>
+                      <w:szCs w:val="18"/>
+                    </w:rPr>
+                    <w:t xml:space="preserve">Ich antwortete: „Ich </w:t>
+                  </w:r>
+                  <w:r>
+                    <w:rPr>
+                      <w:rFonts w:ascii="Calibri" w:cs="Calibri" w:eastAsia="Calibri" w:hAnsi="Calibri"/>
+                      <w:b/>
+                      <w:bCs/>
+                      <w:color w:val="D9534F"/>
+                      <w:sz w:val="18"/>
+                      <w:szCs w:val="18"/>
+                    </w:rPr>
+                    <w:t xml:space="preserve">bin</w:t>
+                  </w:r>
+                  <w:r>
+                    <w:rPr>
+                      <w:rFonts w:ascii="Calibri" w:cs="Calibri" w:eastAsia="Calibri" w:hAnsi="Calibri"/>
+                      <w:color w:val="000000"/>
+                      <w:sz w:val="18"/>
+                      <w:szCs w:val="18"/>
+                    </w:rPr>
+                    <w:t xml:space="preserve"> … </w:t>
+                  </w:r>
+                  <w:r>
+                    <w:rPr>
+                      <w:rFonts w:ascii="Calibri" w:cs="Calibri" w:eastAsia="Calibri" w:hAnsi="Calibri"/>
+                      <w:b/>
+                      <w:bCs/>
+                      <w:color w:val="E8A33D"/>
+                      <w:sz w:val="18"/>
+                      <w:szCs w:val="18"/>
+                    </w:rPr>
+                    <w:t xml:space="preserve">_______</w:t>
+                  </w:r>
+                  <w:r>
+                    <w:rPr>
+                      <w:rFonts w:ascii="Calibri" w:cs="Calibri" w:eastAsia="Calibri" w:hAnsi="Calibri"/>
+                      <w:color w:val="000000"/>
+                      <w:sz w:val="18"/>
+                      <w:szCs w:val="18"/>
+                    </w:rPr>
+                    <w:t xml:space="preserve">“</w:t>
                   </w:r>
                 </w:p>
               </w:tc>
@@ -2853,7 +3219,7 @@
               </w:trPr>
               <w:tc>
                 <w:tcPr>
-                  <w:tcW w:type="dxa" w:w="3800"/>
+                  <w:tcW w:type="dxa" w:w="2500"/>
                   <w:tcBorders>
                     <w:top w:val="single" w:color="B9C6E8" w:sz="6"/>
                     <w:left w:val="single" w:color="B9C6E8" w:sz="6"/>
@@ -2862,12 +3228,12 @@
                   </w:tcBorders>
                   <w:shd w:fill="F4F7FD" w:color="auto" w:val="clear"/>
                   <w:tcMar>
-                    <w:top w:type="dxa" w:w="50"/>
-                    <w:left w:type="dxa" w:w="100"/>
-                    <w:bottom w:type="dxa" w:w="50"/>
-                    <w:right w:type="dxa" w:w="100"/>
-                  </w:tcMar>
-                  <w:vAlign w:val="center"/>
+                    <w:top w:type="dxa" w:w="40"/>
+                    <w:left w:type="dxa" w:w="100"/>
+                    <w:bottom w:type="dxa" w:w="40"/>
+                    <w:right w:type="dxa" w:w="100"/>
+                  </w:tcMar>
+                  <w:vAlign w:val="top"/>
                 </w:tcPr>
                 <w:p>
                   <w:pPr>
@@ -2882,24 +3248,45 @@
                       <w:sz w:val="19"/>
                       <w:szCs w:val="19"/>
                     </w:rPr>
-                    <w:t xml:space="preserve">Präsens  </w:t>
-                  </w:r>
+                    <w:t xml:space="preserve">Präsens</w:t>
+                  </w:r>
+                </w:p>
+                <w:p>
+                  <w:pPr>
+                    <w:spacing w:after="0" w:before="0"/>
+                  </w:pPr>
                   <w:r>
                     <w:rPr>
                       <w:rFonts w:ascii="Calibri" w:cs="Calibri" w:eastAsia="Calibri" w:hAnsi="Calibri"/>
                       <w:b/>
                       <w:bCs/>
                       <w:color w:val="5B6B8C"/>
-                      <w:sz w:val="16"/>
-                      <w:szCs w:val="16"/>
-                    </w:rPr>
-                    <w:t xml:space="preserve">jetzt</w:t>
-                  </w:r>
-                </w:p>
-              </w:tc>
-              <w:tc>
-                <w:tcPr>
-                  <w:tcW w:type="dxa" w:w="6606"/>
+                      <w:sz w:val="15"/>
+                      <w:szCs w:val="15"/>
+                    </w:rPr>
+                    <w:t xml:space="preserve">finites Verb im Präsens</w:t>
+                  </w:r>
+                </w:p>
+                <w:p>
+                  <w:pPr>
+                    <w:spacing w:after="0" w:before="0"/>
+                  </w:pPr>
+                  <w:r>
+                    <w:rPr>
+                      <w:rFonts w:ascii="Calibri" w:cs="Calibri" w:eastAsia="Calibri" w:hAnsi="Calibri"/>
+                      <w:i/>
+                      <w:iCs/>
+                      <w:color w:val="5B6B8C"/>
+                      <w:sz w:val="15"/>
+                      <w:szCs w:val="15"/>
+                    </w:rPr>
+                    <w:t xml:space="preserve">Wie es dir jetzt geht</w:t>
+                  </w:r>
+                </w:p>
+              </w:tc>
+              <w:tc>
+                <w:tcPr>
+                  <w:tcW w:type="dxa" w:w="7906"/>
                   <w:tcBorders>
                     <w:top w:val="single" w:color="B9C6E8" w:sz="6"/>
                     <w:left w:val="single" w:color="B9C6E8" w:sz="6"/>
@@ -2922,31 +3309,64 @@
                     <w:rPr>
                       <w:rFonts w:ascii="Calibri" w:cs="Calibri" w:eastAsia="Calibri" w:hAnsi="Calibri"/>
                       <w:color w:val="000000"/>
-                      <w:sz w:val="19"/>
-                      <w:szCs w:val="19"/>
-                    </w:rPr>
-                    <w:t xml:space="preserve">Heute </w:t>
-                  </w:r>
-                  <w:r>
-                    <w:rPr>
-                      <w:rFonts w:ascii="Calibri" w:cs="Calibri" w:eastAsia="Calibri" w:hAnsi="Calibri"/>
-                      <w:b/>
-                      <w:bCs/>
-                      <w:color w:val="000000"/>
-                      <w:sz w:val="19"/>
-                      <w:szCs w:val="19"/>
-                      <w:u w:val="single"/>
-                    </w:rPr>
-                    <w:t xml:space="preserve">bin</w:t>
-                  </w:r>
-                  <w:r>
-                    <w:rPr>
-                      <w:rFonts w:ascii="Calibri" w:cs="Calibri" w:eastAsia="Calibri" w:hAnsi="Calibri"/>
-                      <w:color w:val="000000"/>
-                      <w:sz w:val="19"/>
-                      <w:szCs w:val="19"/>
-                    </w:rPr>
-                    <w:t xml:space="preserve"> ich noch müde.</w:t>
+                      <w:sz w:val="18"/>
+                      <w:szCs w:val="18"/>
+                    </w:rPr>
+                    <w:t xml:space="preserve">Heute …</w:t>
+                  </w:r>
+                  <w:r>
+                    <w:rPr>
+                      <w:rFonts w:ascii="Calibri" w:cs="Calibri" w:eastAsia="Calibri" w:hAnsi="Calibri"/>
+                      <w:color w:val="9AA3B5"/>
+                      <w:sz w:val="18"/>
+                      <w:szCs w:val="18"/>
+                    </w:rPr>
+                    <w:t xml:space="preserve">  ·  </w:t>
+                  </w:r>
+                  <w:r>
+                    <w:rPr>
+                      <w:rFonts w:ascii="Calibri" w:cs="Calibri" w:eastAsia="Calibri" w:hAnsi="Calibri"/>
+                      <w:color w:val="000000"/>
+                      <w:sz w:val="18"/>
+                      <w:szCs w:val="18"/>
+                    </w:rPr>
+                    <w:t xml:space="preserve">Jetzt fühle ich mich …</w:t>
+                  </w:r>
+                  <w:r>
+                    <w:rPr>
+                      <w:rFonts w:ascii="Calibri" w:cs="Calibri" w:eastAsia="Calibri" w:hAnsi="Calibri"/>
+                      <w:color w:val="9AA3B5"/>
+                      <w:sz w:val="18"/>
+                      <w:szCs w:val="18"/>
+                    </w:rPr>
+                    <w:t xml:space="preserve">  ·  </w:t>
+                  </w:r>
+                  <w:r>
+                    <w:rPr>
+                      <w:rFonts w:ascii="Calibri" w:cs="Calibri" w:eastAsia="Calibri" w:hAnsi="Calibri"/>
+                      <w:color w:val="000000"/>
+                      <w:sz w:val="18"/>
+                      <w:szCs w:val="18"/>
+                    </w:rPr>
+                    <w:t xml:space="preserve">Mein Körper …</w:t>
+                  </w:r>
+                  <w:r>
+                    <w:rPr>
+                      <w:rFonts w:ascii="Calibri" w:cs="Calibri" w:eastAsia="Calibri" w:hAnsi="Calibri"/>
+                      <w:color w:val="9AA3B5"/>
+                      <w:sz w:val="18"/>
+                      <w:szCs w:val="18"/>
+                    </w:rPr>
+                    <w:t xml:space="preserve">  ·  </w:t>
+                  </w:r>
+                  <w:r>
+                    <w:rPr>
+                      <w:rFonts w:ascii="Calibri" w:cs="Calibri" w:eastAsia="Calibri" w:hAnsi="Calibri"/>
+                      <w:color w:val="000000"/>
+                      <w:sz w:val="18"/>
+                      <w:szCs w:val="18"/>
+                    </w:rPr>
+                    <w:t xml:space="preserve">Im Moment …</w:t>
                   </w:r>
                 </w:p>
               </w:tc>
@@ -2957,7 +3377,7 @@
               </w:trPr>
               <w:tc>
                 <w:tcPr>
-                  <w:tcW w:type="dxa" w:w="3800"/>
+                  <w:tcW w:type="dxa" w:w="2500"/>
                   <w:tcBorders>
                     <w:top w:val="single" w:color="B9C6E8" w:sz="6"/>
                     <w:left w:val="single" w:color="B9C6E8" w:sz="6"/>
@@ -2966,12 +3386,12 @@
                   </w:tcBorders>
                   <w:shd w:fill="F4F7FD" w:color="auto" w:val="clear"/>
                   <w:tcMar>
-                    <w:top w:type="dxa" w:w="50"/>
-                    <w:left w:type="dxa" w:w="100"/>
-                    <w:bottom w:type="dxa" w:w="50"/>
-                    <w:right w:type="dxa" w:w="100"/>
-                  </w:tcMar>
-                  <w:vAlign w:val="center"/>
+                    <w:top w:type="dxa" w:w="40"/>
+                    <w:left w:type="dxa" w:w="100"/>
+                    <w:bottom w:type="dxa" w:w="40"/>
+                    <w:right w:type="dxa" w:w="100"/>
+                  </w:tcMar>
+                  <w:vAlign w:val="top"/>
                 </w:tcPr>
                 <w:p>
                   <w:pPr>
@@ -2986,16 +3406,21 @@
                       <w:sz w:val="19"/>
                       <w:szCs w:val="19"/>
                     </w:rPr>
-                    <w:t xml:space="preserve">Futur I  </w:t>
-                  </w:r>
+                    <w:t xml:space="preserve">Futur I</w:t>
+                  </w:r>
+                </w:p>
+                <w:p>
+                  <w:pPr>
+                    <w:spacing w:after="0" w:before="0"/>
+                  </w:pPr>
                   <w:r>
                     <w:rPr>
                       <w:rFonts w:ascii="Calibri" w:cs="Calibri" w:eastAsia="Calibri" w:hAnsi="Calibri"/>
                       <w:b/>
                       <w:bCs/>
                       <w:color w:val="D9534F"/>
-                      <w:sz w:val="16"/>
-                      <w:szCs w:val="16"/>
+                      <w:sz w:val="15"/>
+                      <w:szCs w:val="15"/>
                     </w:rPr>
                     <w:t xml:space="preserve">werde</w:t>
                   </w:r>
@@ -3005,8 +3430,8 @@
                       <w:b/>
                       <w:bCs/>
                       <w:color w:val="5B6B8C"/>
-                      <w:sz w:val="16"/>
-                      <w:szCs w:val="16"/>
+                      <w:sz w:val="15"/>
+                      <w:szCs w:val="15"/>
                     </w:rPr>
                     <w:t xml:space="preserve"> + </w:t>
                   </w:r>
@@ -3016,16 +3441,32 @@
                       <w:b/>
                       <w:bCs/>
                       <w:color w:val="3F7CC4"/>
-                      <w:sz w:val="16"/>
-                      <w:szCs w:val="16"/>
+                      <w:sz w:val="15"/>
+                      <w:szCs w:val="15"/>
                     </w:rPr>
                     <w:t xml:space="preserve">Infinitiv</w:t>
                   </w:r>
                 </w:p>
-              </w:tc>
-              <w:tc>
-                <w:tcPr>
-                  <w:tcW w:type="dxa" w:w="6606"/>
+                <w:p>
+                  <w:pPr>
+                    <w:spacing w:after="0" w:before="0"/>
+                  </w:pPr>
+                  <w:r>
+                    <w:rPr>
+                      <w:rFonts w:ascii="Calibri" w:cs="Calibri" w:eastAsia="Calibri" w:hAnsi="Calibri"/>
+                      <w:i/>
+                      <w:iCs/>
+                      <w:color w:val="5B6B8C"/>
+                      <w:sz w:val="15"/>
+                      <w:szCs w:val="15"/>
+                    </w:rPr>
+                    <w:t xml:space="preserve">Deine Ziele</w:t>
+                  </w:r>
+                </w:p>
+              </w:tc>
+              <w:tc>
+                <w:tcPr>
+                  <w:tcW w:type="dxa" w:w="7906"/>
                   <w:tcBorders>
                     <w:top w:val="single" w:color="B9C6E8" w:sz="6"/>
                     <w:left w:val="single" w:color="B9C6E8" w:sz="6"/>
@@ -3048,8 +3489,8 @@
                     <w:rPr>
                       <w:rFonts w:ascii="Calibri" w:cs="Calibri" w:eastAsia="Calibri" w:hAnsi="Calibri"/>
                       <w:color w:val="000000"/>
-                      <w:sz w:val="19"/>
-                      <w:szCs w:val="19"/>
+                      <w:sz w:val="18"/>
+                      <w:szCs w:val="18"/>
                     </w:rPr>
                     <w:t xml:space="preserve">Beim nächsten Wettkampf </w:t>
                   </w:r>
@@ -3059,8 +3500,8 @@
                       <w:b/>
                       <w:bCs/>
                       <w:color w:val="D9534F"/>
-                      <w:sz w:val="19"/>
-                      <w:szCs w:val="19"/>
+                      <w:sz w:val="18"/>
+                      <w:szCs w:val="18"/>
                     </w:rPr>
                     <w:t xml:space="preserve">werde</w:t>
                   </w:r>
@@ -3068,10 +3509,10 @@
                     <w:rPr>
                       <w:rFonts w:ascii="Calibri" w:cs="Calibri" w:eastAsia="Calibri" w:hAnsi="Calibri"/>
                       <w:color w:val="000000"/>
-                      <w:sz w:val="19"/>
-                      <w:szCs w:val="19"/>
-                    </w:rPr>
-                    <w:t xml:space="preserve"> ich früher </w:t>
+                      <w:sz w:val="18"/>
+                      <w:szCs w:val="18"/>
+                    </w:rPr>
+                    <w:t xml:space="preserve"> ich … </w:t>
                   </w:r>
                   <w:r>
                     <w:rPr>
@@ -3079,19 +3520,157 @@
                       <w:b/>
                       <w:bCs/>
                       <w:color w:val="3F7CC4"/>
-                      <w:sz w:val="19"/>
-                      <w:szCs w:val="19"/>
-                    </w:rPr>
-                    <w:t xml:space="preserve">angreifen</w:t>
-                  </w:r>
-                  <w:r>
-                    <w:rPr>
-                      <w:rFonts w:ascii="Calibri" w:cs="Calibri" w:eastAsia="Calibri" w:hAnsi="Calibri"/>
-                      <w:color w:val="000000"/>
-                      <w:sz w:val="19"/>
-                      <w:szCs w:val="19"/>
-                    </w:rPr>
-                    <w:t xml:space="preserve">.</w:t>
+                      <w:sz w:val="18"/>
+                      <w:szCs w:val="18"/>
+                    </w:rPr>
+                    <w:t xml:space="preserve">_______</w:t>
+                  </w:r>
+                  <w:r>
+                    <w:rPr>
+                      <w:rFonts w:ascii="Calibri" w:cs="Calibri" w:eastAsia="Calibri" w:hAnsi="Calibri"/>
+                      <w:color w:val="9AA3B5"/>
+                      <w:sz w:val="18"/>
+                      <w:szCs w:val="18"/>
+                    </w:rPr>
+                    <w:t xml:space="preserve">  ·  </w:t>
+                  </w:r>
+                  <w:r>
+                    <w:rPr>
+                      <w:rFonts w:ascii="Calibri" w:cs="Calibri" w:eastAsia="Calibri" w:hAnsi="Calibri"/>
+                      <w:color w:val="000000"/>
+                      <w:sz w:val="18"/>
+                      <w:szCs w:val="18"/>
+                    </w:rPr>
+                    <w:t xml:space="preserve">Im Training </w:t>
+                  </w:r>
+                  <w:r>
+                    <w:rPr>
+                      <w:rFonts w:ascii="Calibri" w:cs="Calibri" w:eastAsia="Calibri" w:hAnsi="Calibri"/>
+                      <w:b/>
+                      <w:bCs/>
+                      <w:color w:val="D9534F"/>
+                      <w:sz w:val="18"/>
+                      <w:szCs w:val="18"/>
+                    </w:rPr>
+                    <w:t xml:space="preserve">werde</w:t>
+                  </w:r>
+                  <w:r>
+                    <w:rPr>
+                      <w:rFonts w:ascii="Calibri" w:cs="Calibri" w:eastAsia="Calibri" w:hAnsi="Calibri"/>
+                      <w:color w:val="000000"/>
+                      <w:sz w:val="18"/>
+                      <w:szCs w:val="18"/>
+                    </w:rPr>
+                    <w:t xml:space="preserve"> ich … </w:t>
+                  </w:r>
+                  <w:r>
+                    <w:rPr>
+                      <w:rFonts w:ascii="Calibri" w:cs="Calibri" w:eastAsia="Calibri" w:hAnsi="Calibri"/>
+                      <w:b/>
+                      <w:bCs/>
+                      <w:color w:val="3F7CC4"/>
+                      <w:sz w:val="18"/>
+                      <w:szCs w:val="18"/>
+                    </w:rPr>
+                    <w:t xml:space="preserve">_______</w:t>
+                  </w:r>
+                  <w:r>
+                    <w:rPr>
+                      <w:rFonts w:ascii="Calibri" w:cs="Calibri" w:eastAsia="Calibri" w:hAnsi="Calibri"/>
+                      <w:color w:val="9AA3B5"/>
+                      <w:sz w:val="18"/>
+                      <w:szCs w:val="18"/>
+                    </w:rPr>
+                    <w:t xml:space="preserve">  ·  </w:t>
+                  </w:r>
+                  <w:r>
+                    <w:rPr>
+                      <w:rFonts w:ascii="Calibri" w:cs="Calibri" w:eastAsia="Calibri" w:hAnsi="Calibri"/>
+                      <w:color w:val="000000"/>
+                      <w:sz w:val="18"/>
+                      <w:szCs w:val="18"/>
+                    </w:rPr>
+                    <w:t xml:space="preserve">Ab morgen </w:t>
+                  </w:r>
+                  <w:r>
+                    <w:rPr>
+                      <w:rFonts w:ascii="Calibri" w:cs="Calibri" w:eastAsia="Calibri" w:hAnsi="Calibri"/>
+                      <w:b/>
+                      <w:bCs/>
+                      <w:color w:val="D9534F"/>
+                      <w:sz w:val="18"/>
+                      <w:szCs w:val="18"/>
+                    </w:rPr>
+                    <w:t xml:space="preserve">werde</w:t>
+                  </w:r>
+                  <w:r>
+                    <w:rPr>
+                      <w:rFonts w:ascii="Calibri" w:cs="Calibri" w:eastAsia="Calibri" w:hAnsi="Calibri"/>
+                      <w:color w:val="000000"/>
+                      <w:sz w:val="18"/>
+                      <w:szCs w:val="18"/>
+                    </w:rPr>
+                    <w:t xml:space="preserve"> ich … </w:t>
+                  </w:r>
+                  <w:r>
+                    <w:rPr>
+                      <w:rFonts w:ascii="Calibri" w:cs="Calibri" w:eastAsia="Calibri" w:hAnsi="Calibri"/>
+                      <w:b/>
+                      <w:bCs/>
+                      <w:color w:val="3F7CC4"/>
+                      <w:sz w:val="18"/>
+                      <w:szCs w:val="18"/>
+                    </w:rPr>
+                    <w:t xml:space="preserve">_______</w:t>
+                  </w:r>
+                  <w:r>
+                    <w:rPr>
+                      <w:rFonts w:ascii="Calibri" w:cs="Calibri" w:eastAsia="Calibri" w:hAnsi="Calibri"/>
+                      <w:color w:val="9AA3B5"/>
+                      <w:sz w:val="18"/>
+                      <w:szCs w:val="18"/>
+                    </w:rPr>
+                    <w:t xml:space="preserve">  ·  </w:t>
+                  </w:r>
+                  <w:r>
+                    <w:rPr>
+                      <w:rFonts w:ascii="Calibri" w:cs="Calibri" w:eastAsia="Calibri" w:hAnsi="Calibri"/>
+                      <w:color w:val="000000"/>
+                      <w:sz w:val="18"/>
+                      <w:szCs w:val="18"/>
+                    </w:rPr>
+                    <w:t xml:space="preserve">Wir </w:t>
+                  </w:r>
+                  <w:r>
+                    <w:rPr>
+                      <w:rFonts w:ascii="Calibri" w:cs="Calibri" w:eastAsia="Calibri" w:hAnsi="Calibri"/>
+                      <w:b/>
+                      <w:bCs/>
+                      <w:color w:val="D9534F"/>
+                      <w:sz w:val="18"/>
+                      <w:szCs w:val="18"/>
+                    </w:rPr>
+                    <w:t xml:space="preserve">werden</w:t>
+                  </w:r>
+                  <w:r>
+                    <w:rPr>
+                      <w:rFonts w:ascii="Calibri" w:cs="Calibri" w:eastAsia="Calibri" w:hAnsi="Calibri"/>
+                      <w:color w:val="000000"/>
+                      <w:sz w:val="18"/>
+                      <w:szCs w:val="18"/>
+                    </w:rPr>
+                    <w:t xml:space="preserve"> … </w:t>
+                  </w:r>
+                  <w:r>
+                    <w:rPr>
+                      <w:rFonts w:ascii="Calibri" w:cs="Calibri" w:eastAsia="Calibri" w:hAnsi="Calibri"/>
+                      <w:b/>
+                      <w:bCs/>
+                      <w:color w:val="3F7CC4"/>
+                      <w:sz w:val="18"/>
+                      <w:szCs w:val="18"/>
+                    </w:rPr>
+                    <w:t xml:space="preserve">_______</w:t>
                   </w:r>
                 </w:p>
               </w:tc>
@@ -3115,7 +3694,7 @@
             <w:tr>
               <w:trPr>
                 <w:cantSplit/>
-                <w:trHeight w:val="540" w:hRule="exact"/>
+                <w:trHeight w:val="480" w:hRule="exact"/>
               </w:trPr>
               <w:tc>
                 <w:tcPr>
@@ -3153,7 +3732,7 @@
             <w:tr>
               <w:trPr>
                 <w:cantSplit/>
-                <w:trHeight w:val="540" w:hRule="exact"/>
+                <w:trHeight w:val="480" w:hRule="exact"/>
               </w:trPr>
               <w:tc>
                 <w:tcPr>
@@ -3191,7 +3770,7 @@
             <w:tr>
               <w:trPr>
                 <w:cantSplit/>
-                <w:trHeight w:val="540" w:hRule="exact"/>
+                <w:trHeight w:val="480" w:hRule="exact"/>
               </w:trPr>
               <w:tc>
                 <w:tcPr>
@@ -3229,7 +3808,7 @@
             <w:tr>
               <w:trPr>
                 <w:cantSplit/>
-                <w:trHeight w:val="540" w:hRule="exact"/>
+                <w:trHeight w:val="480" w:hRule="exact"/>
               </w:trPr>
               <w:tc>
                 <w:tcPr>
@@ -3267,7 +3846,7 @@
             <w:tr>
               <w:trPr>
                 <w:cantSplit/>
-                <w:trHeight w:val="540" w:hRule="exact"/>
+                <w:trHeight w:val="480" w:hRule="exact"/>
               </w:trPr>
               <w:tc>
                 <w:tcPr>
@@ -3305,7 +3884,7 @@
             <w:tr>
               <w:trPr>
                 <w:cantSplit/>
-                <w:trHeight w:val="540" w:hRule="exact"/>
+                <w:trHeight w:val="480" w:hRule="exact"/>
               </w:trPr>
               <w:tc>
                 <w:tcPr>
@@ -3340,48 +3919,10 @@
                 </w:p>
               </w:tc>
             </w:tr>
-            <w:tr>
-              <w:trPr>
-                <w:cantSplit/>
-                <w:trHeight w:val="540" w:hRule="exact"/>
-              </w:trPr>
-              <w:tc>
-                <w:tcPr>
-                  <w:tcW w:type="dxa" w:w="10406"/>
-                  <w:tcBorders>
-                    <w:top w:val="none" w:color="FFFFFF" w:sz="0"/>
-                    <w:left w:val="none" w:color="FFFFFF" w:sz="0"/>
-                    <w:bottom w:val="single" w:color="9AA3B5" w:sz="6"/>
-                    <w:right w:val="none" w:color="FFFFFF" w:sz="0"/>
-                  </w:tcBorders>
-                  <w:tcMar>
-                    <w:top w:type="dxa" w:w="60"/>
-                    <w:left w:type="dxa" w:w="100"/>
-                    <w:bottom w:type="dxa" w:w="60"/>
-                    <w:right w:type="dxa" w:w="100"/>
-                  </w:tcMar>
-                  <w:vAlign w:val="center"/>
-                </w:tcPr>
-                <w:p>
-                  <w:pPr>
-                    <w:spacing w:after="0" w:before="0"/>
-                  </w:pPr>
-                  <w:r>
-                    <w:rPr>
-                      <w:rFonts w:ascii="Calibri" w:cs="Calibri" w:eastAsia="Calibri" w:hAnsi="Calibri"/>
-                      <w:color w:val="000000"/>
-                      <w:sz w:val="22"/>
-                      <w:szCs w:val="22"/>
-                    </w:rPr>
-                    <w:t xml:space="preserve"/>
-                  </w:r>
-                </w:p>
-              </w:tc>
-            </w:tr>
           </w:tbl>
           <w:p>
             <w:pPr>
-              <w:spacing w:after="0" w:before="100"/>
+              <w:spacing w:after="0" w:before="80"/>
             </w:pPr>
             <w:r>
               <w:rPr>
@@ -3409,7 +3950,7 @@
     </w:tbl>
     <w:p>
       <w:pPr>
-        <w:spacing w:after="60" w:before="60"/>
+        <w:spacing w:after="20" w:before="20"/>
         <w:jc w:val="center"/>
       </w:pPr>
       <w:r>
@@ -3451,16 +3992,16 @@
               <w:right w:val="dashed" w:color="7A869E" w:sz="8"/>
             </w:tcBorders>
             <w:tcMar>
-              <w:top w:type="dxa" w:w="130"/>
+              <w:top w:type="dxa" w:w="100"/>
               <w:left w:type="dxa" w:w="150"/>
-              <w:bottom w:type="dxa" w:w="130"/>
+              <w:bottom w:type="dxa" w:w="100"/>
               <w:right w:type="dxa" w:w="100"/>
             </w:tcMar>
             <w:vAlign w:val="top"/>
           </w:tcPr>
           <w:p>
             <w:pPr>
-              <w:spacing w:after="70" w:before="0"/>
+              <w:spacing w:after="40" w:before="0"/>
             </w:pPr>
             <w:r>
               <w:rPr>
@@ -3468,8 +4009,8 @@
                 <w:b/>
                 <w:bCs/>
                 <w:color w:val="1E2761"/>
-                <w:sz w:val="28"/>
-                <w:szCs w:val="28"/>
+                <w:sz w:val="26"/>
+                <w:szCs w:val="26"/>
               </w:rPr>
               <w:t xml:space="preserve">Exit-Ticket: Mein Wochenende</w:t>
             </w:r>
@@ -3485,7 +4026,7 @@
           </w:p>
           <w:p>
             <w:pPr>
-              <w:spacing w:after="80" w:before="0"/>
+              <w:spacing w:after="60" w:before="0"/>
             </w:pPr>
             <w:r>
               <w:rPr>
@@ -3514,7 +4055,7 @@
                 <w:sz w:val="21"/>
                 <w:szCs w:val="21"/>
               </w:rPr>
-              <w:t xml:space="preserve"> über deinen Wettkampf am Wochenende – nach dem Muster an der Tafel. Jede Zeitform kommt </w:t>
+              <w:t xml:space="preserve"> über deinen Wettkampf – jede Zeitform </w:t>
             </w:r>
             <w:r>
               <w:rPr>
@@ -3531,10 +4072,10 @@
               <w:rPr>
                 <w:rFonts w:ascii="Calibri" w:cs="Calibri" w:eastAsia="Calibri" w:hAnsi="Calibri"/>
                 <w:color w:val="000000"/>
-                <w:sz w:val="21"/>
-                <w:szCs w:val="21"/>
-              </w:rPr>
-              <w:t xml:space="preserve"> vor.</w:t>
+                <w:sz w:val="19"/>
+                <w:szCs w:val="19"/>
+              </w:rPr>
+              <w:t xml:space="preserve">. Farbige Linie = hier kommt Partizip II bzw. Infinitiv hin. Platz reicht nicht? Rückseite!</w:t>
             </w:r>
           </w:p>
           <w:tbl>
@@ -3550,8 +4091,8 @@
               </w:tblBorders>
             </w:tblPr>
             <w:tblGrid>
-              <w:gridCol w:w="3800"/>
-              <w:gridCol w:w="6606"/>
+              <w:gridCol w:w="2500"/>
+              <w:gridCol w:w="7906"/>
             </w:tblGrid>
             <w:tr>
               <w:trPr>
@@ -3559,7 +4100,7 @@
               </w:trPr>
               <w:tc>
                 <w:tcPr>
-                  <w:tcW w:type="dxa" w:w="3800"/>
+                  <w:tcW w:type="dxa" w:w="2500"/>
                   <w:tcBorders>
                     <w:top w:val="single" w:color="B9C6E8" w:sz="6"/>
                     <w:left w:val="single" w:color="B9C6E8" w:sz="6"/>
@@ -3568,12 +4109,12 @@
                   </w:tcBorders>
                   <w:shd w:fill="F4F7FD" w:color="auto" w:val="clear"/>
                   <w:tcMar>
-                    <w:top w:type="dxa" w:w="50"/>
-                    <w:left w:type="dxa" w:w="100"/>
-                    <w:bottom w:type="dxa" w:w="50"/>
-                    <w:right w:type="dxa" w:w="100"/>
-                  </w:tcMar>
-                  <w:vAlign w:val="center"/>
+                    <w:top w:type="dxa" w:w="40"/>
+                    <w:left w:type="dxa" w:w="100"/>
+                    <w:bottom w:type="dxa" w:w="40"/>
+                    <w:right w:type="dxa" w:w="100"/>
+                  </w:tcMar>
+                  <w:vAlign w:val="top"/>
                 </w:tcPr>
                 <w:p>
                   <w:pPr>
@@ -3588,16 +4129,21 @@
                       <w:sz w:val="19"/>
                       <w:szCs w:val="19"/>
                     </w:rPr>
-                    <w:t xml:space="preserve">Plusquamperfekt  </w:t>
-                  </w:r>
+                    <w:t xml:space="preserve">Plusquamperfekt</w:t>
+                  </w:r>
+                </w:p>
+                <w:p>
+                  <w:pPr>
+                    <w:spacing w:after="0" w:before="0"/>
+                  </w:pPr>
                   <w:r>
                     <w:rPr>
                       <w:rFonts w:ascii="Calibri" w:cs="Calibri" w:eastAsia="Calibri" w:hAnsi="Calibri"/>
                       <w:b/>
                       <w:bCs/>
                       <w:color w:val="D9534F"/>
-                      <w:sz w:val="16"/>
-                      <w:szCs w:val="16"/>
+                      <w:sz w:val="15"/>
+                      <w:szCs w:val="15"/>
                     </w:rPr>
                     <w:t xml:space="preserve">hatte/war</w:t>
                   </w:r>
@@ -3607,8 +4153,8 @@
                       <w:b/>
                       <w:bCs/>
                       <w:color w:val="5B6B8C"/>
-                      <w:sz w:val="16"/>
-                      <w:szCs w:val="16"/>
+                      <w:sz w:val="15"/>
+                      <w:szCs w:val="15"/>
                     </w:rPr>
                     <w:t xml:space="preserve"> + </w:t>
                   </w:r>
@@ -3618,16 +4164,32 @@
                       <w:b/>
                       <w:bCs/>
                       <w:color w:val="C98A1E"/>
-                      <w:sz w:val="16"/>
-                      <w:szCs w:val="16"/>
+                      <w:sz w:val="15"/>
+                      <w:szCs w:val="15"/>
                     </w:rPr>
                     <w:t xml:space="preserve">Partizip II</w:t>
                   </w:r>
                 </w:p>
-              </w:tc>
-              <w:tc>
-                <w:tcPr>
-                  <w:tcW w:type="dxa" w:w="6606"/>
+                <w:p>
+                  <w:pPr>
+                    <w:spacing w:after="0" w:before="0"/>
+                  </w:pPr>
+                  <w:r>
+                    <w:rPr>
+                      <w:rFonts w:ascii="Calibri" w:cs="Calibri" w:eastAsia="Calibri" w:hAnsi="Calibri"/>
+                      <w:i/>
+                      <w:iCs/>
+                      <w:color w:val="5B6B8C"/>
+                      <w:sz w:val="15"/>
+                      <w:szCs w:val="15"/>
+                    </w:rPr>
+                    <w:t xml:space="preserve">Vorbereitung</w:t>
+                  </w:r>
+                </w:p>
+              </w:tc>
+              <w:tc>
+                <w:tcPr>
+                  <w:tcW w:type="dxa" w:w="7906"/>
                   <w:tcBorders>
                     <w:top w:val="single" w:color="B9C6E8" w:sz="6"/>
                     <w:left w:val="single" w:color="B9C6E8" w:sz="6"/>
@@ -3650,8 +4212,8 @@
                     <w:rPr>
                       <w:rFonts w:ascii="Calibri" w:cs="Calibri" w:eastAsia="Calibri" w:hAnsi="Calibri"/>
                       <w:color w:val="000000"/>
-                      <w:sz w:val="19"/>
-                      <w:szCs w:val="19"/>
+                      <w:sz w:val="18"/>
+                      <w:szCs w:val="18"/>
                     </w:rPr>
                     <w:t xml:space="preserve">Vor dem Wettkampf </w:t>
                   </w:r>
@@ -3661,8 +4223,8 @@
                       <w:b/>
                       <w:bCs/>
                       <w:color w:val="D9534F"/>
-                      <w:sz w:val="19"/>
-                      <w:szCs w:val="19"/>
+                      <w:sz w:val="18"/>
+                      <w:szCs w:val="18"/>
                     </w:rPr>
                     <w:t xml:space="preserve">hatte</w:t>
                   </w:r>
@@ -3670,30 +4232,168 @@
                     <w:rPr>
                       <w:rFonts w:ascii="Calibri" w:cs="Calibri" w:eastAsia="Calibri" w:hAnsi="Calibri"/>
                       <w:color w:val="000000"/>
-                      <w:sz w:val="19"/>
-                      <w:szCs w:val="19"/>
-                    </w:rPr>
-                    <w:t xml:space="preserve"> ich wochenlang </w:t>
-                  </w:r>
-                  <w:r>
-                    <w:rPr>
-                      <w:rFonts w:ascii="Calibri" w:cs="Calibri" w:eastAsia="Calibri" w:hAnsi="Calibri"/>
-                      <w:b/>
-                      <w:bCs/>
-                      <w:color w:val="C98A1E"/>
-                      <w:sz w:val="19"/>
-                      <w:szCs w:val="19"/>
-                    </w:rPr>
-                    <w:t xml:space="preserve">trainiert</w:t>
-                  </w:r>
-                  <w:r>
-                    <w:rPr>
-                      <w:rFonts w:ascii="Calibri" w:cs="Calibri" w:eastAsia="Calibri" w:hAnsi="Calibri"/>
-                      <w:color w:val="000000"/>
-                      <w:sz w:val="19"/>
-                      <w:szCs w:val="19"/>
-                    </w:rPr>
-                    <w:t xml:space="preserve">.</w:t>
+                      <w:sz w:val="18"/>
+                      <w:szCs w:val="18"/>
+                    </w:rPr>
+                    <w:t xml:space="preserve"> ich … </w:t>
+                  </w:r>
+                  <w:r>
+                    <w:rPr>
+                      <w:rFonts w:ascii="Calibri" w:cs="Calibri" w:eastAsia="Calibri" w:hAnsi="Calibri"/>
+                      <w:b/>
+                      <w:bCs/>
+                      <w:color w:val="E8A33D"/>
+                      <w:sz w:val="18"/>
+                      <w:szCs w:val="18"/>
+                    </w:rPr>
+                    <w:t xml:space="preserve">_______</w:t>
+                  </w:r>
+                  <w:r>
+                    <w:rPr>
+                      <w:rFonts w:ascii="Calibri" w:cs="Calibri" w:eastAsia="Calibri" w:hAnsi="Calibri"/>
+                      <w:color w:val="9AA3B5"/>
+                      <w:sz w:val="18"/>
+                      <w:szCs w:val="18"/>
+                    </w:rPr>
+                    <w:t xml:space="preserve">  ·  </w:t>
+                  </w:r>
+                  <w:r>
+                    <w:rPr>
+                      <w:rFonts w:ascii="Calibri" w:cs="Calibri" w:eastAsia="Calibri" w:hAnsi="Calibri"/>
+                      <w:color w:val="000000"/>
+                      <w:sz w:val="18"/>
+                      <w:szCs w:val="18"/>
+                    </w:rPr>
+                    <w:t xml:space="preserve">Wochenlang </w:t>
+                  </w:r>
+                  <w:r>
+                    <w:rPr>
+                      <w:rFonts w:ascii="Calibri" w:cs="Calibri" w:eastAsia="Calibri" w:hAnsi="Calibri"/>
+                      <w:b/>
+                      <w:bCs/>
+                      <w:color w:val="D9534F"/>
+                      <w:sz w:val="18"/>
+                      <w:szCs w:val="18"/>
+                    </w:rPr>
+                    <w:t xml:space="preserve">hatte</w:t>
+                  </w:r>
+                  <w:r>
+                    <w:rPr>
+                      <w:rFonts w:ascii="Calibri" w:cs="Calibri" w:eastAsia="Calibri" w:hAnsi="Calibri"/>
+                      <w:color w:val="000000"/>
+                      <w:sz w:val="18"/>
+                      <w:szCs w:val="18"/>
+                    </w:rPr>
+                    <w:t xml:space="preserve"> ich … </w:t>
+                  </w:r>
+                  <w:r>
+                    <w:rPr>
+                      <w:rFonts w:ascii="Calibri" w:cs="Calibri" w:eastAsia="Calibri" w:hAnsi="Calibri"/>
+                      <w:b/>
+                      <w:bCs/>
+                      <w:color w:val="E8A33D"/>
+                      <w:sz w:val="18"/>
+                      <w:szCs w:val="18"/>
+                    </w:rPr>
+                    <w:t xml:space="preserve">_______</w:t>
+                  </w:r>
+                  <w:r>
+                    <w:rPr>
+                      <w:rFonts w:ascii="Calibri" w:cs="Calibri" w:eastAsia="Calibri" w:hAnsi="Calibri"/>
+                      <w:color w:val="9AA3B5"/>
+                      <w:sz w:val="18"/>
+                      <w:szCs w:val="18"/>
+                    </w:rPr>
+                    <w:t xml:space="preserve">  ·  </w:t>
+                  </w:r>
+                  <w:r>
+                    <w:rPr>
+                      <w:rFonts w:ascii="Calibri" w:cs="Calibri" w:eastAsia="Calibri" w:hAnsi="Calibri"/>
+                      <w:color w:val="000000"/>
+                      <w:sz w:val="18"/>
+                      <w:szCs w:val="18"/>
+                    </w:rPr>
+                    <w:t xml:space="preserve">Am Abend davor </w:t>
+                  </w:r>
+                  <w:r>
+                    <w:rPr>
+                      <w:rFonts w:ascii="Calibri" w:cs="Calibri" w:eastAsia="Calibri" w:hAnsi="Calibri"/>
+                      <w:b/>
+                      <w:bCs/>
+                      <w:color w:val="D9534F"/>
+                      <w:sz w:val="18"/>
+                      <w:szCs w:val="18"/>
+                    </w:rPr>
+                    <w:t xml:space="preserve">hatte</w:t>
+                  </w:r>
+                  <w:r>
+                    <w:rPr>
+                      <w:rFonts w:ascii="Calibri" w:cs="Calibri" w:eastAsia="Calibri" w:hAnsi="Calibri"/>
+                      <w:color w:val="000000"/>
+                      <w:sz w:val="18"/>
+                      <w:szCs w:val="18"/>
+                    </w:rPr>
+                    <w:t xml:space="preserve"> ich … </w:t>
+                  </w:r>
+                  <w:r>
+                    <w:rPr>
+                      <w:rFonts w:ascii="Calibri" w:cs="Calibri" w:eastAsia="Calibri" w:hAnsi="Calibri"/>
+                      <w:b/>
+                      <w:bCs/>
+                      <w:color w:val="E8A33D"/>
+                      <w:sz w:val="18"/>
+                      <w:szCs w:val="18"/>
+                    </w:rPr>
+                    <w:t xml:space="preserve">_______</w:t>
+                  </w:r>
+                  <w:r>
+                    <w:rPr>
+                      <w:rFonts w:ascii="Calibri" w:cs="Calibri" w:eastAsia="Calibri" w:hAnsi="Calibri"/>
+                      <w:color w:val="9AA3B5"/>
+                      <w:sz w:val="18"/>
+                      <w:szCs w:val="18"/>
+                    </w:rPr>
+                    <w:t xml:space="preserve">  ·  </w:t>
+                  </w:r>
+                  <w:r>
+                    <w:rPr>
+                      <w:rFonts w:ascii="Calibri" w:cs="Calibri" w:eastAsia="Calibri" w:hAnsi="Calibri"/>
+                      <w:color w:val="000000"/>
+                      <w:sz w:val="18"/>
+                      <w:szCs w:val="18"/>
+                    </w:rPr>
+                    <w:t xml:space="preserve">Am Morgen </w:t>
+                  </w:r>
+                  <w:r>
+                    <w:rPr>
+                      <w:rFonts w:ascii="Calibri" w:cs="Calibri" w:eastAsia="Calibri" w:hAnsi="Calibri"/>
+                      <w:b/>
+                      <w:bCs/>
+                      <w:color w:val="D9534F"/>
+                      <w:sz w:val="18"/>
+                      <w:szCs w:val="18"/>
+                    </w:rPr>
+                    <w:t xml:space="preserve">waren</w:t>
+                  </w:r>
+                  <w:r>
+                    <w:rPr>
+                      <w:rFonts w:ascii="Calibri" w:cs="Calibri" w:eastAsia="Calibri" w:hAnsi="Calibri"/>
+                      <w:color w:val="000000"/>
+                      <w:sz w:val="18"/>
+                      <w:szCs w:val="18"/>
+                    </w:rPr>
+                    <w:t xml:space="preserve"> wir … </w:t>
+                  </w:r>
+                  <w:r>
+                    <w:rPr>
+                      <w:rFonts w:ascii="Calibri" w:cs="Calibri" w:eastAsia="Calibri" w:hAnsi="Calibri"/>
+                      <w:b/>
+                      <w:bCs/>
+                      <w:color w:val="E8A33D"/>
+                      <w:sz w:val="18"/>
+                      <w:szCs w:val="18"/>
+                    </w:rPr>
+                    <w:t xml:space="preserve">_______</w:t>
                   </w:r>
                 </w:p>
               </w:tc>
@@ -3704,7 +4404,7 @@
               </w:trPr>
               <w:tc>
                 <w:tcPr>
-                  <w:tcW w:type="dxa" w:w="3800"/>
+                  <w:tcW w:type="dxa" w:w="2500"/>
                   <w:tcBorders>
                     <w:top w:val="single" w:color="B9C6E8" w:sz="6"/>
                     <w:left w:val="single" w:color="B9C6E8" w:sz="6"/>
@@ -3713,12 +4413,12 @@
                   </w:tcBorders>
                   <w:shd w:fill="F4F7FD" w:color="auto" w:val="clear"/>
                   <w:tcMar>
-                    <w:top w:type="dxa" w:w="50"/>
-                    <w:left w:type="dxa" w:w="100"/>
-                    <w:bottom w:type="dxa" w:w="50"/>
-                    <w:right w:type="dxa" w:w="100"/>
-                  </w:tcMar>
-                  <w:vAlign w:val="center"/>
+                    <w:top w:type="dxa" w:w="40"/>
+                    <w:left w:type="dxa" w:w="100"/>
+                    <w:bottom w:type="dxa" w:w="40"/>
+                    <w:right w:type="dxa" w:w="100"/>
+                  </w:tcMar>
+                  <w:vAlign w:val="top"/>
                 </w:tcPr>
                 <w:p>
                   <w:pPr>
@@ -3733,24 +4433,45 @@
                       <w:sz w:val="19"/>
                       <w:szCs w:val="19"/>
                     </w:rPr>
-                    <w:t xml:space="preserve">Präteritum  </w:t>
-                  </w:r>
+                    <w:t xml:space="preserve">Präteritum</w:t>
+                  </w:r>
+                </w:p>
+                <w:p>
+                  <w:pPr>
+                    <w:spacing w:after="0" w:before="0"/>
+                  </w:pPr>
                   <w:r>
                     <w:rPr>
                       <w:rFonts w:ascii="Calibri" w:cs="Calibri" w:eastAsia="Calibri" w:hAnsi="Calibri"/>
                       <w:b/>
                       <w:bCs/>
                       <w:color w:val="5B6B8C"/>
-                      <w:sz w:val="16"/>
-                      <w:szCs w:val="16"/>
-                    </w:rPr>
-                    <w:t xml:space="preserve">erzählt</w:t>
-                  </w:r>
-                </w:p>
-              </w:tc>
-              <w:tc>
-                <w:tcPr>
-                  <w:tcW w:type="dxa" w:w="6606"/>
+                      <w:sz w:val="15"/>
+                      <w:szCs w:val="15"/>
+                    </w:rPr>
+                    <w:t xml:space="preserve">finites Verb im Präteritum</w:t>
+                  </w:r>
+                </w:p>
+                <w:p>
+                  <w:pPr>
+                    <w:spacing w:after="0" w:before="0"/>
+                  </w:pPr>
+                  <w:r>
+                    <w:rPr>
+                      <w:rFonts w:ascii="Calibri" w:cs="Calibri" w:eastAsia="Calibri" w:hAnsi="Calibri"/>
+                      <w:i/>
+                      <w:iCs/>
+                      <w:color w:val="5B6B8C"/>
+                      <w:sz w:val="15"/>
+                      <w:szCs w:val="15"/>
+                    </w:rPr>
+                    <w:t xml:space="preserve">Ablauf und Ergebnis</w:t>
+                  </w:r>
+                </w:p>
+              </w:tc>
+              <w:tc>
+                <w:tcPr>
+                  <w:tcW w:type="dxa" w:w="7906"/>
                   <w:tcBorders>
                     <w:top w:val="single" w:color="B9C6E8" w:sz="6"/>
                     <w:left w:val="single" w:color="B9C6E8" w:sz="6"/>
@@ -3773,73 +4494,64 @@
                     <w:rPr>
                       <w:rFonts w:ascii="Calibri" w:cs="Calibri" w:eastAsia="Calibri" w:hAnsi="Calibri"/>
                       <w:color w:val="000000"/>
-                      <w:sz w:val="19"/>
-                      <w:szCs w:val="19"/>
-                    </w:rPr>
-                    <w:t xml:space="preserve">Am Samstag </w:t>
-                  </w:r>
-                  <w:r>
-                    <w:rPr>
-                      <w:rFonts w:ascii="Calibri" w:cs="Calibri" w:eastAsia="Calibri" w:hAnsi="Calibri"/>
-                      <w:b/>
-                      <w:bCs/>
-                      <w:color w:val="000000"/>
-                      <w:sz w:val="19"/>
-                      <w:szCs w:val="19"/>
-                      <w:u w:val="single"/>
-                    </w:rPr>
-                    <w:t xml:space="preserve">kämpfte</w:t>
-                  </w:r>
-                  <w:r>
-                    <w:rPr>
-                      <w:rFonts w:ascii="Calibri" w:cs="Calibri" w:eastAsia="Calibri" w:hAnsi="Calibri"/>
-                      <w:color w:val="000000"/>
-                      <w:sz w:val="19"/>
-                      <w:szCs w:val="19"/>
-                    </w:rPr>
-                    <w:t xml:space="preserve"> / </w:t>
-                  </w:r>
-                  <w:r>
-                    <w:rPr>
-                      <w:rFonts w:ascii="Calibri" w:cs="Calibri" w:eastAsia="Calibri" w:hAnsi="Calibri"/>
-                      <w:b/>
-                      <w:bCs/>
-                      <w:color w:val="000000"/>
-                      <w:sz w:val="19"/>
-                      <w:szCs w:val="19"/>
-                      <w:u w:val="single"/>
-                    </w:rPr>
-                    <w:t xml:space="preserve">spielte</w:t>
-                  </w:r>
-                  <w:r>
-                    <w:rPr>
-                      <w:rFonts w:ascii="Calibri" w:cs="Calibri" w:eastAsia="Calibri" w:hAnsi="Calibri"/>
-                      <w:color w:val="000000"/>
-                      <w:sz w:val="19"/>
-                      <w:szCs w:val="19"/>
-                    </w:rPr>
-                    <w:t xml:space="preserve"> / </w:t>
-                  </w:r>
-                  <w:r>
-                    <w:rPr>
-                      <w:rFonts w:ascii="Calibri" w:cs="Calibri" w:eastAsia="Calibri" w:hAnsi="Calibri"/>
-                      <w:b/>
-                      <w:bCs/>
-                      <w:color w:val="000000"/>
-                      <w:sz w:val="19"/>
-                      <w:szCs w:val="19"/>
-                      <w:u w:val="single"/>
-                    </w:rPr>
-                    <w:t xml:space="preserve">hob</w:t>
-                  </w:r>
-                  <w:r>
-                    <w:rPr>
-                      <w:rFonts w:ascii="Calibri" w:cs="Calibri" w:eastAsia="Calibri" w:hAnsi="Calibri"/>
-                      <w:color w:val="000000"/>
-                      <w:sz w:val="19"/>
-                      <w:szCs w:val="19"/>
-                    </w:rPr>
-                    <w:t xml:space="preserve"> ich …</w:t>
+                      <w:sz w:val="18"/>
+                      <w:szCs w:val="18"/>
+                    </w:rPr>
+                    <w:t xml:space="preserve">In der Halle …</w:t>
+                  </w:r>
+                  <w:r>
+                    <w:rPr>
+                      <w:rFonts w:ascii="Calibri" w:cs="Calibri" w:eastAsia="Calibri" w:hAnsi="Calibri"/>
+                      <w:color w:val="9AA3B5"/>
+                      <w:sz w:val="18"/>
+                      <w:szCs w:val="18"/>
+                    </w:rPr>
+                    <w:t xml:space="preserve">  ·  </w:t>
+                  </w:r>
+                  <w:r>
+                    <w:rPr>
+                      <w:rFonts w:ascii="Calibri" w:cs="Calibri" w:eastAsia="Calibri" w:hAnsi="Calibri"/>
+                      <w:color w:val="000000"/>
+                      <w:sz w:val="18"/>
+                      <w:szCs w:val="18"/>
+                    </w:rPr>
+                    <w:t xml:space="preserve">Im ersten Kampf / In der ersten Halbzeit / Im ersten Versuch …</w:t>
+                  </w:r>
+                  <w:r>
+                    <w:rPr>
+                      <w:rFonts w:ascii="Calibri" w:cs="Calibri" w:eastAsia="Calibri" w:hAnsi="Calibri"/>
+                      <w:color w:val="9AA3B5"/>
+                      <w:sz w:val="18"/>
+                      <w:szCs w:val="18"/>
+                    </w:rPr>
+                    <w:t xml:space="preserve">  ·  </w:t>
+                  </w:r>
+                  <w:r>
+                    <w:rPr>
+                      <w:rFonts w:ascii="Calibri" w:cs="Calibri" w:eastAsia="Calibri" w:hAnsi="Calibri"/>
+                      <w:color w:val="000000"/>
+                      <w:sz w:val="18"/>
+                      <w:szCs w:val="18"/>
+                    </w:rPr>
+                    <w:t xml:space="preserve">Danach …</w:t>
+                  </w:r>
+                  <w:r>
+                    <w:rPr>
+                      <w:rFonts w:ascii="Calibri" w:cs="Calibri" w:eastAsia="Calibri" w:hAnsi="Calibri"/>
+                      <w:color w:val="9AA3B5"/>
+                      <w:sz w:val="18"/>
+                      <w:szCs w:val="18"/>
+                    </w:rPr>
+                    <w:t xml:space="preserve">  ·  </w:t>
+                  </w:r>
+                  <w:r>
+                    <w:rPr>
+                      <w:rFonts w:ascii="Calibri" w:cs="Calibri" w:eastAsia="Calibri" w:hAnsi="Calibri"/>
+                      <w:color w:val="000000"/>
+                      <w:sz w:val="18"/>
+                      <w:szCs w:val="18"/>
+                    </w:rPr>
+                    <w:t xml:space="preserve">Am Ende …</w:t>
                   </w:r>
                 </w:p>
               </w:tc>
@@ -3850,7 +4562,7 @@
               </w:trPr>
               <w:tc>
                 <w:tcPr>
-                  <w:tcW w:type="dxa" w:w="3800"/>
+                  <w:tcW w:type="dxa" w:w="2500"/>
                   <w:tcBorders>
                     <w:top w:val="single" w:color="B9C6E8" w:sz="6"/>
                     <w:left w:val="single" w:color="B9C6E8" w:sz="6"/>
@@ -3859,12 +4571,12 @@
                   </w:tcBorders>
                   <w:shd w:fill="F4F7FD" w:color="auto" w:val="clear"/>
                   <w:tcMar>
-                    <w:top w:type="dxa" w:w="50"/>
-                    <w:left w:type="dxa" w:w="100"/>
-                    <w:bottom w:type="dxa" w:w="50"/>
-                    <w:right w:type="dxa" w:w="100"/>
-                  </w:tcMar>
-                  <w:vAlign w:val="center"/>
+                    <w:top w:type="dxa" w:w="40"/>
+                    <w:left w:type="dxa" w:w="100"/>
+                    <w:bottom w:type="dxa" w:w="40"/>
+                    <w:right w:type="dxa" w:w="100"/>
+                  </w:tcMar>
+                  <w:vAlign w:val="top"/>
                 </w:tcPr>
                 <w:p>
                   <w:pPr>
@@ -3879,16 +4591,21 @@
                       <w:sz w:val="19"/>
                       <w:szCs w:val="19"/>
                     </w:rPr>
-                    <w:t xml:space="preserve">Perfekt  </w:t>
-                  </w:r>
+                    <w:t xml:space="preserve">Perfekt</w:t>
+                  </w:r>
+                </w:p>
+                <w:p>
+                  <w:pPr>
+                    <w:spacing w:after="0" w:before="0"/>
+                  </w:pPr>
                   <w:r>
                     <w:rPr>
                       <w:rFonts w:ascii="Calibri" w:cs="Calibri" w:eastAsia="Calibri" w:hAnsi="Calibri"/>
                       <w:b/>
                       <w:bCs/>
                       <w:color w:val="D9534F"/>
-                      <w:sz w:val="16"/>
-                      <w:szCs w:val="16"/>
+                      <w:sz w:val="15"/>
+                      <w:szCs w:val="15"/>
                     </w:rPr>
                     <w:t xml:space="preserve">habe/bin</w:t>
                   </w:r>
@@ -3898,8 +4615,8 @@
                       <w:b/>
                       <w:bCs/>
                       <w:color w:val="5B6B8C"/>
-                      <w:sz w:val="16"/>
-                      <w:szCs w:val="16"/>
+                      <w:sz w:val="15"/>
+                      <w:szCs w:val="15"/>
                     </w:rPr>
                     <w:t xml:space="preserve"> + </w:t>
                   </w:r>
@@ -3909,16 +4626,32 @@
                       <w:b/>
                       <w:bCs/>
                       <w:color w:val="C98A1E"/>
-                      <w:sz w:val="16"/>
-                      <w:szCs w:val="16"/>
+                      <w:sz w:val="15"/>
+                      <w:szCs w:val="15"/>
                     </w:rPr>
                     <w:t xml:space="preserve">Partizip II</w:t>
                   </w:r>
                 </w:p>
-              </w:tc>
-              <w:tc>
-                <w:tcPr>
-                  <w:tcW w:type="dxa" w:w="6606"/>
+                <w:p>
+                  <w:pPr>
+                    <w:spacing w:after="0" w:before="0"/>
+                  </w:pPr>
+                  <w:r>
+                    <w:rPr>
+                      <w:rFonts w:ascii="Calibri" w:cs="Calibri" w:eastAsia="Calibri" w:hAnsi="Calibri"/>
+                      <w:i/>
+                      <w:iCs/>
+                      <w:color w:val="5B6B8C"/>
+                      <w:sz w:val="15"/>
+                      <w:szCs w:val="15"/>
+                    </w:rPr>
+                    <w:t xml:space="preserve">Was jemand gesagt hat</w:t>
+                  </w:r>
+                </w:p>
+              </w:tc>
+              <w:tc>
+                <w:tcPr>
+                  <w:tcW w:type="dxa" w:w="7906"/>
                   <w:tcBorders>
                     <w:top w:val="single" w:color="B9C6E8" w:sz="6"/>
                     <w:left w:val="single" w:color="B9C6E8" w:sz="6"/>
@@ -3941,8 +4674,8 @@
                     <w:rPr>
                       <w:rFonts w:ascii="Calibri" w:cs="Calibri" w:eastAsia="Calibri" w:hAnsi="Calibri"/>
                       <w:color w:val="000000"/>
-                      <w:sz w:val="19"/>
-                      <w:szCs w:val="19"/>
+                      <w:sz w:val="18"/>
+                      <w:szCs w:val="18"/>
                     </w:rPr>
                     <w:t xml:space="preserve">Mein Trainer sagte: „Du </w:t>
                   </w:r>
@@ -3952,8 +4685,8 @@
                       <w:b/>
                       <w:bCs/>
                       <w:color w:val="D9534F"/>
-                      <w:sz w:val="19"/>
-                      <w:szCs w:val="19"/>
+                      <w:sz w:val="18"/>
+                      <w:szCs w:val="18"/>
                     </w:rPr>
                     <w:t xml:space="preserve">hast</w:t>
                   </w:r>
@@ -3961,30 +4694,204 @@
                     <w:rPr>
                       <w:rFonts w:ascii="Calibri" w:cs="Calibri" w:eastAsia="Calibri" w:hAnsi="Calibri"/>
                       <w:color w:val="000000"/>
-                      <w:sz w:val="19"/>
-                      <w:szCs w:val="19"/>
-                    </w:rPr>
-                    <w:t xml:space="preserve"> stark </w:t>
-                  </w:r>
-                  <w:r>
-                    <w:rPr>
-                      <w:rFonts w:ascii="Calibri" w:cs="Calibri" w:eastAsia="Calibri" w:hAnsi="Calibri"/>
-                      <w:b/>
-                      <w:bCs/>
-                      <w:color w:val="C98A1E"/>
-                      <w:sz w:val="19"/>
-                      <w:szCs w:val="19"/>
-                    </w:rPr>
-                    <w:t xml:space="preserve">gekämpft</w:t>
-                  </w:r>
-                  <w:r>
-                    <w:rPr>
-                      <w:rFonts w:ascii="Calibri" w:cs="Calibri" w:eastAsia="Calibri" w:hAnsi="Calibri"/>
-                      <w:color w:val="000000"/>
-                      <w:sz w:val="19"/>
-                      <w:szCs w:val="19"/>
-                    </w:rPr>
-                    <w:t xml:space="preserve">!“</w:t>
+                      <w:sz w:val="18"/>
+                      <w:szCs w:val="18"/>
+                    </w:rPr>
+                    <w:t xml:space="preserve"> … </w:t>
+                  </w:r>
+                  <w:r>
+                    <w:rPr>
+                      <w:rFonts w:ascii="Calibri" w:cs="Calibri" w:eastAsia="Calibri" w:hAnsi="Calibri"/>
+                      <w:b/>
+                      <w:bCs/>
+                      <w:color w:val="E8A33D"/>
+                      <w:sz w:val="18"/>
+                      <w:szCs w:val="18"/>
+                    </w:rPr>
+                    <w:t xml:space="preserve">_______</w:t>
+                  </w:r>
+                  <w:r>
+                    <w:rPr>
+                      <w:rFonts w:ascii="Calibri" w:cs="Calibri" w:eastAsia="Calibri" w:hAnsi="Calibri"/>
+                      <w:color w:val="000000"/>
+                      <w:sz w:val="18"/>
+                      <w:szCs w:val="18"/>
+                    </w:rPr>
+                    <w:t xml:space="preserve">“</w:t>
+                  </w:r>
+                  <w:r>
+                    <w:rPr>
+                      <w:rFonts w:ascii="Calibri" w:cs="Calibri" w:eastAsia="Calibri" w:hAnsi="Calibri"/>
+                      <w:color w:val="9AA3B5"/>
+                      <w:sz w:val="18"/>
+                      <w:szCs w:val="18"/>
+                    </w:rPr>
+                    <w:t xml:space="preserve">  ·  </w:t>
+                  </w:r>
+                  <w:r>
+                    <w:rPr>
+                      <w:rFonts w:ascii="Calibri" w:cs="Calibri" w:eastAsia="Calibri" w:hAnsi="Calibri"/>
+                      <w:color w:val="000000"/>
+                      <w:sz w:val="18"/>
+                      <w:szCs w:val="18"/>
+                    </w:rPr>
+                    <w:t xml:space="preserve">Mein Team rief: „Wir </w:t>
+                  </w:r>
+                  <w:r>
+                    <w:rPr>
+                      <w:rFonts w:ascii="Calibri" w:cs="Calibri" w:eastAsia="Calibri" w:hAnsi="Calibri"/>
+                      <w:b/>
+                      <w:bCs/>
+                      <w:color w:val="D9534F"/>
+                      <w:sz w:val="18"/>
+                      <w:szCs w:val="18"/>
+                    </w:rPr>
+                    <w:t xml:space="preserve">haben</w:t>
+                  </w:r>
+                  <w:r>
+                    <w:rPr>
+                      <w:rFonts w:ascii="Calibri" w:cs="Calibri" w:eastAsia="Calibri" w:hAnsi="Calibri"/>
+                      <w:color w:val="000000"/>
+                      <w:sz w:val="18"/>
+                      <w:szCs w:val="18"/>
+                    </w:rPr>
+                    <w:t xml:space="preserve"> … </w:t>
+                  </w:r>
+                  <w:r>
+                    <w:rPr>
+                      <w:rFonts w:ascii="Calibri" w:cs="Calibri" w:eastAsia="Calibri" w:hAnsi="Calibri"/>
+                      <w:b/>
+                      <w:bCs/>
+                      <w:color w:val="E8A33D"/>
+                      <w:sz w:val="18"/>
+                      <w:szCs w:val="18"/>
+                    </w:rPr>
+                    <w:t xml:space="preserve">_______</w:t>
+                  </w:r>
+                  <w:r>
+                    <w:rPr>
+                      <w:rFonts w:ascii="Calibri" w:cs="Calibri" w:eastAsia="Calibri" w:hAnsi="Calibri"/>
+                      <w:color w:val="000000"/>
+                      <w:sz w:val="18"/>
+                      <w:szCs w:val="18"/>
+                    </w:rPr>
+                    <w:t xml:space="preserve">“</w:t>
+                  </w:r>
+                  <w:r>
+                    <w:rPr>
+                      <w:rFonts w:ascii="Calibri" w:cs="Calibri" w:eastAsia="Calibri" w:hAnsi="Calibri"/>
+                      <w:color w:val="9AA3B5"/>
+                      <w:sz w:val="18"/>
+                      <w:szCs w:val="18"/>
+                    </w:rPr>
+                    <w:t xml:space="preserve">  ·  </w:t>
+                  </w:r>
+                  <w:r>
+                    <w:rPr>
+                      <w:rFonts w:ascii="Calibri" w:cs="Calibri" w:eastAsia="Calibri" w:hAnsi="Calibri"/>
+                      <w:color w:val="000000"/>
+                      <w:sz w:val="18"/>
+                      <w:szCs w:val="18"/>
+                    </w:rPr>
+                    <w:t xml:space="preserve">Meine Eltern fragten: „</w:t>
+                  </w:r>
+                  <w:r>
+                    <w:rPr>
+                      <w:rFonts w:ascii="Calibri" w:cs="Calibri" w:eastAsia="Calibri" w:hAnsi="Calibri"/>
+                      <w:b/>
+                      <w:bCs/>
+                      <w:color w:val="D9534F"/>
+                      <w:sz w:val="18"/>
+                      <w:szCs w:val="18"/>
+                    </w:rPr>
+                    <w:t xml:space="preserve">Hast</w:t>
+                  </w:r>
+                  <w:r>
+                    <w:rPr>
+                      <w:rFonts w:ascii="Calibri" w:cs="Calibri" w:eastAsia="Calibri" w:hAnsi="Calibri"/>
+                      <w:color w:val="000000"/>
+                      <w:sz w:val="18"/>
+                      <w:szCs w:val="18"/>
+                    </w:rPr>
+                    <w:t xml:space="preserve"> du … </w:t>
+                  </w:r>
+                  <w:r>
+                    <w:rPr>
+                      <w:rFonts w:ascii="Calibri" w:cs="Calibri" w:eastAsia="Calibri" w:hAnsi="Calibri"/>
+                      <w:b/>
+                      <w:bCs/>
+                      <w:color w:val="E8A33D"/>
+                      <w:sz w:val="18"/>
+                      <w:szCs w:val="18"/>
+                    </w:rPr>
+                    <w:t xml:space="preserve">_______</w:t>
+                  </w:r>
+                  <w:r>
+                    <w:rPr>
+                      <w:rFonts w:ascii="Calibri" w:cs="Calibri" w:eastAsia="Calibri" w:hAnsi="Calibri"/>
+                      <w:color w:val="000000"/>
+                      <w:sz w:val="18"/>
+                      <w:szCs w:val="18"/>
+                    </w:rPr>
+                    <w:t xml:space="preserve">?“</w:t>
+                  </w:r>
+                  <w:r>
+                    <w:rPr>
+                      <w:rFonts w:ascii="Calibri" w:cs="Calibri" w:eastAsia="Calibri" w:hAnsi="Calibri"/>
+                      <w:color w:val="9AA3B5"/>
+                      <w:sz w:val="18"/>
+                      <w:szCs w:val="18"/>
+                    </w:rPr>
+                    <w:t xml:space="preserve">  ·  </w:t>
+                  </w:r>
+                  <w:r>
+                    <w:rPr>
+                      <w:rFonts w:ascii="Calibri" w:cs="Calibri" w:eastAsia="Calibri" w:hAnsi="Calibri"/>
+                      <w:color w:val="000000"/>
+                      <w:sz w:val="18"/>
+                      <w:szCs w:val="18"/>
+                    </w:rPr>
+                    <w:t xml:space="preserve">Ich antwortete: „Ich </w:t>
+                  </w:r>
+                  <w:r>
+                    <w:rPr>
+                      <w:rFonts w:ascii="Calibri" w:cs="Calibri" w:eastAsia="Calibri" w:hAnsi="Calibri"/>
+                      <w:b/>
+                      <w:bCs/>
+                      <w:color w:val="D9534F"/>
+                      <w:sz w:val="18"/>
+                      <w:szCs w:val="18"/>
+                    </w:rPr>
+                    <w:t xml:space="preserve">bin</w:t>
+                  </w:r>
+                  <w:r>
+                    <w:rPr>
+                      <w:rFonts w:ascii="Calibri" w:cs="Calibri" w:eastAsia="Calibri" w:hAnsi="Calibri"/>
+                      <w:color w:val="000000"/>
+                      <w:sz w:val="18"/>
+                      <w:szCs w:val="18"/>
+                    </w:rPr>
+                    <w:t xml:space="preserve"> … </w:t>
+                  </w:r>
+                  <w:r>
+                    <w:rPr>
+                      <w:rFonts w:ascii="Calibri" w:cs="Calibri" w:eastAsia="Calibri" w:hAnsi="Calibri"/>
+                      <w:b/>
+                      <w:bCs/>
+                      <w:color w:val="E8A33D"/>
+                      <w:sz w:val="18"/>
+                      <w:szCs w:val="18"/>
+                    </w:rPr>
+                    <w:t xml:space="preserve">_______</w:t>
+                  </w:r>
+                  <w:r>
+                    <w:rPr>
+                      <w:rFonts w:ascii="Calibri" w:cs="Calibri" w:eastAsia="Calibri" w:hAnsi="Calibri"/>
+                      <w:color w:val="000000"/>
+                      <w:sz w:val="18"/>
+                      <w:szCs w:val="18"/>
+                    </w:rPr>
+                    <w:t xml:space="preserve">“</w:t>
                   </w:r>
                 </w:p>
               </w:tc>
@@ -3995,7 +4902,7 @@
               </w:trPr>
               <w:tc>
                 <w:tcPr>
-                  <w:tcW w:type="dxa" w:w="3800"/>
+                  <w:tcW w:type="dxa" w:w="2500"/>
                   <w:tcBorders>
                     <w:top w:val="single" w:color="B9C6E8" w:sz="6"/>
                     <w:left w:val="single" w:color="B9C6E8" w:sz="6"/>
@@ -4004,12 +4911,12 @@
                   </w:tcBorders>
                   <w:shd w:fill="F4F7FD" w:color="auto" w:val="clear"/>
                   <w:tcMar>
-                    <w:top w:type="dxa" w:w="50"/>
-                    <w:left w:type="dxa" w:w="100"/>
-                    <w:bottom w:type="dxa" w:w="50"/>
-                    <w:right w:type="dxa" w:w="100"/>
-                  </w:tcMar>
-                  <w:vAlign w:val="center"/>
+                    <w:top w:type="dxa" w:w="40"/>
+                    <w:left w:type="dxa" w:w="100"/>
+                    <w:bottom w:type="dxa" w:w="40"/>
+                    <w:right w:type="dxa" w:w="100"/>
+                  </w:tcMar>
+                  <w:vAlign w:val="top"/>
                 </w:tcPr>
                 <w:p>
                   <w:pPr>
@@ -4024,24 +4931,45 @@
                       <w:sz w:val="19"/>
                       <w:szCs w:val="19"/>
                     </w:rPr>
-                    <w:t xml:space="preserve">Präsens  </w:t>
-                  </w:r>
+                    <w:t xml:space="preserve">Präsens</w:t>
+                  </w:r>
+                </w:p>
+                <w:p>
+                  <w:pPr>
+                    <w:spacing w:after="0" w:before="0"/>
+                  </w:pPr>
                   <w:r>
                     <w:rPr>
                       <w:rFonts w:ascii="Calibri" w:cs="Calibri" w:eastAsia="Calibri" w:hAnsi="Calibri"/>
                       <w:b/>
                       <w:bCs/>
                       <w:color w:val="5B6B8C"/>
-                      <w:sz w:val="16"/>
-                      <w:szCs w:val="16"/>
-                    </w:rPr>
-                    <w:t xml:space="preserve">jetzt</w:t>
-                  </w:r>
-                </w:p>
-              </w:tc>
-              <w:tc>
-                <w:tcPr>
-                  <w:tcW w:type="dxa" w:w="6606"/>
+                      <w:sz w:val="15"/>
+                      <w:szCs w:val="15"/>
+                    </w:rPr>
+                    <w:t xml:space="preserve">finites Verb im Präsens</w:t>
+                  </w:r>
+                </w:p>
+                <w:p>
+                  <w:pPr>
+                    <w:spacing w:after="0" w:before="0"/>
+                  </w:pPr>
+                  <w:r>
+                    <w:rPr>
+                      <w:rFonts w:ascii="Calibri" w:cs="Calibri" w:eastAsia="Calibri" w:hAnsi="Calibri"/>
+                      <w:i/>
+                      <w:iCs/>
+                      <w:color w:val="5B6B8C"/>
+                      <w:sz w:val="15"/>
+                      <w:szCs w:val="15"/>
+                    </w:rPr>
+                    <w:t xml:space="preserve">Wie es dir jetzt geht</w:t>
+                  </w:r>
+                </w:p>
+              </w:tc>
+              <w:tc>
+                <w:tcPr>
+                  <w:tcW w:type="dxa" w:w="7906"/>
                   <w:tcBorders>
                     <w:top w:val="single" w:color="B9C6E8" w:sz="6"/>
                     <w:left w:val="single" w:color="B9C6E8" w:sz="6"/>
@@ -4064,31 +4992,64 @@
                     <w:rPr>
                       <w:rFonts w:ascii="Calibri" w:cs="Calibri" w:eastAsia="Calibri" w:hAnsi="Calibri"/>
                       <w:color w:val="000000"/>
-                      <w:sz w:val="19"/>
-                      <w:szCs w:val="19"/>
-                    </w:rPr>
-                    <w:t xml:space="preserve">Heute </w:t>
-                  </w:r>
-                  <w:r>
-                    <w:rPr>
-                      <w:rFonts w:ascii="Calibri" w:cs="Calibri" w:eastAsia="Calibri" w:hAnsi="Calibri"/>
-                      <w:b/>
-                      <w:bCs/>
-                      <w:color w:val="000000"/>
-                      <w:sz w:val="19"/>
-                      <w:szCs w:val="19"/>
-                      <w:u w:val="single"/>
-                    </w:rPr>
-                    <w:t xml:space="preserve">bin</w:t>
-                  </w:r>
-                  <w:r>
-                    <w:rPr>
-                      <w:rFonts w:ascii="Calibri" w:cs="Calibri" w:eastAsia="Calibri" w:hAnsi="Calibri"/>
-                      <w:color w:val="000000"/>
-                      <w:sz w:val="19"/>
-                      <w:szCs w:val="19"/>
-                    </w:rPr>
-                    <w:t xml:space="preserve"> ich noch müde.</w:t>
+                      <w:sz w:val="18"/>
+                      <w:szCs w:val="18"/>
+                    </w:rPr>
+                    <w:t xml:space="preserve">Heute …</w:t>
+                  </w:r>
+                  <w:r>
+                    <w:rPr>
+                      <w:rFonts w:ascii="Calibri" w:cs="Calibri" w:eastAsia="Calibri" w:hAnsi="Calibri"/>
+                      <w:color w:val="9AA3B5"/>
+                      <w:sz w:val="18"/>
+                      <w:szCs w:val="18"/>
+                    </w:rPr>
+                    <w:t xml:space="preserve">  ·  </w:t>
+                  </w:r>
+                  <w:r>
+                    <w:rPr>
+                      <w:rFonts w:ascii="Calibri" w:cs="Calibri" w:eastAsia="Calibri" w:hAnsi="Calibri"/>
+                      <w:color w:val="000000"/>
+                      <w:sz w:val="18"/>
+                      <w:szCs w:val="18"/>
+                    </w:rPr>
+                    <w:t xml:space="preserve">Jetzt fühle ich mich …</w:t>
+                  </w:r>
+                  <w:r>
+                    <w:rPr>
+                      <w:rFonts w:ascii="Calibri" w:cs="Calibri" w:eastAsia="Calibri" w:hAnsi="Calibri"/>
+                      <w:color w:val="9AA3B5"/>
+                      <w:sz w:val="18"/>
+                      <w:szCs w:val="18"/>
+                    </w:rPr>
+                    <w:t xml:space="preserve">  ·  </w:t>
+                  </w:r>
+                  <w:r>
+                    <w:rPr>
+                      <w:rFonts w:ascii="Calibri" w:cs="Calibri" w:eastAsia="Calibri" w:hAnsi="Calibri"/>
+                      <w:color w:val="000000"/>
+                      <w:sz w:val="18"/>
+                      <w:szCs w:val="18"/>
+                    </w:rPr>
+                    <w:t xml:space="preserve">Mein Körper …</w:t>
+                  </w:r>
+                  <w:r>
+                    <w:rPr>
+                      <w:rFonts w:ascii="Calibri" w:cs="Calibri" w:eastAsia="Calibri" w:hAnsi="Calibri"/>
+                      <w:color w:val="9AA3B5"/>
+                      <w:sz w:val="18"/>
+                      <w:szCs w:val="18"/>
+                    </w:rPr>
+                    <w:t xml:space="preserve">  ·  </w:t>
+                  </w:r>
+                  <w:r>
+                    <w:rPr>
+                      <w:rFonts w:ascii="Calibri" w:cs="Calibri" w:eastAsia="Calibri" w:hAnsi="Calibri"/>
+                      <w:color w:val="000000"/>
+                      <w:sz w:val="18"/>
+                      <w:szCs w:val="18"/>
+                    </w:rPr>
+                    <w:t xml:space="preserve">Im Moment …</w:t>
                   </w:r>
                 </w:p>
               </w:tc>
@@ -4099,7 +5060,7 @@
               </w:trPr>
               <w:tc>
                 <w:tcPr>
-                  <w:tcW w:type="dxa" w:w="3800"/>
+                  <w:tcW w:type="dxa" w:w="2500"/>
                   <w:tcBorders>
                     <w:top w:val="single" w:color="B9C6E8" w:sz="6"/>
                     <w:left w:val="single" w:color="B9C6E8" w:sz="6"/>
@@ -4108,12 +5069,12 @@
                   </w:tcBorders>
                   <w:shd w:fill="F4F7FD" w:color="auto" w:val="clear"/>
                   <w:tcMar>
-                    <w:top w:type="dxa" w:w="50"/>
-                    <w:left w:type="dxa" w:w="100"/>
-                    <w:bottom w:type="dxa" w:w="50"/>
-                    <w:right w:type="dxa" w:w="100"/>
-                  </w:tcMar>
-                  <w:vAlign w:val="center"/>
+                    <w:top w:type="dxa" w:w="40"/>
+                    <w:left w:type="dxa" w:w="100"/>
+                    <w:bottom w:type="dxa" w:w="40"/>
+                    <w:right w:type="dxa" w:w="100"/>
+                  </w:tcMar>
+                  <w:vAlign w:val="top"/>
                 </w:tcPr>
                 <w:p>
                   <w:pPr>
@@ -4128,16 +5089,21 @@
                       <w:sz w:val="19"/>
                       <w:szCs w:val="19"/>
                     </w:rPr>
-                    <w:t xml:space="preserve">Futur I  </w:t>
-                  </w:r>
+                    <w:t xml:space="preserve">Futur I</w:t>
+                  </w:r>
+                </w:p>
+                <w:p>
+                  <w:pPr>
+                    <w:spacing w:after="0" w:before="0"/>
+                  </w:pPr>
                   <w:r>
                     <w:rPr>
                       <w:rFonts w:ascii="Calibri" w:cs="Calibri" w:eastAsia="Calibri" w:hAnsi="Calibri"/>
                       <w:b/>
                       <w:bCs/>
                       <w:color w:val="D9534F"/>
-                      <w:sz w:val="16"/>
-                      <w:szCs w:val="16"/>
+                      <w:sz w:val="15"/>
+                      <w:szCs w:val="15"/>
                     </w:rPr>
                     <w:t xml:space="preserve">werde</w:t>
                   </w:r>
@@ -4147,8 +5113,8 @@
                       <w:b/>
                       <w:bCs/>
                       <w:color w:val="5B6B8C"/>
-                      <w:sz w:val="16"/>
-                      <w:szCs w:val="16"/>
+                      <w:sz w:val="15"/>
+                      <w:szCs w:val="15"/>
                     </w:rPr>
                     <w:t xml:space="preserve"> + </w:t>
                   </w:r>
@@ -4158,16 +5124,32 @@
                       <w:b/>
                       <w:bCs/>
                       <w:color w:val="3F7CC4"/>
-                      <w:sz w:val="16"/>
-                      <w:szCs w:val="16"/>
+                      <w:sz w:val="15"/>
+                      <w:szCs w:val="15"/>
                     </w:rPr>
                     <w:t xml:space="preserve">Infinitiv</w:t>
                   </w:r>
                 </w:p>
-              </w:tc>
-              <w:tc>
-                <w:tcPr>
-                  <w:tcW w:type="dxa" w:w="6606"/>
+                <w:p>
+                  <w:pPr>
+                    <w:spacing w:after="0" w:before="0"/>
+                  </w:pPr>
+                  <w:r>
+                    <w:rPr>
+                      <w:rFonts w:ascii="Calibri" w:cs="Calibri" w:eastAsia="Calibri" w:hAnsi="Calibri"/>
+                      <w:i/>
+                      <w:iCs/>
+                      <w:color w:val="5B6B8C"/>
+                      <w:sz w:val="15"/>
+                      <w:szCs w:val="15"/>
+                    </w:rPr>
+                    <w:t xml:space="preserve">Deine Ziele</w:t>
+                  </w:r>
+                </w:p>
+              </w:tc>
+              <w:tc>
+                <w:tcPr>
+                  <w:tcW w:type="dxa" w:w="7906"/>
                   <w:tcBorders>
                     <w:top w:val="single" w:color="B9C6E8" w:sz="6"/>
                     <w:left w:val="single" w:color="B9C6E8" w:sz="6"/>
@@ -4190,8 +5172,8 @@
                     <w:rPr>
                       <w:rFonts w:ascii="Calibri" w:cs="Calibri" w:eastAsia="Calibri" w:hAnsi="Calibri"/>
                       <w:color w:val="000000"/>
-                      <w:sz w:val="19"/>
-                      <w:szCs w:val="19"/>
+                      <w:sz w:val="18"/>
+                      <w:szCs w:val="18"/>
                     </w:rPr>
                     <w:t xml:space="preserve">Beim nächsten Wettkampf </w:t>
                   </w:r>
@@ -4201,8 +5183,8 @@
                       <w:b/>
                       <w:bCs/>
                       <w:color w:val="D9534F"/>
-                      <w:sz w:val="19"/>
-                      <w:szCs w:val="19"/>
+                      <w:sz w:val="18"/>
+                      <w:szCs w:val="18"/>
                     </w:rPr>
                     <w:t xml:space="preserve">werde</w:t>
                   </w:r>
@@ -4210,10 +5192,10 @@
                     <w:rPr>
                       <w:rFonts w:ascii="Calibri" w:cs="Calibri" w:eastAsia="Calibri" w:hAnsi="Calibri"/>
                       <w:color w:val="000000"/>
-                      <w:sz w:val="19"/>
-                      <w:szCs w:val="19"/>
-                    </w:rPr>
-                    <w:t xml:space="preserve"> ich früher </w:t>
+                      <w:sz w:val="18"/>
+                      <w:szCs w:val="18"/>
+                    </w:rPr>
+                    <w:t xml:space="preserve"> ich … </w:t>
                   </w:r>
                   <w:r>
                     <w:rPr>
@@ -4221,19 +5203,157 @@
                       <w:b/>
                       <w:bCs/>
                       <w:color w:val="3F7CC4"/>
-                      <w:sz w:val="19"/>
-                      <w:szCs w:val="19"/>
-                    </w:rPr>
-                    <w:t xml:space="preserve">angreifen</w:t>
-                  </w:r>
-                  <w:r>
-                    <w:rPr>
-                      <w:rFonts w:ascii="Calibri" w:cs="Calibri" w:eastAsia="Calibri" w:hAnsi="Calibri"/>
-                      <w:color w:val="000000"/>
-                      <w:sz w:val="19"/>
-                      <w:szCs w:val="19"/>
-                    </w:rPr>
-                    <w:t xml:space="preserve">.</w:t>
+                      <w:sz w:val="18"/>
+                      <w:szCs w:val="18"/>
+                    </w:rPr>
+                    <w:t xml:space="preserve">_______</w:t>
+                  </w:r>
+                  <w:r>
+                    <w:rPr>
+                      <w:rFonts w:ascii="Calibri" w:cs="Calibri" w:eastAsia="Calibri" w:hAnsi="Calibri"/>
+                      <w:color w:val="9AA3B5"/>
+                      <w:sz w:val="18"/>
+                      <w:szCs w:val="18"/>
+                    </w:rPr>
+                    <w:t xml:space="preserve">  ·  </w:t>
+                  </w:r>
+                  <w:r>
+                    <w:rPr>
+                      <w:rFonts w:ascii="Calibri" w:cs="Calibri" w:eastAsia="Calibri" w:hAnsi="Calibri"/>
+                      <w:color w:val="000000"/>
+                      <w:sz w:val="18"/>
+                      <w:szCs w:val="18"/>
+                    </w:rPr>
+                    <w:t xml:space="preserve">Im Training </w:t>
+                  </w:r>
+                  <w:r>
+                    <w:rPr>
+                      <w:rFonts w:ascii="Calibri" w:cs="Calibri" w:eastAsia="Calibri" w:hAnsi="Calibri"/>
+                      <w:b/>
+                      <w:bCs/>
+                      <w:color w:val="D9534F"/>
+                      <w:sz w:val="18"/>
+                      <w:szCs w:val="18"/>
+                    </w:rPr>
+                    <w:t xml:space="preserve">werde</w:t>
+                  </w:r>
+                  <w:r>
+                    <w:rPr>
+                      <w:rFonts w:ascii="Calibri" w:cs="Calibri" w:eastAsia="Calibri" w:hAnsi="Calibri"/>
+                      <w:color w:val="000000"/>
+                      <w:sz w:val="18"/>
+                      <w:szCs w:val="18"/>
+                    </w:rPr>
+                    <w:t xml:space="preserve"> ich … </w:t>
+                  </w:r>
+                  <w:r>
+                    <w:rPr>
+                      <w:rFonts w:ascii="Calibri" w:cs="Calibri" w:eastAsia="Calibri" w:hAnsi="Calibri"/>
+                      <w:b/>
+                      <w:bCs/>
+                      <w:color w:val="3F7CC4"/>
+                      <w:sz w:val="18"/>
+                      <w:szCs w:val="18"/>
+                    </w:rPr>
+                    <w:t xml:space="preserve">_______</w:t>
+                  </w:r>
+                  <w:r>
+                    <w:rPr>
+                      <w:rFonts w:ascii="Calibri" w:cs="Calibri" w:eastAsia="Calibri" w:hAnsi="Calibri"/>
+                      <w:color w:val="9AA3B5"/>
+                      <w:sz w:val="18"/>
+                      <w:szCs w:val="18"/>
+                    </w:rPr>
+                    <w:t xml:space="preserve">  ·  </w:t>
+                  </w:r>
+                  <w:r>
+                    <w:rPr>
+                      <w:rFonts w:ascii="Calibri" w:cs="Calibri" w:eastAsia="Calibri" w:hAnsi="Calibri"/>
+                      <w:color w:val="000000"/>
+                      <w:sz w:val="18"/>
+                      <w:szCs w:val="18"/>
+                    </w:rPr>
+                    <w:t xml:space="preserve">Ab morgen </w:t>
+                  </w:r>
+                  <w:r>
+                    <w:rPr>
+                      <w:rFonts w:ascii="Calibri" w:cs="Calibri" w:eastAsia="Calibri" w:hAnsi="Calibri"/>
+                      <w:b/>
+                      <w:bCs/>
+                      <w:color w:val="D9534F"/>
+                      <w:sz w:val="18"/>
+                      <w:szCs w:val="18"/>
+                    </w:rPr>
+                    <w:t xml:space="preserve">werde</w:t>
+                  </w:r>
+                  <w:r>
+                    <w:rPr>
+                      <w:rFonts w:ascii="Calibri" w:cs="Calibri" w:eastAsia="Calibri" w:hAnsi="Calibri"/>
+                      <w:color w:val="000000"/>
+                      <w:sz w:val="18"/>
+                      <w:szCs w:val="18"/>
+                    </w:rPr>
+                    <w:t xml:space="preserve"> ich … </w:t>
+                  </w:r>
+                  <w:r>
+                    <w:rPr>
+                      <w:rFonts w:ascii="Calibri" w:cs="Calibri" w:eastAsia="Calibri" w:hAnsi="Calibri"/>
+                      <w:b/>
+                      <w:bCs/>
+                      <w:color w:val="3F7CC4"/>
+                      <w:sz w:val="18"/>
+                      <w:szCs w:val="18"/>
+                    </w:rPr>
+                    <w:t xml:space="preserve">_______</w:t>
+                  </w:r>
+                  <w:r>
+                    <w:rPr>
+                      <w:rFonts w:ascii="Calibri" w:cs="Calibri" w:eastAsia="Calibri" w:hAnsi="Calibri"/>
+                      <w:color w:val="9AA3B5"/>
+                      <w:sz w:val="18"/>
+                      <w:szCs w:val="18"/>
+                    </w:rPr>
+                    <w:t xml:space="preserve">  ·  </w:t>
+                  </w:r>
+                  <w:r>
+                    <w:rPr>
+                      <w:rFonts w:ascii="Calibri" w:cs="Calibri" w:eastAsia="Calibri" w:hAnsi="Calibri"/>
+                      <w:color w:val="000000"/>
+                      <w:sz w:val="18"/>
+                      <w:szCs w:val="18"/>
+                    </w:rPr>
+                    <w:t xml:space="preserve">Wir </w:t>
+                  </w:r>
+                  <w:r>
+                    <w:rPr>
+                      <w:rFonts w:ascii="Calibri" w:cs="Calibri" w:eastAsia="Calibri" w:hAnsi="Calibri"/>
+                      <w:b/>
+                      <w:bCs/>
+                      <w:color w:val="D9534F"/>
+                      <w:sz w:val="18"/>
+                      <w:szCs w:val="18"/>
+                    </w:rPr>
+                    <w:t xml:space="preserve">werden</w:t>
+                  </w:r>
+                  <w:r>
+                    <w:rPr>
+                      <w:rFonts w:ascii="Calibri" w:cs="Calibri" w:eastAsia="Calibri" w:hAnsi="Calibri"/>
+                      <w:color w:val="000000"/>
+                      <w:sz w:val="18"/>
+                      <w:szCs w:val="18"/>
+                    </w:rPr>
+                    <w:t xml:space="preserve"> … </w:t>
+                  </w:r>
+                  <w:r>
+                    <w:rPr>
+                      <w:rFonts w:ascii="Calibri" w:cs="Calibri" w:eastAsia="Calibri" w:hAnsi="Calibri"/>
+                      <w:b/>
+                      <w:bCs/>
+                      <w:color w:val="3F7CC4"/>
+                      <w:sz w:val="18"/>
+                      <w:szCs w:val="18"/>
+                    </w:rPr>
+                    <w:t xml:space="preserve">_______</w:t>
                   </w:r>
                 </w:p>
               </w:tc>
@@ -4257,7 +5377,7 @@
             <w:tr>
               <w:trPr>
                 <w:cantSplit/>
-                <w:trHeight w:val="540" w:hRule="exact"/>
+                <w:trHeight w:val="480" w:hRule="exact"/>
               </w:trPr>
               <w:tc>
                 <w:tcPr>
@@ -4295,7 +5415,7 @@
             <w:tr>
               <w:trPr>
                 <w:cantSplit/>
-                <w:trHeight w:val="540" w:hRule="exact"/>
+                <w:trHeight w:val="480" w:hRule="exact"/>
               </w:trPr>
               <w:tc>
                 <w:tcPr>
@@ -4333,7 +5453,7 @@
             <w:tr>
               <w:trPr>
                 <w:cantSplit/>
-                <w:trHeight w:val="540" w:hRule="exact"/>
+                <w:trHeight w:val="480" w:hRule="exact"/>
               </w:trPr>
               <w:tc>
                 <w:tcPr>
@@ -4371,7 +5491,7 @@
             <w:tr>
               <w:trPr>
                 <w:cantSplit/>
-                <w:trHeight w:val="540" w:hRule="exact"/>
+                <w:trHeight w:val="480" w:hRule="exact"/>
               </w:trPr>
               <w:tc>
                 <w:tcPr>
@@ -4409,7 +5529,7 @@
             <w:tr>
               <w:trPr>
                 <w:cantSplit/>
-                <w:trHeight w:val="540" w:hRule="exact"/>
+                <w:trHeight w:val="480" w:hRule="exact"/>
               </w:trPr>
               <w:tc>
                 <w:tcPr>
@@ -4447,7 +5567,7 @@
             <w:tr>
               <w:trPr>
                 <w:cantSplit/>
-                <w:trHeight w:val="540" w:hRule="exact"/>
+                <w:trHeight w:val="480" w:hRule="exact"/>
               </w:trPr>
               <w:tc>
                 <w:tcPr>
@@ -4482,48 +5602,10 @@
                 </w:p>
               </w:tc>
             </w:tr>
-            <w:tr>
-              <w:trPr>
-                <w:cantSplit/>
-                <w:trHeight w:val="540" w:hRule="exact"/>
-              </w:trPr>
-              <w:tc>
-                <w:tcPr>
-                  <w:tcW w:type="dxa" w:w="10406"/>
-                  <w:tcBorders>
-                    <w:top w:val="none" w:color="FFFFFF" w:sz="0"/>
-                    <w:left w:val="none" w:color="FFFFFF" w:sz="0"/>
-                    <w:bottom w:val="single" w:color="9AA3B5" w:sz="6"/>
-                    <w:right w:val="none" w:color="FFFFFF" w:sz="0"/>
-                  </w:tcBorders>
-                  <w:tcMar>
-                    <w:top w:type="dxa" w:w="60"/>
-                    <w:left w:type="dxa" w:w="100"/>
-                    <w:bottom w:type="dxa" w:w="60"/>
-                    <w:right w:type="dxa" w:w="100"/>
-                  </w:tcMar>
-                  <w:vAlign w:val="center"/>
-                </w:tcPr>
-                <w:p>
-                  <w:pPr>
-                    <w:spacing w:after="0" w:before="0"/>
-                  </w:pPr>
-                  <w:r>
-                    <w:rPr>
-                      <w:rFonts w:ascii="Calibri" w:cs="Calibri" w:eastAsia="Calibri" w:hAnsi="Calibri"/>
-                      <w:color w:val="000000"/>
-                      <w:sz w:val="22"/>
-                      <w:szCs w:val="22"/>
-                    </w:rPr>
-                    <w:t xml:space="preserve"/>
-                  </w:r>
-                </w:p>
-              </w:tc>
-            </w:tr>
           </w:tbl>
           <w:p>
             <w:pPr>
-              <w:spacing w:after="0" w:before="100"/>
+              <w:spacing w:after="0" w:before="80"/>
             </w:pPr>
             <w:r>
               <w:rPr>

</xml_diff>

<commit_message>
Satzstreifen: Label „Mustertext“ entfernt, kleine Zahl für die Reihenfolge
Co-Authored-By: Claude Opus 5.5 <noreply@anthropic.com>
Claude-Session: https://claude.ai/code/session_01KXvLXHMYPnCyEbMRgNaaYs
</commit_message>
<xml_diff>
--- a/Deutsch_7A/Zeitformen_Zeitstrahl/Druckvorlage_Zeitformen_Zeitstrahl.docx
+++ b/Deutsch_7A/Zeitformen_Zeitstrahl/Druckvorlage_Zeitformen_Zeitstrahl.docx
@@ -5685,13 +5685,11 @@
             <w:r>
               <w:rPr>
                 <w:rFonts w:ascii="Calibri" w:cs="Calibri" w:eastAsia="Calibri" w:hAnsi="Calibri"/>
-                <w:b/>
-                <w:bCs/>
-                <w:color w:val="5B6B8C"/>
-                <w:sz w:val="32"/>
-                <w:szCs w:val="32"/>
-              </w:rPr>
-              <w:t xml:space="preserve">MUSTERTEXT</w:t>
+                <w:color w:val="A9B0BE"/>
+                <w:sz w:val="18"/>
+                <w:szCs w:val="18"/>
+              </w:rPr>
+              <w:t xml:space="preserve">3</w:t>
             </w:r>
           </w:p>
           <w:p>
@@ -5772,13 +5770,11 @@
             <w:r>
               <w:rPr>
                 <w:rFonts w:ascii="Calibri" w:cs="Calibri" w:eastAsia="Calibri" w:hAnsi="Calibri"/>
-                <w:b/>
-                <w:bCs/>
-                <w:color w:val="5B6B8C"/>
-                <w:sz w:val="32"/>
-                <w:szCs w:val="32"/>
-              </w:rPr>
-              <w:t xml:space="preserve">MUSTERTEXT</w:t>
+                <w:color w:val="A9B0BE"/>
+                <w:sz w:val="18"/>
+                <w:szCs w:val="18"/>
+              </w:rPr>
+              <w:t xml:space="preserve">7</w:t>
             </w:r>
           </w:p>
           <w:p>
@@ -5850,13 +5846,11 @@
             <w:r>
               <w:rPr>
                 <w:rFonts w:ascii="Calibri" w:cs="Calibri" w:eastAsia="Calibri" w:hAnsi="Calibri"/>
-                <w:b/>
-                <w:bCs/>
-                <w:color w:val="5B6B8C"/>
-                <w:sz w:val="32"/>
-                <w:szCs w:val="32"/>
-              </w:rPr>
-              <w:t xml:space="preserve">MUSTERTEXT</w:t>
+                <w:color w:val="A9B0BE"/>
+                <w:sz w:val="18"/>
+                <w:szCs w:val="18"/>
+              </w:rPr>
+              <w:t xml:space="preserve">1</w:t>
             </w:r>
           </w:p>
           <w:p>
@@ -5937,13 +5931,11 @@
             <w:r>
               <w:rPr>
                 <w:rFonts w:ascii="Calibri" w:cs="Calibri" w:eastAsia="Calibri" w:hAnsi="Calibri"/>
-                <w:b/>
-                <w:bCs/>
-                <w:color w:val="5B6B8C"/>
-                <w:sz w:val="32"/>
-                <w:szCs w:val="32"/>
-              </w:rPr>
-              <w:t xml:space="preserve">MUSTERTEXT</w:t>
+                <w:color w:val="A9B0BE"/>
+                <w:sz w:val="18"/>
+                <w:szCs w:val="18"/>
+              </w:rPr>
+              <w:t xml:space="preserve">5</w:t>
             </w:r>
           </w:p>
           <w:p>
@@ -6015,13 +6007,11 @@
             <w:r>
               <w:rPr>
                 <w:rFonts w:ascii="Calibri" w:cs="Calibri" w:eastAsia="Calibri" w:hAnsi="Calibri"/>
-                <w:b/>
-                <w:bCs/>
-                <w:color w:val="5B6B8C"/>
-                <w:sz w:val="32"/>
-                <w:szCs w:val="32"/>
-              </w:rPr>
-              <w:t xml:space="preserve">MUSTERTEXT</w:t>
+                <w:color w:val="A9B0BE"/>
+                <w:sz w:val="18"/>
+                <w:szCs w:val="18"/>
+              </w:rPr>
+              <w:t xml:space="preserve">6</w:t>
             </w:r>
           </w:p>
           <w:p>
@@ -6102,13 +6092,11 @@
             <w:r>
               <w:rPr>
                 <w:rFonts w:ascii="Calibri" w:cs="Calibri" w:eastAsia="Calibri" w:hAnsi="Calibri"/>
-                <w:b/>
-                <w:bCs/>
-                <w:color w:val="5B6B8C"/>
-                <w:sz w:val="32"/>
-                <w:szCs w:val="32"/>
-              </w:rPr>
-              <w:t xml:space="preserve">MUSTERTEXT</w:t>
+                <w:color w:val="A9B0BE"/>
+                <w:sz w:val="18"/>
+                <w:szCs w:val="18"/>
+              </w:rPr>
+              <w:t xml:space="preserve">2</w:t>
             </w:r>
           </w:p>
           <w:p>
@@ -6180,13 +6168,11 @@
             <w:r>
               <w:rPr>
                 <w:rFonts w:ascii="Calibri" w:cs="Calibri" w:eastAsia="Calibri" w:hAnsi="Calibri"/>
-                <w:b/>
-                <w:bCs/>
-                <w:color w:val="5B6B8C"/>
-                <w:sz w:val="32"/>
-                <w:szCs w:val="32"/>
-              </w:rPr>
-              <w:t xml:space="preserve">MUSTERTEXT</w:t>
+                <w:color w:val="A9B0BE"/>
+                <w:sz w:val="18"/>
+                <w:szCs w:val="18"/>
+              </w:rPr>
+              <w:t xml:space="preserve">4</w:t>
             </w:r>
           </w:p>
           <w:p>

</xml_diff>

<commit_message>
Mustertext auf Gewichtheben umgestellt
Co-Authored-By: Claude Opus 5.5 <noreply@anthropic.com>
Claude-Session: https://claude.ai/code/session_01KXvLXHMYPnCyEbMRgNaaYs
</commit_message>
<xml_diff>
--- a/Deutsch_7A/Zeitformen_Zeitstrahl/Druckvorlage_Zeitformen_Zeitstrahl.docx
+++ b/Deutsch_7A/Zeitformen_Zeitstrahl/Druckvorlage_Zeitformen_Zeitstrahl.docx
@@ -5706,7 +5706,7 @@
                 <w:sz w:val="96"/>
                 <w:szCs w:val="96"/>
               </w:rPr>
-              <w:t xml:space="preserve">Am Samstag kämpfte ich in der Klasse bis 50 Kilo.</w:t>
+              <w:t xml:space="preserve">Im Reißen schaffte ich 50 Kilo.</w:t>
             </w:r>
           </w:p>
         </w:tc>
@@ -5791,7 +5791,7 @@
                 <w:sz w:val="96"/>
                 <w:szCs w:val="96"/>
               </w:rPr>
-              <w:t xml:space="preserve">Beim nächsten Turnier werde ich früher angreifen.</w:t>
+              <w:t xml:space="preserve">Beim nächsten Wettkampf werde ich 65 Kilo stoßen.</w:t>
             </w:r>
           </w:p>
         </w:tc>
@@ -5867,7 +5867,7 @@
                 <w:sz w:val="96"/>
                 <w:szCs w:val="96"/>
               </w:rPr>
-              <w:t xml:space="preserve">Vor dem Turnier hatte ich wochenlang hart trainiert.</w:t>
+              <w:t xml:space="preserve">Vor dem Wettkampf hatte ich wochenlang hart trainiert.</w:t>
             </w:r>
           </w:p>
         </w:tc>
@@ -5952,7 +5952,7 @@
                 <w:sz w:val="96"/>
                 <w:szCs w:val="96"/>
               </w:rPr>
-              <w:t xml:space="preserve">Danach sagte mein Trainer: „Du hast stark gekämpft!“</w:t>
+              <w:t xml:space="preserve">Danach sagte mein Trainer: „Du hast super gehoben!“</w:t>
             </w:r>
           </w:p>
         </w:tc>
@@ -6189,7 +6189,7 @@
                 <w:sz w:val="96"/>
                 <w:szCs w:val="96"/>
               </w:rPr>
-              <w:t xml:space="preserve">Im Finale verlor ich nur knapp.</w:t>
+              <w:t xml:space="preserve">Im Stoßen hob ich 62 Kilo.</w:t>
             </w:r>
           </w:p>
         </w:tc>

</xml_diff>

<commit_message>
Trainer-Satz auf zwei Streifen geteilt (Präteritum / Perfekt)
Co-Authored-By: Claude Opus 5.5 <noreply@anthropic.com>
Claude-Session: https://claude.ai/code/session_01KXvLXHMYPnCyEbMRgNaaYs
</commit_message>
<xml_diff>
--- a/Deutsch_7A/Zeitformen_Zeitstrahl/Druckvorlage_Zeitformen_Zeitstrahl.docx
+++ b/Deutsch_7A/Zeitformen_Zeitstrahl/Druckvorlage_Zeitformen_Zeitstrahl.docx
@@ -5774,7 +5774,7 @@
                 <w:sz w:val="18"/>
                 <w:szCs w:val="18"/>
               </w:rPr>
-              <w:t xml:space="preserve">7</w:t>
+              <w:t xml:space="preserve">8</w:t>
             </w:r>
           </w:p>
           <w:p>
@@ -5952,7 +5952,7 @@
                 <w:sz w:val="96"/>
                 <w:szCs w:val="96"/>
               </w:rPr>
-              <w:t xml:space="preserve">Danach sagte mein Trainer: „Du hast super gehoben!“</w:t>
+              <w:t xml:space="preserve">Danach sagte mein Trainer:</w:t>
             </w:r>
           </w:p>
         </w:tc>
@@ -6028,7 +6028,7 @@
                 <w:sz w:val="96"/>
                 <w:szCs w:val="96"/>
               </w:rPr>
-              <w:t xml:space="preserve">Heute analysiere ich mit ihm das Video.</w:t>
+              <w:t xml:space="preserve">„Du hast super gehoben!“</w:t>
             </w:r>
           </w:p>
         </w:tc>
@@ -6096,7 +6096,7 @@
                 <w:sz w:val="18"/>
                 <w:szCs w:val="18"/>
               </w:rPr>
-              <w:t xml:space="preserve">2</w:t>
+              <w:t xml:space="preserve">7</w:t>
             </w:r>
           </w:p>
           <w:p>
@@ -6113,7 +6113,7 @@
                 <w:sz w:val="96"/>
                 <w:szCs w:val="96"/>
               </w:rPr>
-              <w:t xml:space="preserve">Am Morgen waren wir früh zur Halle in Frankfurt (Oder) gefahren.</w:t>
+              <w:t xml:space="preserve">Heute analysiere ich mit ihm das Video.</w:t>
             </w:r>
           </w:p>
         </w:tc>
@@ -6172,7 +6172,7 @@
                 <w:sz w:val="18"/>
                 <w:szCs w:val="18"/>
               </w:rPr>
-              <w:t xml:space="preserve">4</w:t>
+              <w:t xml:space="preserve">2</w:t>
             </w:r>
           </w:p>
           <w:p>
@@ -6189,7 +6189,7 @@
                 <w:sz w:val="96"/>
                 <w:szCs w:val="96"/>
               </w:rPr>
-              <w:t xml:space="preserve">Im Stoßen hob ich 62 Kilo.</w:t>
+              <w:t xml:space="preserve">Am Morgen waren wir früh zur Halle in Frankfurt (Oder) gefahren.</w:t>
             </w:r>
           </w:p>
         </w:tc>
@@ -6253,13 +6253,11 @@
             <w:r>
               <w:rPr>
                 <w:rFonts w:ascii="Calibri" w:cs="Calibri" w:eastAsia="Calibri" w:hAnsi="Calibri"/>
-                <w:b/>
-                <w:bCs/>
-                <w:color w:val="5B6B8C"/>
-                <w:sz w:val="32"/>
-                <w:szCs w:val="32"/>
-              </w:rPr>
-              <w:t xml:space="preserve">ZEITFORM</w:t>
+                <w:color w:val="A9B0BE"/>
+                <w:sz w:val="18"/>
+                <w:szCs w:val="18"/>
+              </w:rPr>
+              <w:t xml:space="preserve">4</w:t>
             </w:r>
           </w:p>
           <w:p>
@@ -6272,11 +6270,11 @@
                 <w:rFonts w:ascii="Cambria" w:cs="Cambria" w:eastAsia="Cambria" w:hAnsi="Cambria"/>
                 <w:b/>
                 <w:bCs/>
-                <w:color w:val="1E2761"/>
-                <w:sz w:val="120"/>
-                <w:szCs w:val="120"/>
-              </w:rPr>
-              <w:t xml:space="preserve">Plusquamperfekt</w:t>
+                <w:color w:val="111111"/>
+                <w:sz w:val="96"/>
+                <w:szCs w:val="96"/>
+              </w:rPr>
+              <w:t xml:space="preserve">Im Stoßen hob ich 62 Kilo.</w:t>
             </w:r>
           </w:p>
         </w:tc>
@@ -6354,7 +6352,7 @@
                 <w:sz w:val="120"/>
                 <w:szCs w:val="120"/>
               </w:rPr>
-              <w:t xml:space="preserve">Präteritum</w:t>
+              <w:t xml:space="preserve">Plusquamperfekt</w:t>
             </w:r>
           </w:p>
         </w:tc>
@@ -6441,7 +6439,7 @@
                 <w:sz w:val="120"/>
                 <w:szCs w:val="120"/>
               </w:rPr>
-              <w:t xml:space="preserve">Perfekt</w:t>
+              <w:t xml:space="preserve">Präteritum</w:t>
             </w:r>
           </w:p>
         </w:tc>
@@ -6519,7 +6517,7 @@
                 <w:sz w:val="120"/>
                 <w:szCs w:val="120"/>
               </w:rPr>
-              <w:t xml:space="preserve">Präsens</w:t>
+              <w:t xml:space="preserve">Perfekt</w:t>
             </w:r>
           </w:p>
         </w:tc>
@@ -6606,7 +6604,7 @@
                 <w:sz w:val="120"/>
                 <w:szCs w:val="120"/>
               </w:rPr>
-              <w:t xml:space="preserve">Futur I</w:t>
+              <w:t xml:space="preserve">Präsens</w:t>
             </w:r>
           </w:p>
         </w:tc>
@@ -6667,7 +6665,7 @@
                 <w:sz w:val="32"/>
                 <w:szCs w:val="32"/>
               </w:rPr>
-              <w:t xml:space="preserve">BAUPLAN</w:t>
+              <w:t xml:space="preserve">ZEITFORM</w:t>
             </w:r>
           </w:p>
           <w:p>
@@ -6680,33 +6678,11 @@
                 <w:rFonts w:ascii="Cambria" w:cs="Cambria" w:eastAsia="Cambria" w:hAnsi="Cambria"/>
                 <w:b/>
                 <w:bCs/>
-                <w:color w:val="D9534F"/>
-                <w:sz w:val="96"/>
-                <w:szCs w:val="96"/>
-              </w:rPr>
-              <w:t xml:space="preserve">hatte / war</w:t>
-            </w:r>
-            <w:r>
-              <w:rPr>
-                <w:rFonts w:ascii="Cambria" w:cs="Cambria" w:eastAsia="Cambria" w:hAnsi="Cambria"/>
-                <w:b/>
-                <w:bCs/>
-                <w:color w:val="111111"/>
-                <w:sz w:val="96"/>
-                <w:szCs w:val="96"/>
-              </w:rPr>
-              <w:t xml:space="preserve"> + </w:t>
-            </w:r>
-            <w:r>
-              <w:rPr>
-                <w:rFonts w:ascii="Cambria" w:cs="Cambria" w:eastAsia="Cambria" w:hAnsi="Cambria"/>
-                <w:b/>
-                <w:bCs/>
-                <w:color w:val="C98A1E"/>
-                <w:sz w:val="96"/>
-                <w:szCs w:val="96"/>
-              </w:rPr>
-              <w:t xml:space="preserve">Partizip II</w:t>
+                <w:color w:val="1E2761"/>
+                <w:sz w:val="120"/>
+                <w:szCs w:val="120"/>
+              </w:rPr>
+              <w:t xml:space="preserve">Futur I</w:t>
             </w:r>
           </w:p>
         </w:tc>
@@ -6789,11 +6765,33 @@
                 <w:rFonts w:ascii="Cambria" w:cs="Cambria" w:eastAsia="Cambria" w:hAnsi="Cambria"/>
                 <w:b/>
                 <w:bCs/>
+                <w:color w:val="D9534F"/>
+                <w:sz w:val="96"/>
+                <w:szCs w:val="96"/>
+              </w:rPr>
+              <w:t xml:space="preserve">hatte / war</w:t>
+            </w:r>
+            <w:r>
+              <w:rPr>
+                <w:rFonts w:ascii="Cambria" w:cs="Cambria" w:eastAsia="Cambria" w:hAnsi="Cambria"/>
+                <w:b/>
+                <w:bCs/>
                 <w:color w:val="111111"/>
                 <w:sz w:val="96"/>
                 <w:szCs w:val="96"/>
               </w:rPr>
-              <w:t xml:space="preserve">finites Verb im Präteritum</w:t>
+              <w:t xml:space="preserve"> + </w:t>
+            </w:r>
+            <w:r>
+              <w:rPr>
+                <w:rFonts w:ascii="Cambria" w:cs="Cambria" w:eastAsia="Cambria" w:hAnsi="Cambria"/>
+                <w:b/>
+                <w:bCs/>
+                <w:color w:val="C98A1E"/>
+                <w:sz w:val="96"/>
+                <w:szCs w:val="96"/>
+              </w:rPr>
+              <w:t xml:space="preserve">Partizip II</w:t>
             </w:r>
           </w:p>
         </w:tc>
@@ -6867,33 +6865,11 @@
                 <w:rFonts w:ascii="Cambria" w:cs="Cambria" w:eastAsia="Cambria" w:hAnsi="Cambria"/>
                 <w:b/>
                 <w:bCs/>
-                <w:color w:val="D9534F"/>
-                <w:sz w:val="96"/>
-                <w:szCs w:val="96"/>
-              </w:rPr>
-              <w:t xml:space="preserve">habe / bin</w:t>
-            </w:r>
-            <w:r>
-              <w:rPr>
-                <w:rFonts w:ascii="Cambria" w:cs="Cambria" w:eastAsia="Cambria" w:hAnsi="Cambria"/>
-                <w:b/>
-                <w:bCs/>
                 <w:color w:val="111111"/>
                 <w:sz w:val="96"/>
                 <w:szCs w:val="96"/>
               </w:rPr>
-              <w:t xml:space="preserve"> + </w:t>
-            </w:r>
-            <w:r>
-              <w:rPr>
-                <w:rFonts w:ascii="Cambria" w:cs="Cambria" w:eastAsia="Cambria" w:hAnsi="Cambria"/>
-                <w:b/>
-                <w:bCs/>
-                <w:color w:val="C98A1E"/>
-                <w:sz w:val="96"/>
-                <w:szCs w:val="96"/>
-              </w:rPr>
-              <w:t xml:space="preserve">Partizip II</w:t>
+              <w:t xml:space="preserve">finites Verb im Präteritum</w:t>
             </w:r>
           </w:p>
         </w:tc>
@@ -6976,11 +6952,33 @@
                 <w:rFonts w:ascii="Cambria" w:cs="Cambria" w:eastAsia="Cambria" w:hAnsi="Cambria"/>
                 <w:b/>
                 <w:bCs/>
+                <w:color w:val="D9534F"/>
+                <w:sz w:val="96"/>
+                <w:szCs w:val="96"/>
+              </w:rPr>
+              <w:t xml:space="preserve">habe / bin</w:t>
+            </w:r>
+            <w:r>
+              <w:rPr>
+                <w:rFonts w:ascii="Cambria" w:cs="Cambria" w:eastAsia="Cambria" w:hAnsi="Cambria"/>
+                <w:b/>
+                <w:bCs/>
                 <w:color w:val="111111"/>
                 <w:sz w:val="96"/>
                 <w:szCs w:val="96"/>
               </w:rPr>
-              <w:t xml:space="preserve">finites Verb im Präsens</w:t>
+              <w:t xml:space="preserve"> + </w:t>
+            </w:r>
+            <w:r>
+              <w:rPr>
+                <w:rFonts w:ascii="Cambria" w:cs="Cambria" w:eastAsia="Cambria" w:hAnsi="Cambria"/>
+                <w:b/>
+                <w:bCs/>
+                <w:color w:val="C98A1E"/>
+                <w:sz w:val="96"/>
+                <w:szCs w:val="96"/>
+              </w:rPr>
+              <w:t xml:space="preserve">Partizip II</w:t>
             </w:r>
           </w:p>
         </w:tc>
@@ -6989,6 +6987,93 @@
     <w:p>
       <w:r>
         <w:br w:type="page"/>
+      </w:r>
+    </w:p>
+    <w:tbl>
+      <w:tblPr>
+        <w:tblW w:type="dxa" w:w="15638"/>
+        <w:tblBorders>
+          <w:top w:val="single" w:color="auto" w:sz="4"/>
+          <w:left w:val="single" w:color="auto" w:sz="4"/>
+          <w:bottom w:val="single" w:color="auto" w:sz="4"/>
+          <w:right w:val="single" w:color="auto" w:sz="4"/>
+          <w:insideH w:val="single" w:color="auto" w:sz="4"/>
+          <w:insideV w:val="single" w:color="auto" w:sz="4"/>
+        </w:tblBorders>
+      </w:tblPr>
+      <w:tblGrid>
+        <w:gridCol w:w="15638"/>
+      </w:tblGrid>
+      <w:tr>
+        <w:trPr>
+          <w:cantSplit/>
+          <w:trHeight w:val="5050" w:hRule="exact"/>
+        </w:trPr>
+        <w:tc>
+          <w:tcPr>
+            <w:tcW w:type="dxa" w:w="15638"/>
+            <w:tcBorders>
+              <w:top w:val="dashed" w:color="7A869E" w:sz="8"/>
+              <w:left w:val="dashed" w:color="7A869E" w:sz="8"/>
+              <w:bottom w:val="dashed" w:color="7A869E" w:sz="8"/>
+              <w:right w:val="dashed" w:color="7A869E" w:sz="8"/>
+            </w:tcBorders>
+            <w:tcMar>
+              <w:top w:type="dxa" w:w="200"/>
+              <w:left w:type="dxa" w:w="260"/>
+              <w:bottom w:type="dxa" w:w="200"/>
+              <w:right w:type="dxa" w:w="100"/>
+            </w:tcMar>
+            <w:vAlign w:val="center"/>
+          </w:tcPr>
+          <w:p>
+            <w:pPr>
+              <w:spacing w:after="120" w:before="0"/>
+            </w:pPr>
+            <w:r>
+              <w:rPr>
+                <w:rFonts w:ascii="Calibri" w:cs="Calibri" w:eastAsia="Calibri" w:hAnsi="Calibri"/>
+                <w:b/>
+                <w:bCs/>
+                <w:color w:val="5B6B8C"/>
+                <w:sz w:val="32"/>
+                <w:szCs w:val="32"/>
+              </w:rPr>
+              <w:t xml:space="preserve">BAUPLAN</w:t>
+            </w:r>
+          </w:p>
+          <w:p>
+            <w:pPr>
+              <w:spacing w:after="0" w:before="0"/>
+              <w:jc w:val="center"/>
+            </w:pPr>
+            <w:r>
+              <w:rPr>
+                <w:rFonts w:ascii="Cambria" w:cs="Cambria" w:eastAsia="Cambria" w:hAnsi="Cambria"/>
+                <w:b/>
+                <w:bCs/>
+                <w:color w:val="111111"/>
+                <w:sz w:val="96"/>
+                <w:szCs w:val="96"/>
+              </w:rPr>
+              <w:t xml:space="preserve">finites Verb im Präsens</w:t>
+            </w:r>
+          </w:p>
+        </w:tc>
+      </w:tr>
+    </w:tbl>
+    <w:p>
+      <w:pPr>
+        <w:spacing w:after="0" w:before="0"/>
+      </w:pPr>
+      <w:r>
+        <w:rPr>
+          <w:rFonts w:ascii="Calibri" w:cs="Calibri" w:eastAsia="Calibri" w:hAnsi="Calibri"/>
+          <w:color w:val="000000"/>
+          <w:sz w:val="22"/>
+          <w:szCs w:val="22"/>
+        </w:rPr>
+        <w:t xml:space="preserve"/>
       </w:r>
     </w:p>
     <w:tbl>

</xml_diff>

<commit_message>
Zeitstrahl: „Vorvergangenheit“ statt „vorher“
Co-Authored-By: Claude Opus 5.5 <noreply@anthropic.com>
Claude-Session: https://claude.ai/code/session_01KXvLXHMYPnCyEbMRgNaaYs
</commit_message>
<xml_diff>
--- a/Deutsch_7A/Zeitformen_Zeitstrahl/Druckvorlage_Zeitformen_Zeitstrahl.docx
+++ b/Deutsch_7A/Zeitformen_Zeitstrahl/Druckvorlage_Zeitformen_Zeitstrahl.docx
@@ -210,10 +210,10 @@
               </w:tblBorders>
             </w:tblPr>
             <w:tblGrid>
-              <w:gridCol w:w="2050"/>
-              <w:gridCol w:w="2050"/>
-              <w:gridCol w:w="2650"/>
-              <w:gridCol w:w="3656"/>
+              <w:gridCol w:w="2400"/>
+              <w:gridCol w:w="2000"/>
+              <w:gridCol w:w="2600"/>
+              <w:gridCol w:w="3406"/>
             </w:tblGrid>
             <w:tr>
               <w:trPr>
@@ -222,7 +222,7 @@
               </w:trPr>
               <w:tc>
                 <w:tcPr>
-                  <w:tcW w:type="dxa" w:w="2050"/>
+                  <w:tcW w:type="dxa" w:w="2400"/>
                   <w:tcBorders>
                     <w:top w:val="single" w:color="7A869E" w:sz="8"/>
                     <w:left w:val="single" w:color="7A869E" w:sz="8"/>
@@ -258,7 +258,7 @@
               </w:tc>
               <w:tc>
                 <w:tcPr>
-                  <w:tcW w:type="dxa" w:w="2050"/>
+                  <w:tcW w:type="dxa" w:w="2000"/>
                   <w:tcBorders>
                     <w:top w:val="single" w:color="7A869E" w:sz="8"/>
                     <w:left w:val="single" w:color="7A869E" w:sz="8"/>
@@ -294,7 +294,7 @@
               </w:tc>
               <w:tc>
                 <w:tcPr>
-                  <w:tcW w:type="dxa" w:w="2650"/>
+                  <w:tcW w:type="dxa" w:w="2600"/>
                   <w:tcBorders>
                     <w:top w:val="single" w:color="7A869E" w:sz="8"/>
                     <w:left w:val="single" w:color="7A869E" w:sz="8"/>
@@ -330,7 +330,7 @@
               </w:tc>
               <w:tc>
                 <w:tcPr>
-                  <w:tcW w:type="dxa" w:w="3656"/>
+                  <w:tcW w:type="dxa" w:w="3406"/>
                   <w:tcBorders>
                     <w:top w:val="single" w:color="7A869E" w:sz="8"/>
                     <w:left w:val="single" w:color="7A869E" w:sz="8"/>
@@ -372,7 +372,7 @@
               </w:trPr>
               <w:tc>
                 <w:tcPr>
-                  <w:tcW w:type="dxa" w:w="2050"/>
+                  <w:tcW w:type="dxa" w:w="2400"/>
                   <w:tcBorders>
                     <w:top w:val="single" w:color="7A869E" w:sz="8"/>
                     <w:left w:val="single" w:color="7A869E" w:sz="8"/>
@@ -401,13 +401,13 @@
                       <w:sz w:val="20"/>
                       <w:szCs w:val="20"/>
                     </w:rPr>
-                    <w:t xml:space="preserve">vorher</w:t>
-                  </w:r>
-                </w:p>
-              </w:tc>
-              <w:tc>
-                <w:tcPr>
-                  <w:tcW w:type="dxa" w:w="2050"/>
+                    <w:t xml:space="preserve">Vorvergangenheit</w:t>
+                  </w:r>
+                </w:p>
+              </w:tc>
+              <w:tc>
+                <w:tcPr>
+                  <w:tcW w:type="dxa" w:w="2000"/>
                   <w:tcBorders>
                     <w:top w:val="single" w:color="7A869E" w:sz="8"/>
                     <w:left w:val="single" w:color="7A869E" w:sz="8"/>
@@ -439,7 +439,7 @@
               </w:tc>
               <w:tc>
                 <w:tcPr>
-                  <w:tcW w:type="dxa" w:w="2650"/>
+                  <w:tcW w:type="dxa" w:w="2600"/>
                   <w:tcBorders>
                     <w:top w:val="single" w:color="7A869E" w:sz="8"/>
                     <w:left w:val="single" w:color="7A869E" w:sz="8"/>
@@ -471,7 +471,7 @@
               </w:tc>
               <w:tc>
                 <w:tcPr>
-                  <w:tcW w:type="dxa" w:w="3656"/>
+                  <w:tcW w:type="dxa" w:w="3406"/>
                   <w:tcBorders>
                     <w:top w:val="single" w:color="7A869E" w:sz="8"/>
                     <w:left w:val="single" w:color="7A869E" w:sz="8"/>
@@ -509,7 +509,7 @@
               </w:trPr>
               <w:tc>
                 <w:tcPr>
-                  <w:tcW w:type="dxa" w:w="2050"/>
+                  <w:tcW w:type="dxa" w:w="2400"/>
                   <w:tcBorders>
                     <w:top w:val="single" w:color="7A869E" w:sz="8"/>
                     <w:left w:val="single" w:color="7A869E" w:sz="8"/>
@@ -560,7 +560,7 @@
               </w:tc>
               <w:tc>
                 <w:tcPr>
-                  <w:tcW w:type="dxa" w:w="2050"/>
+                  <w:tcW w:type="dxa" w:w="2000"/>
                   <w:tcBorders>
                     <w:top w:val="single" w:color="7A869E" w:sz="8"/>
                     <w:left w:val="single" w:color="7A869E" w:sz="8"/>
@@ -592,7 +592,7 @@
               </w:tc>
               <w:tc>
                 <w:tcPr>
-                  <w:tcW w:type="dxa" w:w="2650"/>
+                  <w:tcW w:type="dxa" w:w="2600"/>
                   <w:tcBorders>
                     <w:top w:val="single" w:color="7A869E" w:sz="8"/>
                     <w:left w:val="single" w:color="7A869E" w:sz="8"/>
@@ -624,7 +624,7 @@
               </w:tc>
               <w:tc>
                 <w:tcPr>
-                  <w:tcW w:type="dxa" w:w="3656"/>
+                  <w:tcW w:type="dxa" w:w="3406"/>
                   <w:tcBorders>
                     <w:top w:val="single" w:color="7A869E" w:sz="8"/>
                     <w:left w:val="single" w:color="7A869E" w:sz="8"/>
@@ -662,7 +662,7 @@
               </w:trPr>
               <w:tc>
                 <w:tcPr>
-                  <w:tcW w:type="dxa" w:w="2050"/>
+                  <w:tcW w:type="dxa" w:w="2400"/>
                   <w:tcBorders>
                     <w:top w:val="single" w:color="7A869E" w:sz="8"/>
                     <w:left w:val="single" w:color="7A869E" w:sz="8"/>
@@ -713,7 +713,7 @@
               </w:tc>
               <w:tc>
                 <w:tcPr>
-                  <w:tcW w:type="dxa" w:w="2050"/>
+                  <w:tcW w:type="dxa" w:w="2000"/>
                   <w:tcBorders>
                     <w:top w:val="single" w:color="7A869E" w:sz="8"/>
                     <w:left w:val="single" w:color="7A869E" w:sz="8"/>
@@ -745,7 +745,7 @@
               </w:tc>
               <w:tc>
                 <w:tcPr>
-                  <w:tcW w:type="dxa" w:w="2650"/>
+                  <w:tcW w:type="dxa" w:w="2600"/>
                   <w:tcBorders>
                     <w:top w:val="single" w:color="7A869E" w:sz="8"/>
                     <w:left w:val="single" w:color="7A869E" w:sz="8"/>
@@ -777,7 +777,7 @@
               </w:tc>
               <w:tc>
                 <w:tcPr>
-                  <w:tcW w:type="dxa" w:w="3656"/>
+                  <w:tcW w:type="dxa" w:w="3406"/>
                   <w:tcBorders>
                     <w:top w:val="single" w:color="7A869E" w:sz="8"/>
                     <w:left w:val="single" w:color="7A869E" w:sz="8"/>
@@ -815,7 +815,7 @@
               </w:trPr>
               <w:tc>
                 <w:tcPr>
-                  <w:tcW w:type="dxa" w:w="2050"/>
+                  <w:tcW w:type="dxa" w:w="2400"/>
                   <w:tcBorders>
                     <w:top w:val="single" w:color="7A869E" w:sz="8"/>
                     <w:left w:val="single" w:color="7A869E" w:sz="8"/>
@@ -850,7 +850,7 @@
               </w:tc>
               <w:tc>
                 <w:tcPr>
-                  <w:tcW w:type="dxa" w:w="2050"/>
+                  <w:tcW w:type="dxa" w:w="2000"/>
                   <w:tcBorders>
                     <w:top w:val="single" w:color="7A869E" w:sz="8"/>
                     <w:left w:val="single" w:color="7A869E" w:sz="8"/>
@@ -882,7 +882,7 @@
               </w:tc>
               <w:tc>
                 <w:tcPr>
-                  <w:tcW w:type="dxa" w:w="2650"/>
+                  <w:tcW w:type="dxa" w:w="2600"/>
                   <w:tcBorders>
                     <w:top w:val="single" w:color="7A869E" w:sz="8"/>
                     <w:left w:val="single" w:color="7A869E" w:sz="8"/>
@@ -914,7 +914,7 @@
               </w:tc>
               <w:tc>
                 <w:tcPr>
-                  <w:tcW w:type="dxa" w:w="3656"/>
+                  <w:tcW w:type="dxa" w:w="3406"/>
                   <w:tcBorders>
                     <w:top w:val="single" w:color="7A869E" w:sz="8"/>
                     <w:left w:val="single" w:color="7A869E" w:sz="8"/>
@@ -952,7 +952,7 @@
               </w:trPr>
               <w:tc>
                 <w:tcPr>
-                  <w:tcW w:type="dxa" w:w="2050"/>
+                  <w:tcW w:type="dxa" w:w="2400"/>
                   <w:tcBorders>
                     <w:top w:val="single" w:color="7A869E" w:sz="8"/>
                     <w:left w:val="single" w:color="7A869E" w:sz="8"/>
@@ -987,7 +987,7 @@
               </w:tc>
               <w:tc>
                 <w:tcPr>
-                  <w:tcW w:type="dxa" w:w="2050"/>
+                  <w:tcW w:type="dxa" w:w="2000"/>
                   <w:tcBorders>
                     <w:top w:val="single" w:color="7A869E" w:sz="8"/>
                     <w:left w:val="single" w:color="7A869E" w:sz="8"/>
@@ -1019,7 +1019,7 @@
               </w:tc>
               <w:tc>
                 <w:tcPr>
-                  <w:tcW w:type="dxa" w:w="2650"/>
+                  <w:tcW w:type="dxa" w:w="2600"/>
                   <w:tcBorders>
                     <w:top w:val="single" w:color="7A869E" w:sz="8"/>
                     <w:left w:val="single" w:color="7A869E" w:sz="8"/>
@@ -1051,7 +1051,7 @@
               </w:tc>
               <w:tc>
                 <w:tcPr>
-                  <w:tcW w:type="dxa" w:w="3656"/>
+                  <w:tcW w:type="dxa" w:w="3406"/>
                   <w:tcBorders>
                     <w:top w:val="single" w:color="7A869E" w:sz="8"/>
                     <w:left w:val="single" w:color="7A869E" w:sz="8"/>
@@ -1354,10 +1354,10 @@
               </w:tblBorders>
             </w:tblPr>
             <w:tblGrid>
-              <w:gridCol w:w="2050"/>
-              <w:gridCol w:w="2050"/>
-              <w:gridCol w:w="2650"/>
-              <w:gridCol w:w="3656"/>
+              <w:gridCol w:w="2400"/>
+              <w:gridCol w:w="2000"/>
+              <w:gridCol w:w="2600"/>
+              <w:gridCol w:w="3406"/>
             </w:tblGrid>
             <w:tr>
               <w:trPr>
@@ -1366,7 +1366,7 @@
               </w:trPr>
               <w:tc>
                 <w:tcPr>
-                  <w:tcW w:type="dxa" w:w="2050"/>
+                  <w:tcW w:type="dxa" w:w="2400"/>
                   <w:tcBorders>
                     <w:top w:val="single" w:color="7A869E" w:sz="8"/>
                     <w:left w:val="single" w:color="7A869E" w:sz="8"/>
@@ -1402,7 +1402,7 @@
               </w:tc>
               <w:tc>
                 <w:tcPr>
-                  <w:tcW w:type="dxa" w:w="2050"/>
+                  <w:tcW w:type="dxa" w:w="2000"/>
                   <w:tcBorders>
                     <w:top w:val="single" w:color="7A869E" w:sz="8"/>
                     <w:left w:val="single" w:color="7A869E" w:sz="8"/>
@@ -1438,7 +1438,7 @@
               </w:tc>
               <w:tc>
                 <w:tcPr>
-                  <w:tcW w:type="dxa" w:w="2650"/>
+                  <w:tcW w:type="dxa" w:w="2600"/>
                   <w:tcBorders>
                     <w:top w:val="single" w:color="7A869E" w:sz="8"/>
                     <w:left w:val="single" w:color="7A869E" w:sz="8"/>
@@ -1474,7 +1474,7 @@
               </w:tc>
               <w:tc>
                 <w:tcPr>
-                  <w:tcW w:type="dxa" w:w="3656"/>
+                  <w:tcW w:type="dxa" w:w="3406"/>
                   <w:tcBorders>
                     <w:top w:val="single" w:color="7A869E" w:sz="8"/>
                     <w:left w:val="single" w:color="7A869E" w:sz="8"/>
@@ -1516,7 +1516,7 @@
               </w:trPr>
               <w:tc>
                 <w:tcPr>
-                  <w:tcW w:type="dxa" w:w="2050"/>
+                  <w:tcW w:type="dxa" w:w="2400"/>
                   <w:tcBorders>
                     <w:top w:val="single" w:color="7A869E" w:sz="8"/>
                     <w:left w:val="single" w:color="7A869E" w:sz="8"/>
@@ -1545,13 +1545,13 @@
                       <w:sz w:val="20"/>
                       <w:szCs w:val="20"/>
                     </w:rPr>
-                    <w:t xml:space="preserve">vorher</w:t>
-                  </w:r>
-                </w:p>
-              </w:tc>
-              <w:tc>
-                <w:tcPr>
-                  <w:tcW w:type="dxa" w:w="2050"/>
+                    <w:t xml:space="preserve">Vorvergangenheit</w:t>
+                  </w:r>
+                </w:p>
+              </w:tc>
+              <w:tc>
+                <w:tcPr>
+                  <w:tcW w:type="dxa" w:w="2000"/>
                   <w:tcBorders>
                     <w:top w:val="single" w:color="7A869E" w:sz="8"/>
                     <w:left w:val="single" w:color="7A869E" w:sz="8"/>
@@ -1583,7 +1583,7 @@
               </w:tc>
               <w:tc>
                 <w:tcPr>
-                  <w:tcW w:type="dxa" w:w="2650"/>
+                  <w:tcW w:type="dxa" w:w="2600"/>
                   <w:tcBorders>
                     <w:top w:val="single" w:color="7A869E" w:sz="8"/>
                     <w:left w:val="single" w:color="7A869E" w:sz="8"/>
@@ -1615,7 +1615,7 @@
               </w:tc>
               <w:tc>
                 <w:tcPr>
-                  <w:tcW w:type="dxa" w:w="3656"/>
+                  <w:tcW w:type="dxa" w:w="3406"/>
                   <w:tcBorders>
                     <w:top w:val="single" w:color="7A869E" w:sz="8"/>
                     <w:left w:val="single" w:color="7A869E" w:sz="8"/>
@@ -1653,7 +1653,7 @@
               </w:trPr>
               <w:tc>
                 <w:tcPr>
-                  <w:tcW w:type="dxa" w:w="2050"/>
+                  <w:tcW w:type="dxa" w:w="2400"/>
                   <w:tcBorders>
                     <w:top w:val="single" w:color="7A869E" w:sz="8"/>
                     <w:left w:val="single" w:color="7A869E" w:sz="8"/>
@@ -1704,7 +1704,7 @@
               </w:tc>
               <w:tc>
                 <w:tcPr>
-                  <w:tcW w:type="dxa" w:w="2050"/>
+                  <w:tcW w:type="dxa" w:w="2000"/>
                   <w:tcBorders>
                     <w:top w:val="single" w:color="7A869E" w:sz="8"/>
                     <w:left w:val="single" w:color="7A869E" w:sz="8"/>
@@ -1736,7 +1736,7 @@
               </w:tc>
               <w:tc>
                 <w:tcPr>
-                  <w:tcW w:type="dxa" w:w="2650"/>
+                  <w:tcW w:type="dxa" w:w="2600"/>
                   <w:tcBorders>
                     <w:top w:val="single" w:color="7A869E" w:sz="8"/>
                     <w:left w:val="single" w:color="7A869E" w:sz="8"/>
@@ -1768,7 +1768,7 @@
               </w:tc>
               <w:tc>
                 <w:tcPr>
-                  <w:tcW w:type="dxa" w:w="3656"/>
+                  <w:tcW w:type="dxa" w:w="3406"/>
                   <w:tcBorders>
                     <w:top w:val="single" w:color="7A869E" w:sz="8"/>
                     <w:left w:val="single" w:color="7A869E" w:sz="8"/>
@@ -1806,7 +1806,7 @@
               </w:trPr>
               <w:tc>
                 <w:tcPr>
-                  <w:tcW w:type="dxa" w:w="2050"/>
+                  <w:tcW w:type="dxa" w:w="2400"/>
                   <w:tcBorders>
                     <w:top w:val="single" w:color="7A869E" w:sz="8"/>
                     <w:left w:val="single" w:color="7A869E" w:sz="8"/>
@@ -1857,7 +1857,7 @@
               </w:tc>
               <w:tc>
                 <w:tcPr>
-                  <w:tcW w:type="dxa" w:w="2050"/>
+                  <w:tcW w:type="dxa" w:w="2000"/>
                   <w:tcBorders>
                     <w:top w:val="single" w:color="7A869E" w:sz="8"/>
                     <w:left w:val="single" w:color="7A869E" w:sz="8"/>
@@ -1889,7 +1889,7 @@
               </w:tc>
               <w:tc>
                 <w:tcPr>
-                  <w:tcW w:type="dxa" w:w="2650"/>
+                  <w:tcW w:type="dxa" w:w="2600"/>
                   <w:tcBorders>
                     <w:top w:val="single" w:color="7A869E" w:sz="8"/>
                     <w:left w:val="single" w:color="7A869E" w:sz="8"/>
@@ -1921,7 +1921,7 @@
               </w:tc>
               <w:tc>
                 <w:tcPr>
-                  <w:tcW w:type="dxa" w:w="3656"/>
+                  <w:tcW w:type="dxa" w:w="3406"/>
                   <w:tcBorders>
                     <w:top w:val="single" w:color="7A869E" w:sz="8"/>
                     <w:left w:val="single" w:color="7A869E" w:sz="8"/>
@@ -1959,7 +1959,7 @@
               </w:trPr>
               <w:tc>
                 <w:tcPr>
-                  <w:tcW w:type="dxa" w:w="2050"/>
+                  <w:tcW w:type="dxa" w:w="2400"/>
                   <w:tcBorders>
                     <w:top w:val="single" w:color="7A869E" w:sz="8"/>
                     <w:left w:val="single" w:color="7A869E" w:sz="8"/>
@@ -1994,7 +1994,7 @@
               </w:tc>
               <w:tc>
                 <w:tcPr>
-                  <w:tcW w:type="dxa" w:w="2050"/>
+                  <w:tcW w:type="dxa" w:w="2000"/>
                   <w:tcBorders>
                     <w:top w:val="single" w:color="7A869E" w:sz="8"/>
                     <w:left w:val="single" w:color="7A869E" w:sz="8"/>
@@ -2026,7 +2026,7 @@
               </w:tc>
               <w:tc>
                 <w:tcPr>
-                  <w:tcW w:type="dxa" w:w="2650"/>
+                  <w:tcW w:type="dxa" w:w="2600"/>
                   <w:tcBorders>
                     <w:top w:val="single" w:color="7A869E" w:sz="8"/>
                     <w:left w:val="single" w:color="7A869E" w:sz="8"/>
@@ -2058,7 +2058,7 @@
               </w:tc>
               <w:tc>
                 <w:tcPr>
-                  <w:tcW w:type="dxa" w:w="3656"/>
+                  <w:tcW w:type="dxa" w:w="3406"/>
                   <w:tcBorders>
                     <w:top w:val="single" w:color="7A869E" w:sz="8"/>
                     <w:left w:val="single" w:color="7A869E" w:sz="8"/>
@@ -2096,7 +2096,7 @@
               </w:trPr>
               <w:tc>
                 <w:tcPr>
-                  <w:tcW w:type="dxa" w:w="2050"/>
+                  <w:tcW w:type="dxa" w:w="2400"/>
                   <w:tcBorders>
                     <w:top w:val="single" w:color="7A869E" w:sz="8"/>
                     <w:left w:val="single" w:color="7A869E" w:sz="8"/>
@@ -2131,7 +2131,7 @@
               </w:tc>
               <w:tc>
                 <w:tcPr>
-                  <w:tcW w:type="dxa" w:w="2050"/>
+                  <w:tcW w:type="dxa" w:w="2000"/>
                   <w:tcBorders>
                     <w:top w:val="single" w:color="7A869E" w:sz="8"/>
                     <w:left w:val="single" w:color="7A869E" w:sz="8"/>
@@ -2163,7 +2163,7 @@
               </w:tc>
               <w:tc>
                 <w:tcPr>
-                  <w:tcW w:type="dxa" w:w="2650"/>
+                  <w:tcW w:type="dxa" w:w="2600"/>
                   <w:tcBorders>
                     <w:top w:val="single" w:color="7A869E" w:sz="8"/>
                     <w:left w:val="single" w:color="7A869E" w:sz="8"/>
@@ -2195,7 +2195,7 @@
               </w:tc>
               <w:tc>
                 <w:tcPr>
-                  <w:tcW w:type="dxa" w:w="3656"/>
+                  <w:tcW w:type="dxa" w:w="3406"/>
                   <w:tcBorders>
                     <w:top w:val="single" w:color="7A869E" w:sz="8"/>
                     <w:left w:val="single" w:color="7A869E" w:sz="8"/>

</xml_diff>